<commit_message>
leve modificacion al documento
</commit_message>
<xml_diff>
--- a/docs/provisional_DocumentacionProyecto_2VIFC302.docx
+++ b/docs/provisional_DocumentacionProyecto_2VIFC302.docx
@@ -1166,7 +1166,7 @@
           <w:lang w:eastAsia="es-VE"/>
         </w:rPr>
         <w:drawing>
-          <wp:inline distT="0" distB="0" distL="0" distR="0" wp14:anchorId="1183C0B2" wp14:editId="7B5CE78C">
+          <wp:inline distT="0" distB="0" distL="0" distR="0" wp14:anchorId="1183C0B2" wp14:editId="2F4ED7D5">
             <wp:extent cx="7556500" cy="10599420"/>
             <wp:effectExtent l="0" t="0" r="6350" b="0"/>
             <wp:docPr id="2" name="Imagen 2" descr="D:\servicios forobeta posts\diseño grafico\CLIENTES\Feelmusic - 05.11.18\archivos\11\11.jpg"/>
@@ -4692,10 +4692,10 @@
     </w:p>
     <w:p>
       <w:r>
-        <w:t>En este apartado se describen los objetivos del proyecto (…)</w:t>
-      </w:r>
-      <w:r>
-        <w:t xml:space="preserve"> </w:t>
+        <w:t xml:space="preserve">En este apartado se describen los objetivos </w:t>
+      </w:r>
+      <w:r>
+        <w:t>que se pretenden alcanzar con el desarrollo de la aplicación. Esos objetivos no solo buscan dar solución a un problema real de un Centro de Formación Profesional como La Laboral, sino también sirven como hoja de ruta para demostrar las competencias técnicas adquiridas durante el ciclo.</w:t>
       </w:r>
     </w:p>
     <w:p>
@@ -4857,7 +4857,7 @@
         </w:numPr>
       </w:pPr>
       <w:r>
-        <w:t>(…) Debe implementar 3 especificaciones propias</w:t>
+        <w:t>Multiplataforma: el proyecto debe contar con una aplicación de escritorio funcional, y otra de móvil.</w:t>
       </w:r>
     </w:p>
     <w:p>
@@ -4869,19 +4869,7 @@
         </w:numPr>
       </w:pPr>
       <w:r>
-        <w:t>(…)</w:t>
-      </w:r>
-    </w:p>
-    <w:p>
-      <w:pPr>
-        <w:pStyle w:val="Prrafodelista"/>
-        <w:numPr>
-          <w:ilvl w:val="0"/>
-          <w:numId w:val="6"/>
-        </w:numPr>
-      </w:pPr>
-      <w:r>
-        <w:t>(…)</w:t>
+        <w:t>Seguridad y contraseñas: debe implementar un sistema automatizado de generación y recuperación de credenciales.</w:t>
       </w:r>
     </w:p>
     <w:p>
@@ -4953,11 +4941,6 @@
       <w:bookmarkEnd w:id="10"/>
     </w:p>
     <w:p>
-      <w:r>
-        <w:t>(…)</w:t>
-      </w:r>
-    </w:p>
-    <w:p>
       <w:pPr>
         <w:pStyle w:val="Prrafodelista"/>
         <w:numPr>
@@ -5038,7 +5021,13 @@
         </w:numPr>
       </w:pPr>
       <w:r>
-        <w:t>Interfaz gráfica: el sistema debe incluir interfaces graficas de usuario (GUI).</w:t>
+        <w:t>Interfaz gráfica: el sistema debe incluir interfaces graficas de usuario (GUI)</w:t>
+      </w:r>
+      <w:r>
+        <w:t xml:space="preserve"> para Desktop</w:t>
+      </w:r>
+      <w:r>
+        <w:t>.</w:t>
       </w:r>
     </w:p>
     <w:p>
@@ -5080,7 +5069,20 @@
     <w:p>
       <w:pPr>
         <w:pStyle w:val="Prrafodelista"/>
-      </w:pPr>
+        <w:numPr>
+          <w:ilvl w:val="0"/>
+          <w:numId w:val="6"/>
+        </w:numPr>
+      </w:pPr>
+      <w:r>
+        <w:rPr>
+          <w:u w:val="single"/>
+        </w:rPr>
+        <w:t>Búsqueda y filtrado</w:t>
+      </w:r>
+      <w:r>
+        <w:t>: el sistema debe permitir realizar búsquedas y aplicar filtros sobre los listados de estudiantes, empresas y FCTs.</w:t>
+      </w:r>
     </w:p>
     <w:p>
       <w:pPr>
@@ -5091,7 +5093,13 @@
         </w:numPr>
       </w:pPr>
       <w:r>
-        <w:t>Búsqueda y filtrado: el sistema debe permitir realizar búsquedas y aplicar filtros sobre los listados de estudiantes, empresas y FCTs.</w:t>
+        <w:rPr>
+          <w:u w:val="single"/>
+        </w:rPr>
+        <w:t>Recuperación de contraseña</w:t>
+      </w:r>
+      <w:r>
+        <w:t>: el sistema debe implementar un mecanismo seguro para la recuperación de las contraseñas olvidadas por los usuarios.</w:t>
       </w:r>
     </w:p>
     <w:p>
@@ -5103,7 +5111,41 @@
         </w:numPr>
       </w:pPr>
       <w:r>
-        <w:t>Recuperación de contraseña: el sistema debe implementar un mecanismo seguro para la recuperación de las contraseñas olvidadas por los usuarios.</w:t>
+        <w:rPr>
+          <w:u w:val="single"/>
+        </w:rPr>
+        <w:t xml:space="preserve">Generación automática de </w:t>
+      </w:r>
+      <w:r>
+        <w:rPr>
+          <w:u w:val="single"/>
+        </w:rPr>
+        <w:t>contraseña</w:t>
+      </w:r>
+      <w:r>
+        <w:t>:</w:t>
+      </w:r>
+      <w:r>
+        <w:t xml:space="preserve"> el sistema creará una contraseña única que deberá ser cambiada por el alumno mas adelante.</w:t>
+      </w:r>
+    </w:p>
+    <w:p>
+      <w:pPr>
+        <w:pStyle w:val="Ttulo2"/>
+        <w:numPr>
+          <w:ilvl w:val="1"/>
+          <w:numId w:val="3"/>
+        </w:numPr>
+      </w:pPr>
+      <w:bookmarkStart w:id="11" w:name="_Toc210125373"/>
+      <w:r>
+        <w:t>REQUISITOS NO FUNCIONALES</w:t>
+      </w:r>
+      <w:bookmarkEnd w:id="11"/>
+    </w:p>
+    <w:p>
+      <w:r>
+        <w:t>(…)</w:t>
       </w:r>
     </w:p>
     <w:p>
@@ -5115,16 +5157,13 @@
         </w:numPr>
       </w:pPr>
       <w:r>
-        <w:t xml:space="preserve">Generación automática de </w:t>
-      </w:r>
-      <w:r>
-        <w:t>contraseña</w:t>
-      </w:r>
-      <w:r>
-        <w:t>:</w:t>
-      </w:r>
-      <w:r>
-        <w:t xml:space="preserve"> el sistema creará una contraseña única que deberá ser cambiada por el alumno mas adelante.</w:t>
+        <w:t xml:space="preserve">Arquitectura: el proyecto debe seguir una arquitectura basada en el </w:t>
+      </w:r>
+      <w:r>
+        <w:t>patrón</w:t>
+      </w:r>
+      <w:r>
+        <w:t xml:space="preserve"> Modelo-Vista-Controlador.</w:t>
       </w:r>
     </w:p>
     <w:p>
@@ -5134,17 +5173,75 @@
           <w:ilvl w:val="0"/>
           <w:numId w:val="6"/>
         </w:numPr>
-        <w:rPr>
-          <w:color w:val="EE0000"/>
-        </w:rPr>
-      </w:pPr>
-      <w:r>
-        <w:rPr>
-          <w:b/>
-          <w:bCs/>
-          <w:color w:val="EE0000"/>
-        </w:rPr>
-        <w:t>SEGUIR</w:t>
+      </w:pPr>
+      <w:r>
+        <w:t>Tecnología: el proyecto debe ser implementado con Java Spring.</w:t>
+      </w:r>
+    </w:p>
+    <w:p>
+      <w:pPr>
+        <w:pStyle w:val="Prrafodelista"/>
+        <w:numPr>
+          <w:ilvl w:val="0"/>
+          <w:numId w:val="6"/>
+        </w:numPr>
+      </w:pPr>
+      <w:r>
+        <w:t>Documentación: el proyecto debe estar totalmente documentado mediante el presente documento.</w:t>
+      </w:r>
+    </w:p>
+    <w:p>
+      <w:pPr>
+        <w:pStyle w:val="Prrafodelista"/>
+        <w:numPr>
+          <w:ilvl w:val="0"/>
+          <w:numId w:val="6"/>
+        </w:numPr>
+      </w:pPr>
+      <w:r>
+        <w:t xml:space="preserve">Base de datos: el proyecto debe </w:t>
+      </w:r>
+      <w:r>
+        <w:t>garantizar la persistencia de datos a través de</w:t>
+      </w:r>
+      <w:r>
+        <w:t xml:space="preserve"> una base de datos.</w:t>
+      </w:r>
+    </w:p>
+    <w:p>
+      <w:pPr>
+        <w:pStyle w:val="Prrafodelista"/>
+        <w:numPr>
+          <w:ilvl w:val="0"/>
+          <w:numId w:val="6"/>
+        </w:numPr>
+      </w:pPr>
+      <w:r>
+        <w:t>Seguridad de datos: se debe asegurar la confidencialidad de los datos sensibles como las contraseñas.</w:t>
+      </w:r>
+    </w:p>
+    <w:p>
+      <w:pPr>
+        <w:pStyle w:val="Prrafodelista"/>
+        <w:numPr>
+          <w:ilvl w:val="0"/>
+          <w:numId w:val="6"/>
+        </w:numPr>
+      </w:pPr>
+      <w:r>
+        <w:t>Usabilidad: la interfaz debe ser intuitiva y seguir una guía de estilos incluida en este documento.</w:t>
+      </w:r>
+    </w:p>
+    <w:p>
+      <w:pPr>
+        <w:pStyle w:val="Prrafodelista"/>
+        <w:numPr>
+          <w:ilvl w:val="0"/>
+          <w:numId w:val="6"/>
+        </w:numPr>
+      </w:pPr>
+      <w:r>
+        <w:t>Accesibilidad: la interfaz debe estar creada en condiciones accesibles y responsivas.</w:t>
       </w:r>
     </w:p>
     <w:p>
@@ -5155,114 +5252,11 @@
           <w:numId w:val="3"/>
         </w:numPr>
       </w:pPr>
-      <w:bookmarkStart w:id="11" w:name="_Toc210125373"/>
-      <w:r>
-        <w:t>REQUISITOS NO FUNCIONALES</w:t>
-      </w:r>
-      <w:bookmarkEnd w:id="11"/>
-    </w:p>
-    <w:p>
-      <w:r>
-        <w:t>(…)</w:t>
-      </w:r>
-    </w:p>
-    <w:p>
-      <w:pPr>
-        <w:pStyle w:val="Prrafodelista"/>
-        <w:numPr>
-          <w:ilvl w:val="0"/>
-          <w:numId w:val="6"/>
-        </w:numPr>
-      </w:pPr>
-      <w:r>
-        <w:t xml:space="preserve">Arquitectura: el proyecto debe seguir una arquitectura basada en el </w:t>
-      </w:r>
-      <w:r>
-        <w:t>patrón</w:t>
-      </w:r>
-      <w:r>
-        <w:t xml:space="preserve"> Modelo-Vista-Controlador.</w:t>
-      </w:r>
-    </w:p>
-    <w:p>
-      <w:pPr>
-        <w:pStyle w:val="Prrafodelista"/>
-        <w:numPr>
-          <w:ilvl w:val="0"/>
-          <w:numId w:val="6"/>
-        </w:numPr>
-      </w:pPr>
-      <w:r>
-        <w:t>Tecnología: el proyecto debe ser implementado con Java Spring.</w:t>
-      </w:r>
-    </w:p>
-    <w:p>
-      <w:pPr>
-        <w:pStyle w:val="Prrafodelista"/>
-        <w:numPr>
-          <w:ilvl w:val="0"/>
-          <w:numId w:val="6"/>
-        </w:numPr>
-      </w:pPr>
-      <w:r>
-        <w:t>Documentación: el proyecto debe estar totalmente documentado mediante el presente documento.</w:t>
-      </w:r>
-    </w:p>
-    <w:p>
-      <w:pPr>
-        <w:pStyle w:val="Prrafodelista"/>
-        <w:numPr>
-          <w:ilvl w:val="0"/>
-          <w:numId w:val="6"/>
-        </w:numPr>
-      </w:pPr>
-      <w:r>
-        <w:t>Base de datos: el proyecto debe estar preparado para conectar a una base de datos.</w:t>
-      </w:r>
-    </w:p>
-    <w:p>
-      <w:pPr>
-        <w:pStyle w:val="Prrafodelista"/>
-        <w:numPr>
-          <w:ilvl w:val="0"/>
-          <w:numId w:val="6"/>
-        </w:numPr>
-      </w:pPr>
-      <w:r>
-        <w:t>Seguridad de datos: se debe asegurar la confidencialidad de los datos sensibles como las contraseñas.</w:t>
-      </w:r>
-    </w:p>
-    <w:p>
-      <w:pPr>
-        <w:pStyle w:val="Prrafodelista"/>
-        <w:numPr>
-          <w:ilvl w:val="0"/>
-          <w:numId w:val="6"/>
-        </w:numPr>
-      </w:pPr>
-      <w:r>
-        <w:t>Usabilidad: la interfaz debe ser intuitiva y seguir una guía de estilos incluida en este documento.</w:t>
-      </w:r>
-    </w:p>
-    <w:p>
-      <w:pPr>
-        <w:pStyle w:val="Ttulo2"/>
-        <w:numPr>
-          <w:ilvl w:val="1"/>
-          <w:numId w:val="3"/>
-        </w:numPr>
-      </w:pPr>
       <w:bookmarkStart w:id="12" w:name="_Toc210125374"/>
       <w:r>
-        <w:lastRenderedPageBreak/>
         <w:t>CASOS DE USO</w:t>
       </w:r>
       <w:bookmarkEnd w:id="12"/>
-    </w:p>
-    <w:p>
-      <w:r>
-        <w:t>(...)</w:t>
-      </w:r>
     </w:p>
     <w:p>
       <w:r>
@@ -5303,6 +5297,7 @@
         <w:rPr>
           <w:noProof/>
         </w:rPr>
+        <w:lastRenderedPageBreak/>
         <w:drawing>
           <wp:inline distT="0" distB="0" distL="0" distR="0" wp14:anchorId="6DE35D98" wp14:editId="5DBA6D6C">
             <wp:extent cx="6120130" cy="4680585"/>
@@ -5402,11 +5397,6 @@
       <w:bookmarkEnd w:id="15"/>
     </w:p>
     <w:p>
-      <w:r>
-        <w:t>(…)</w:t>
-      </w:r>
-    </w:p>
-    <w:p>
       <w:pPr>
         <w:pStyle w:val="Prrafodelista"/>
         <w:numPr>
@@ -5439,7 +5429,7 @@
         <w:t>Profesor: personas responsables de la tutoría de los ciclos. Son intermediarios entre Empresa y Alumno.</w:t>
       </w:r>
       <w:r>
-        <w:t xml:space="preserve"> Dentro del sistema asumen el rol de Coordinador.</w:t>
+        <w:t xml:space="preserve"> Por cada curso, un profesor tendrá el rol de Profesor Coordinador.</w:t>
       </w:r>
     </w:p>
     <w:p>
@@ -5451,10 +5441,19 @@
         </w:numPr>
       </w:pPr>
       <w:r>
-        <w:t xml:space="preserve">Empresa: </w:t>
-      </w:r>
-      <w:r>
-        <w:t>persona que llevan la tutoría de la formación en la empresa</w:t>
+        <w:t>Tutor Empresa</w:t>
+      </w:r>
+      <w:r>
+        <w:t xml:space="preserve">: </w:t>
+      </w:r>
+      <w:r>
+        <w:t xml:space="preserve">persona </w:t>
+      </w:r>
+      <w:r>
+        <w:t xml:space="preserve">encargada de la formación </w:t>
+      </w:r>
+      <w:r>
+        <w:t>en la empresa</w:t>
       </w:r>
       <w:r>
         <w:t>.</w:t>
@@ -5527,7 +5526,6 @@
         </w:numPr>
       </w:pPr>
       <w:r>
-        <w:lastRenderedPageBreak/>
         <w:t>CU2. Gestión de empresas: el administrador</w:t>
       </w:r>
       <w:r>
@@ -5573,6 +5571,7 @@
         </w:numPr>
       </w:pPr>
       <w:r>
+        <w:lastRenderedPageBreak/>
         <w:t xml:space="preserve">CU4. </w:t>
       </w:r>
       <w:r>
@@ -5680,7 +5679,12 @@
     <w:p/>
     <w:p>
       <w:r>
-        <w:t>(…)</w:t>
+        <w:t>En este apartado se define la estructura lógica y física de la información que maneja la aplicación.</w:t>
+      </w:r>
+    </w:p>
+    <w:p>
+      <w:r>
+        <w:t>A continuación se presentan los diagramas que definen el almacenamiento y la relacion</w:t>
       </w:r>
     </w:p>
     <w:p>
@@ -5899,6 +5903,7 @@
       </w:pPr>
       <w:bookmarkStart w:id="22" w:name="_Toc210125381"/>
       <w:r>
+        <w:lastRenderedPageBreak/>
         <w:t>INTERFACES GRÁFICAS DE USUARIO</w:t>
       </w:r>
       <w:bookmarkEnd w:id="22"/>
@@ -5910,7 +5915,6 @@
     </w:p>
     <w:p>
       <w:r>
-        <w:lastRenderedPageBreak/>
         <w:t xml:space="preserve">A </w:t>
       </w:r>
       <w:r>
@@ -6077,6 +6081,7 @@
         <w:rPr>
           <w:noProof/>
         </w:rPr>
+        <w:lastRenderedPageBreak/>
         <w:drawing>
           <wp:inline distT="0" distB="0" distL="0" distR="0" wp14:anchorId="4333422A" wp14:editId="207E113D">
             <wp:extent cx="472440" cy="670560"/>
@@ -6246,7 +6251,6 @@
     </w:p>
     <w:p>
       <w:r>
-        <w:lastRenderedPageBreak/>
         <w:t xml:space="preserve">El </w:t>
       </w:r>
       <w:r>
@@ -6530,7 +6534,6 @@
       </w:pPr>
       <w:bookmarkStart w:id="42" w:name="_Toc210125390"/>
       <w:r>
-        <w:lastRenderedPageBreak/>
         <w:t>ESTIMACIONES DE COSTES</w:t>
       </w:r>
       <w:bookmarkEnd w:id="42"/>
@@ -6799,6 +6802,7 @@
       </w:pPr>
       <w:bookmarkStart w:id="66" w:name="_Toc210125402"/>
       <w:r>
+        <w:lastRenderedPageBreak/>
         <w:t>GUÍA DE ESTILOS Y MANUAL DE USUARIO</w:t>
       </w:r>
       <w:bookmarkEnd w:id="66"/>
@@ -9066,6 +9070,15 @@
 </file>
 
 <file path=customXml/item1.xml><?xml version="1.0" encoding="utf-8"?>
+<?mso-contentType ?>
+<FormTemplates xmlns="http://schemas.microsoft.com/sharepoint/v3/contenttype/forms">
+  <Display>DocumentLibraryForm</Display>
+  <Edit>DocumentLibraryForm</Edit>
+  <New>DocumentLibraryForm</New>
+</FormTemplates>
+</file>
+
+<file path=customXml/item2.xml><?xml version="1.0" encoding="utf-8"?>
 <ct:contentTypeSchema xmlns:ct="http://schemas.microsoft.com/office/2006/metadata/contentType" xmlns:ma="http://schemas.microsoft.com/office/2006/metadata/properties/metaAttributes" ct:_="" ma:_="" ma:contentTypeName="Documento" ma:contentTypeID="0x010100089FBA7B0FAFA84E9F1E615D3FC0A129" ma:contentTypeVersion="11" ma:contentTypeDescription="Crear nuevo documento." ma:contentTypeScope="" ma:versionID="fa55cfaacbcd603bd53d850e3b8176f7">
   <xsd:schema xmlns:xsd="http://www.w3.org/2001/XMLSchema" xmlns:xs="http://www.w3.org/2001/XMLSchema" xmlns:p="http://schemas.microsoft.com/office/2006/metadata/properties" xmlns:ns3="d07641f9-f1a5-43c1-ac16-fa53e6c318bc" targetNamespace="http://schemas.microsoft.com/office/2006/metadata/properties" ma:root="true" ma:fieldsID="78f989df160fe6a5ee2e0e0b0bfde0e3" ns3:_="">
     <xsd:import namespace="d07641f9-f1a5-43c1-ac16-fa53e6c318bc"/>
@@ -9253,20 +9266,7 @@
 </ct:contentTypeSchema>
 </file>
 
-<file path=customXml/item2.xml><?xml version="1.0" encoding="utf-8"?>
-<?mso-contentType ?>
-<FormTemplates xmlns="http://schemas.microsoft.com/sharepoint/v3/contenttype/forms">
-  <Display>DocumentLibraryForm</Display>
-  <Edit>DocumentLibraryForm</Edit>
-  <New>DocumentLibraryForm</New>
-</FormTemplates>
-</file>
-
 <file path=customXml/item3.xml><?xml version="1.0" encoding="utf-8"?>
-<b:Sources xmlns:b="http://schemas.openxmlformats.org/officeDocument/2006/bibliography" xmlns="http://schemas.openxmlformats.org/officeDocument/2006/bibliography" SelectedStyle="\APASixthEditionOfficeOnline.xsl" StyleName="APA" Version="6"/>
-</file>
-
-<file path=customXml/item4.xml><?xml version="1.0" encoding="utf-8"?>
 <p:properties xmlns:p="http://schemas.microsoft.com/office/2006/metadata/properties" xmlns:xsi="http://www.w3.org/2001/XMLSchema-instance" xmlns:pc="http://schemas.microsoft.com/office/infopath/2007/PartnerControls">
   <documentManagement>
     <_activity xmlns="d07641f9-f1a5-43c1-ac16-fa53e6c318bc" xsi:nil="true"/>
@@ -9274,7 +9274,19 @@
 </p:properties>
 </file>
 
+<file path=customXml/item4.xml><?xml version="1.0" encoding="utf-8"?>
+<b:Sources xmlns:b="http://schemas.openxmlformats.org/officeDocument/2006/bibliography" xmlns="http://schemas.openxmlformats.org/officeDocument/2006/bibliography" SelectedStyle="\APASixthEditionOfficeOnline.xsl" StyleName="APA" Version="6"/>
+</file>
+
 <file path=customXml/itemProps1.xml><?xml version="1.0" encoding="utf-8"?>
+<ds:datastoreItem xmlns:ds="http://schemas.openxmlformats.org/officeDocument/2006/customXml" ds:itemID="{480B8420-1B48-4D23-8D6E-64373AC5070B}">
+  <ds:schemaRefs>
+    <ds:schemaRef ds:uri="http://schemas.microsoft.com/sharepoint/v3/contenttype/forms"/>
+  </ds:schemaRefs>
+</ds:datastoreItem>
+</file>
+
+<file path=customXml/itemProps2.xml><?xml version="1.0" encoding="utf-8"?>
 <ds:datastoreItem xmlns:ds="http://schemas.openxmlformats.org/officeDocument/2006/customXml" ds:itemID="{B3C09D93-2BDC-4563-9759-9158244E5DE7}">
   <ds:schemaRefs>
     <ds:schemaRef ds:uri="http://schemas.microsoft.com/office/2006/metadata/contentType"/>
@@ -9292,23 +9304,7 @@
 </ds:datastoreItem>
 </file>
 
-<file path=customXml/itemProps2.xml><?xml version="1.0" encoding="utf-8"?>
-<ds:datastoreItem xmlns:ds="http://schemas.openxmlformats.org/officeDocument/2006/customXml" ds:itemID="{480B8420-1B48-4D23-8D6E-64373AC5070B}">
-  <ds:schemaRefs>
-    <ds:schemaRef ds:uri="http://schemas.microsoft.com/sharepoint/v3/contenttype/forms"/>
-  </ds:schemaRefs>
-</ds:datastoreItem>
-</file>
-
 <file path=customXml/itemProps3.xml><?xml version="1.0" encoding="utf-8"?>
-<ds:datastoreItem xmlns:ds="http://schemas.openxmlformats.org/officeDocument/2006/customXml" ds:itemID="{453714F8-FBC3-4DCC-8DCB-89BB58DCF76F}">
-  <ds:schemaRefs>
-    <ds:schemaRef ds:uri="http://schemas.openxmlformats.org/officeDocument/2006/bibliography"/>
-  </ds:schemaRefs>
-</ds:datastoreItem>
-</file>
-
-<file path=customXml/itemProps4.xml><?xml version="1.0" encoding="utf-8"?>
 <ds:datastoreItem xmlns:ds="http://schemas.openxmlformats.org/officeDocument/2006/customXml" ds:itemID="{7F0B1298-25D5-45B9-909D-DD837044A49E}">
   <ds:schemaRefs>
     <ds:schemaRef ds:uri="http://purl.org/dc/elements/1.1/"/>
@@ -9322,4 +9318,12 @@
     <ds:schemaRef ds:uri="http://schemas.microsoft.com/office/2006/metadata/properties"/>
   </ds:schemaRefs>
 </ds:datastoreItem>
+</file>
+
+<file path=customXml/itemProps4.xml><?xml version="1.0" encoding="utf-8"?>
+<ds:datastoreItem xmlns:ds="http://schemas.openxmlformats.org/officeDocument/2006/customXml" ds:itemID="{453714F8-FBC3-4DCC-8DCB-89BB58DCF76F}">
+  <ds:schemaRefs>
+    <ds:schemaRef ds:uri="http://schemas.openxmlformats.org/officeDocument/2006/bibliography"/>
+  </ds:schemaRefs>
+</ds:datastoreItem>
 </file>
</xml_diff>

<commit_message>
Modificacion en la documentacion
- se ha modificado el diagrama de casos de uso, y con ello el apartado
2.3.3.
</commit_message>
<xml_diff>
--- a/docs/provisional_DocumentacionProyecto_2VIFC302.docx
+++ b/docs/provisional_DocumentacionProyecto_2VIFC302.docx
@@ -183,7 +183,7 @@
                                     </pic:cNvPicPr>
                                   </pic:nvPicPr>
                                   <pic:blipFill>
-                                    <a:blip r:embed="rId11">
+                                    <a:blip r:embed="rId12">
                                       <a:extLst>
                                         <a:ext uri="{28A0092B-C50C-407E-A947-70E740481C1C}">
                                           <a14:useLocalDpi xmlns:a14="http://schemas.microsoft.com/office/drawing/2010/main" val="0"/>
@@ -829,7 +829,33 @@
                           <w:szCs w:val="32"/>
                           <w:lang w:val="en-US"/>
                         </w:rPr>
-                        <w:t>&lt;&lt;Mes y año&gt;&gt;</w:t>
+                        <w:t xml:space="preserve">&lt;&lt;Mes y </w:t>
+                      </w:r>
+                      <w:proofErr w:type="spellStart"/>
+                      <w:r>
+                        <w:rPr>
+                          <w:rFonts w:eastAsia="Aptos" w:hAnsi="Aptos" w:cs="Aptos"/>
+                          <w:b/>
+                          <w:bCs/>
+                          <w:color w:val="215E99" w:themeColor="text2" w:themeTint="BF"/>
+                          <w:sz w:val="32"/>
+                          <w:szCs w:val="32"/>
+                          <w:lang w:val="en-US"/>
+                        </w:rPr>
+                        <w:t>año</w:t>
+                      </w:r>
+                      <w:proofErr w:type="spellEnd"/>
+                      <w:r>
+                        <w:rPr>
+                          <w:rFonts w:eastAsia="Aptos" w:hAnsi="Aptos" w:cs="Aptos"/>
+                          <w:b/>
+                          <w:bCs/>
+                          <w:color w:val="215E99" w:themeColor="text2" w:themeTint="BF"/>
+                          <w:sz w:val="32"/>
+                          <w:szCs w:val="32"/>
+                          <w:lang w:val="en-US"/>
+                        </w:rPr>
+                        <w:t>&gt;&gt;</w:t>
                       </w:r>
                     </w:p>
                     <w:p>
@@ -1150,8 +1176,42 @@
                           <w:szCs w:val="44"/>
                           <w:lang w:val="en-US"/>
                         </w:rPr>
-                        <w:t>Desarrollo de Aplicaciones Multiplataforma</w:t>
+                        <w:t xml:space="preserve">Desarrollo de </w:t>
                       </w:r>
+                      <w:proofErr w:type="spellStart"/>
+                      <w:r>
+                        <w:rPr>
+                          <w:rFonts w:eastAsia="Aptos" w:hAnsi="Aptos" w:cs="Aptos"/>
+                          <w:color w:val="215E99" w:themeColor="text2" w:themeTint="BF"/>
+                          <w:sz w:val="44"/>
+                          <w:szCs w:val="44"/>
+                          <w:lang w:val="en-US"/>
+                        </w:rPr>
+                        <w:t>Aplicaciones</w:t>
+                      </w:r>
+                      <w:proofErr w:type="spellEnd"/>
+                      <w:r>
+                        <w:rPr>
+                          <w:rFonts w:eastAsia="Aptos" w:hAnsi="Aptos" w:cs="Aptos"/>
+                          <w:color w:val="215E99" w:themeColor="text2" w:themeTint="BF"/>
+                          <w:sz w:val="44"/>
+                          <w:szCs w:val="44"/>
+                          <w:lang w:val="en-US"/>
+                        </w:rPr>
+                        <w:t xml:space="preserve"> </w:t>
+                      </w:r>
+                      <w:proofErr w:type="spellStart"/>
+                      <w:r>
+                        <w:rPr>
+                          <w:rFonts w:eastAsia="Aptos" w:hAnsi="Aptos" w:cs="Aptos"/>
+                          <w:color w:val="215E99" w:themeColor="text2" w:themeTint="BF"/>
+                          <w:sz w:val="44"/>
+                          <w:szCs w:val="44"/>
+                          <w:lang w:val="en-US"/>
+                        </w:rPr>
+                        <w:t>Multiplataforma</w:t>
+                      </w:r>
+                      <w:proofErr w:type="spellEnd"/>
                     </w:p>
                   </w:txbxContent>
                 </v:textbox>
@@ -1166,7 +1226,7 @@
           <w:lang w:eastAsia="es-VE"/>
         </w:rPr>
         <w:drawing>
-          <wp:inline distT="0" distB="0" distL="0" distR="0" wp14:anchorId="1183C0B2" wp14:editId="2F4ED7D5">
+          <wp:inline distT="0" distB="0" distL="0" distR="0" wp14:anchorId="1183C0B2" wp14:editId="0C75CF69">
             <wp:extent cx="7556500" cy="10599420"/>
             <wp:effectExtent l="0" t="0" r="6350" b="0"/>
             <wp:docPr id="2" name="Imagen 2" descr="D:\servicios forobeta posts\diseño grafico\CLIENTES\Feelmusic - 05.11.18\archivos\11\11.jpg"/>
@@ -1183,7 +1243,7 @@
                     </pic:cNvPicPr>
                   </pic:nvPicPr>
                   <pic:blipFill>
-                    <a:blip r:embed="rId12" cstate="print">
+                    <a:blip r:embed="rId13" cstate="print">
                       <a:extLst>
                         <a:ext uri="{28A0092B-C50C-407E-A947-70E740481C1C}">
                           <a14:useLocalDpi xmlns:a14="http://schemas.microsoft.com/office/drawing/2010/main" val="0"/>
@@ -1218,8 +1278,8 @@
     <w:p>
       <w:pPr>
         <w:sectPr>
-          <w:headerReference w:type="default" r:id="rId13"/>
-          <w:footerReference w:type="default" r:id="rId14"/>
+          <w:headerReference w:type="default" r:id="rId14"/>
+          <w:footerReference w:type="default" r:id="rId15"/>
           <w:pgSz w:w="11906" w:h="16838"/>
           <w:pgMar w:top="0" w:right="0" w:bottom="0" w:left="0" w:header="708" w:footer="708" w:gutter="0"/>
           <w:cols w:space="708"/>
@@ -4835,29 +4895,18 @@
           <w:ilvl w:val="0"/>
           <w:numId w:val="6"/>
         </w:numPr>
-        <w:rPr>
-          <w:color w:val="EE0000"/>
-        </w:rPr>
-      </w:pPr>
-      <w:r>
-        <w:rPr>
-          <w:b/>
-          <w:bCs/>
-          <w:color w:val="EE0000"/>
-        </w:rPr>
-        <w:t>SEGUIR</w:t>
-      </w:r>
-    </w:p>
-    <w:p>
-      <w:pPr>
-        <w:pStyle w:val="Prrafodelista"/>
-        <w:numPr>
-          <w:ilvl w:val="0"/>
-          <w:numId w:val="6"/>
-        </w:numPr>
-      </w:pPr>
-      <w:r>
-        <w:t>Multiplataforma: el proyecto debe contar con una aplicación de escritorio funcional, y otra de móvil.</w:t>
+      </w:pPr>
+      <w:r>
+        <w:t xml:space="preserve">Multiplataforma: el proyecto debe contar con una aplicación de escritorio </w:t>
+      </w:r>
+      <w:r>
+        <w:t xml:space="preserve">100% </w:t>
+      </w:r>
+      <w:r>
+        <w:t xml:space="preserve">funcional, y </w:t>
+      </w:r>
+      <w:r>
+        <w:t>una aplicación de móvil especifica para el perfil Estudiante, centrada en la consulta y gestión de su propia información.</w:t>
       </w:r>
     </w:p>
     <w:p>
@@ -5126,7 +5175,13 @@
         <w:t>:</w:t>
       </w:r>
       <w:r>
-        <w:t xml:space="preserve"> el sistema creará una contraseña única que deberá ser cambiada por el alumno mas adelante.</w:t>
+        <w:t xml:space="preserve"> el sistema creará una contraseña única que deberá ser cambiada por el alumno </w:t>
+      </w:r>
+      <w:r>
+        <w:t>más</w:t>
+      </w:r>
+      <w:r>
+        <w:t xml:space="preserve"> adelante.</w:t>
       </w:r>
     </w:p>
     <w:p>
@@ -5157,7 +5212,13 @@
         </w:numPr>
       </w:pPr>
       <w:r>
-        <w:t xml:space="preserve">Arquitectura: el proyecto debe seguir una arquitectura basada en el </w:t>
+        <w:rPr>
+          <w:u w:val="single"/>
+        </w:rPr>
+        <w:t>Arquitectura</w:t>
+      </w:r>
+      <w:r>
+        <w:t xml:space="preserve">: el proyecto debe seguir una arquitectura basada en el </w:t>
       </w:r>
       <w:r>
         <w:t>patrón</w:t>
@@ -5299,10 +5360,10 @@
         </w:rPr>
         <w:lastRenderedPageBreak/>
         <w:drawing>
-          <wp:inline distT="0" distB="0" distL="0" distR="0" wp14:anchorId="6DE35D98" wp14:editId="5DBA6D6C">
+          <wp:inline distT="0" distB="0" distL="0" distR="0" wp14:anchorId="629EDE24" wp14:editId="024A0034">
             <wp:extent cx="6120130" cy="4680585"/>
             <wp:effectExtent l="0" t="0" r="0" b="5715"/>
-            <wp:docPr id="1993878499" name="Imagen 8"/>
+            <wp:docPr id="1224806174" name="Imagen 6"/>
             <wp:cNvGraphicFramePr>
               <a:graphicFrameLocks xmlns:a="http://schemas.openxmlformats.org/drawingml/2006/main" noChangeAspect="1"/>
             </wp:cNvGraphicFramePr>
@@ -5310,11 +5371,11 @@
               <a:graphicData uri="http://schemas.openxmlformats.org/drawingml/2006/picture">
                 <pic:pic xmlns:pic="http://schemas.openxmlformats.org/drawingml/2006/picture">
                   <pic:nvPicPr>
-                    <pic:cNvPr id="1993878499" name=""/>
+                    <pic:cNvPr id="1224806174" name=""/>
                     <pic:cNvPicPr/>
                   </pic:nvPicPr>
                   <pic:blipFill>
-                    <a:blip r:embed="rId15" cstate="print">
+                    <a:blip r:embed="rId16" cstate="print">
                       <a:extLst>
                         <a:ext uri="{28A0092B-C50C-407E-A947-70E740481C1C}">
                           <a14:useLocalDpi xmlns:a14="http://schemas.microsoft.com/office/drawing/2010/main" val="0"/>
@@ -5429,7 +5490,10 @@
         <w:t>Profesor: personas responsables de la tutoría de los ciclos. Son intermediarios entre Empresa y Alumno.</w:t>
       </w:r>
       <w:r>
-        <w:t xml:space="preserve"> Por cada curso, un profesor tendrá el rol de Profesor Coordinador.</w:t>
+        <w:t xml:space="preserve"> Por cada curso, un profesor tendrá el rol de Profesor Coordinador</w:t>
+      </w:r>
+      <w:r>
+        <w:t>, y será el encargado de asociar cada estudiante con una empresa.</w:t>
       </w:r>
     </w:p>
     <w:p>
@@ -5456,6 +5520,9 @@
         <w:t>en la empresa</w:t>
       </w:r>
       <w:r>
+        <w:t xml:space="preserve"> (o centro equiparado)</w:t>
+      </w:r>
+      <w:r>
         <w:t>.</w:t>
       </w:r>
     </w:p>
@@ -5489,11 +5556,6 @@
       <w:bookmarkEnd w:id="16"/>
     </w:p>
     <w:p>
-      <w:r>
-        <w:t>(...)</w:t>
-      </w:r>
-    </w:p>
-    <w:p>
       <w:pPr>
         <w:pStyle w:val="Prrafodelista"/>
         <w:numPr>
@@ -5553,13 +5615,11 @@
         <w:t xml:space="preserve">todos los perfiles de usuario </w:t>
       </w:r>
       <w:r>
-        <w:t xml:space="preserve">tendrán </w:t>
-      </w:r>
-      <w:r>
-        <w:rPr>
-          <w:color w:val="EE0000"/>
-        </w:rPr>
-        <w:t>(Terminar)</w:t>
+        <w:t xml:space="preserve">generarán documentación de forma automática (como convenios). Además, el sistema permitirá a todos los usuarios, según sus </w:t>
+      </w:r>
+      <w:r>
+        <w:lastRenderedPageBreak/>
+        <w:t xml:space="preserve">permisos, la carga, almacenamiento y descarga de documentos específicos (justificantes de asistencia para Estudiantes, evaluaciones para Profesores y Tutores de Empresa). </w:t>
       </w:r>
     </w:p>
     <w:p>
@@ -5571,7 +5631,6 @@
         </w:numPr>
       </w:pPr>
       <w:r>
-        <w:lastRenderedPageBreak/>
         <w:t xml:space="preserve">CU4. </w:t>
       </w:r>
       <w:r>
@@ -5599,13 +5658,22 @@
         <w:t>CU5.</w:t>
       </w:r>
       <w:r>
-        <w:t xml:space="preserve"> Consultar FCT propia: los estudiantes pueden </w:t>
+        <w:t xml:space="preserve"> Consultar </w:t>
+      </w:r>
+      <w:r>
+        <w:t>datos</w:t>
+      </w:r>
+      <w:r>
+        <w:t xml:space="preserve">: los estudiantes pueden </w:t>
       </w:r>
       <w:r>
         <w:t>consultar</w:t>
       </w:r>
       <w:r>
-        <w:t xml:space="preserve"> una vista detallada de su asignación de FCT, incluyendo todos los datos que se incluyen en la formación</w:t>
+        <w:t xml:space="preserve"> una vista detallada de su asignación de FCT, </w:t>
+      </w:r>
+      <w:r>
+        <w:t>sus datos personales, y sus faltas de asistencia</w:t>
       </w:r>
       <w:r>
         <w:t>.</w:t>
@@ -5620,16 +5688,7 @@
         </w:numPr>
       </w:pPr>
       <w:r>
-        <w:t xml:space="preserve">CU6. Evaluar FCT: </w:t>
-      </w:r>
-      <w:r>
-        <w:t xml:space="preserve">los </w:t>
-      </w:r>
-      <w:r>
-        <w:t>profesores y las empresas</w:t>
-      </w:r>
-      <w:r>
-        <w:t xml:space="preserve"> tendrán que valorar la formación en empresa de los estudiantes.</w:t>
+        <w:t>CU6. Registrar faltas de asistencia: los usuarios Estudiante y Tutor de empresa podrán registrar una falta de asistencia.</w:t>
       </w:r>
     </w:p>
     <w:p>
@@ -5641,25 +5700,142 @@
         </w:numPr>
       </w:pPr>
       <w:r>
-        <w:t xml:space="preserve">CU7. </w:t>
-      </w:r>
-      <w:r>
-        <w:t>Gestión FCT: permita al profesorado crear una nueva FCT, asociando un estudiante</w:t>
-      </w:r>
-      <w:r>
-        <w:t xml:space="preserve"> con una empresa</w:t>
-      </w:r>
-      <w:r>
-        <w:t xml:space="preserve"> y </w:t>
-      </w:r>
-      <w:r>
-        <w:t>añadiendo</w:t>
-      </w:r>
-      <w:r>
-        <w:t xml:space="preserve"> los datos necesarios</w:t>
-      </w:r>
-      <w:r>
-        <w:t>.</w:t>
+        <w:t>CU</w:t>
+      </w:r>
+      <w:r>
+        <w:t>7</w:t>
+      </w:r>
+      <w:r>
+        <w:t xml:space="preserve">. Evaluar </w:t>
+      </w:r>
+      <w:r>
+        <w:t>Estudiante</w:t>
+      </w:r>
+      <w:r>
+        <w:t xml:space="preserve">: </w:t>
+      </w:r>
+      <w:r>
+        <w:t xml:space="preserve">los </w:t>
+      </w:r>
+      <w:r>
+        <w:t>P</w:t>
+      </w:r>
+      <w:r>
+        <w:t xml:space="preserve">rofesores y </w:t>
+      </w:r>
+      <w:r>
+        <w:t>los Tutores de</w:t>
+      </w:r>
+      <w:r>
+        <w:t xml:space="preserve"> empresas</w:t>
+      </w:r>
+      <w:r>
+        <w:t xml:space="preserve"> tendrán que valorar la formación en empresa de los estudiantes.</w:t>
+      </w:r>
+    </w:p>
+    <w:p>
+      <w:pPr>
+        <w:pStyle w:val="Prrafodelista"/>
+        <w:numPr>
+          <w:ilvl w:val="0"/>
+          <w:numId w:val="6"/>
+        </w:numPr>
+      </w:pPr>
+      <w:r>
+        <w:t>CU</w:t>
+      </w:r>
+      <w:r>
+        <w:t>8</w:t>
+      </w:r>
+      <w:r>
+        <w:t xml:space="preserve">. </w:t>
+      </w:r>
+      <w:r>
+        <w:t>Gestión</w:t>
+      </w:r>
+      <w:r>
+        <w:t xml:space="preserve"> Empresa</w:t>
+      </w:r>
+      <w:r>
+        <w:t>: permit</w:t>
+      </w:r>
+      <w:r>
+        <w:t>e</w:t>
+      </w:r>
+      <w:r>
+        <w:t xml:space="preserve"> al profesorado c</w:t>
+      </w:r>
+      <w:r>
+        <w:t>rear, modificar o eliminar</w:t>
+      </w:r>
+      <w:r>
+        <w:t xml:space="preserve"> una nueva </w:t>
+      </w:r>
+      <w:r>
+        <w:t xml:space="preserve">Empresa, </w:t>
+      </w:r>
+      <w:r>
+        <w:t>persistiendo sus datos en el sistema.</w:t>
+      </w:r>
+    </w:p>
+    <w:p>
+      <w:pPr>
+        <w:pStyle w:val="Prrafodelista"/>
+        <w:numPr>
+          <w:ilvl w:val="0"/>
+          <w:numId w:val="6"/>
+        </w:numPr>
+      </w:pPr>
+      <w:r>
+        <w:t xml:space="preserve">CU9. Gestión Tutor de Empresa: </w:t>
+      </w:r>
+      <w:r>
+        <w:t>permite al profesorado crear, modificar o eliminar</w:t>
+      </w:r>
+      <w:r>
+        <w:t xml:space="preserve"> un Tutor asociado a una Empresa ya existente.</w:t>
+      </w:r>
+    </w:p>
+    <w:p>
+      <w:pPr>
+        <w:pStyle w:val="Prrafodelista"/>
+        <w:numPr>
+          <w:ilvl w:val="0"/>
+          <w:numId w:val="6"/>
+        </w:numPr>
+      </w:pPr>
+      <w:r>
+        <w:t>CU10. Gestión Estudiante</w:t>
+      </w:r>
+      <w:r>
+        <w:t>:</w:t>
+      </w:r>
+      <w:r>
+        <w:t xml:space="preserve"> </w:t>
+      </w:r>
+      <w:r>
+        <w:t>permite al profesorado crear, modificar o eliminar</w:t>
+      </w:r>
+      <w:r>
+        <w:t xml:space="preserve"> un Estudiante.</w:t>
+      </w:r>
+    </w:p>
+    <w:p>
+      <w:pPr>
+        <w:pStyle w:val="Prrafodelista"/>
+        <w:numPr>
+          <w:ilvl w:val="0"/>
+          <w:numId w:val="6"/>
+        </w:numPr>
+      </w:pPr>
+      <w:r>
+        <w:t xml:space="preserve">CU11. Gestión FCT: </w:t>
+      </w:r>
+      <w:r>
+        <w:t>permite al profesorado crear, modificar o eliminar</w:t>
+      </w:r>
+      <w:r>
+        <w:t xml:space="preserve"> una relación entre Estudiante y Empresa mediante una FCT.</w:t>
       </w:r>
     </w:p>
     <w:p>
@@ -5683,8 +5859,22 @@
       </w:r>
     </w:p>
     <w:p>
-      <w:r>
-        <w:t>A continuación se presentan los diagramas que definen el almacenamiento y la relacion</w:t>
+      <w:pPr>
+        <w:rPr>
+          <w:u w:val="single"/>
+        </w:rPr>
+      </w:pPr>
+      <w:r>
+        <w:t xml:space="preserve">A </w:t>
+      </w:r>
+      <w:r>
+        <w:t>continuación,</w:t>
+      </w:r>
+      <w:r>
+        <w:t xml:space="preserve"> se presentan los diagramas que definen el almacenamiento y la </w:t>
+      </w:r>
+      <w:r>
+        <w:t>relación entre las entidades del sistema, proporcionando una visión integral desde el diseño conceptual de la base de datos, hasta su implementación bajo el paradigma de la programación orientada a objetos.</w:t>
       </w:r>
     </w:p>
     <w:p>
@@ -5731,7 +5921,7 @@
                     <pic:cNvPicPr/>
                   </pic:nvPicPr>
                   <pic:blipFill>
-                    <a:blip r:embed="rId16" cstate="print">
+                    <a:blip r:embed="rId17" cstate="print">
                       <a:extLst>
                         <a:ext uri="{28A0092B-C50C-407E-A947-70E740481C1C}">
                           <a14:useLocalDpi xmlns:a14="http://schemas.microsoft.com/office/drawing/2010/main" val="0"/>
@@ -5818,6 +6008,7 @@
         <w:rPr>
           <w:noProof/>
         </w:rPr>
+        <w:lastRenderedPageBreak/>
         <w:drawing>
           <wp:inline distT="0" distB="0" distL="0" distR="0" wp14:anchorId="2E1B7058" wp14:editId="7B996087">
             <wp:extent cx="4352925" cy="3540421"/>
@@ -5834,7 +6025,7 @@
                     <pic:cNvPicPr/>
                   </pic:nvPicPr>
                   <pic:blipFill>
-                    <a:blip r:embed="rId17" cstate="print">
+                    <a:blip r:embed="rId18" cstate="print">
                       <a:extLst>
                         <a:ext uri="{28A0092B-C50C-407E-A947-70E740481C1C}">
                           <a14:useLocalDpi xmlns:a14="http://schemas.microsoft.com/office/drawing/2010/main" val="0"/>
@@ -5903,7 +6094,6 @@
       </w:pPr>
       <w:bookmarkStart w:id="22" w:name="_Toc210125381"/>
       <w:r>
-        <w:lastRenderedPageBreak/>
         <w:t>INTERFACES GRÁFICAS DE USUARIO</w:t>
       </w:r>
       <w:bookmarkEnd w:id="22"/>
@@ -5949,7 +6139,7 @@
                     <pic:cNvPicPr/>
                   </pic:nvPicPr>
                   <pic:blipFill>
-                    <a:blip r:embed="rId18">
+                    <a:blip r:embed="rId19">
                       <a:extLst>
                         <a:ext uri="{28A0092B-C50C-407E-A947-70E740481C1C}">
                           <a14:useLocalDpi xmlns:a14="http://schemas.microsoft.com/office/drawing/2010/main" val="0"/>
@@ -6007,6 +6197,7 @@
         <w:rPr>
           <w:noProof/>
         </w:rPr>
+        <w:lastRenderedPageBreak/>
         <w:drawing>
           <wp:inline distT="0" distB="0" distL="0" distR="0" wp14:anchorId="4499399C" wp14:editId="0647006F">
             <wp:extent cx="5276217" cy="3600000"/>
@@ -6023,7 +6214,7 @@
                     <pic:cNvPicPr/>
                   </pic:nvPicPr>
                   <pic:blipFill>
-                    <a:blip r:embed="rId19" cstate="print">
+                    <a:blip r:embed="rId20" cstate="print">
                       <a:extLst>
                         <a:ext uri="{28A0092B-C50C-407E-A947-70E740481C1C}">
                           <a14:useLocalDpi xmlns:a14="http://schemas.microsoft.com/office/drawing/2010/main" val="0"/>
@@ -6081,7 +6272,6 @@
         <w:rPr>
           <w:noProof/>
         </w:rPr>
-        <w:lastRenderedPageBreak/>
         <w:drawing>
           <wp:inline distT="0" distB="0" distL="0" distR="0" wp14:anchorId="4333422A" wp14:editId="207E113D">
             <wp:extent cx="472440" cy="670560"/>
@@ -6098,7 +6288,7 @@
                     <pic:cNvPicPr/>
                   </pic:nvPicPr>
                   <pic:blipFill>
-                    <a:blip r:embed="rId16" cstate="print">
+                    <a:blip r:embed="rId17" cstate="print">
                       <a:extLst>
                         <a:ext uri="{28A0092B-C50C-407E-A947-70E740481C1C}">
                           <a14:useLocalDpi xmlns:a14="http://schemas.microsoft.com/office/drawing/2010/main" val="0"/>
@@ -6150,7 +6340,7 @@
                     <pic:cNvPicPr/>
                   </pic:nvPicPr>
                   <pic:blipFill>
-                    <a:blip r:embed="rId16" cstate="print">
+                    <a:blip r:embed="rId17" cstate="print">
                       <a:extLst>
                         <a:ext uri="{28A0092B-C50C-407E-A947-70E740481C1C}">
                           <a14:useLocalDpi xmlns:a14="http://schemas.microsoft.com/office/drawing/2010/main" val="0"/>
@@ -6202,7 +6392,7 @@
                     <pic:cNvPicPr/>
                   </pic:nvPicPr>
                   <pic:blipFill>
-                    <a:blip r:embed="rId16" cstate="print">
+                    <a:blip r:embed="rId17" cstate="print">
                       <a:extLst>
                         <a:ext uri="{28A0092B-C50C-407E-A947-70E740481C1C}">
                           <a14:useLocalDpi xmlns:a14="http://schemas.microsoft.com/office/drawing/2010/main" val="0"/>
@@ -6267,6 +6457,7 @@
         <w:rPr>
           <w:noProof/>
         </w:rPr>
+        <w:lastRenderedPageBreak/>
         <w:drawing>
           <wp:inline distT="0" distB="0" distL="0" distR="0" wp14:anchorId="041199A3" wp14:editId="1DAEB531">
             <wp:extent cx="6439986" cy="4830992"/>
@@ -6285,7 +6476,7 @@
                     </pic:cNvPicPr>
                   </pic:nvPicPr>
                   <pic:blipFill>
-                    <a:blip r:embed="rId20">
+                    <a:blip r:embed="rId21">
                       <a:extLst>
                         <a:ext uri="{28A0092B-C50C-407E-A947-70E740481C1C}">
                           <a14:useLocalDpi xmlns:a14="http://schemas.microsoft.com/office/drawing/2010/main" val="0"/>
@@ -6366,7 +6557,70 @@
     </w:p>
     <w:p>
       <w:r>
-        <w:t>(…)</w:t>
+        <w:t>Para garantizar el correcto funcionamiento de la aplicación, se seguirán las siguientes etapas:</w:t>
+      </w:r>
+    </w:p>
+    <w:p>
+      <w:pPr>
+        <w:pStyle w:val="Prrafodelista"/>
+        <w:numPr>
+          <w:ilvl w:val="0"/>
+          <w:numId w:val="7"/>
+        </w:numPr>
+      </w:pPr>
+      <w:r>
+        <w:t>Pruebas Unitarias: verificación de la lógica de negocio en el backend.</w:t>
+      </w:r>
+    </w:p>
+    <w:p>
+      <w:pPr>
+        <w:pStyle w:val="Prrafodelista"/>
+        <w:numPr>
+          <w:ilvl w:val="0"/>
+          <w:numId w:val="7"/>
+        </w:numPr>
+      </w:pPr>
+      <w:r>
+        <w:t xml:space="preserve">Pruebas de </w:t>
+      </w:r>
+      <w:r>
+        <w:t>Integraci</w:t>
+      </w:r>
+      <w:r>
+        <w:t>ó</w:t>
+      </w:r>
+      <w:r>
+        <w:t>n</w:t>
+      </w:r>
+      <w:r>
+        <w:t>: asegurar que la GUI de escritorio y la app móvil se comunican correctamente con la base de datos.</w:t>
+      </w:r>
+    </w:p>
+    <w:p>
+      <w:pPr>
+        <w:pStyle w:val="Prrafodelista"/>
+        <w:numPr>
+          <w:ilvl w:val="0"/>
+          <w:numId w:val="7"/>
+        </w:numPr>
+      </w:pPr>
+      <w:r>
+        <w:t>Pruebas de Interfaz Gráfica: validación de los flujos de navegación en desktop y Android</w:t>
+      </w:r>
+      <w:r>
+        <w:t>.</w:t>
+      </w:r>
+    </w:p>
+    <w:p>
+      <w:pPr>
+        <w:pStyle w:val="Prrafodelista"/>
+        <w:numPr>
+          <w:ilvl w:val="0"/>
+          <w:numId w:val="7"/>
+        </w:numPr>
+      </w:pPr>
+      <w:r>
+        <w:t>Pruebas de Usuario: validación de que un Estudiante puede subir un justificante correctamente desde su móvil.</w:t>
       </w:r>
     </w:p>
     <w:p>
@@ -6409,6 +6663,7 @@
       </w:pPr>
       <w:bookmarkStart w:id="28" w:name="_Toc210125385"/>
       <w:r>
+        <w:lastRenderedPageBreak/>
         <w:t>PLANIFICACIÓN Y PRESUPUESTO</w:t>
       </w:r>
       <w:bookmarkEnd w:id="28"/>
@@ -6539,8 +6794,39 @@
       <w:bookmarkEnd w:id="42"/>
     </w:p>
     <w:p>
-      <w:r>
-        <w:t>(…)</w:t>
+      <w:pPr>
+        <w:pStyle w:val="Prrafodelista"/>
+        <w:numPr>
+          <w:ilvl w:val="0"/>
+          <w:numId w:val="6"/>
+        </w:numPr>
+      </w:pPr>
+      <w:r>
+        <w:t xml:space="preserve">Costes de personal: </w:t>
+      </w:r>
+    </w:p>
+    <w:p>
+      <w:pPr>
+        <w:pStyle w:val="Prrafodelista"/>
+        <w:numPr>
+          <w:ilvl w:val="0"/>
+          <w:numId w:val="6"/>
+        </w:numPr>
+      </w:pPr>
+      <w:r>
+        <w:t>Infraestructura: servidores para la base de datos y hosting para la documentación.</w:t>
+      </w:r>
+    </w:p>
+    <w:p>
+      <w:pPr>
+        <w:pStyle w:val="Prrafodelista"/>
+        <w:numPr>
+          <w:ilvl w:val="0"/>
+          <w:numId w:val="6"/>
+        </w:numPr>
+      </w:pPr>
+      <w:r>
+        <w:t>Licencias: uso de software de desarrollo y entornos IDE.</w:t>
       </w:r>
     </w:p>
     <w:p>
@@ -6645,7 +6931,67 @@
     </w:p>
     <w:p>
       <w:r>
-        <w:t>(…)</w:t>
+        <w:t>Este proyecto integra conocimientos de:</w:t>
+      </w:r>
+    </w:p>
+    <w:p>
+      <w:pPr>
+        <w:pStyle w:val="Prrafodelista"/>
+        <w:numPr>
+          <w:ilvl w:val="0"/>
+          <w:numId w:val="6"/>
+        </w:numPr>
+      </w:pPr>
+      <w:r>
+        <w:t>Programación Multimedia y Dispositivos Móviles: para la App de Estudiante.</w:t>
+      </w:r>
+    </w:p>
+    <w:p>
+      <w:pPr>
+        <w:pStyle w:val="Prrafodelista"/>
+        <w:numPr>
+          <w:ilvl w:val="0"/>
+          <w:numId w:val="6"/>
+        </w:numPr>
+      </w:pPr>
+      <w:r>
+        <w:t>Desarrollo de Interfaces: para la creación de las GUI de escritorio.</w:t>
+      </w:r>
+    </w:p>
+    <w:p>
+      <w:pPr>
+        <w:pStyle w:val="Prrafodelista"/>
+        <w:numPr>
+          <w:ilvl w:val="0"/>
+          <w:numId w:val="6"/>
+        </w:numPr>
+      </w:pPr>
+      <w:r>
+        <w:t>Acceso a Datos: para la persistencia de la información en la base de datos.</w:t>
+      </w:r>
+    </w:p>
+    <w:p>
+      <w:pPr>
+        <w:pStyle w:val="Prrafodelista"/>
+        <w:numPr>
+          <w:ilvl w:val="0"/>
+          <w:numId w:val="6"/>
+        </w:numPr>
+      </w:pPr>
+      <w:r>
+        <w:t>Sistemas de Gestión Empresarial: para la estructura de administración.</w:t>
+      </w:r>
+    </w:p>
+    <w:p>
+      <w:pPr>
+        <w:pStyle w:val="Prrafodelista"/>
+        <w:numPr>
+          <w:ilvl w:val="0"/>
+          <w:numId w:val="6"/>
+        </w:numPr>
+      </w:pPr>
+      <w:r>
+        <w:t>Programacion de Servicios y Procesos:</w:t>
       </w:r>
     </w:p>
     <w:p>
@@ -6802,7 +7148,6 @@
       </w:pPr>
       <w:bookmarkStart w:id="66" w:name="_Toc210125402"/>
       <w:r>
-        <w:lastRenderedPageBreak/>
         <w:t>GUÍA DE ESTILOS Y MANUAL DE USUARIO</w:t>
       </w:r>
       <w:bookmarkEnd w:id="66"/>
@@ -6870,6 +7215,7 @@
       </w:pPr>
       <w:bookmarkStart w:id="72" w:name="_Toc210125405"/>
       <w:r>
+        <w:lastRenderedPageBreak/>
         <w:t>MANUAL DE USUARIO</w:t>
       </w:r>
       <w:bookmarkEnd w:id="72"/>
@@ -6906,7 +7252,7 @@
     <w:p/>
     <w:p/>
     <w:sectPr>
-      <w:footerReference w:type="default" r:id="rId21"/>
+      <w:footerReference w:type="default" r:id="rId22"/>
       <w:pgSz w:w="11906" w:h="16838"/>
       <w:pgMar w:top="1134" w:right="1134" w:bottom="1418" w:left="1134" w:header="709" w:footer="709" w:gutter="0"/>
       <w:pgNumType w:start="1"/>
@@ -7697,6 +8043,95 @@
       </w:rPr>
     </w:lvl>
   </w:abstractNum>
+  <w:abstractNum w:abstractNumId="6" w15:restartNumberingAfterBreak="0">
+    <w:nsid w:val="729D44F2"/>
+    <w:multiLevelType w:val="hybridMultilevel"/>
+    <w:tmpl w:val="2E3299B2"/>
+    <w:lvl w:ilvl="0" w:tplc="1A20A728">
+      <w:start w:val="1"/>
+      <w:numFmt w:val="decimal"/>
+      <w:lvlText w:val="%1."/>
+      <w:lvlJc w:val="left"/>
+      <w:pPr>
+        <w:ind w:left="1080" w:hanging="360"/>
+      </w:pPr>
+      <w:rPr>
+        <w:rFonts w:hint="default"/>
+      </w:rPr>
+    </w:lvl>
+    <w:lvl w:ilvl="1" w:tplc="0C0A0019" w:tentative="1">
+      <w:start w:val="1"/>
+      <w:numFmt w:val="lowerLetter"/>
+      <w:lvlText w:val="%2."/>
+      <w:lvlJc w:val="left"/>
+      <w:pPr>
+        <w:ind w:left="1800" w:hanging="360"/>
+      </w:pPr>
+    </w:lvl>
+    <w:lvl w:ilvl="2" w:tplc="0C0A001B" w:tentative="1">
+      <w:start w:val="1"/>
+      <w:numFmt w:val="lowerRoman"/>
+      <w:lvlText w:val="%3."/>
+      <w:lvlJc w:val="right"/>
+      <w:pPr>
+        <w:ind w:left="2520" w:hanging="180"/>
+      </w:pPr>
+    </w:lvl>
+    <w:lvl w:ilvl="3" w:tplc="0C0A000F" w:tentative="1">
+      <w:start w:val="1"/>
+      <w:numFmt w:val="decimal"/>
+      <w:lvlText w:val="%4."/>
+      <w:lvlJc w:val="left"/>
+      <w:pPr>
+        <w:ind w:left="3240" w:hanging="360"/>
+      </w:pPr>
+    </w:lvl>
+    <w:lvl w:ilvl="4" w:tplc="0C0A0019" w:tentative="1">
+      <w:start w:val="1"/>
+      <w:numFmt w:val="lowerLetter"/>
+      <w:lvlText w:val="%5."/>
+      <w:lvlJc w:val="left"/>
+      <w:pPr>
+        <w:ind w:left="3960" w:hanging="360"/>
+      </w:pPr>
+    </w:lvl>
+    <w:lvl w:ilvl="5" w:tplc="0C0A001B" w:tentative="1">
+      <w:start w:val="1"/>
+      <w:numFmt w:val="lowerRoman"/>
+      <w:lvlText w:val="%6."/>
+      <w:lvlJc w:val="right"/>
+      <w:pPr>
+        <w:ind w:left="4680" w:hanging="180"/>
+      </w:pPr>
+    </w:lvl>
+    <w:lvl w:ilvl="6" w:tplc="0C0A000F" w:tentative="1">
+      <w:start w:val="1"/>
+      <w:numFmt w:val="decimal"/>
+      <w:lvlText w:val="%7."/>
+      <w:lvlJc w:val="left"/>
+      <w:pPr>
+        <w:ind w:left="5400" w:hanging="360"/>
+      </w:pPr>
+    </w:lvl>
+    <w:lvl w:ilvl="7" w:tplc="0C0A0019" w:tentative="1">
+      <w:start w:val="1"/>
+      <w:numFmt w:val="lowerLetter"/>
+      <w:lvlText w:val="%8."/>
+      <w:lvlJc w:val="left"/>
+      <w:pPr>
+        <w:ind w:left="6120" w:hanging="360"/>
+      </w:pPr>
+    </w:lvl>
+    <w:lvl w:ilvl="8" w:tplc="0C0A001B" w:tentative="1">
+      <w:start w:val="1"/>
+      <w:numFmt w:val="lowerRoman"/>
+      <w:lvlText w:val="%9."/>
+      <w:lvlJc w:val="right"/>
+      <w:pPr>
+        <w:ind w:left="6840" w:hanging="180"/>
+      </w:pPr>
+    </w:lvl>
+  </w:abstractNum>
   <w:num w:numId="1" w16cid:durableId="533735661">
     <w:abstractNumId w:val="4"/>
   </w:num>
@@ -7714,6 +8149,9 @@
   </w:num>
   <w:num w:numId="6" w16cid:durableId="779909664">
     <w:abstractNumId w:val="1"/>
+  </w:num>
+  <w:num w:numId="7" w16cid:durableId="253172023">
+    <w:abstractNumId w:val="6"/>
   </w:num>
 </w:numbering>
 </file>
@@ -9070,6 +9508,10 @@
 </file>
 
 <file path=customXml/item1.xml><?xml version="1.0" encoding="utf-8"?>
+<b:Sources xmlns:b="http://schemas.openxmlformats.org/officeDocument/2006/bibliography" xmlns="http://schemas.openxmlformats.org/officeDocument/2006/bibliography" SelectedStyle="\APASixthEditionOfficeOnline.xsl" StyleName="APA" Version="6"/>
+</file>
+
+<file path=customXml/item2.xml><?xml version="1.0" encoding="utf-8"?>
 <?mso-contentType ?>
 <FormTemplates xmlns="http://schemas.microsoft.com/sharepoint/v3/contenttype/forms">
   <Display>DocumentLibraryForm</Display>
@@ -9078,7 +9520,7 @@
 </FormTemplates>
 </file>
 
-<file path=customXml/item2.xml><?xml version="1.0" encoding="utf-8"?>
+<file path=customXml/item3.xml><?xml version="1.0" encoding="utf-8"?>
 <ct:contentTypeSchema xmlns:ct="http://schemas.microsoft.com/office/2006/metadata/contentType" xmlns:ma="http://schemas.microsoft.com/office/2006/metadata/properties/metaAttributes" ct:_="" ma:_="" ma:contentTypeName="Documento" ma:contentTypeID="0x010100089FBA7B0FAFA84E9F1E615D3FC0A129" ma:contentTypeVersion="11" ma:contentTypeDescription="Crear nuevo documento." ma:contentTypeScope="" ma:versionID="fa55cfaacbcd603bd53d850e3b8176f7">
   <xsd:schema xmlns:xsd="http://www.w3.org/2001/XMLSchema" xmlns:xs="http://www.w3.org/2001/XMLSchema" xmlns:p="http://schemas.microsoft.com/office/2006/metadata/properties" xmlns:ns3="d07641f9-f1a5-43c1-ac16-fa53e6c318bc" targetNamespace="http://schemas.microsoft.com/office/2006/metadata/properties" ma:root="true" ma:fieldsID="78f989df160fe6a5ee2e0e0b0bfde0e3" ns3:_="">
     <xsd:import namespace="d07641f9-f1a5-43c1-ac16-fa53e6c318bc"/>
@@ -9266,7 +9708,7 @@
 </ct:contentTypeSchema>
 </file>
 
-<file path=customXml/item3.xml><?xml version="1.0" encoding="utf-8"?>
+<file path=customXml/item4.xml><?xml version="1.0" encoding="utf-8"?>
 <p:properties xmlns:p="http://schemas.microsoft.com/office/2006/metadata/properties" xmlns:xsi="http://www.w3.org/2001/XMLSchema-instance" xmlns:pc="http://schemas.microsoft.com/office/infopath/2007/PartnerControls">
   <documentManagement>
     <_activity xmlns="d07641f9-f1a5-43c1-ac16-fa53e6c318bc" xsi:nil="true"/>
@@ -9274,11 +9716,15 @@
 </p:properties>
 </file>
 
-<file path=customXml/item4.xml><?xml version="1.0" encoding="utf-8"?>
-<b:Sources xmlns:b="http://schemas.openxmlformats.org/officeDocument/2006/bibliography" xmlns="http://schemas.openxmlformats.org/officeDocument/2006/bibliography" SelectedStyle="\APASixthEditionOfficeOnline.xsl" StyleName="APA" Version="6"/>
+<file path=customXml/itemProps1.xml><?xml version="1.0" encoding="utf-8"?>
+<ds:datastoreItem xmlns:ds="http://schemas.openxmlformats.org/officeDocument/2006/customXml" ds:itemID="{453714F8-FBC3-4DCC-8DCB-89BB58DCF76F}">
+  <ds:schemaRefs>
+    <ds:schemaRef ds:uri="http://schemas.openxmlformats.org/officeDocument/2006/bibliography"/>
+  </ds:schemaRefs>
+</ds:datastoreItem>
 </file>
 
-<file path=customXml/itemProps1.xml><?xml version="1.0" encoding="utf-8"?>
+<file path=customXml/itemProps2.xml><?xml version="1.0" encoding="utf-8"?>
 <ds:datastoreItem xmlns:ds="http://schemas.openxmlformats.org/officeDocument/2006/customXml" ds:itemID="{480B8420-1B48-4D23-8D6E-64373AC5070B}">
   <ds:schemaRefs>
     <ds:schemaRef ds:uri="http://schemas.microsoft.com/sharepoint/v3/contenttype/forms"/>
@@ -9286,7 +9732,7 @@
 </ds:datastoreItem>
 </file>
 
-<file path=customXml/itemProps2.xml><?xml version="1.0" encoding="utf-8"?>
+<file path=customXml/itemProps3.xml><?xml version="1.0" encoding="utf-8"?>
 <ds:datastoreItem xmlns:ds="http://schemas.openxmlformats.org/officeDocument/2006/customXml" ds:itemID="{B3C09D93-2BDC-4563-9759-9158244E5DE7}">
   <ds:schemaRefs>
     <ds:schemaRef ds:uri="http://schemas.microsoft.com/office/2006/metadata/contentType"/>
@@ -9304,7 +9750,7 @@
 </ds:datastoreItem>
 </file>
 
-<file path=customXml/itemProps3.xml><?xml version="1.0" encoding="utf-8"?>
+<file path=customXml/itemProps4.xml><?xml version="1.0" encoding="utf-8"?>
 <ds:datastoreItem xmlns:ds="http://schemas.openxmlformats.org/officeDocument/2006/customXml" ds:itemID="{7F0B1298-25D5-45B9-909D-DD837044A49E}">
   <ds:schemaRefs>
     <ds:schemaRef ds:uri="http://purl.org/dc/elements/1.1/"/>
@@ -9318,12 +9764,4 @@
     <ds:schemaRef ds:uri="http://schemas.microsoft.com/office/2006/metadata/properties"/>
   </ds:schemaRefs>
 </ds:datastoreItem>
-</file>
-
-<file path=customXml/itemProps4.xml><?xml version="1.0" encoding="utf-8"?>
-<ds:datastoreItem xmlns:ds="http://schemas.openxmlformats.org/officeDocument/2006/customXml" ds:itemID="{453714F8-FBC3-4DCC-8DCB-89BB58DCF76F}">
-  <ds:schemaRefs>
-    <ds:schemaRef ds:uri="http://schemas.openxmlformats.org/officeDocument/2006/bibliography"/>
-  </ds:schemaRefs>
-</ds:datastoreItem>
 </file>
</xml_diff>

<commit_message>
Cambios en la documentación
</commit_message>
<xml_diff>
--- a/docs/provisional_DocumentacionProyecto_2VIFC302.docx
+++ b/docs/provisional_DocumentacionProyecto_2VIFC302.docx
@@ -1286,7 +1286,7 @@
           <w:lang w:eastAsia="es-VE"/>
         </w:rPr>
         <w:drawing>
-          <wp:inline distT="0" distB="0" distL="0" distR="0" wp14:anchorId="1183C0B2" wp14:editId="16767DB8">
+          <wp:inline distT="0" distB="0" distL="0" distR="0" wp14:anchorId="1183C0B2" wp14:editId="6144F8AB">
             <wp:extent cx="7556500" cy="10599420"/>
             <wp:effectExtent l="0" t="0" r="6350" b="0"/>
             <wp:docPr id="2" name="Imagen 2" descr="D:\servicios forobeta posts\diseño grafico\CLIENTES\Feelmusic - 05.11.18\archivos\11\11.jpg"/>
@@ -1432,7 +1432,7 @@
             </w:rPr>
             <w:fldChar w:fldCharType="separate"/>
           </w:r>
-          <w:hyperlink w:anchor="_Toc210125366" w:history="1">
+          <w:hyperlink w:anchor="_Toc221908739" w:history="1">
             <w:r>
               <w:rPr>
                 <w:rStyle w:val="Hipervnculo"/>
@@ -1459,7 +1459,7 @@
                 <w:noProof/>
                 <w:webHidden/>
               </w:rPr>
-              <w:instrText xml:space="preserve"> PAGEREF _Toc210125366 \h </w:instrText>
+              <w:instrText xml:space="preserve"> PAGEREF _Toc221908739 \h </w:instrText>
             </w:r>
             <w:r>
               <w:rPr>
@@ -1505,7 +1505,7 @@
               <w:lang w:eastAsia="es-ES"/>
             </w:rPr>
           </w:pPr>
-          <w:hyperlink w:anchor="_Toc210125367" w:history="1">
+          <w:hyperlink w:anchor="_Toc221908740" w:history="1">
             <w:r>
               <w:rPr>
                 <w:rStyle w:val="Hipervnculo"/>
@@ -1549,7 +1549,7 @@
                 <w:noProof/>
                 <w:webHidden/>
               </w:rPr>
-              <w:instrText xml:space="preserve"> PAGEREF _Toc210125367 \h </w:instrText>
+              <w:instrText xml:space="preserve"> PAGEREF _Toc221908740 \h </w:instrText>
             </w:r>
             <w:r>
               <w:rPr>
@@ -1587,7 +1587,6 @@
               <w:tab w:val="left" w:pos="960"/>
               <w:tab w:val="right" w:leader="dot" w:pos="9628"/>
             </w:tabs>
-            <w:ind w:firstLine="206"/>
             <w:rPr>
               <w:rFonts w:eastAsiaTheme="minorEastAsia"/>
               <w:noProof/>
@@ -1596,7 +1595,7 @@
               <w:lang w:eastAsia="es-ES"/>
             </w:rPr>
           </w:pPr>
-          <w:hyperlink w:anchor="_Toc210125368" w:history="1">
+          <w:hyperlink w:anchor="_Toc221908741" w:history="1">
             <w:r>
               <w:rPr>
                 <w:rStyle w:val="Hipervnculo"/>
@@ -1640,7 +1639,7 @@
                 <w:noProof/>
                 <w:webHidden/>
               </w:rPr>
-              <w:instrText xml:space="preserve"> PAGEREF _Toc210125368 \h </w:instrText>
+              <w:instrText xml:space="preserve"> PAGEREF _Toc221908741 \h </w:instrText>
             </w:r>
             <w:r>
               <w:rPr>
@@ -1678,7 +1677,6 @@
               <w:tab w:val="left" w:pos="960"/>
               <w:tab w:val="right" w:leader="dot" w:pos="9628"/>
             </w:tabs>
-            <w:ind w:firstLine="206"/>
             <w:rPr>
               <w:rFonts w:eastAsiaTheme="minorEastAsia"/>
               <w:noProof/>
@@ -1687,7 +1685,7 @@
               <w:lang w:eastAsia="es-ES"/>
             </w:rPr>
           </w:pPr>
-          <w:hyperlink w:anchor="_Toc210125369" w:history="1">
+          <w:hyperlink w:anchor="_Toc221908742" w:history="1">
             <w:r>
               <w:rPr>
                 <w:rStyle w:val="Hipervnculo"/>
@@ -1731,7 +1729,7 @@
                 <w:noProof/>
                 <w:webHidden/>
               </w:rPr>
-              <w:instrText xml:space="preserve"> PAGEREF _Toc210125369 \h </w:instrText>
+              <w:instrText xml:space="preserve"> PAGEREF _Toc221908742 \h </w:instrText>
             </w:r>
             <w:r>
               <w:rPr>
@@ -1777,7 +1775,7 @@
               <w:lang w:eastAsia="es-ES"/>
             </w:rPr>
           </w:pPr>
-          <w:hyperlink w:anchor="_Toc210125370" w:history="1">
+          <w:hyperlink w:anchor="_Toc221908743" w:history="1">
             <w:r>
               <w:rPr>
                 <w:rStyle w:val="Hipervnculo"/>
@@ -1821,7 +1819,7 @@
                 <w:noProof/>
                 <w:webHidden/>
               </w:rPr>
-              <w:instrText xml:space="preserve"> PAGEREF _Toc210125370 \h </w:instrText>
+              <w:instrText xml:space="preserve"> PAGEREF _Toc221908743 \h </w:instrText>
             </w:r>
             <w:r>
               <w:rPr>
@@ -1859,13 +1857,15 @@
               <w:tab w:val="left" w:pos="960"/>
               <w:tab w:val="right" w:leader="dot" w:pos="9628"/>
             </w:tabs>
-            <w:ind w:firstLine="206"/>
             <w:rPr>
-              <w:rStyle w:val="Hipervnculo"/>
+              <w:rFonts w:eastAsiaTheme="minorEastAsia"/>
               <w:noProof/>
+              <w:sz w:val="24"/>
+              <w:szCs w:val="24"/>
+              <w:lang w:eastAsia="es-ES"/>
             </w:rPr>
           </w:pPr>
-          <w:hyperlink w:anchor="_Toc210125372" w:history="1">
+          <w:hyperlink w:anchor="_Toc221908745" w:history="1">
             <w:r>
               <w:rPr>
                 <w:rStyle w:val="Hipervnculo"/>
@@ -1875,29 +1875,30 @@
             </w:r>
             <w:r>
               <w:rPr>
+                <w:rFonts w:eastAsiaTheme="minorEastAsia"/>
+                <w:noProof/>
+                <w:sz w:val="24"/>
+                <w:szCs w:val="24"/>
+                <w:lang w:eastAsia="es-ES"/>
+              </w:rPr>
+              <w:tab/>
+            </w:r>
+            <w:r>
+              <w:rPr>
                 <w:rStyle w:val="Hipervnculo"/>
                 <w:noProof/>
               </w:rPr>
+              <w:t>REQUISITOS FUNCIONALES</w:t>
+            </w:r>
+            <w:r>
+              <w:rPr>
+                <w:noProof/>
+                <w:webHidden/>
+              </w:rPr>
               <w:tab/>
             </w:r>
             <w:r>
               <w:rPr>
-                <w:rStyle w:val="Hipervnculo"/>
-                <w:noProof/>
-              </w:rPr>
-              <w:t>REQUISITOS FUNCIONALES</w:t>
-            </w:r>
-            <w:r>
-              <w:rPr>
-                <w:rStyle w:val="Hipervnculo"/>
-                <w:noProof/>
-                <w:webHidden/>
-              </w:rPr>
-              <w:tab/>
-            </w:r>
-            <w:r>
-              <w:rPr>
-                <w:rStyle w:val="Hipervnculo"/>
                 <w:noProof/>
                 <w:webHidden/>
               </w:rPr>
@@ -1905,22 +1906,19 @@
             </w:r>
             <w:r>
               <w:rPr>
-                <w:rStyle w:val="Hipervnculo"/>
-                <w:noProof/>
-                <w:webHidden/>
-              </w:rPr>
-              <w:instrText xml:space="preserve"> PAGEREF _Toc210125372 \h </w:instrText>
-            </w:r>
-            <w:r>
-              <w:rPr>
-                <w:rStyle w:val="Hipervnculo"/>
-                <w:noProof/>
-                <w:webHidden/>
-              </w:rPr>
-            </w:r>
-            <w:r>
-              <w:rPr>
-                <w:rStyle w:val="Hipervnculo"/>
+                <w:noProof/>
+                <w:webHidden/>
+              </w:rPr>
+              <w:instrText xml:space="preserve"> PAGEREF _Toc221908745 \h </w:instrText>
+            </w:r>
+            <w:r>
+              <w:rPr>
+                <w:noProof/>
+                <w:webHidden/>
+              </w:rPr>
+            </w:r>
+            <w:r>
+              <w:rPr>
                 <w:noProof/>
                 <w:webHidden/>
               </w:rPr>
@@ -1928,15 +1926,13 @@
             </w:r>
             <w:r>
               <w:rPr>
-                <w:rStyle w:val="Hipervnculo"/>
-                <w:noProof/>
-                <w:webHidden/>
-              </w:rPr>
-              <w:t>3</w:t>
-            </w:r>
-            <w:r>
-              <w:rPr>
-                <w:rStyle w:val="Hipervnculo"/>
+                <w:noProof/>
+                <w:webHidden/>
+              </w:rPr>
+              <w:t>4</w:t>
+            </w:r>
+            <w:r>
+              <w:rPr>
                 <w:noProof/>
                 <w:webHidden/>
               </w:rPr>
@@ -1951,13 +1947,15 @@
               <w:tab w:val="left" w:pos="960"/>
               <w:tab w:val="right" w:leader="dot" w:pos="9628"/>
             </w:tabs>
-            <w:ind w:firstLine="206"/>
             <w:rPr>
-              <w:rStyle w:val="Hipervnculo"/>
+              <w:rFonts w:eastAsiaTheme="minorEastAsia"/>
               <w:noProof/>
+              <w:sz w:val="24"/>
+              <w:szCs w:val="24"/>
+              <w:lang w:eastAsia="es-ES"/>
             </w:rPr>
           </w:pPr>
-          <w:hyperlink w:anchor="_Toc210125373" w:history="1">
+          <w:hyperlink w:anchor="_Toc221908746" w:history="1">
             <w:r>
               <w:rPr>
                 <w:rStyle w:val="Hipervnculo"/>
@@ -1967,29 +1965,30 @@
             </w:r>
             <w:r>
               <w:rPr>
+                <w:rFonts w:eastAsiaTheme="minorEastAsia"/>
+                <w:noProof/>
+                <w:sz w:val="24"/>
+                <w:szCs w:val="24"/>
+                <w:lang w:eastAsia="es-ES"/>
+              </w:rPr>
+              <w:tab/>
+            </w:r>
+            <w:r>
+              <w:rPr>
                 <w:rStyle w:val="Hipervnculo"/>
                 <w:noProof/>
               </w:rPr>
+              <w:t>REQUISITOS NO FUNCIONALES</w:t>
+            </w:r>
+            <w:r>
+              <w:rPr>
+                <w:noProof/>
+                <w:webHidden/>
+              </w:rPr>
               <w:tab/>
             </w:r>
             <w:r>
               <w:rPr>
-                <w:rStyle w:val="Hipervnculo"/>
-                <w:noProof/>
-              </w:rPr>
-              <w:t>REQUISITOS NO FUNCIONALES</w:t>
-            </w:r>
-            <w:r>
-              <w:rPr>
-                <w:rStyle w:val="Hipervnculo"/>
-                <w:noProof/>
-                <w:webHidden/>
-              </w:rPr>
-              <w:tab/>
-            </w:r>
-            <w:r>
-              <w:rPr>
-                <w:rStyle w:val="Hipervnculo"/>
                 <w:noProof/>
                 <w:webHidden/>
               </w:rPr>
@@ -1997,22 +1996,19 @@
             </w:r>
             <w:r>
               <w:rPr>
-                <w:rStyle w:val="Hipervnculo"/>
-                <w:noProof/>
-                <w:webHidden/>
-              </w:rPr>
-              <w:instrText xml:space="preserve"> PAGEREF _Toc210125373 \h </w:instrText>
-            </w:r>
-            <w:r>
-              <w:rPr>
-                <w:rStyle w:val="Hipervnculo"/>
-                <w:noProof/>
-                <w:webHidden/>
-              </w:rPr>
-            </w:r>
-            <w:r>
-              <w:rPr>
-                <w:rStyle w:val="Hipervnculo"/>
+                <w:noProof/>
+                <w:webHidden/>
+              </w:rPr>
+              <w:instrText xml:space="preserve"> PAGEREF _Toc221908746 \h </w:instrText>
+            </w:r>
+            <w:r>
+              <w:rPr>
+                <w:noProof/>
+                <w:webHidden/>
+              </w:rPr>
+            </w:r>
+            <w:r>
+              <w:rPr>
                 <w:noProof/>
                 <w:webHidden/>
               </w:rPr>
@@ -2020,15 +2016,13 @@
             </w:r>
             <w:r>
               <w:rPr>
-                <w:rStyle w:val="Hipervnculo"/>
-                <w:noProof/>
-                <w:webHidden/>
-              </w:rPr>
-              <w:t>3</w:t>
-            </w:r>
-            <w:r>
-              <w:rPr>
-                <w:rStyle w:val="Hipervnculo"/>
+                <w:noProof/>
+                <w:webHidden/>
+              </w:rPr>
+              <w:t>4</w:t>
+            </w:r>
+            <w:r>
+              <w:rPr>
                 <w:noProof/>
                 <w:webHidden/>
               </w:rPr>
@@ -2043,13 +2037,15 @@
               <w:tab w:val="left" w:pos="960"/>
               <w:tab w:val="right" w:leader="dot" w:pos="9628"/>
             </w:tabs>
-            <w:ind w:firstLine="206"/>
             <w:rPr>
-              <w:rStyle w:val="Hipervnculo"/>
+              <w:rFonts w:eastAsiaTheme="minorEastAsia"/>
               <w:noProof/>
+              <w:sz w:val="24"/>
+              <w:szCs w:val="24"/>
+              <w:lang w:eastAsia="es-ES"/>
             </w:rPr>
           </w:pPr>
-          <w:hyperlink w:anchor="_Toc210125374" w:history="1">
+          <w:hyperlink w:anchor="_Toc221908747" w:history="1">
             <w:r>
               <w:rPr>
                 <w:rStyle w:val="Hipervnculo"/>
@@ -2059,29 +2055,30 @@
             </w:r>
             <w:r>
               <w:rPr>
+                <w:rFonts w:eastAsiaTheme="minorEastAsia"/>
+                <w:noProof/>
+                <w:sz w:val="24"/>
+                <w:szCs w:val="24"/>
+                <w:lang w:eastAsia="es-ES"/>
+              </w:rPr>
+              <w:tab/>
+            </w:r>
+            <w:r>
+              <w:rPr>
                 <w:rStyle w:val="Hipervnculo"/>
                 <w:noProof/>
               </w:rPr>
+              <w:t>CASOS DE USO</w:t>
+            </w:r>
+            <w:r>
+              <w:rPr>
+                <w:noProof/>
+                <w:webHidden/>
+              </w:rPr>
               <w:tab/>
             </w:r>
             <w:r>
               <w:rPr>
-                <w:rStyle w:val="Hipervnculo"/>
-                <w:noProof/>
-              </w:rPr>
-              <w:t>CASOS DE USO</w:t>
-            </w:r>
-            <w:r>
-              <w:rPr>
-                <w:rStyle w:val="Hipervnculo"/>
-                <w:noProof/>
-                <w:webHidden/>
-              </w:rPr>
-              <w:tab/>
-            </w:r>
-            <w:r>
-              <w:rPr>
-                <w:rStyle w:val="Hipervnculo"/>
                 <w:noProof/>
                 <w:webHidden/>
               </w:rPr>
@@ -2089,22 +2086,19 @@
             </w:r>
             <w:r>
               <w:rPr>
-                <w:rStyle w:val="Hipervnculo"/>
-                <w:noProof/>
-                <w:webHidden/>
-              </w:rPr>
-              <w:instrText xml:space="preserve"> PAGEREF _Toc210125374 \h </w:instrText>
-            </w:r>
-            <w:r>
-              <w:rPr>
-                <w:rStyle w:val="Hipervnculo"/>
-                <w:noProof/>
-                <w:webHidden/>
-              </w:rPr>
-            </w:r>
-            <w:r>
-              <w:rPr>
-                <w:rStyle w:val="Hipervnculo"/>
+                <w:noProof/>
+                <w:webHidden/>
+              </w:rPr>
+              <w:instrText xml:space="preserve"> PAGEREF _Toc221908747 \h </w:instrText>
+            </w:r>
+            <w:r>
+              <w:rPr>
+                <w:noProof/>
+                <w:webHidden/>
+              </w:rPr>
+            </w:r>
+            <w:r>
+              <w:rPr>
                 <w:noProof/>
                 <w:webHidden/>
               </w:rPr>
@@ -2112,15 +2106,13 @@
             </w:r>
             <w:r>
               <w:rPr>
-                <w:rStyle w:val="Hipervnculo"/>
-                <w:noProof/>
-                <w:webHidden/>
-              </w:rPr>
-              <w:t>3</w:t>
-            </w:r>
-            <w:r>
-              <w:rPr>
-                <w:rStyle w:val="Hipervnculo"/>
+                <w:noProof/>
+                <w:webHidden/>
+              </w:rPr>
+              <w:t>4</w:t>
+            </w:r>
+            <w:r>
+              <w:rPr>
                 <w:noProof/>
                 <w:webHidden/>
               </w:rPr>
@@ -2135,7 +2127,6 @@
               <w:tab w:val="left" w:pos="1200"/>
               <w:tab w:val="right" w:leader="dot" w:pos="9628"/>
             </w:tabs>
-            <w:ind w:firstLine="347"/>
             <w:rPr>
               <w:rFonts w:eastAsiaTheme="minorEastAsia"/>
               <w:noProof/>
@@ -2144,7 +2135,7 @@
               <w:lang w:eastAsia="es-ES"/>
             </w:rPr>
           </w:pPr>
-          <w:hyperlink w:anchor="_Toc210125375" w:history="1">
+          <w:hyperlink w:anchor="_Toc221908748" w:history="1">
             <w:r>
               <w:rPr>
                 <w:rStyle w:val="Hipervnculo"/>
@@ -2188,7 +2179,7 @@
                 <w:noProof/>
                 <w:webHidden/>
               </w:rPr>
-              <w:instrText xml:space="preserve"> PAGEREF _Toc210125375 \h </w:instrText>
+              <w:instrText xml:space="preserve"> PAGEREF _Toc221908748 \h </w:instrText>
             </w:r>
             <w:r>
               <w:rPr>
@@ -2208,7 +2199,7 @@
                 <w:noProof/>
                 <w:webHidden/>
               </w:rPr>
-              <w:t>3</w:t>
+              <w:t>5</w:t>
             </w:r>
             <w:r>
               <w:rPr>
@@ -2226,7 +2217,6 @@
               <w:tab w:val="left" w:pos="1200"/>
               <w:tab w:val="right" w:leader="dot" w:pos="9628"/>
             </w:tabs>
-            <w:ind w:firstLine="347"/>
             <w:rPr>
               <w:rFonts w:eastAsiaTheme="minorEastAsia"/>
               <w:noProof/>
@@ -2235,7 +2225,7 @@
               <w:lang w:eastAsia="es-ES"/>
             </w:rPr>
           </w:pPr>
-          <w:hyperlink w:anchor="_Toc210125376" w:history="1">
+          <w:hyperlink w:anchor="_Toc221908749" w:history="1">
             <w:r>
               <w:rPr>
                 <w:rStyle w:val="Hipervnculo"/>
@@ -2279,7 +2269,7 @@
                 <w:noProof/>
                 <w:webHidden/>
               </w:rPr>
-              <w:instrText xml:space="preserve"> PAGEREF _Toc210125376 \h </w:instrText>
+              <w:instrText xml:space="preserve"> PAGEREF _Toc221908749 \h </w:instrText>
             </w:r>
             <w:r>
               <w:rPr>
@@ -2299,7 +2289,7 @@
                 <w:noProof/>
                 <w:webHidden/>
               </w:rPr>
-              <w:t>3</w:t>
+              <w:t>5</w:t>
             </w:r>
             <w:r>
               <w:rPr>
@@ -2317,7 +2307,6 @@
               <w:tab w:val="left" w:pos="1200"/>
               <w:tab w:val="right" w:leader="dot" w:pos="9628"/>
             </w:tabs>
-            <w:ind w:firstLine="347"/>
             <w:rPr>
               <w:rFonts w:eastAsiaTheme="minorEastAsia"/>
               <w:noProof/>
@@ -2326,7 +2315,7 @@
               <w:lang w:eastAsia="es-ES"/>
             </w:rPr>
           </w:pPr>
-          <w:hyperlink w:anchor="_Toc210125377" w:history="1">
+          <w:hyperlink w:anchor="_Toc221908750" w:history="1">
             <w:r>
               <w:rPr>
                 <w:rStyle w:val="Hipervnculo"/>
@@ -2370,7 +2359,7 @@
                 <w:noProof/>
                 <w:webHidden/>
               </w:rPr>
-              <w:instrText xml:space="preserve"> PAGEREF _Toc210125377 \h </w:instrText>
+              <w:instrText xml:space="preserve"> PAGEREF _Toc221908750 \h </w:instrText>
             </w:r>
             <w:r>
               <w:rPr>
@@ -2390,7 +2379,7 @@
                 <w:noProof/>
                 <w:webHidden/>
               </w:rPr>
-              <w:t>3</w:t>
+              <w:t>5</w:t>
             </w:r>
             <w:r>
               <w:rPr>
@@ -2408,13 +2397,15 @@
               <w:tab w:val="left" w:pos="960"/>
               <w:tab w:val="right" w:leader="dot" w:pos="9628"/>
             </w:tabs>
-            <w:ind w:firstLine="206"/>
             <w:rPr>
-              <w:rStyle w:val="Hipervnculo"/>
+              <w:rFonts w:eastAsiaTheme="minorEastAsia"/>
               <w:noProof/>
+              <w:sz w:val="24"/>
+              <w:szCs w:val="24"/>
+              <w:lang w:eastAsia="es-ES"/>
             </w:rPr>
           </w:pPr>
-          <w:hyperlink w:anchor="_Toc210125378" w:history="1">
+          <w:hyperlink w:anchor="_Toc221908751" w:history="1">
             <w:r>
               <w:rPr>
                 <w:rStyle w:val="Hipervnculo"/>
@@ -2424,29 +2415,30 @@
             </w:r>
             <w:r>
               <w:rPr>
+                <w:rFonts w:eastAsiaTheme="minorEastAsia"/>
+                <w:noProof/>
+                <w:sz w:val="24"/>
+                <w:szCs w:val="24"/>
+                <w:lang w:eastAsia="es-ES"/>
+              </w:rPr>
+              <w:tab/>
+            </w:r>
+            <w:r>
+              <w:rPr>
                 <w:rStyle w:val="Hipervnculo"/>
                 <w:noProof/>
               </w:rPr>
+              <w:t>MODELOS DE DATOS</w:t>
+            </w:r>
+            <w:r>
+              <w:rPr>
+                <w:noProof/>
+                <w:webHidden/>
+              </w:rPr>
               <w:tab/>
             </w:r>
             <w:r>
               <w:rPr>
-                <w:rStyle w:val="Hipervnculo"/>
-                <w:noProof/>
-              </w:rPr>
-              <w:t>MODELOS DE DATOS</w:t>
-            </w:r>
-            <w:r>
-              <w:rPr>
-                <w:rStyle w:val="Hipervnculo"/>
-                <w:noProof/>
-                <w:webHidden/>
-              </w:rPr>
-              <w:tab/>
-            </w:r>
-            <w:r>
-              <w:rPr>
-                <w:rStyle w:val="Hipervnculo"/>
                 <w:noProof/>
                 <w:webHidden/>
               </w:rPr>
@@ -2454,22 +2446,19 @@
             </w:r>
             <w:r>
               <w:rPr>
-                <w:rStyle w:val="Hipervnculo"/>
-                <w:noProof/>
-                <w:webHidden/>
-              </w:rPr>
-              <w:instrText xml:space="preserve"> PAGEREF _Toc210125378 \h </w:instrText>
-            </w:r>
-            <w:r>
-              <w:rPr>
-                <w:rStyle w:val="Hipervnculo"/>
-                <w:noProof/>
-                <w:webHidden/>
-              </w:rPr>
-            </w:r>
-            <w:r>
-              <w:rPr>
-                <w:rStyle w:val="Hipervnculo"/>
+                <w:noProof/>
+                <w:webHidden/>
+              </w:rPr>
+              <w:instrText xml:space="preserve"> PAGEREF _Toc221908751 \h </w:instrText>
+            </w:r>
+            <w:r>
+              <w:rPr>
+                <w:noProof/>
+                <w:webHidden/>
+              </w:rPr>
+            </w:r>
+            <w:r>
+              <w:rPr>
                 <w:noProof/>
                 <w:webHidden/>
               </w:rPr>
@@ -2477,15 +2466,13 @@
             </w:r>
             <w:r>
               <w:rPr>
-                <w:rStyle w:val="Hipervnculo"/>
-                <w:noProof/>
-                <w:webHidden/>
-              </w:rPr>
-              <w:t>3</w:t>
-            </w:r>
-            <w:r>
-              <w:rPr>
-                <w:rStyle w:val="Hipervnculo"/>
+                <w:noProof/>
+                <w:webHidden/>
+              </w:rPr>
+              <w:t>6</w:t>
+            </w:r>
+            <w:r>
+              <w:rPr>
                 <w:noProof/>
                 <w:webHidden/>
               </w:rPr>
@@ -2500,13 +2487,15 @@
               <w:tab w:val="left" w:pos="1200"/>
               <w:tab w:val="right" w:leader="dot" w:pos="9628"/>
             </w:tabs>
-            <w:ind w:firstLine="347"/>
             <w:rPr>
-              <w:rStyle w:val="Hipervnculo"/>
+              <w:rFonts w:eastAsiaTheme="minorEastAsia"/>
               <w:noProof/>
+              <w:sz w:val="24"/>
+              <w:szCs w:val="24"/>
+              <w:lang w:eastAsia="es-ES"/>
             </w:rPr>
           </w:pPr>
-          <w:hyperlink w:anchor="_Toc210125379" w:history="1">
+          <w:hyperlink w:anchor="_Toc221908752" w:history="1">
             <w:r>
               <w:rPr>
                 <w:rStyle w:val="Hipervnculo"/>
@@ -2516,29 +2505,30 @@
             </w:r>
             <w:r>
               <w:rPr>
+                <w:rFonts w:eastAsiaTheme="minorEastAsia"/>
+                <w:noProof/>
+                <w:sz w:val="24"/>
+                <w:szCs w:val="24"/>
+                <w:lang w:eastAsia="es-ES"/>
+              </w:rPr>
+              <w:tab/>
+            </w:r>
+            <w:r>
+              <w:rPr>
                 <w:rStyle w:val="Hipervnculo"/>
                 <w:noProof/>
               </w:rPr>
+              <w:t>DIAGRAMA E/R</w:t>
+            </w:r>
+            <w:r>
+              <w:rPr>
+                <w:noProof/>
+                <w:webHidden/>
+              </w:rPr>
               <w:tab/>
             </w:r>
             <w:r>
               <w:rPr>
-                <w:rStyle w:val="Hipervnculo"/>
-                <w:noProof/>
-              </w:rPr>
-              <w:t>DIAGRAMA E/R</w:t>
-            </w:r>
-            <w:r>
-              <w:rPr>
-                <w:rStyle w:val="Hipervnculo"/>
-                <w:noProof/>
-                <w:webHidden/>
-              </w:rPr>
-              <w:tab/>
-            </w:r>
-            <w:r>
-              <w:rPr>
-                <w:rStyle w:val="Hipervnculo"/>
                 <w:noProof/>
                 <w:webHidden/>
               </w:rPr>
@@ -2546,22 +2536,19 @@
             </w:r>
             <w:r>
               <w:rPr>
-                <w:rStyle w:val="Hipervnculo"/>
-                <w:noProof/>
-                <w:webHidden/>
-              </w:rPr>
-              <w:instrText xml:space="preserve"> PAGEREF _Toc210125379 \h </w:instrText>
-            </w:r>
-            <w:r>
-              <w:rPr>
-                <w:rStyle w:val="Hipervnculo"/>
-                <w:noProof/>
-                <w:webHidden/>
-              </w:rPr>
-            </w:r>
-            <w:r>
-              <w:rPr>
-                <w:rStyle w:val="Hipervnculo"/>
+                <w:noProof/>
+                <w:webHidden/>
+              </w:rPr>
+              <w:instrText xml:space="preserve"> PAGEREF _Toc221908752 \h </w:instrText>
+            </w:r>
+            <w:r>
+              <w:rPr>
+                <w:noProof/>
+                <w:webHidden/>
+              </w:rPr>
+            </w:r>
+            <w:r>
+              <w:rPr>
                 <w:noProof/>
                 <w:webHidden/>
               </w:rPr>
@@ -2569,15 +2556,13 @@
             </w:r>
             <w:r>
               <w:rPr>
-                <w:rStyle w:val="Hipervnculo"/>
-                <w:noProof/>
-                <w:webHidden/>
-              </w:rPr>
-              <w:t>3</w:t>
-            </w:r>
-            <w:r>
-              <w:rPr>
-                <w:rStyle w:val="Hipervnculo"/>
+                <w:noProof/>
+                <w:webHidden/>
+              </w:rPr>
+              <w:t>7</w:t>
+            </w:r>
+            <w:r>
+              <w:rPr>
                 <w:noProof/>
                 <w:webHidden/>
               </w:rPr>
@@ -2592,13 +2577,15 @@
               <w:tab w:val="left" w:pos="1200"/>
               <w:tab w:val="right" w:leader="dot" w:pos="9628"/>
             </w:tabs>
-            <w:ind w:firstLine="347"/>
             <w:rPr>
-              <w:rStyle w:val="Hipervnculo"/>
+              <w:rFonts w:eastAsiaTheme="minorEastAsia"/>
               <w:noProof/>
+              <w:sz w:val="24"/>
+              <w:szCs w:val="24"/>
+              <w:lang w:eastAsia="es-ES"/>
             </w:rPr>
           </w:pPr>
-          <w:hyperlink w:anchor="_Toc210125380" w:history="1">
+          <w:hyperlink w:anchor="_Toc221908753" w:history="1">
             <w:r>
               <w:rPr>
                 <w:rStyle w:val="Hipervnculo"/>
@@ -2608,29 +2595,30 @@
             </w:r>
             <w:r>
               <w:rPr>
+                <w:rFonts w:eastAsiaTheme="minorEastAsia"/>
+                <w:noProof/>
+                <w:sz w:val="24"/>
+                <w:szCs w:val="24"/>
+                <w:lang w:eastAsia="es-ES"/>
+              </w:rPr>
+              <w:tab/>
+            </w:r>
+            <w:r>
+              <w:rPr>
                 <w:rStyle w:val="Hipervnculo"/>
                 <w:noProof/>
               </w:rPr>
+              <w:t>DIAGRAMA DE CLASES</w:t>
+            </w:r>
+            <w:r>
+              <w:rPr>
+                <w:noProof/>
+                <w:webHidden/>
+              </w:rPr>
               <w:tab/>
             </w:r>
             <w:r>
               <w:rPr>
-                <w:rStyle w:val="Hipervnculo"/>
-                <w:noProof/>
-              </w:rPr>
-              <w:t>DIAGRAMA DE CLASES</w:t>
-            </w:r>
-            <w:r>
-              <w:rPr>
-                <w:rStyle w:val="Hipervnculo"/>
-                <w:noProof/>
-                <w:webHidden/>
-              </w:rPr>
-              <w:tab/>
-            </w:r>
-            <w:r>
-              <w:rPr>
-                <w:rStyle w:val="Hipervnculo"/>
                 <w:noProof/>
                 <w:webHidden/>
               </w:rPr>
@@ -2638,22 +2626,19 @@
             </w:r>
             <w:r>
               <w:rPr>
-                <w:rStyle w:val="Hipervnculo"/>
-                <w:noProof/>
-                <w:webHidden/>
-              </w:rPr>
-              <w:instrText xml:space="preserve"> PAGEREF _Toc210125380 \h </w:instrText>
-            </w:r>
-            <w:r>
-              <w:rPr>
-                <w:rStyle w:val="Hipervnculo"/>
-                <w:noProof/>
-                <w:webHidden/>
-              </w:rPr>
-            </w:r>
-            <w:r>
-              <w:rPr>
-                <w:rStyle w:val="Hipervnculo"/>
+                <w:noProof/>
+                <w:webHidden/>
+              </w:rPr>
+              <w:instrText xml:space="preserve"> PAGEREF _Toc221908753 \h </w:instrText>
+            </w:r>
+            <w:r>
+              <w:rPr>
+                <w:noProof/>
+                <w:webHidden/>
+              </w:rPr>
+            </w:r>
+            <w:r>
+              <w:rPr>
                 <w:noProof/>
                 <w:webHidden/>
               </w:rPr>
@@ -2661,15 +2646,13 @@
             </w:r>
             <w:r>
               <w:rPr>
-                <w:rStyle w:val="Hipervnculo"/>
-                <w:noProof/>
-                <w:webHidden/>
-              </w:rPr>
-              <w:t>4</w:t>
-            </w:r>
-            <w:r>
-              <w:rPr>
-                <w:rStyle w:val="Hipervnculo"/>
+                <w:noProof/>
+                <w:webHidden/>
+              </w:rPr>
+              <w:t>8</w:t>
+            </w:r>
+            <w:r>
+              <w:rPr>
                 <w:noProof/>
                 <w:webHidden/>
               </w:rPr>
@@ -2684,13 +2667,15 @@
               <w:tab w:val="left" w:pos="960"/>
               <w:tab w:val="right" w:leader="dot" w:pos="9628"/>
             </w:tabs>
-            <w:ind w:firstLine="206"/>
             <w:rPr>
-              <w:rStyle w:val="Hipervnculo"/>
+              <w:rFonts w:eastAsiaTheme="minorEastAsia"/>
               <w:noProof/>
+              <w:sz w:val="24"/>
+              <w:szCs w:val="24"/>
+              <w:lang w:eastAsia="es-ES"/>
             </w:rPr>
           </w:pPr>
-          <w:hyperlink w:anchor="_Toc210125381" w:history="1">
+          <w:hyperlink w:anchor="_Toc221908754" w:history="1">
             <w:r>
               <w:rPr>
                 <w:rStyle w:val="Hipervnculo"/>
@@ -2700,29 +2685,30 @@
             </w:r>
             <w:r>
               <w:rPr>
+                <w:rFonts w:eastAsiaTheme="minorEastAsia"/>
+                <w:noProof/>
+                <w:sz w:val="24"/>
+                <w:szCs w:val="24"/>
+                <w:lang w:eastAsia="es-ES"/>
+              </w:rPr>
+              <w:tab/>
+            </w:r>
+            <w:r>
+              <w:rPr>
                 <w:rStyle w:val="Hipervnculo"/>
                 <w:noProof/>
               </w:rPr>
+              <w:t>INTERFACES GRÁFICAS DE USUARIO</w:t>
+            </w:r>
+            <w:r>
+              <w:rPr>
+                <w:noProof/>
+                <w:webHidden/>
+              </w:rPr>
               <w:tab/>
             </w:r>
             <w:r>
               <w:rPr>
-                <w:rStyle w:val="Hipervnculo"/>
-                <w:noProof/>
-              </w:rPr>
-              <w:t>INTERFACES GRÁFICAS DE USUARIO</w:t>
-            </w:r>
-            <w:r>
-              <w:rPr>
-                <w:rStyle w:val="Hipervnculo"/>
-                <w:noProof/>
-                <w:webHidden/>
-              </w:rPr>
-              <w:tab/>
-            </w:r>
-            <w:r>
-              <w:rPr>
-                <w:rStyle w:val="Hipervnculo"/>
                 <w:noProof/>
                 <w:webHidden/>
               </w:rPr>
@@ -2730,22 +2716,19 @@
             </w:r>
             <w:r>
               <w:rPr>
-                <w:rStyle w:val="Hipervnculo"/>
-                <w:noProof/>
-                <w:webHidden/>
-              </w:rPr>
-              <w:instrText xml:space="preserve"> PAGEREF _Toc210125381 \h </w:instrText>
-            </w:r>
-            <w:r>
-              <w:rPr>
-                <w:rStyle w:val="Hipervnculo"/>
-                <w:noProof/>
-                <w:webHidden/>
-              </w:rPr>
-            </w:r>
-            <w:r>
-              <w:rPr>
-                <w:rStyle w:val="Hipervnculo"/>
+                <w:noProof/>
+                <w:webHidden/>
+              </w:rPr>
+              <w:instrText xml:space="preserve"> PAGEREF _Toc221908754 \h </w:instrText>
+            </w:r>
+            <w:r>
+              <w:rPr>
+                <w:noProof/>
+                <w:webHidden/>
+              </w:rPr>
+            </w:r>
+            <w:r>
+              <w:rPr>
                 <w:noProof/>
                 <w:webHidden/>
               </w:rPr>
@@ -2753,15 +2736,13 @@
             </w:r>
             <w:r>
               <w:rPr>
-                <w:rStyle w:val="Hipervnculo"/>
-                <w:noProof/>
-                <w:webHidden/>
-              </w:rPr>
-              <w:t>4</w:t>
-            </w:r>
-            <w:r>
-              <w:rPr>
-                <w:rStyle w:val="Hipervnculo"/>
+                <w:noProof/>
+                <w:webHidden/>
+              </w:rPr>
+              <w:t>10</w:t>
+            </w:r>
+            <w:r>
+              <w:rPr>
                 <w:noProof/>
                 <w:webHidden/>
               </w:rPr>
@@ -2776,13 +2757,15 @@
               <w:tab w:val="left" w:pos="1200"/>
               <w:tab w:val="right" w:leader="dot" w:pos="9628"/>
             </w:tabs>
-            <w:ind w:firstLine="347"/>
             <w:rPr>
-              <w:rStyle w:val="Hipervnculo"/>
+              <w:rFonts w:eastAsiaTheme="minorEastAsia"/>
               <w:noProof/>
+              <w:sz w:val="24"/>
+              <w:szCs w:val="24"/>
+              <w:lang w:eastAsia="es-ES"/>
             </w:rPr>
           </w:pPr>
-          <w:hyperlink w:anchor="_Toc210125382" w:history="1">
+          <w:hyperlink w:anchor="_Toc221908755" w:history="1">
             <w:r>
               <w:rPr>
                 <w:rStyle w:val="Hipervnculo"/>
@@ -2792,29 +2775,30 @@
             </w:r>
             <w:r>
               <w:rPr>
+                <w:rFonts w:eastAsiaTheme="minorEastAsia"/>
+                <w:noProof/>
+                <w:sz w:val="24"/>
+                <w:szCs w:val="24"/>
+                <w:lang w:eastAsia="es-ES"/>
+              </w:rPr>
+              <w:tab/>
+            </w:r>
+            <w:r>
+              <w:rPr>
                 <w:rStyle w:val="Hipervnculo"/>
                 <w:noProof/>
               </w:rPr>
+              <w:t>MAPA DE NAVEGABILIDAD</w:t>
+            </w:r>
+            <w:r>
+              <w:rPr>
+                <w:noProof/>
+                <w:webHidden/>
+              </w:rPr>
               <w:tab/>
             </w:r>
             <w:r>
               <w:rPr>
-                <w:rStyle w:val="Hipervnculo"/>
-                <w:noProof/>
-              </w:rPr>
-              <w:t>MAPA DE NAVEGABILIDAD</w:t>
-            </w:r>
-            <w:r>
-              <w:rPr>
-                <w:rStyle w:val="Hipervnculo"/>
-                <w:noProof/>
-                <w:webHidden/>
-              </w:rPr>
-              <w:tab/>
-            </w:r>
-            <w:r>
-              <w:rPr>
-                <w:rStyle w:val="Hipervnculo"/>
                 <w:noProof/>
                 <w:webHidden/>
               </w:rPr>
@@ -2822,22 +2806,19 @@
             </w:r>
             <w:r>
               <w:rPr>
-                <w:rStyle w:val="Hipervnculo"/>
-                <w:noProof/>
-                <w:webHidden/>
-              </w:rPr>
-              <w:instrText xml:space="preserve"> PAGEREF _Toc210125382 \h </w:instrText>
-            </w:r>
-            <w:r>
-              <w:rPr>
-                <w:rStyle w:val="Hipervnculo"/>
-                <w:noProof/>
-                <w:webHidden/>
-              </w:rPr>
-            </w:r>
-            <w:r>
-              <w:rPr>
-                <w:rStyle w:val="Hipervnculo"/>
+                <w:noProof/>
+                <w:webHidden/>
+              </w:rPr>
+              <w:instrText xml:space="preserve"> PAGEREF _Toc221908755 \h </w:instrText>
+            </w:r>
+            <w:r>
+              <w:rPr>
+                <w:noProof/>
+                <w:webHidden/>
+              </w:rPr>
+            </w:r>
+            <w:r>
+              <w:rPr>
                 <w:noProof/>
                 <w:webHidden/>
               </w:rPr>
@@ -2845,15 +2826,13 @@
             </w:r>
             <w:r>
               <w:rPr>
-                <w:rStyle w:val="Hipervnculo"/>
-                <w:noProof/>
-                <w:webHidden/>
-              </w:rPr>
-              <w:t>4</w:t>
-            </w:r>
-            <w:r>
-              <w:rPr>
-                <w:rStyle w:val="Hipervnculo"/>
+                <w:noProof/>
+                <w:webHidden/>
+              </w:rPr>
+              <w:t>12</w:t>
+            </w:r>
+            <w:r>
+              <w:rPr>
                 <w:noProof/>
                 <w:webHidden/>
               </w:rPr>
@@ -2876,7 +2855,7 @@
               <w:lang w:eastAsia="es-ES"/>
             </w:rPr>
           </w:pPr>
-          <w:hyperlink w:anchor="_Toc210125383" w:history="1">
+          <w:hyperlink w:anchor="_Toc221908756" w:history="1">
             <w:r>
               <w:rPr>
                 <w:rStyle w:val="Hipervnculo"/>
@@ -2920,7 +2899,7 @@
                 <w:noProof/>
                 <w:webHidden/>
               </w:rPr>
-              <w:instrText xml:space="preserve"> PAGEREF _Toc210125383 \h </w:instrText>
+              <w:instrText xml:space="preserve"> PAGEREF _Toc221908756 \h </w:instrText>
             </w:r>
             <w:r>
               <w:rPr>
@@ -2940,7 +2919,7 @@
                 <w:noProof/>
                 <w:webHidden/>
               </w:rPr>
-              <w:t>4</w:t>
+              <w:t>13</w:t>
             </w:r>
             <w:r>
               <w:rPr>
@@ -2966,7 +2945,7 @@
               <w:lang w:eastAsia="es-ES"/>
             </w:rPr>
           </w:pPr>
-          <w:hyperlink w:anchor="_Toc210125384" w:history="1">
+          <w:hyperlink w:anchor="_Toc221908757" w:history="1">
             <w:r>
               <w:rPr>
                 <w:rStyle w:val="Hipervnculo"/>
@@ -3010,7 +2989,7 @@
                 <w:noProof/>
                 <w:webHidden/>
               </w:rPr>
-              <w:instrText xml:space="preserve"> PAGEREF _Toc210125384 \h </w:instrText>
+              <w:instrText xml:space="preserve"> PAGEREF _Toc221908757 \h </w:instrText>
             </w:r>
             <w:r>
               <w:rPr>
@@ -3030,7 +3009,7 @@
                 <w:noProof/>
                 <w:webHidden/>
               </w:rPr>
-              <w:t>4</w:t>
+              <w:t>13</w:t>
             </w:r>
             <w:r>
               <w:rPr>
@@ -3056,7 +3035,7 @@
               <w:lang w:eastAsia="es-ES"/>
             </w:rPr>
           </w:pPr>
-          <w:hyperlink w:anchor="_Toc210125385" w:history="1">
+          <w:hyperlink w:anchor="_Toc221908758" w:history="1">
             <w:r>
               <w:rPr>
                 <w:rStyle w:val="Hipervnculo"/>
@@ -3100,7 +3079,7 @@
                 <w:noProof/>
                 <w:webHidden/>
               </w:rPr>
-              <w:instrText xml:space="preserve"> PAGEREF _Toc210125385 \h </w:instrText>
+              <w:instrText xml:space="preserve"> PAGEREF _Toc221908758 \h </w:instrText>
             </w:r>
             <w:r>
               <w:rPr>
@@ -3120,7 +3099,7 @@
                 <w:noProof/>
                 <w:webHidden/>
               </w:rPr>
-              <w:t>4</w:t>
+              <w:t>14</w:t>
             </w:r>
             <w:r>
               <w:rPr>
@@ -3135,16 +3114,18 @@
           <w:pPr>
             <w:pStyle w:val="TDC2"/>
             <w:tabs>
-              <w:tab w:val="left" w:pos="1200"/>
+              <w:tab w:val="left" w:pos="960"/>
               <w:tab w:val="right" w:leader="dot" w:pos="9628"/>
             </w:tabs>
-            <w:ind w:firstLine="347"/>
             <w:rPr>
-              <w:rStyle w:val="Hipervnculo"/>
+              <w:rFonts w:eastAsiaTheme="minorEastAsia"/>
               <w:noProof/>
+              <w:sz w:val="24"/>
+              <w:szCs w:val="24"/>
+              <w:lang w:eastAsia="es-ES"/>
             </w:rPr>
           </w:pPr>
-          <w:hyperlink w:anchor="_Toc210125389" w:history="1">
+          <w:hyperlink w:anchor="_Toc221908762" w:history="1">
             <w:r>
               <w:rPr>
                 <w:rStyle w:val="Hipervnculo"/>
@@ -3154,29 +3135,30 @@
             </w:r>
             <w:r>
               <w:rPr>
+                <w:rFonts w:eastAsiaTheme="minorEastAsia"/>
+                <w:noProof/>
+                <w:sz w:val="24"/>
+                <w:szCs w:val="24"/>
+                <w:lang w:eastAsia="es-ES"/>
+              </w:rPr>
+              <w:tab/>
+            </w:r>
+            <w:r>
+              <w:rPr>
                 <w:rStyle w:val="Hipervnculo"/>
                 <w:noProof/>
               </w:rPr>
+              <w:t>DIAGRAMA DE GANTT</w:t>
+            </w:r>
+            <w:r>
+              <w:rPr>
+                <w:noProof/>
+                <w:webHidden/>
+              </w:rPr>
               <w:tab/>
             </w:r>
             <w:r>
               <w:rPr>
-                <w:rStyle w:val="Hipervnculo"/>
-                <w:noProof/>
-              </w:rPr>
-              <w:t>DIAGRAMA DE GANTT</w:t>
-            </w:r>
-            <w:r>
-              <w:rPr>
-                <w:rStyle w:val="Hipervnculo"/>
-                <w:noProof/>
-                <w:webHidden/>
-              </w:rPr>
-              <w:tab/>
-            </w:r>
-            <w:r>
-              <w:rPr>
-                <w:rStyle w:val="Hipervnculo"/>
                 <w:noProof/>
                 <w:webHidden/>
               </w:rPr>
@@ -3184,22 +3166,19 @@
             </w:r>
             <w:r>
               <w:rPr>
-                <w:rStyle w:val="Hipervnculo"/>
-                <w:noProof/>
-                <w:webHidden/>
-              </w:rPr>
-              <w:instrText xml:space="preserve"> PAGEREF _Toc210125389 \h </w:instrText>
-            </w:r>
-            <w:r>
-              <w:rPr>
-                <w:rStyle w:val="Hipervnculo"/>
-                <w:noProof/>
-                <w:webHidden/>
-              </w:rPr>
-            </w:r>
-            <w:r>
-              <w:rPr>
-                <w:rStyle w:val="Hipervnculo"/>
+                <w:noProof/>
+                <w:webHidden/>
+              </w:rPr>
+              <w:instrText xml:space="preserve"> PAGEREF _Toc221908762 \h </w:instrText>
+            </w:r>
+            <w:r>
+              <w:rPr>
+                <w:noProof/>
+                <w:webHidden/>
+              </w:rPr>
+            </w:r>
+            <w:r>
+              <w:rPr>
                 <w:noProof/>
                 <w:webHidden/>
               </w:rPr>
@@ -3207,15 +3186,13 @@
             </w:r>
             <w:r>
               <w:rPr>
-                <w:rStyle w:val="Hipervnculo"/>
-                <w:noProof/>
-                <w:webHidden/>
-              </w:rPr>
-              <w:t>4</w:t>
-            </w:r>
-            <w:r>
-              <w:rPr>
-                <w:rStyle w:val="Hipervnculo"/>
+                <w:noProof/>
+                <w:webHidden/>
+              </w:rPr>
+              <w:t>14</w:t>
+            </w:r>
+            <w:r>
+              <w:rPr>
                 <w:noProof/>
                 <w:webHidden/>
               </w:rPr>
@@ -3227,16 +3204,18 @@
           <w:pPr>
             <w:pStyle w:val="TDC2"/>
             <w:tabs>
-              <w:tab w:val="left" w:pos="1200"/>
+              <w:tab w:val="left" w:pos="960"/>
               <w:tab w:val="right" w:leader="dot" w:pos="9628"/>
             </w:tabs>
-            <w:ind w:firstLine="347"/>
             <w:rPr>
-              <w:rStyle w:val="Hipervnculo"/>
+              <w:rFonts w:eastAsiaTheme="minorEastAsia"/>
               <w:noProof/>
+              <w:sz w:val="24"/>
+              <w:szCs w:val="24"/>
+              <w:lang w:eastAsia="es-ES"/>
             </w:rPr>
           </w:pPr>
-          <w:hyperlink w:anchor="_Toc210125390" w:history="1">
+          <w:hyperlink w:anchor="_Toc221908763" w:history="1">
             <w:r>
               <w:rPr>
                 <w:rStyle w:val="Hipervnculo"/>
@@ -3246,29 +3225,30 @@
             </w:r>
             <w:r>
               <w:rPr>
+                <w:rFonts w:eastAsiaTheme="minorEastAsia"/>
+                <w:noProof/>
+                <w:sz w:val="24"/>
+                <w:szCs w:val="24"/>
+                <w:lang w:eastAsia="es-ES"/>
+              </w:rPr>
+              <w:tab/>
+            </w:r>
+            <w:r>
+              <w:rPr>
                 <w:rStyle w:val="Hipervnculo"/>
                 <w:noProof/>
               </w:rPr>
+              <w:t>ESTIMACIONES DE COSTES</w:t>
+            </w:r>
+            <w:r>
+              <w:rPr>
+                <w:noProof/>
+                <w:webHidden/>
+              </w:rPr>
               <w:tab/>
             </w:r>
             <w:r>
               <w:rPr>
-                <w:rStyle w:val="Hipervnculo"/>
-                <w:noProof/>
-              </w:rPr>
-              <w:t>ESTIMACIONES DE COSTES</w:t>
-            </w:r>
-            <w:r>
-              <w:rPr>
-                <w:rStyle w:val="Hipervnculo"/>
-                <w:noProof/>
-                <w:webHidden/>
-              </w:rPr>
-              <w:tab/>
-            </w:r>
-            <w:r>
-              <w:rPr>
-                <w:rStyle w:val="Hipervnculo"/>
                 <w:noProof/>
                 <w:webHidden/>
               </w:rPr>
@@ -3276,22 +3256,19 @@
             </w:r>
             <w:r>
               <w:rPr>
-                <w:rStyle w:val="Hipervnculo"/>
-                <w:noProof/>
-                <w:webHidden/>
-              </w:rPr>
-              <w:instrText xml:space="preserve"> PAGEREF _Toc210125390 \h </w:instrText>
-            </w:r>
-            <w:r>
-              <w:rPr>
-                <w:rStyle w:val="Hipervnculo"/>
-                <w:noProof/>
-                <w:webHidden/>
-              </w:rPr>
-            </w:r>
-            <w:r>
-              <w:rPr>
-                <w:rStyle w:val="Hipervnculo"/>
+                <w:noProof/>
+                <w:webHidden/>
+              </w:rPr>
+              <w:instrText xml:space="preserve"> PAGEREF _Toc221908763 \h </w:instrText>
+            </w:r>
+            <w:r>
+              <w:rPr>
+                <w:noProof/>
+                <w:webHidden/>
+              </w:rPr>
+            </w:r>
+            <w:r>
+              <w:rPr>
                 <w:noProof/>
                 <w:webHidden/>
               </w:rPr>
@@ -3299,15 +3276,13 @@
             </w:r>
             <w:r>
               <w:rPr>
-                <w:rStyle w:val="Hipervnculo"/>
-                <w:noProof/>
-                <w:webHidden/>
-              </w:rPr>
-              <w:t>4</w:t>
-            </w:r>
-            <w:r>
-              <w:rPr>
-                <w:rStyle w:val="Hipervnculo"/>
+                <w:noProof/>
+                <w:webHidden/>
+              </w:rPr>
+              <w:t>14</w:t>
+            </w:r>
+            <w:r>
+              <w:rPr>
                 <w:noProof/>
                 <w:webHidden/>
               </w:rPr>
@@ -3330,7 +3305,7 @@
               <w:lang w:eastAsia="es-ES"/>
             </w:rPr>
           </w:pPr>
-          <w:hyperlink w:anchor="_Toc210125391" w:history="1">
+          <w:hyperlink w:anchor="_Toc221908764" w:history="1">
             <w:r>
               <w:rPr>
                 <w:rStyle w:val="Hipervnculo"/>
@@ -3374,7 +3349,7 @@
                 <w:noProof/>
                 <w:webHidden/>
               </w:rPr>
-              <w:instrText xml:space="preserve"> PAGEREF _Toc210125391 \h </w:instrText>
+              <w:instrText xml:space="preserve"> PAGEREF _Toc221908764 \h </w:instrText>
             </w:r>
             <w:r>
               <w:rPr>
@@ -3394,7 +3369,7 @@
                 <w:noProof/>
                 <w:webHidden/>
               </w:rPr>
-              <w:t>4</w:t>
+              <w:t>14</w:t>
             </w:r>
             <w:r>
               <w:rPr>
@@ -3409,16 +3384,18 @@
           <w:pPr>
             <w:pStyle w:val="TDC2"/>
             <w:tabs>
-              <w:tab w:val="left" w:pos="1200"/>
+              <w:tab w:val="left" w:pos="960"/>
               <w:tab w:val="right" w:leader="dot" w:pos="9628"/>
             </w:tabs>
-            <w:ind w:firstLine="347"/>
             <w:rPr>
-              <w:rStyle w:val="Hipervnculo"/>
+              <w:rFonts w:eastAsiaTheme="minorEastAsia"/>
               <w:noProof/>
+              <w:sz w:val="24"/>
+              <w:szCs w:val="24"/>
+              <w:lang w:eastAsia="es-ES"/>
             </w:rPr>
           </w:pPr>
-          <w:hyperlink w:anchor="_Toc210125393" w:history="1">
+          <w:hyperlink w:anchor="_Toc221908766" w:history="1">
             <w:r>
               <w:rPr>
                 <w:rStyle w:val="Hipervnculo"/>
@@ -3428,29 +3405,30 @@
             </w:r>
             <w:r>
               <w:rPr>
+                <w:rFonts w:eastAsiaTheme="minorEastAsia"/>
+                <w:noProof/>
+                <w:sz w:val="24"/>
+                <w:szCs w:val="24"/>
+                <w:lang w:eastAsia="es-ES"/>
+              </w:rPr>
+              <w:tab/>
+            </w:r>
+            <w:r>
+              <w:rPr>
                 <w:rStyle w:val="Hipervnculo"/>
                 <w:noProof/>
               </w:rPr>
+              <w:t>PROPUESTAS DE MEJORA Y AMPLIACIONES</w:t>
+            </w:r>
+            <w:r>
+              <w:rPr>
+                <w:noProof/>
+                <w:webHidden/>
+              </w:rPr>
               <w:tab/>
             </w:r>
             <w:r>
               <w:rPr>
-                <w:rStyle w:val="Hipervnculo"/>
-                <w:noProof/>
-              </w:rPr>
-              <w:t>PROPUESTAS DE MEJORA Y AMPLIACIONES</w:t>
-            </w:r>
-            <w:r>
-              <w:rPr>
-                <w:rStyle w:val="Hipervnculo"/>
-                <w:noProof/>
-                <w:webHidden/>
-              </w:rPr>
-              <w:tab/>
-            </w:r>
-            <w:r>
-              <w:rPr>
-                <w:rStyle w:val="Hipervnculo"/>
                 <w:noProof/>
                 <w:webHidden/>
               </w:rPr>
@@ -3458,22 +3436,19 @@
             </w:r>
             <w:r>
               <w:rPr>
-                <w:rStyle w:val="Hipervnculo"/>
-                <w:noProof/>
-                <w:webHidden/>
-              </w:rPr>
-              <w:instrText xml:space="preserve"> PAGEREF _Toc210125393 \h </w:instrText>
-            </w:r>
-            <w:r>
-              <w:rPr>
-                <w:rStyle w:val="Hipervnculo"/>
-                <w:noProof/>
-                <w:webHidden/>
-              </w:rPr>
-            </w:r>
-            <w:r>
-              <w:rPr>
-                <w:rStyle w:val="Hipervnculo"/>
+                <w:noProof/>
+                <w:webHidden/>
+              </w:rPr>
+              <w:instrText xml:space="preserve"> PAGEREF _Toc221908766 \h </w:instrText>
+            </w:r>
+            <w:r>
+              <w:rPr>
+                <w:noProof/>
+                <w:webHidden/>
+              </w:rPr>
+            </w:r>
+            <w:r>
+              <w:rPr>
                 <w:noProof/>
                 <w:webHidden/>
               </w:rPr>
@@ -3481,15 +3456,13 @@
             </w:r>
             <w:r>
               <w:rPr>
-                <w:rStyle w:val="Hipervnculo"/>
-                <w:noProof/>
-                <w:webHidden/>
-              </w:rPr>
-              <w:t>4</w:t>
-            </w:r>
-            <w:r>
-              <w:rPr>
-                <w:rStyle w:val="Hipervnculo"/>
+                <w:noProof/>
+                <w:webHidden/>
+              </w:rPr>
+              <w:t>14</w:t>
+            </w:r>
+            <w:r>
+              <w:rPr>
                 <w:noProof/>
                 <w:webHidden/>
               </w:rPr>
@@ -3501,16 +3474,18 @@
           <w:pPr>
             <w:pStyle w:val="TDC2"/>
             <w:tabs>
-              <w:tab w:val="left" w:pos="1200"/>
+              <w:tab w:val="left" w:pos="960"/>
               <w:tab w:val="right" w:leader="dot" w:pos="9628"/>
             </w:tabs>
-            <w:ind w:firstLine="347"/>
             <w:rPr>
-              <w:rStyle w:val="Hipervnculo"/>
+              <w:rFonts w:eastAsiaTheme="minorEastAsia"/>
               <w:noProof/>
+              <w:sz w:val="24"/>
+              <w:szCs w:val="24"/>
+              <w:lang w:eastAsia="es-ES"/>
             </w:rPr>
           </w:pPr>
-          <w:hyperlink w:anchor="_Toc210125394" w:history="1">
+          <w:hyperlink w:anchor="_Toc221908767" w:history="1">
             <w:r>
               <w:rPr>
                 <w:rStyle w:val="Hipervnculo"/>
@@ -3520,29 +3495,30 @@
             </w:r>
             <w:r>
               <w:rPr>
+                <w:rFonts w:eastAsiaTheme="minorEastAsia"/>
+                <w:noProof/>
+                <w:sz w:val="24"/>
+                <w:szCs w:val="24"/>
+                <w:lang w:eastAsia="es-ES"/>
+              </w:rPr>
+              <w:tab/>
+            </w:r>
+            <w:r>
+              <w:rPr>
                 <w:rStyle w:val="Hipervnculo"/>
                 <w:noProof/>
               </w:rPr>
+              <w:t>IMPACTO Y RIESGO DE LOS CAMBIOS PROPUESTOS</w:t>
+            </w:r>
+            <w:r>
+              <w:rPr>
+                <w:noProof/>
+                <w:webHidden/>
+              </w:rPr>
               <w:tab/>
             </w:r>
             <w:r>
               <w:rPr>
-                <w:rStyle w:val="Hipervnculo"/>
-                <w:noProof/>
-              </w:rPr>
-              <w:t>IMPACTO Y RIESGO DE LOS CAMBIOS PROPUESTOS</w:t>
-            </w:r>
-            <w:r>
-              <w:rPr>
-                <w:rStyle w:val="Hipervnculo"/>
-                <w:noProof/>
-                <w:webHidden/>
-              </w:rPr>
-              <w:tab/>
-            </w:r>
-            <w:r>
-              <w:rPr>
-                <w:rStyle w:val="Hipervnculo"/>
                 <w:noProof/>
                 <w:webHidden/>
               </w:rPr>
@@ -3550,22 +3526,19 @@
             </w:r>
             <w:r>
               <w:rPr>
-                <w:rStyle w:val="Hipervnculo"/>
-                <w:noProof/>
-                <w:webHidden/>
-              </w:rPr>
-              <w:instrText xml:space="preserve"> PAGEREF _Toc210125394 \h </w:instrText>
-            </w:r>
-            <w:r>
-              <w:rPr>
-                <w:rStyle w:val="Hipervnculo"/>
-                <w:noProof/>
-                <w:webHidden/>
-              </w:rPr>
-            </w:r>
-            <w:r>
-              <w:rPr>
-                <w:rStyle w:val="Hipervnculo"/>
+                <w:noProof/>
+                <w:webHidden/>
+              </w:rPr>
+              <w:instrText xml:space="preserve"> PAGEREF _Toc221908767 \h </w:instrText>
+            </w:r>
+            <w:r>
+              <w:rPr>
+                <w:noProof/>
+                <w:webHidden/>
+              </w:rPr>
+            </w:r>
+            <w:r>
+              <w:rPr>
                 <w:noProof/>
                 <w:webHidden/>
               </w:rPr>
@@ -3573,15 +3546,13 @@
             </w:r>
             <w:r>
               <w:rPr>
-                <w:rStyle w:val="Hipervnculo"/>
-                <w:noProof/>
-                <w:webHidden/>
-              </w:rPr>
-              <w:t>4</w:t>
-            </w:r>
-            <w:r>
-              <w:rPr>
-                <w:rStyle w:val="Hipervnculo"/>
+                <w:noProof/>
+                <w:webHidden/>
+              </w:rPr>
+              <w:t>14</w:t>
+            </w:r>
+            <w:r>
+              <w:rPr>
                 <w:noProof/>
                 <w:webHidden/>
               </w:rPr>
@@ -3604,7 +3575,7 @@
               <w:lang w:eastAsia="es-ES"/>
             </w:rPr>
           </w:pPr>
-          <w:hyperlink w:anchor="_Toc210125395" w:history="1">
+          <w:hyperlink w:anchor="_Toc221908768" w:history="1">
             <w:r>
               <w:rPr>
                 <w:rStyle w:val="Hipervnculo"/>
@@ -3648,7 +3619,7 @@
                 <w:noProof/>
                 <w:webHidden/>
               </w:rPr>
-              <w:instrText xml:space="preserve"> PAGEREF _Toc210125395 \h </w:instrText>
+              <w:instrText xml:space="preserve"> PAGEREF _Toc221908768 \h </w:instrText>
             </w:r>
             <w:r>
               <w:rPr>
@@ -3668,7 +3639,7 @@
                 <w:noProof/>
                 <w:webHidden/>
               </w:rPr>
-              <w:t>5</w:t>
+              <w:t>14</w:t>
             </w:r>
             <w:r>
               <w:rPr>
@@ -3694,7 +3665,7 @@
               <w:lang w:eastAsia="es-ES"/>
             </w:rPr>
           </w:pPr>
-          <w:hyperlink w:anchor="_Toc210125396" w:history="1">
+          <w:hyperlink w:anchor="_Toc221908769" w:history="1">
             <w:r>
               <w:rPr>
                 <w:rStyle w:val="Hipervnculo"/>
@@ -3738,7 +3709,7 @@
                 <w:noProof/>
                 <w:webHidden/>
               </w:rPr>
-              <w:instrText xml:space="preserve"> PAGEREF _Toc210125396 \h </w:instrText>
+              <w:instrText xml:space="preserve"> PAGEREF _Toc221908769 \h </w:instrText>
             </w:r>
             <w:r>
               <w:rPr>
@@ -3758,7 +3729,7 @@
                 <w:noProof/>
                 <w:webHidden/>
               </w:rPr>
-              <w:t>5</w:t>
+              <w:t>14</w:t>
             </w:r>
             <w:r>
               <w:rPr>
@@ -3784,7 +3755,7 @@
               <w:lang w:eastAsia="es-ES"/>
             </w:rPr>
           </w:pPr>
-          <w:hyperlink w:anchor="_Toc210125397" w:history="1">
+          <w:hyperlink w:anchor="_Toc221908770" w:history="1">
             <w:r>
               <w:rPr>
                 <w:rStyle w:val="Hipervnculo"/>
@@ -3828,7 +3799,7 @@
                 <w:noProof/>
                 <w:webHidden/>
               </w:rPr>
-              <w:instrText xml:space="preserve"> PAGEREF _Toc210125397 \h </w:instrText>
+              <w:instrText xml:space="preserve"> PAGEREF _Toc221908770 \h </w:instrText>
             </w:r>
             <w:r>
               <w:rPr>
@@ -3848,102 +3819,10 @@
                 <w:noProof/>
                 <w:webHidden/>
               </w:rPr>
-              <w:t>5</w:t>
-            </w:r>
-            <w:r>
-              <w:rPr>
-                <w:noProof/>
-                <w:webHidden/>
-              </w:rPr>
-              <w:fldChar w:fldCharType="end"/>
-            </w:r>
-          </w:hyperlink>
-        </w:p>
-        <w:p>
-          <w:pPr>
-            <w:pStyle w:val="TDC2"/>
-            <w:tabs>
-              <w:tab w:val="left" w:pos="1200"/>
-              <w:tab w:val="right" w:leader="dot" w:pos="9628"/>
-            </w:tabs>
-            <w:ind w:firstLine="347"/>
-            <w:rPr>
-              <w:rStyle w:val="Hipervnculo"/>
-              <w:noProof/>
-            </w:rPr>
-          </w:pPr>
-          <w:hyperlink w:anchor="_Toc210125401" w:history="1">
-            <w:r>
-              <w:rPr>
-                <w:rStyle w:val="Hipervnculo"/>
-                <w:noProof/>
-              </w:rPr>
-              <w:t>9.1.</w:t>
-            </w:r>
-            <w:r>
-              <w:rPr>
-                <w:rStyle w:val="Hipervnculo"/>
-                <w:noProof/>
-              </w:rPr>
-              <w:tab/>
-            </w:r>
-            <w:r>
-              <w:rPr>
-                <w:rStyle w:val="Hipervnculo"/>
-                <w:noProof/>
-              </w:rPr>
-              <w:t>INSTALACIÓN</w:t>
-            </w:r>
-            <w:r>
-              <w:rPr>
-                <w:rStyle w:val="Hipervnculo"/>
-                <w:noProof/>
-                <w:webHidden/>
-              </w:rPr>
-              <w:tab/>
-            </w:r>
-            <w:r>
-              <w:rPr>
-                <w:rStyle w:val="Hipervnculo"/>
-                <w:noProof/>
-                <w:webHidden/>
-              </w:rPr>
-              <w:fldChar w:fldCharType="begin"/>
-            </w:r>
-            <w:r>
-              <w:rPr>
-                <w:rStyle w:val="Hipervnculo"/>
-                <w:noProof/>
-                <w:webHidden/>
-              </w:rPr>
-              <w:instrText xml:space="preserve"> PAGEREF _Toc210125401 \h </w:instrText>
-            </w:r>
-            <w:r>
-              <w:rPr>
-                <w:rStyle w:val="Hipervnculo"/>
-                <w:noProof/>
-                <w:webHidden/>
-              </w:rPr>
-            </w:r>
-            <w:r>
-              <w:rPr>
-                <w:rStyle w:val="Hipervnculo"/>
-                <w:noProof/>
-                <w:webHidden/>
-              </w:rPr>
-              <w:fldChar w:fldCharType="separate"/>
-            </w:r>
-            <w:r>
-              <w:rPr>
-                <w:rStyle w:val="Hipervnculo"/>
-                <w:noProof/>
-                <w:webHidden/>
-              </w:rPr>
-              <w:t>5</w:t>
-            </w:r>
-            <w:r>
-              <w:rPr>
-                <w:rStyle w:val="Hipervnculo"/>
+              <w:t>14</w:t>
+            </w:r>
+            <w:r>
+              <w:rPr>
                 <w:noProof/>
                 <w:webHidden/>
               </w:rPr>
@@ -3966,13 +3845,13 @@
               <w:lang w:eastAsia="es-ES"/>
             </w:rPr>
           </w:pPr>
-          <w:hyperlink w:anchor="_Toc210125402" w:history="1">
+          <w:hyperlink w:anchor="_Toc221908774" w:history="1">
             <w:r>
               <w:rPr>
                 <w:rStyle w:val="Hipervnculo"/>
                 <w:noProof/>
               </w:rPr>
-              <w:t>10.</w:t>
+              <w:t>9.1.</w:t>
             </w:r>
             <w:r>
               <w:rPr>
@@ -3989,7 +3868,7 @@
                 <w:rStyle w:val="Hipervnculo"/>
                 <w:noProof/>
               </w:rPr>
-              <w:t>GUÍA DE ESTILOS Y MANUAL DE USUARIO</w:t>
+              <w:t>INSTALACIÓN</w:t>
             </w:r>
             <w:r>
               <w:rPr>
@@ -4010,7 +3889,7 @@
                 <w:noProof/>
                 <w:webHidden/>
               </w:rPr>
-              <w:instrText xml:space="preserve"> PAGEREF _Toc210125402 \h </w:instrText>
+              <w:instrText xml:space="preserve"> PAGEREF _Toc221908774 \h </w:instrText>
             </w:r>
             <w:r>
               <w:rPr>
@@ -4030,194 +3909,10 @@
                 <w:noProof/>
                 <w:webHidden/>
               </w:rPr>
-              <w:t>5</w:t>
-            </w:r>
-            <w:r>
-              <w:rPr>
-                <w:noProof/>
-                <w:webHidden/>
-              </w:rPr>
-              <w:fldChar w:fldCharType="end"/>
-            </w:r>
-          </w:hyperlink>
-        </w:p>
-        <w:p>
-          <w:pPr>
-            <w:pStyle w:val="TDC2"/>
-            <w:tabs>
-              <w:tab w:val="left" w:pos="1200"/>
-              <w:tab w:val="right" w:leader="dot" w:pos="9628"/>
-            </w:tabs>
-            <w:ind w:firstLine="347"/>
-            <w:rPr>
-              <w:rStyle w:val="Hipervnculo"/>
-              <w:noProof/>
-            </w:rPr>
-          </w:pPr>
-          <w:hyperlink w:anchor="_Toc210125404" w:history="1">
-            <w:r>
-              <w:rPr>
-                <w:rStyle w:val="Hipervnculo"/>
-                <w:noProof/>
-              </w:rPr>
-              <w:t>10.1.</w:t>
-            </w:r>
-            <w:r>
-              <w:rPr>
-                <w:rStyle w:val="Hipervnculo"/>
-                <w:noProof/>
-              </w:rPr>
-              <w:tab/>
-            </w:r>
-            <w:r>
-              <w:rPr>
-                <w:rStyle w:val="Hipervnculo"/>
-                <w:noProof/>
-              </w:rPr>
-              <w:t>GUÍA DE ESTILOS</w:t>
-            </w:r>
-            <w:r>
-              <w:rPr>
-                <w:rStyle w:val="Hipervnculo"/>
-                <w:noProof/>
-                <w:webHidden/>
-              </w:rPr>
-              <w:tab/>
-            </w:r>
-            <w:r>
-              <w:rPr>
-                <w:rStyle w:val="Hipervnculo"/>
-                <w:noProof/>
-                <w:webHidden/>
-              </w:rPr>
-              <w:fldChar w:fldCharType="begin"/>
-            </w:r>
-            <w:r>
-              <w:rPr>
-                <w:rStyle w:val="Hipervnculo"/>
-                <w:noProof/>
-                <w:webHidden/>
-              </w:rPr>
-              <w:instrText xml:space="preserve"> PAGEREF _Toc210125404 \h </w:instrText>
-            </w:r>
-            <w:r>
-              <w:rPr>
-                <w:rStyle w:val="Hipervnculo"/>
-                <w:noProof/>
-                <w:webHidden/>
-              </w:rPr>
-            </w:r>
-            <w:r>
-              <w:rPr>
-                <w:rStyle w:val="Hipervnculo"/>
-                <w:noProof/>
-                <w:webHidden/>
-              </w:rPr>
-              <w:fldChar w:fldCharType="separate"/>
-            </w:r>
-            <w:r>
-              <w:rPr>
-                <w:rStyle w:val="Hipervnculo"/>
-                <w:noProof/>
-                <w:webHidden/>
-              </w:rPr>
-              <w:t>5</w:t>
-            </w:r>
-            <w:r>
-              <w:rPr>
-                <w:rStyle w:val="Hipervnculo"/>
-                <w:noProof/>
-                <w:webHidden/>
-              </w:rPr>
-              <w:fldChar w:fldCharType="end"/>
-            </w:r>
-          </w:hyperlink>
-        </w:p>
-        <w:p>
-          <w:pPr>
-            <w:pStyle w:val="TDC2"/>
-            <w:tabs>
-              <w:tab w:val="left" w:pos="1200"/>
-              <w:tab w:val="right" w:leader="dot" w:pos="9628"/>
-            </w:tabs>
-            <w:ind w:firstLine="347"/>
-            <w:rPr>
-              <w:rStyle w:val="Hipervnculo"/>
-              <w:noProof/>
-            </w:rPr>
-          </w:pPr>
-          <w:hyperlink w:anchor="_Toc210125405" w:history="1">
-            <w:r>
-              <w:rPr>
-                <w:rStyle w:val="Hipervnculo"/>
-                <w:noProof/>
-              </w:rPr>
-              <w:t>10.2.</w:t>
-            </w:r>
-            <w:r>
-              <w:rPr>
-                <w:rStyle w:val="Hipervnculo"/>
-                <w:noProof/>
-              </w:rPr>
-              <w:tab/>
-            </w:r>
-            <w:r>
-              <w:rPr>
-                <w:rStyle w:val="Hipervnculo"/>
-                <w:noProof/>
-              </w:rPr>
-              <w:t>MANUAL DE USUARIO</w:t>
-            </w:r>
-            <w:r>
-              <w:rPr>
-                <w:rStyle w:val="Hipervnculo"/>
-                <w:noProof/>
-                <w:webHidden/>
-              </w:rPr>
-              <w:tab/>
-            </w:r>
-            <w:r>
-              <w:rPr>
-                <w:rStyle w:val="Hipervnculo"/>
-                <w:noProof/>
-                <w:webHidden/>
-              </w:rPr>
-              <w:fldChar w:fldCharType="begin"/>
-            </w:r>
-            <w:r>
-              <w:rPr>
-                <w:rStyle w:val="Hipervnculo"/>
-                <w:noProof/>
-                <w:webHidden/>
-              </w:rPr>
-              <w:instrText xml:space="preserve"> PAGEREF _Toc210125405 \h </w:instrText>
-            </w:r>
-            <w:r>
-              <w:rPr>
-                <w:rStyle w:val="Hipervnculo"/>
-                <w:noProof/>
-                <w:webHidden/>
-              </w:rPr>
-            </w:r>
-            <w:r>
-              <w:rPr>
-                <w:rStyle w:val="Hipervnculo"/>
-                <w:noProof/>
-                <w:webHidden/>
-              </w:rPr>
-              <w:fldChar w:fldCharType="separate"/>
-            </w:r>
-            <w:r>
-              <w:rPr>
-                <w:rStyle w:val="Hipervnculo"/>
-                <w:noProof/>
-                <w:webHidden/>
-              </w:rPr>
-              <w:t>5</w:t>
-            </w:r>
-            <w:r>
-              <w:rPr>
-                <w:rStyle w:val="Hipervnculo"/>
+              <w:t>14</w:t>
+            </w:r>
+            <w:r>
+              <w:rPr>
                 <w:noProof/>
                 <w:webHidden/>
               </w:rPr>
@@ -4240,13 +3935,13 @@
               <w:lang w:eastAsia="es-ES"/>
             </w:rPr>
           </w:pPr>
-          <w:hyperlink w:anchor="_Toc210125406" w:history="1">
+          <w:hyperlink w:anchor="_Toc221908775" w:history="1">
             <w:r>
               <w:rPr>
                 <w:rStyle w:val="Hipervnculo"/>
                 <w:noProof/>
               </w:rPr>
-              <w:t>11.</w:t>
+              <w:t>10.</w:t>
             </w:r>
             <w:r>
               <w:rPr>
@@ -4263,6 +3958,276 @@
                 <w:rStyle w:val="Hipervnculo"/>
                 <w:noProof/>
               </w:rPr>
+              <w:t>GUÍA DE ESTILOS Y MANUAL DE USUARIO</w:t>
+            </w:r>
+            <w:r>
+              <w:rPr>
+                <w:noProof/>
+                <w:webHidden/>
+              </w:rPr>
+              <w:tab/>
+            </w:r>
+            <w:r>
+              <w:rPr>
+                <w:noProof/>
+                <w:webHidden/>
+              </w:rPr>
+              <w:fldChar w:fldCharType="begin"/>
+            </w:r>
+            <w:r>
+              <w:rPr>
+                <w:noProof/>
+                <w:webHidden/>
+              </w:rPr>
+              <w:instrText xml:space="preserve"> PAGEREF _Toc221908775 \h </w:instrText>
+            </w:r>
+            <w:r>
+              <w:rPr>
+                <w:noProof/>
+                <w:webHidden/>
+              </w:rPr>
+            </w:r>
+            <w:r>
+              <w:rPr>
+                <w:noProof/>
+                <w:webHidden/>
+              </w:rPr>
+              <w:fldChar w:fldCharType="separate"/>
+            </w:r>
+            <w:r>
+              <w:rPr>
+                <w:noProof/>
+                <w:webHidden/>
+              </w:rPr>
+              <w:t>14</w:t>
+            </w:r>
+            <w:r>
+              <w:rPr>
+                <w:noProof/>
+                <w:webHidden/>
+              </w:rPr>
+              <w:fldChar w:fldCharType="end"/>
+            </w:r>
+          </w:hyperlink>
+        </w:p>
+        <w:p>
+          <w:pPr>
+            <w:pStyle w:val="TDC2"/>
+            <w:tabs>
+              <w:tab w:val="left" w:pos="960"/>
+              <w:tab w:val="right" w:leader="dot" w:pos="9628"/>
+            </w:tabs>
+            <w:rPr>
+              <w:rFonts w:eastAsiaTheme="minorEastAsia"/>
+              <w:noProof/>
+              <w:sz w:val="24"/>
+              <w:szCs w:val="24"/>
+              <w:lang w:eastAsia="es-ES"/>
+            </w:rPr>
+          </w:pPr>
+          <w:hyperlink w:anchor="_Toc221908777" w:history="1">
+            <w:r>
+              <w:rPr>
+                <w:rStyle w:val="Hipervnculo"/>
+                <w:noProof/>
+              </w:rPr>
+              <w:t>10.1.</w:t>
+            </w:r>
+            <w:r>
+              <w:rPr>
+                <w:rFonts w:eastAsiaTheme="minorEastAsia"/>
+                <w:noProof/>
+                <w:sz w:val="24"/>
+                <w:szCs w:val="24"/>
+                <w:lang w:eastAsia="es-ES"/>
+              </w:rPr>
+              <w:tab/>
+            </w:r>
+            <w:r>
+              <w:rPr>
+                <w:rStyle w:val="Hipervnculo"/>
+                <w:noProof/>
+              </w:rPr>
+              <w:t>GUÍA DE ESTILOS</w:t>
+            </w:r>
+            <w:r>
+              <w:rPr>
+                <w:noProof/>
+                <w:webHidden/>
+              </w:rPr>
+              <w:tab/>
+            </w:r>
+            <w:r>
+              <w:rPr>
+                <w:noProof/>
+                <w:webHidden/>
+              </w:rPr>
+              <w:fldChar w:fldCharType="begin"/>
+            </w:r>
+            <w:r>
+              <w:rPr>
+                <w:noProof/>
+                <w:webHidden/>
+              </w:rPr>
+              <w:instrText xml:space="preserve"> PAGEREF _Toc221908777 \h </w:instrText>
+            </w:r>
+            <w:r>
+              <w:rPr>
+                <w:noProof/>
+                <w:webHidden/>
+              </w:rPr>
+            </w:r>
+            <w:r>
+              <w:rPr>
+                <w:noProof/>
+                <w:webHidden/>
+              </w:rPr>
+              <w:fldChar w:fldCharType="separate"/>
+            </w:r>
+            <w:r>
+              <w:rPr>
+                <w:noProof/>
+                <w:webHidden/>
+              </w:rPr>
+              <w:t>15</w:t>
+            </w:r>
+            <w:r>
+              <w:rPr>
+                <w:noProof/>
+                <w:webHidden/>
+              </w:rPr>
+              <w:fldChar w:fldCharType="end"/>
+            </w:r>
+          </w:hyperlink>
+        </w:p>
+        <w:p>
+          <w:pPr>
+            <w:pStyle w:val="TDC2"/>
+            <w:tabs>
+              <w:tab w:val="left" w:pos="960"/>
+              <w:tab w:val="right" w:leader="dot" w:pos="9628"/>
+            </w:tabs>
+            <w:rPr>
+              <w:rFonts w:eastAsiaTheme="minorEastAsia"/>
+              <w:noProof/>
+              <w:sz w:val="24"/>
+              <w:szCs w:val="24"/>
+              <w:lang w:eastAsia="es-ES"/>
+            </w:rPr>
+          </w:pPr>
+          <w:hyperlink w:anchor="_Toc221908778" w:history="1">
+            <w:r>
+              <w:rPr>
+                <w:rStyle w:val="Hipervnculo"/>
+                <w:noProof/>
+              </w:rPr>
+              <w:t>10.2.</w:t>
+            </w:r>
+            <w:r>
+              <w:rPr>
+                <w:rFonts w:eastAsiaTheme="minorEastAsia"/>
+                <w:noProof/>
+                <w:sz w:val="24"/>
+                <w:szCs w:val="24"/>
+                <w:lang w:eastAsia="es-ES"/>
+              </w:rPr>
+              <w:tab/>
+            </w:r>
+            <w:r>
+              <w:rPr>
+                <w:rStyle w:val="Hipervnculo"/>
+                <w:noProof/>
+              </w:rPr>
+              <w:t>MANUAL DE USUARIO</w:t>
+            </w:r>
+            <w:r>
+              <w:rPr>
+                <w:noProof/>
+                <w:webHidden/>
+              </w:rPr>
+              <w:tab/>
+            </w:r>
+            <w:r>
+              <w:rPr>
+                <w:noProof/>
+                <w:webHidden/>
+              </w:rPr>
+              <w:fldChar w:fldCharType="begin"/>
+            </w:r>
+            <w:r>
+              <w:rPr>
+                <w:noProof/>
+                <w:webHidden/>
+              </w:rPr>
+              <w:instrText xml:space="preserve"> PAGEREF _Toc221908778 \h </w:instrText>
+            </w:r>
+            <w:r>
+              <w:rPr>
+                <w:noProof/>
+                <w:webHidden/>
+              </w:rPr>
+            </w:r>
+            <w:r>
+              <w:rPr>
+                <w:noProof/>
+                <w:webHidden/>
+              </w:rPr>
+              <w:fldChar w:fldCharType="separate"/>
+            </w:r>
+            <w:r>
+              <w:rPr>
+                <w:noProof/>
+                <w:webHidden/>
+              </w:rPr>
+              <w:t>15</w:t>
+            </w:r>
+            <w:r>
+              <w:rPr>
+                <w:noProof/>
+                <w:webHidden/>
+              </w:rPr>
+              <w:fldChar w:fldCharType="end"/>
+            </w:r>
+          </w:hyperlink>
+        </w:p>
+        <w:p>
+          <w:pPr>
+            <w:pStyle w:val="TDC2"/>
+            <w:tabs>
+              <w:tab w:val="left" w:pos="960"/>
+              <w:tab w:val="right" w:leader="dot" w:pos="9628"/>
+            </w:tabs>
+            <w:rPr>
+              <w:rFonts w:eastAsiaTheme="minorEastAsia"/>
+              <w:noProof/>
+              <w:sz w:val="24"/>
+              <w:szCs w:val="24"/>
+              <w:lang w:eastAsia="es-ES"/>
+            </w:rPr>
+          </w:pPr>
+          <w:hyperlink w:anchor="_Toc221908779" w:history="1">
+            <w:r>
+              <w:rPr>
+                <w:rStyle w:val="Hipervnculo"/>
+                <w:noProof/>
+              </w:rPr>
+              <w:t>11.</w:t>
+            </w:r>
+            <w:r>
+              <w:rPr>
+                <w:rFonts w:eastAsiaTheme="minorEastAsia"/>
+                <w:noProof/>
+                <w:sz w:val="24"/>
+                <w:szCs w:val="24"/>
+                <w:lang w:eastAsia="es-ES"/>
+              </w:rPr>
+              <w:tab/>
+            </w:r>
+            <w:r>
+              <w:rPr>
+                <w:rStyle w:val="Hipervnculo"/>
+                <w:noProof/>
+              </w:rPr>
               <w:t>WEBGRAFÍA Y FUENTES DE INFORMACIÓN</w:t>
             </w:r>
             <w:r>
@@ -4284,7 +4249,7 @@
                 <w:noProof/>
                 <w:webHidden/>
               </w:rPr>
-              <w:instrText xml:space="preserve"> PAGEREF _Toc210125406 \h </w:instrText>
+              <w:instrText xml:space="preserve"> PAGEREF _Toc221908779 \h </w:instrText>
             </w:r>
             <w:r>
               <w:rPr>
@@ -4304,7 +4269,7 @@
                 <w:noProof/>
                 <w:webHidden/>
               </w:rPr>
-              <w:t>5</w:t>
+              <w:t>15</w:t>
             </w:r>
             <w:r>
               <w:rPr>
@@ -4396,7 +4361,7 @@
       <w:r>
         <w:fldChar w:fldCharType="separate"/>
       </w:r>
-      <w:hyperlink w:anchor="_Toc213432234" w:history="1">
+      <w:hyperlink w:anchor="_Toc221908851" w:history="1">
         <w:r>
           <w:rPr>
             <w:rStyle w:val="Hipervnculo"/>
@@ -4423,7 +4388,7 @@
             <w:noProof/>
             <w:webHidden/>
           </w:rPr>
-          <w:instrText xml:space="preserve"> PAGEREF _Toc213432234 \h </w:instrText>
+          <w:instrText xml:space="preserve"> PAGEREF _Toc221908851 \h </w:instrText>
         </w:r>
         <w:r>
           <w:rPr>
@@ -4468,13 +4433,13 @@
           <w:lang w:eastAsia="es-ES"/>
         </w:rPr>
       </w:pPr>
-      <w:hyperlink w:anchor="_Toc213432235" w:history="1">
+      <w:hyperlink w:anchor="_Toc221908852" w:history="1">
         <w:r>
           <w:rPr>
             <w:rStyle w:val="Hipervnculo"/>
             <w:noProof/>
           </w:rPr>
-          <w:t>Figura 2. Imagen02 no disponible</w:t>
+          <w:t>Figura 2. Diagrama Entidad/Relación</w:t>
         </w:r>
         <w:r>
           <w:rPr>
@@ -4495,151 +4460,7 @@
             <w:noProof/>
             <w:webHidden/>
           </w:rPr>
-          <w:instrText xml:space="preserve"> PAGEREF _Toc213432235 \h </w:instrText>
-        </w:r>
-        <w:r>
-          <w:rPr>
-            <w:noProof/>
-            <w:webHidden/>
-          </w:rPr>
-        </w:r>
-        <w:r>
-          <w:rPr>
-            <w:noProof/>
-            <w:webHidden/>
-          </w:rPr>
-          <w:fldChar w:fldCharType="separate"/>
-        </w:r>
-        <w:r>
-          <w:rPr>
-            <w:noProof/>
-            <w:webHidden/>
-          </w:rPr>
-          <w:t>6</w:t>
-        </w:r>
-        <w:r>
-          <w:rPr>
-            <w:noProof/>
-            <w:webHidden/>
-          </w:rPr>
-          <w:fldChar w:fldCharType="end"/>
-        </w:r>
-      </w:hyperlink>
-    </w:p>
-    <w:p>
-      <w:pPr>
-        <w:pStyle w:val="Tabladeilustraciones"/>
-        <w:tabs>
-          <w:tab w:val="right" w:leader="dot" w:pos="9628"/>
-        </w:tabs>
-        <w:rPr>
-          <w:rFonts w:eastAsiaTheme="minorEastAsia"/>
-          <w:noProof/>
-          <w:sz w:val="24"/>
-          <w:szCs w:val="24"/>
-          <w:lang w:eastAsia="es-ES"/>
-        </w:rPr>
-      </w:pPr>
-      <w:hyperlink w:anchor="_Toc213432236" w:history="1">
-        <w:r>
-          <w:rPr>
-            <w:rStyle w:val="Hipervnculo"/>
-            <w:noProof/>
-          </w:rPr>
-          <w:t>Figura 3. Diagrama de clases.</w:t>
-        </w:r>
-        <w:r>
-          <w:rPr>
-            <w:noProof/>
-            <w:webHidden/>
-          </w:rPr>
-          <w:tab/>
-        </w:r>
-        <w:r>
-          <w:rPr>
-            <w:noProof/>
-            <w:webHidden/>
-          </w:rPr>
-          <w:fldChar w:fldCharType="begin"/>
-        </w:r>
-        <w:r>
-          <w:rPr>
-            <w:noProof/>
-            <w:webHidden/>
-          </w:rPr>
-          <w:instrText xml:space="preserve"> PAGEREF _Toc213432236 \h </w:instrText>
-        </w:r>
-        <w:r>
-          <w:rPr>
-            <w:noProof/>
-            <w:webHidden/>
-          </w:rPr>
-        </w:r>
-        <w:r>
-          <w:rPr>
-            <w:noProof/>
-            <w:webHidden/>
-          </w:rPr>
-          <w:fldChar w:fldCharType="separate"/>
-        </w:r>
-        <w:r>
-          <w:rPr>
-            <w:noProof/>
-            <w:webHidden/>
-          </w:rPr>
-          <w:t>6</w:t>
-        </w:r>
-        <w:r>
-          <w:rPr>
-            <w:noProof/>
-            <w:webHidden/>
-          </w:rPr>
-          <w:fldChar w:fldCharType="end"/>
-        </w:r>
-      </w:hyperlink>
-    </w:p>
-    <w:p>
-      <w:pPr>
-        <w:pStyle w:val="Tabladeilustraciones"/>
-        <w:tabs>
-          <w:tab w:val="right" w:leader="dot" w:pos="9628"/>
-        </w:tabs>
-        <w:rPr>
-          <w:rFonts w:eastAsiaTheme="minorEastAsia"/>
-          <w:noProof/>
-          <w:sz w:val="24"/>
-          <w:szCs w:val="24"/>
-          <w:lang w:eastAsia="es-ES"/>
-        </w:rPr>
-      </w:pPr>
-      <w:hyperlink w:anchor="_Toc213432237" w:history="1">
-        <w:r>
-          <w:rPr>
-            <w:rStyle w:val="Hipervnculo"/>
-            <w:noProof/>
-          </w:rPr>
-          <w:t>Figura 4. Pantalla de inicio de sesión.</w:t>
-        </w:r>
-        <w:r>
-          <w:rPr>
-            <w:noProof/>
-            <w:webHidden/>
-          </w:rPr>
-          <w:tab/>
-        </w:r>
-        <w:r>
-          <w:rPr>
-            <w:noProof/>
-            <w:webHidden/>
-          </w:rPr>
-          <w:fldChar w:fldCharType="begin"/>
-        </w:r>
-        <w:r>
-          <w:rPr>
-            <w:noProof/>
-            <w:webHidden/>
-          </w:rPr>
-          <w:instrText xml:space="preserve"> PAGEREF _Toc213432237 \h </w:instrText>
+          <w:instrText xml:space="preserve"> PAGEREF _Toc221908852 \h </w:instrText>
         </w:r>
         <w:r>
           <w:rPr>
@@ -4684,13 +4505,13 @@
           <w:lang w:eastAsia="es-ES"/>
         </w:rPr>
       </w:pPr>
-      <w:hyperlink w:anchor="_Toc213432238" w:history="1">
+      <w:hyperlink w:anchor="_Toc221908853" w:history="1">
         <w:r>
           <w:rPr>
             <w:rStyle w:val="Hipervnculo"/>
             <w:noProof/>
           </w:rPr>
-          <w:t>Figura 5. Pantalla Nueva FCT</w:t>
+          <w:t>Figura 3. Diagrama de clases.</w:t>
         </w:r>
         <w:r>
           <w:rPr>
@@ -4711,7 +4532,7 @@
             <w:noProof/>
             <w:webHidden/>
           </w:rPr>
-          <w:instrText xml:space="preserve"> PAGEREF _Toc213432238 \h </w:instrText>
+          <w:instrText xml:space="preserve"> PAGEREF _Toc221908853 \h </w:instrText>
         </w:r>
         <w:r>
           <w:rPr>
@@ -4731,7 +4552,7 @@
             <w:noProof/>
             <w:webHidden/>
           </w:rPr>
-          <w:t>7</w:t>
+          <w:t>9</w:t>
         </w:r>
         <w:r>
           <w:rPr>
@@ -4743,6 +4564,294 @@
       </w:hyperlink>
     </w:p>
     <w:p>
+      <w:pPr>
+        <w:pStyle w:val="Tabladeilustraciones"/>
+        <w:tabs>
+          <w:tab w:val="right" w:leader="dot" w:pos="9628"/>
+        </w:tabs>
+        <w:rPr>
+          <w:rFonts w:eastAsiaTheme="minorEastAsia"/>
+          <w:noProof/>
+          <w:sz w:val="24"/>
+          <w:szCs w:val="24"/>
+          <w:lang w:eastAsia="es-ES"/>
+        </w:rPr>
+      </w:pPr>
+      <w:hyperlink w:anchor="_Toc221908854" w:history="1">
+        <w:r>
+          <w:rPr>
+            <w:rStyle w:val="Hipervnculo"/>
+            <w:noProof/>
+          </w:rPr>
+          <w:t>Figura 4. Pantalla de inicio de sesión - Desktop</w:t>
+        </w:r>
+        <w:r>
+          <w:rPr>
+            <w:noProof/>
+            <w:webHidden/>
+          </w:rPr>
+          <w:tab/>
+        </w:r>
+        <w:r>
+          <w:rPr>
+            <w:noProof/>
+            <w:webHidden/>
+          </w:rPr>
+          <w:fldChar w:fldCharType="begin"/>
+        </w:r>
+        <w:r>
+          <w:rPr>
+            <w:noProof/>
+            <w:webHidden/>
+          </w:rPr>
+          <w:instrText xml:space="preserve"> PAGEREF _Toc221908854 \h </w:instrText>
+        </w:r>
+        <w:r>
+          <w:rPr>
+            <w:noProof/>
+            <w:webHidden/>
+          </w:rPr>
+        </w:r>
+        <w:r>
+          <w:rPr>
+            <w:noProof/>
+            <w:webHidden/>
+          </w:rPr>
+          <w:fldChar w:fldCharType="separate"/>
+        </w:r>
+        <w:r>
+          <w:rPr>
+            <w:noProof/>
+            <w:webHidden/>
+          </w:rPr>
+          <w:t>10</w:t>
+        </w:r>
+        <w:r>
+          <w:rPr>
+            <w:noProof/>
+            <w:webHidden/>
+          </w:rPr>
+          <w:fldChar w:fldCharType="end"/>
+        </w:r>
+      </w:hyperlink>
+    </w:p>
+    <w:p>
+      <w:pPr>
+        <w:pStyle w:val="Tabladeilustraciones"/>
+        <w:tabs>
+          <w:tab w:val="right" w:leader="dot" w:pos="9628"/>
+        </w:tabs>
+        <w:rPr>
+          <w:rFonts w:eastAsiaTheme="minorEastAsia"/>
+          <w:noProof/>
+          <w:sz w:val="24"/>
+          <w:szCs w:val="24"/>
+          <w:lang w:eastAsia="es-ES"/>
+        </w:rPr>
+      </w:pPr>
+      <w:hyperlink w:anchor="_Toc221908855" w:history="1">
+        <w:r>
+          <w:rPr>
+            <w:rStyle w:val="Hipervnculo"/>
+            <w:noProof/>
+          </w:rPr>
+          <w:t>Figura 5. Pantalla Nueva FCT - Desktop</w:t>
+        </w:r>
+        <w:r>
+          <w:rPr>
+            <w:noProof/>
+            <w:webHidden/>
+          </w:rPr>
+          <w:tab/>
+        </w:r>
+        <w:r>
+          <w:rPr>
+            <w:noProof/>
+            <w:webHidden/>
+          </w:rPr>
+          <w:fldChar w:fldCharType="begin"/>
+        </w:r>
+        <w:r>
+          <w:rPr>
+            <w:noProof/>
+            <w:webHidden/>
+          </w:rPr>
+          <w:instrText xml:space="preserve"> PAGEREF _Toc221908855 \h </w:instrText>
+        </w:r>
+        <w:r>
+          <w:rPr>
+            <w:noProof/>
+            <w:webHidden/>
+          </w:rPr>
+        </w:r>
+        <w:r>
+          <w:rPr>
+            <w:noProof/>
+            <w:webHidden/>
+          </w:rPr>
+          <w:fldChar w:fldCharType="separate"/>
+        </w:r>
+        <w:r>
+          <w:rPr>
+            <w:noProof/>
+            <w:webHidden/>
+          </w:rPr>
+          <w:t>10</w:t>
+        </w:r>
+        <w:r>
+          <w:rPr>
+            <w:noProof/>
+            <w:webHidden/>
+          </w:rPr>
+          <w:fldChar w:fldCharType="end"/>
+        </w:r>
+      </w:hyperlink>
+    </w:p>
+    <w:p>
+      <w:pPr>
+        <w:pStyle w:val="Tabladeilustraciones"/>
+        <w:tabs>
+          <w:tab w:val="right" w:leader="dot" w:pos="9628"/>
+        </w:tabs>
+        <w:rPr>
+          <w:rFonts w:eastAsiaTheme="minorEastAsia"/>
+          <w:noProof/>
+          <w:sz w:val="24"/>
+          <w:szCs w:val="24"/>
+          <w:lang w:eastAsia="es-ES"/>
+        </w:rPr>
+      </w:pPr>
+      <w:hyperlink w:anchor="_Toc221908856" w:history="1">
+        <w:r>
+          <w:rPr>
+            <w:rStyle w:val="Hipervnculo"/>
+            <w:noProof/>
+          </w:rPr>
+          <w:t>Figura 6. Pantalla inicial usuario Estudiante - Móvil</w:t>
+        </w:r>
+        <w:r>
+          <w:rPr>
+            <w:noProof/>
+            <w:webHidden/>
+          </w:rPr>
+          <w:tab/>
+        </w:r>
+        <w:r>
+          <w:rPr>
+            <w:noProof/>
+            <w:webHidden/>
+          </w:rPr>
+          <w:fldChar w:fldCharType="begin"/>
+        </w:r>
+        <w:r>
+          <w:rPr>
+            <w:noProof/>
+            <w:webHidden/>
+          </w:rPr>
+          <w:instrText xml:space="preserve"> PAGEREF _Toc221908856 \h </w:instrText>
+        </w:r>
+        <w:r>
+          <w:rPr>
+            <w:noProof/>
+            <w:webHidden/>
+          </w:rPr>
+        </w:r>
+        <w:r>
+          <w:rPr>
+            <w:noProof/>
+            <w:webHidden/>
+          </w:rPr>
+          <w:fldChar w:fldCharType="separate"/>
+        </w:r>
+        <w:r>
+          <w:rPr>
+            <w:noProof/>
+            <w:webHidden/>
+          </w:rPr>
+          <w:t>11</w:t>
+        </w:r>
+        <w:r>
+          <w:rPr>
+            <w:noProof/>
+            <w:webHidden/>
+          </w:rPr>
+          <w:fldChar w:fldCharType="end"/>
+        </w:r>
+      </w:hyperlink>
+    </w:p>
+    <w:p>
+      <w:pPr>
+        <w:pStyle w:val="Tabladeilustraciones"/>
+        <w:tabs>
+          <w:tab w:val="right" w:leader="dot" w:pos="9628"/>
+        </w:tabs>
+        <w:rPr>
+          <w:rFonts w:eastAsiaTheme="minorEastAsia"/>
+          <w:noProof/>
+          <w:sz w:val="24"/>
+          <w:szCs w:val="24"/>
+          <w:lang w:eastAsia="es-ES"/>
+        </w:rPr>
+      </w:pPr>
+      <w:hyperlink w:anchor="_Toc221908857" w:history="1">
+        <w:r>
+          <w:rPr>
+            <w:rStyle w:val="Hipervnculo"/>
+            <w:noProof/>
+          </w:rPr>
+          <w:t>Figura 7. Pantalla Añadir justificante usuario Estudiante - Móvil</w:t>
+        </w:r>
+        <w:r>
+          <w:rPr>
+            <w:noProof/>
+            <w:webHidden/>
+          </w:rPr>
+          <w:tab/>
+        </w:r>
+        <w:r>
+          <w:rPr>
+            <w:noProof/>
+            <w:webHidden/>
+          </w:rPr>
+          <w:fldChar w:fldCharType="begin"/>
+        </w:r>
+        <w:r>
+          <w:rPr>
+            <w:noProof/>
+            <w:webHidden/>
+          </w:rPr>
+          <w:instrText xml:space="preserve"> PAGEREF _Toc221908857 \h </w:instrText>
+        </w:r>
+        <w:r>
+          <w:rPr>
+            <w:noProof/>
+            <w:webHidden/>
+          </w:rPr>
+        </w:r>
+        <w:r>
+          <w:rPr>
+            <w:noProof/>
+            <w:webHidden/>
+          </w:rPr>
+          <w:fldChar w:fldCharType="separate"/>
+        </w:r>
+        <w:r>
+          <w:rPr>
+            <w:noProof/>
+            <w:webHidden/>
+          </w:rPr>
+          <w:t>12</w:t>
+        </w:r>
+        <w:r>
+          <w:rPr>
+            <w:noProof/>
+            <w:webHidden/>
+          </w:rPr>
+          <w:fldChar w:fldCharType="end"/>
+        </w:r>
+      </w:hyperlink>
+    </w:p>
+    <w:p>
       <w:r>
         <w:fldChar w:fldCharType="end"/>
       </w:r>
@@ -4765,7 +4874,7 @@
       <w:pPr>
         <w:pStyle w:val="Ttulo2"/>
       </w:pPr>
-      <w:bookmarkStart w:id="0" w:name="_Toc210125366"/>
+      <w:bookmarkStart w:id="0" w:name="_Toc221908739"/>
       <w:r>
         <w:lastRenderedPageBreak/>
         <w:t>INTRODUCCIÓN</w:t>
@@ -4804,7 +4913,7 @@
           <w:numId w:val="2"/>
         </w:numPr>
       </w:pPr>
-      <w:bookmarkStart w:id="1" w:name="_Toc210125367"/>
+      <w:bookmarkStart w:id="1" w:name="_Toc221908740"/>
       <w:r>
         <w:t>OBJETIVOS DEL PROYECTO</w:t>
       </w:r>
@@ -4826,7 +4935,7 @@
           <w:numId w:val="3"/>
         </w:numPr>
       </w:pPr>
-      <w:bookmarkStart w:id="2" w:name="_Toc210125368"/>
+      <w:bookmarkStart w:id="2" w:name="_Toc221908741"/>
       <w:r>
         <w:t>OBJETIVO GENERAL DEL PROYECTO</w:t>
       </w:r>
@@ -4846,7 +4955,7 @@
           <w:numId w:val="3"/>
         </w:numPr>
       </w:pPr>
-      <w:bookmarkStart w:id="4" w:name="_Toc210125369"/>
+      <w:bookmarkStart w:id="4" w:name="_Toc221908742"/>
       <w:bookmarkEnd w:id="3"/>
       <w:r>
         <w:t>OBJETIVOS ESPECÍFICOS</w:t>
@@ -4968,11 +5077,9 @@
       <w:r>
         <w:t xml:space="preserve">una aplicación de móvil </w:t>
       </w:r>
-      <w:proofErr w:type="spellStart"/>
-      <w:r>
-        <w:t>especifica</w:t>
-      </w:r>
-      <w:proofErr w:type="spellEnd"/>
+      <w:r>
+        <w:t>específica</w:t>
+      </w:r>
       <w:r>
         <w:t xml:space="preserve"> para el perfil Estudiante, centrada en la consulta y gestión de su propia información.</w:t>
       </w:r>
@@ -4997,7 +5104,7 @@
           <w:numId w:val="2"/>
         </w:numPr>
       </w:pPr>
-      <w:bookmarkStart w:id="5" w:name="_Toc210125370"/>
+      <w:bookmarkStart w:id="5" w:name="_Toc221908743"/>
       <w:r>
         <w:t>ANÁLISIS Y DISEÑO</w:t>
       </w:r>
@@ -5038,10 +5145,14 @@
       <w:bookmarkStart w:id="7" w:name="_Toc210123282"/>
       <w:bookmarkStart w:id="8" w:name="_Toc210124613"/>
       <w:bookmarkStart w:id="9" w:name="_Toc210125371"/>
+      <w:bookmarkStart w:id="10" w:name="_Toc221907947"/>
+      <w:bookmarkStart w:id="11" w:name="_Toc221908744"/>
       <w:bookmarkEnd w:id="6"/>
       <w:bookmarkEnd w:id="7"/>
       <w:bookmarkEnd w:id="8"/>
       <w:bookmarkEnd w:id="9"/>
+      <w:bookmarkEnd w:id="10"/>
+      <w:bookmarkEnd w:id="11"/>
     </w:p>
     <w:p>
       <w:pPr>
@@ -5051,11 +5162,11 @@
           <w:numId w:val="3"/>
         </w:numPr>
       </w:pPr>
-      <w:bookmarkStart w:id="10" w:name="_Toc210125372"/>
+      <w:bookmarkStart w:id="12" w:name="_Toc221908745"/>
       <w:r>
         <w:t>REQUISITOS FUNCIONALES</w:t>
       </w:r>
-      <w:bookmarkEnd w:id="10"/>
+      <w:bookmarkEnd w:id="12"/>
     </w:p>
     <w:p>
       <w:pPr>
@@ -5260,11 +5371,11 @@
           <w:numId w:val="3"/>
         </w:numPr>
       </w:pPr>
-      <w:bookmarkStart w:id="11" w:name="_Toc210125373"/>
+      <w:bookmarkStart w:id="13" w:name="_Toc221908746"/>
       <w:r>
         <w:t>REQUISITOS NO FUNCIONALES</w:t>
       </w:r>
-      <w:bookmarkEnd w:id="11"/>
+      <w:bookmarkEnd w:id="13"/>
     </w:p>
     <w:p>
       <w:r>
@@ -5381,11 +5492,11 @@
           <w:numId w:val="3"/>
         </w:numPr>
       </w:pPr>
-      <w:bookmarkStart w:id="12" w:name="_Toc210125374"/>
+      <w:bookmarkStart w:id="14" w:name="_Toc221908747"/>
       <w:r>
         <w:t>CASOS DE USO</w:t>
       </w:r>
-      <w:bookmarkEnd w:id="12"/>
+      <w:bookmarkEnd w:id="14"/>
     </w:p>
     <w:p>
       <w:r>
@@ -5406,12 +5517,12 @@
           <w:numId w:val="3"/>
         </w:numPr>
       </w:pPr>
-      <w:bookmarkStart w:id="13" w:name="_Toc210125375"/>
+      <w:bookmarkStart w:id="15" w:name="_Toc221908748"/>
       <w:r>
         <w:lastRenderedPageBreak/>
         <w:t>DIAGRAMA DE CASOS DE USO</w:t>
       </w:r>
-      <w:bookmarkEnd w:id="13"/>
+      <w:bookmarkEnd w:id="15"/>
     </w:p>
     <w:p>
       <w:pPr>
@@ -5476,7 +5587,7 @@
         <w:pStyle w:val="Descripcin"/>
         <w:jc w:val="center"/>
       </w:pPr>
-      <w:bookmarkStart w:id="14" w:name="_Toc213432234"/>
+      <w:bookmarkStart w:id="16" w:name="_Toc221908851"/>
       <w:r>
         <w:t xml:space="preserve">Figura </w:t>
       </w:r>
@@ -5504,7 +5615,7 @@
       <w:r>
         <w:t>Diagrama de Casos de Uso</w:t>
       </w:r>
-      <w:bookmarkEnd w:id="14"/>
+      <w:bookmarkEnd w:id="16"/>
     </w:p>
     <w:p>
       <w:pPr>
@@ -5514,11 +5625,11 @@
           <w:numId w:val="3"/>
         </w:numPr>
       </w:pPr>
-      <w:bookmarkStart w:id="15" w:name="_Toc210125376"/>
+      <w:bookmarkStart w:id="17" w:name="_Toc221908749"/>
       <w:r>
         <w:t>DESCRIPCIÓN DE LOS ACTORES</w:t>
       </w:r>
-      <w:bookmarkEnd w:id="15"/>
+      <w:bookmarkEnd w:id="17"/>
     </w:p>
     <w:p>
       <w:pPr>
@@ -5612,11 +5723,11 @@
           <w:numId w:val="3"/>
         </w:numPr>
       </w:pPr>
-      <w:bookmarkStart w:id="16" w:name="_Toc210125377"/>
+      <w:bookmarkStart w:id="18" w:name="_Toc221908750"/>
       <w:r>
         <w:t>DESCRIPCIÓN DE LOS CASOS DE USO</w:t>
       </w:r>
-      <w:bookmarkEnd w:id="16"/>
+      <w:bookmarkEnd w:id="18"/>
     </w:p>
     <w:p>
       <w:pPr>
@@ -5891,11 +6002,11 @@
           <w:numId w:val="3"/>
         </w:numPr>
       </w:pPr>
-      <w:bookmarkStart w:id="17" w:name="_Toc210125378"/>
+      <w:bookmarkStart w:id="19" w:name="_Toc221908751"/>
       <w:r>
         <w:t>MODELOS DE DATOS</w:t>
       </w:r>
-      <w:bookmarkEnd w:id="17"/>
+      <w:bookmarkEnd w:id="19"/>
     </w:p>
     <w:p/>
     <w:p>
@@ -5930,12 +6041,12 @@
           <w:numId w:val="3"/>
         </w:numPr>
       </w:pPr>
-      <w:bookmarkStart w:id="18" w:name="_Toc210125379"/>
+      <w:bookmarkStart w:id="20" w:name="_Toc221908752"/>
       <w:r>
         <w:lastRenderedPageBreak/>
         <w:t>DIAGRAMA E/R</w:t>
       </w:r>
-      <w:bookmarkEnd w:id="18"/>
+      <w:bookmarkEnd w:id="20"/>
     </w:p>
     <w:p>
       <w:pPr>
@@ -5994,7 +6105,7 @@
         <w:pStyle w:val="Descripcin"/>
         <w:jc w:val="center"/>
       </w:pPr>
-      <w:bookmarkStart w:id="19" w:name="_Toc213432235"/>
+      <w:bookmarkStart w:id="21" w:name="_Toc221908852"/>
       <w:r>
         <w:t xml:space="preserve">Figura </w:t>
       </w:r>
@@ -6019,10 +6130,10 @@
       <w:r>
         <w:t xml:space="preserve">. </w:t>
       </w:r>
-      <w:bookmarkEnd w:id="19"/>
       <w:r>
         <w:t>Diagrama Entidad/Relación</w:t>
       </w:r>
+      <w:bookmarkEnd w:id="21"/>
     </w:p>
     <w:p>
       <w:pPr>
@@ -6032,12 +6143,12 @@
           <w:numId w:val="3"/>
         </w:numPr>
       </w:pPr>
-      <w:bookmarkStart w:id="20" w:name="_Toc210125380"/>
+      <w:bookmarkStart w:id="22" w:name="_Toc221908753"/>
       <w:r>
         <w:lastRenderedPageBreak/>
         <w:t>DIAGRAMA DE CLASES</w:t>
       </w:r>
-      <w:bookmarkEnd w:id="20"/>
+      <w:bookmarkEnd w:id="22"/>
     </w:p>
     <w:p>
       <w:pPr>
@@ -6048,11 +6159,12 @@
         <w:rPr>
           <w:noProof/>
         </w:rPr>
+        <w:lastRenderedPageBreak/>
         <w:drawing>
-          <wp:inline distT="0" distB="0" distL="0" distR="0" wp14:anchorId="2E1B7058" wp14:editId="2494AB8D">
-            <wp:extent cx="5687568" cy="8407033"/>
-            <wp:effectExtent l="0" t="0" r="8890" b="0"/>
-            <wp:docPr id="1154627747" name="Imagen 9"/>
+          <wp:inline distT="0" distB="0" distL="0" distR="0" wp14:anchorId="12EC9159" wp14:editId="42E8EFC1">
+            <wp:extent cx="5929746" cy="8764802"/>
+            <wp:effectExtent l="0" t="0" r="0" b="0"/>
+            <wp:docPr id="45274374" name="Imagen 6" descr="Interfaz de usuario gráfica, Aplicación"/>
             <wp:cNvGraphicFramePr>
               <a:graphicFrameLocks xmlns:a="http://schemas.openxmlformats.org/drawingml/2006/main" noChangeAspect="1"/>
             </wp:cNvGraphicFramePr>
@@ -6060,14 +6172,14 @@
               <a:graphicData uri="http://schemas.openxmlformats.org/drawingml/2006/picture">
                 <pic:pic xmlns:pic="http://schemas.openxmlformats.org/drawingml/2006/picture">
                   <pic:nvPicPr>
-                    <pic:cNvPr id="1154627747" name="Imagen 9"/>
+                    <pic:cNvPr id="45274374" name="Imagen 6" descr="Interfaz de usuario gráfica, Aplicación"/>
                     <pic:cNvPicPr/>
                   </pic:nvPicPr>
                   <pic:blipFill>
                     <a:blip r:embed="rId18">
                       <a:extLst>
-                        <a:ext uri="{96DAC541-7B7A-43D3-8B79-37D633B846F1}">
-                          <asvg:svgBlip xmlns:asvg="http://schemas.microsoft.com/office/drawing/2016/SVG/main" r:embed="rId19"/>
+                        <a:ext uri="{28A0092B-C50C-407E-A947-70E740481C1C}">
+                          <a14:useLocalDpi xmlns:a14="http://schemas.microsoft.com/office/drawing/2010/main" val="0"/>
                         </a:ext>
                       </a:extLst>
                     </a:blip>
@@ -6078,7 +6190,7 @@
                   <pic:spPr>
                     <a:xfrm>
                       <a:off x="0" y="0"/>
-                      <a:ext cx="5710419" cy="8440810"/>
+                      <a:ext cx="5935427" cy="8773200"/>
                     </a:xfrm>
                     <a:prstGeom prst="rect">
                       <a:avLst/>
@@ -6096,7 +6208,7 @@
         <w:pStyle w:val="Descripcin"/>
         <w:jc w:val="center"/>
       </w:pPr>
-      <w:bookmarkStart w:id="21" w:name="_Toc213432236"/>
+      <w:bookmarkStart w:id="23" w:name="_Toc221908853"/>
       <w:r>
         <w:t xml:space="preserve">Figura </w:t>
       </w:r>
@@ -6121,7 +6233,7 @@
       <w:r>
         <w:t>. Diagrama de clases.</w:t>
       </w:r>
-      <w:bookmarkEnd w:id="21"/>
+      <w:bookmarkEnd w:id="23"/>
     </w:p>
     <w:p>
       <w:pPr>
@@ -6131,12 +6243,12 @@
           <w:numId w:val="3"/>
         </w:numPr>
       </w:pPr>
-      <w:bookmarkStart w:id="22" w:name="_Toc210125381"/>
+      <w:bookmarkStart w:id="24" w:name="_Toc221908754"/>
       <w:r>
         <w:lastRenderedPageBreak/>
         <w:t>INTERFACES GRÁFICAS DE USUARIO</w:t>
       </w:r>
-      <w:bookmarkEnd w:id="22"/>
+      <w:bookmarkEnd w:id="24"/>
     </w:p>
     <w:p>
       <w:r>
@@ -6174,7 +6286,7 @@
                     <pic:cNvPicPr/>
                   </pic:nvPicPr>
                   <pic:blipFill>
-                    <a:blip r:embed="rId20">
+                    <a:blip r:embed="rId19">
                       <a:extLst>
                         <a:ext uri="{28A0092B-C50C-407E-A947-70E740481C1C}">
                           <a14:useLocalDpi xmlns:a14="http://schemas.microsoft.com/office/drawing/2010/main" val="0"/>
@@ -6206,7 +6318,7 @@
         <w:pStyle w:val="Descripcin"/>
         <w:jc w:val="center"/>
       </w:pPr>
-      <w:bookmarkStart w:id="23" w:name="_Toc213432237"/>
+      <w:bookmarkStart w:id="25" w:name="_Toc221908854"/>
       <w:r>
         <w:t xml:space="preserve">Figura </w:t>
       </w:r>
@@ -6219,9 +6331,12 @@
         </w:r>
       </w:fldSimple>
       <w:r>
-        <w:t>. Pantalla de inicio de sesión.</w:t>
-      </w:r>
-      <w:bookmarkEnd w:id="23"/>
+        <w:t>. Pantalla de inicio de sesión</w:t>
+      </w:r>
+      <w:r>
+        <w:t xml:space="preserve"> - Desktop</w:t>
+      </w:r>
+      <w:bookmarkEnd w:id="25"/>
     </w:p>
     <w:p>
       <w:pPr>
@@ -6248,7 +6363,7 @@
                     <pic:cNvPicPr/>
                   </pic:nvPicPr>
                   <pic:blipFill>
-                    <a:blip r:embed="rId21" cstate="print">
+                    <a:blip r:embed="rId20" cstate="print">
                       <a:extLst>
                         <a:ext uri="{28A0092B-C50C-407E-A947-70E740481C1C}">
                           <a14:useLocalDpi xmlns:a14="http://schemas.microsoft.com/office/drawing/2010/main" val="0"/>
@@ -6280,7 +6395,7 @@
         <w:pStyle w:val="Descripcin"/>
         <w:jc w:val="center"/>
       </w:pPr>
-      <w:bookmarkStart w:id="24" w:name="_Toc213432238"/>
+      <w:bookmarkStart w:id="26" w:name="_Toc221908855"/>
       <w:r>
         <w:t xml:space="preserve">Figura </w:t>
       </w:r>
@@ -6295,7 +6410,103 @@
       <w:r>
         <w:t>. Pantalla Nueva FCT</w:t>
       </w:r>
-      <w:bookmarkEnd w:id="24"/>
+      <w:r>
+        <w:t xml:space="preserve"> - Desktop</w:t>
+      </w:r>
+      <w:bookmarkEnd w:id="26"/>
+    </w:p>
+    <w:p/>
+    <w:p>
+      <w:r>
+        <w:lastRenderedPageBreak/>
+        <w:t>también algunas de las pantallas propuestas para el usuario Estudiante en la aplicación móvil.</w:t>
+      </w:r>
+    </w:p>
+    <w:p>
+      <w:pPr>
+        <w:keepNext/>
+        <w:jc w:val="center"/>
+        <w:rPr>
+          <w:u w:val="single"/>
+        </w:rPr>
+      </w:pPr>
+      <w:r>
+        <w:rPr>
+          <w:noProof/>
+        </w:rPr>
+        <w:drawing>
+          <wp:inline distT="0" distB="0" distL="0" distR="0" wp14:anchorId="4333422A" wp14:editId="66C1AAEE">
+            <wp:extent cx="5290723" cy="5802523"/>
+            <wp:effectExtent l="0" t="0" r="5715" b="8255"/>
+            <wp:docPr id="58759575" name="Imagen 3"/>
+            <wp:cNvGraphicFramePr>
+              <a:graphicFrameLocks xmlns:a="http://schemas.openxmlformats.org/drawingml/2006/main" noChangeAspect="1"/>
+            </wp:cNvGraphicFramePr>
+            <a:graphic xmlns:a="http://schemas.openxmlformats.org/drawingml/2006/main">
+              <a:graphicData uri="http://schemas.openxmlformats.org/drawingml/2006/picture">
+                <pic:pic xmlns:pic="http://schemas.openxmlformats.org/drawingml/2006/picture">
+                  <pic:nvPicPr>
+                    <pic:cNvPr id="58759575" name="Imagen 3"/>
+                    <pic:cNvPicPr/>
+                  </pic:nvPicPr>
+                  <pic:blipFill>
+                    <a:blip r:embed="rId21">
+                      <a:extLst>
+                        <a:ext uri="{28A0092B-C50C-407E-A947-70E740481C1C}">
+                          <a14:useLocalDpi xmlns:a14="http://schemas.microsoft.com/office/drawing/2010/main" val="0"/>
+                        </a:ext>
+                      </a:extLst>
+                    </a:blip>
+                    <a:stretch>
+                      <a:fillRect/>
+                    </a:stretch>
+                  </pic:blipFill>
+                  <pic:spPr>
+                    <a:xfrm>
+                      <a:off x="0" y="0"/>
+                      <a:ext cx="5290723" cy="5802523"/>
+                    </a:xfrm>
+                    <a:prstGeom prst="rect">
+                      <a:avLst/>
+                    </a:prstGeom>
+                  </pic:spPr>
+                </pic:pic>
+              </a:graphicData>
+            </a:graphic>
+          </wp:inline>
+        </w:drawing>
+      </w:r>
+    </w:p>
+    <w:p>
+      <w:pPr>
+        <w:pStyle w:val="Descripcin"/>
+        <w:jc w:val="center"/>
+      </w:pPr>
+      <w:bookmarkStart w:id="27" w:name="_Toc221908856"/>
+      <w:r>
+        <w:t xml:space="preserve">Figura </w:t>
+      </w:r>
+      <w:fldSimple w:instr=" SEQ Figura \* ARABIC ">
+        <w:r>
+          <w:rPr>
+            <w:noProof/>
+          </w:rPr>
+          <w:t>6</w:t>
+        </w:r>
+      </w:fldSimple>
+      <w:r>
+        <w:t>. Pantalla inicial</w:t>
+      </w:r>
+      <w:r>
+        <w:t xml:space="preserve"> usuario</w:t>
+      </w:r>
+      <w:r>
+        <w:t xml:space="preserve"> Estudiante</w:t>
+      </w:r>
+      <w:r>
+        <w:t xml:space="preserve"> - Móvil</w:t>
+      </w:r>
+      <w:bookmarkEnd w:id="27"/>
     </w:p>
     <w:p>
       <w:pPr>
@@ -6308,10 +6519,93 @@
         </w:rPr>
         <w:lastRenderedPageBreak/>
         <w:drawing>
-          <wp:inline distT="0" distB="0" distL="0" distR="0" wp14:anchorId="4333422A" wp14:editId="207E113D">
+          <wp:inline distT="0" distB="0" distL="0" distR="0" wp14:anchorId="6C646993" wp14:editId="2EDC75F6">
+            <wp:extent cx="5421515" cy="6248051"/>
+            <wp:effectExtent l="0" t="0" r="8255" b="635"/>
+            <wp:docPr id="1157977682" name="Imagen 3"/>
+            <wp:cNvGraphicFramePr>
+              <a:graphicFrameLocks xmlns:a="http://schemas.openxmlformats.org/drawingml/2006/main" noChangeAspect="1"/>
+            </wp:cNvGraphicFramePr>
+            <a:graphic xmlns:a="http://schemas.openxmlformats.org/drawingml/2006/main">
+              <a:graphicData uri="http://schemas.openxmlformats.org/drawingml/2006/picture">
+                <pic:pic xmlns:pic="http://schemas.openxmlformats.org/drawingml/2006/picture">
+                  <pic:nvPicPr>
+                    <pic:cNvPr id="1157977682" name="Imagen 3"/>
+                    <pic:cNvPicPr/>
+                  </pic:nvPicPr>
+                  <pic:blipFill>
+                    <a:blip r:embed="rId22">
+                      <a:extLst>
+                        <a:ext uri="{28A0092B-C50C-407E-A947-70E740481C1C}">
+                          <a14:useLocalDpi xmlns:a14="http://schemas.microsoft.com/office/drawing/2010/main" val="0"/>
+                        </a:ext>
+                      </a:extLst>
+                    </a:blip>
+                    <a:stretch>
+                      <a:fillRect/>
+                    </a:stretch>
+                  </pic:blipFill>
+                  <pic:spPr>
+                    <a:xfrm>
+                      <a:off x="0" y="0"/>
+                      <a:ext cx="5421515" cy="6248051"/>
+                    </a:xfrm>
+                    <a:prstGeom prst="rect">
+                      <a:avLst/>
+                    </a:prstGeom>
+                  </pic:spPr>
+                </pic:pic>
+              </a:graphicData>
+            </a:graphic>
+          </wp:inline>
+        </w:drawing>
+      </w:r>
+    </w:p>
+    <w:p>
+      <w:pPr>
+        <w:pStyle w:val="Descripcin"/>
+        <w:jc w:val="center"/>
+      </w:pPr>
+      <w:bookmarkStart w:id="28" w:name="_Toc221908857"/>
+      <w:r>
+        <w:t xml:space="preserve">Figura </w:t>
+      </w:r>
+      <w:fldSimple w:instr=" SEQ Figura \* ARABIC ">
+        <w:r>
+          <w:rPr>
+            <w:noProof/>
+          </w:rPr>
+          <w:t>7</w:t>
+        </w:r>
+      </w:fldSimple>
+      <w:r>
+        <w:t xml:space="preserve">. Pantalla Añadir justificante </w:t>
+      </w:r>
+      <w:r>
+        <w:t>usuario</w:t>
+      </w:r>
+      <w:r>
+        <w:t xml:space="preserve"> Estudiante</w:t>
+      </w:r>
+      <w:r>
+        <w:t xml:space="preserve"> - Móvil</w:t>
+      </w:r>
+      <w:bookmarkEnd w:id="28"/>
+    </w:p>
+    <w:p>
+      <w:pPr>
+        <w:keepNext/>
+        <w:jc w:val="center"/>
+      </w:pPr>
+      <w:r>
+        <w:rPr>
+          <w:noProof/>
+        </w:rPr>
+        <w:drawing>
+          <wp:inline distT="0" distB="0" distL="0" distR="0" wp14:anchorId="30A034C7" wp14:editId="0D158220">
             <wp:extent cx="472440" cy="670560"/>
             <wp:effectExtent l="0" t="0" r="3810" b="0"/>
-            <wp:docPr id="58759575" name="Imagen 3" descr="Icono&#10;&#10;El contenido generado por IA puede ser incorrecto."/>
+            <wp:docPr id="135549473" name="Imagen 3" descr="Icono&#10;&#10;El contenido generado por IA puede ser incorrecto."/>
             <wp:cNvGraphicFramePr>
               <a:graphicFrameLocks xmlns:a="http://schemas.openxmlformats.org/drawingml/2006/main" noChangeAspect="1"/>
             </wp:cNvGraphicFramePr>
@@ -6323,7 +6617,7 @@
                     <pic:cNvPicPr/>
                   </pic:nvPicPr>
                   <pic:blipFill>
-                    <a:blip r:embed="rId22" cstate="print">
+                    <a:blip r:embed="rId23" cstate="print">
                       <a:extLst>
                         <a:ext uri="{28A0092B-C50C-407E-A947-70E740481C1C}">
                           <a14:useLocalDpi xmlns:a14="http://schemas.microsoft.com/office/drawing/2010/main" val="0"/>
@@ -6350,110 +6644,6 @@
         </w:drawing>
       </w:r>
     </w:p>
-    <w:p>
-      <w:pPr>
-        <w:keepNext/>
-        <w:jc w:val="center"/>
-      </w:pPr>
-      <w:r>
-        <w:rPr>
-          <w:noProof/>
-        </w:rPr>
-        <w:drawing>
-          <wp:inline distT="0" distB="0" distL="0" distR="0" wp14:anchorId="6C646993" wp14:editId="63331DEB">
-            <wp:extent cx="472440" cy="670560"/>
-            <wp:effectExtent l="0" t="0" r="3810" b="0"/>
-            <wp:docPr id="1157977682" name="Imagen 3" descr="Icono&#10;&#10;El contenido generado por IA puede ser incorrecto."/>
-            <wp:cNvGraphicFramePr>
-              <a:graphicFrameLocks xmlns:a="http://schemas.openxmlformats.org/drawingml/2006/main" noChangeAspect="1"/>
-            </wp:cNvGraphicFramePr>
-            <a:graphic xmlns:a="http://schemas.openxmlformats.org/drawingml/2006/main">
-              <a:graphicData uri="http://schemas.openxmlformats.org/drawingml/2006/picture">
-                <pic:pic xmlns:pic="http://schemas.openxmlformats.org/drawingml/2006/picture">
-                  <pic:nvPicPr>
-                    <pic:cNvPr id="137856651" name="Imagen 3" descr="Icono&#10;&#10;El contenido generado por IA puede ser incorrecto."/>
-                    <pic:cNvPicPr/>
-                  </pic:nvPicPr>
-                  <pic:blipFill>
-                    <a:blip r:embed="rId22" cstate="print">
-                      <a:extLst>
-                        <a:ext uri="{28A0092B-C50C-407E-A947-70E740481C1C}">
-                          <a14:useLocalDpi xmlns:a14="http://schemas.microsoft.com/office/drawing/2010/main" val="0"/>
-                        </a:ext>
-                      </a:extLst>
-                    </a:blip>
-                    <a:stretch>
-                      <a:fillRect/>
-                    </a:stretch>
-                  </pic:blipFill>
-                  <pic:spPr>
-                    <a:xfrm>
-                      <a:off x="0" y="0"/>
-                      <a:ext cx="472440" cy="670560"/>
-                    </a:xfrm>
-                    <a:prstGeom prst="rect">
-                      <a:avLst/>
-                    </a:prstGeom>
-                  </pic:spPr>
-                </pic:pic>
-              </a:graphicData>
-            </a:graphic>
-          </wp:inline>
-        </w:drawing>
-      </w:r>
-    </w:p>
-    <w:p>
-      <w:pPr>
-        <w:keepNext/>
-        <w:jc w:val="center"/>
-      </w:pPr>
-      <w:r>
-        <w:rPr>
-          <w:noProof/>
-        </w:rPr>
-        <w:drawing>
-          <wp:inline distT="0" distB="0" distL="0" distR="0" wp14:anchorId="30A034C7" wp14:editId="0D158220">
-            <wp:extent cx="472440" cy="670560"/>
-            <wp:effectExtent l="0" t="0" r="3810" b="0"/>
-            <wp:docPr id="135549473" name="Imagen 3" descr="Icono&#10;&#10;El contenido generado por IA puede ser incorrecto."/>
-            <wp:cNvGraphicFramePr>
-              <a:graphicFrameLocks xmlns:a="http://schemas.openxmlformats.org/drawingml/2006/main" noChangeAspect="1"/>
-            </wp:cNvGraphicFramePr>
-            <a:graphic xmlns:a="http://schemas.openxmlformats.org/drawingml/2006/main">
-              <a:graphicData uri="http://schemas.openxmlformats.org/drawingml/2006/picture">
-                <pic:pic xmlns:pic="http://schemas.openxmlformats.org/drawingml/2006/picture">
-                  <pic:nvPicPr>
-                    <pic:cNvPr id="137856651" name="Imagen 3" descr="Icono&#10;&#10;El contenido generado por IA puede ser incorrecto."/>
-                    <pic:cNvPicPr/>
-                  </pic:nvPicPr>
-                  <pic:blipFill>
-                    <a:blip r:embed="rId22" cstate="print">
-                      <a:extLst>
-                        <a:ext uri="{28A0092B-C50C-407E-A947-70E740481C1C}">
-                          <a14:useLocalDpi xmlns:a14="http://schemas.microsoft.com/office/drawing/2010/main" val="0"/>
-                        </a:ext>
-                      </a:extLst>
-                    </a:blip>
-                    <a:stretch>
-                      <a:fillRect/>
-                    </a:stretch>
-                  </pic:blipFill>
-                  <pic:spPr>
-                    <a:xfrm>
-                      <a:off x="0" y="0"/>
-                      <a:ext cx="472440" cy="670560"/>
-                    </a:xfrm>
-                    <a:prstGeom prst="rect">
-                      <a:avLst/>
-                    </a:prstGeom>
-                  </pic:spPr>
-                </pic:pic>
-              </a:graphicData>
-            </a:graphic>
-          </wp:inline>
-        </w:drawing>
-      </w:r>
-    </w:p>
     <w:p/>
     <w:p>
       <w:pPr>
@@ -6463,11 +6653,11 @@
           <w:numId w:val="3"/>
         </w:numPr>
       </w:pPr>
-      <w:bookmarkStart w:id="25" w:name="_Toc210125382"/>
+      <w:bookmarkStart w:id="29" w:name="_Toc221908755"/>
       <w:r>
         <w:t>MAPA DE NAVEGABILIDAD</w:t>
       </w:r>
-      <w:bookmarkEnd w:id="25"/>
+      <w:bookmarkEnd w:id="29"/>
     </w:p>
     <w:p>
       <w:r>
@@ -6487,6 +6677,7 @@
         <w:rPr>
           <w:noProof/>
         </w:rPr>
+        <w:lastRenderedPageBreak/>
         <w:drawing>
           <wp:inline distT="0" distB="0" distL="0" distR="0" wp14:anchorId="041199A3" wp14:editId="1DAEB531">
             <wp:extent cx="6439986" cy="4830992"/>
@@ -6505,7 +6696,7 @@
                     </pic:cNvPicPr>
                   </pic:nvPicPr>
                   <pic:blipFill>
-                    <a:blip r:embed="rId23">
+                    <a:blip r:embed="rId24">
                       <a:extLst>
                         <a:ext uri="{28A0092B-C50C-407E-A947-70E740481C1C}">
                           <a14:useLocalDpi xmlns:a14="http://schemas.microsoft.com/office/drawing/2010/main" val="0"/>
@@ -6547,7 +6738,6 @@
         <w:pStyle w:val="Prrafodelista"/>
       </w:pPr>
       <w:r>
-        <w:lastRenderedPageBreak/>
         <w:t xml:space="preserve">Cada pantalla de gestión dispondrá de un botón “volver” que regresará a la pantalla con el menú propio de cada rol. Además, cada pantalla con </w:t>
       </w:r>
       <w:r>
@@ -6579,11 +6769,11 @@
           <w:numId w:val="2"/>
         </w:numPr>
       </w:pPr>
-      <w:bookmarkStart w:id="26" w:name="_Toc210125383"/>
+      <w:bookmarkStart w:id="30" w:name="_Toc221908756"/>
       <w:r>
         <w:t>PLAN DE PRUEBAS</w:t>
       </w:r>
-      <w:bookmarkEnd w:id="26"/>
+      <w:bookmarkEnd w:id="30"/>
     </w:p>
     <w:p>
       <w:r>
@@ -6631,15 +6821,7 @@
         <w:t>n</w:t>
       </w:r>
       <w:r>
-        <w:t xml:space="preserve">: asegurar que la GUI de escritorio y la </w:t>
-      </w:r>
-      <w:proofErr w:type="gramStart"/>
-      <w:r>
-        <w:t>app</w:t>
-      </w:r>
-      <w:proofErr w:type="gramEnd"/>
-      <w:r>
-        <w:t xml:space="preserve"> móvil se comunican correctamente con la base de datos.</w:t>
+        <w:t>: asegurar que la GUI de escritorio y la app móvil se comunican correctamente con la base de datos.</w:t>
       </w:r>
     </w:p>
     <w:p>
@@ -6677,11 +6859,11 @@
           <w:numId w:val="2"/>
         </w:numPr>
       </w:pPr>
-      <w:bookmarkStart w:id="27" w:name="_Toc210125384"/>
+      <w:bookmarkStart w:id="31" w:name="_Toc221908757"/>
       <w:r>
         <w:t>TECNOLOGÍAS EMPLEADAS</w:t>
       </w:r>
-      <w:bookmarkEnd w:id="27"/>
+      <w:bookmarkEnd w:id="31"/>
     </w:p>
     <w:p>
       <w:r>
@@ -6724,6 +6906,7 @@
         </w:numPr>
       </w:pPr>
       <w:r>
+        <w:lastRenderedPageBreak/>
         <w:t>Draw.io: diagramas</w:t>
       </w:r>
     </w:p>
@@ -6750,11 +6933,11 @@
           <w:numId w:val="2"/>
         </w:numPr>
       </w:pPr>
-      <w:bookmarkStart w:id="28" w:name="_Toc210125385"/>
+      <w:bookmarkStart w:id="32" w:name="_Toc221908758"/>
       <w:r>
         <w:t>PLANIFICACIÓN Y PRESUPUESTO</w:t>
       </w:r>
-      <w:bookmarkEnd w:id="28"/>
+      <w:bookmarkEnd w:id="32"/>
     </w:p>
     <w:p>
       <w:r>
@@ -6781,14 +6964,18 @@
           <w:szCs w:val="32"/>
         </w:rPr>
       </w:pPr>
-      <w:bookmarkStart w:id="29" w:name="_Toc210123170"/>
-      <w:bookmarkStart w:id="30" w:name="_Toc210123297"/>
-      <w:bookmarkStart w:id="31" w:name="_Toc210124628"/>
-      <w:bookmarkStart w:id="32" w:name="_Toc210125386"/>
-      <w:bookmarkEnd w:id="29"/>
-      <w:bookmarkEnd w:id="30"/>
-      <w:bookmarkEnd w:id="31"/>
-      <w:bookmarkEnd w:id="32"/>
+      <w:bookmarkStart w:id="33" w:name="_Toc210123170"/>
+      <w:bookmarkStart w:id="34" w:name="_Toc210123297"/>
+      <w:bookmarkStart w:id="35" w:name="_Toc210124628"/>
+      <w:bookmarkStart w:id="36" w:name="_Toc210125386"/>
+      <w:bookmarkStart w:id="37" w:name="_Toc221907962"/>
+      <w:bookmarkStart w:id="38" w:name="_Toc221908759"/>
+      <w:bookmarkEnd w:id="33"/>
+      <w:bookmarkEnd w:id="34"/>
+      <w:bookmarkEnd w:id="35"/>
+      <w:bookmarkEnd w:id="36"/>
+      <w:bookmarkEnd w:id="37"/>
+      <w:bookmarkEnd w:id="38"/>
     </w:p>
     <w:p>
       <w:pPr>
@@ -6810,14 +6997,18 @@
           <w:szCs w:val="32"/>
         </w:rPr>
       </w:pPr>
-      <w:bookmarkStart w:id="33" w:name="_Toc210123171"/>
-      <w:bookmarkStart w:id="34" w:name="_Toc210123298"/>
-      <w:bookmarkStart w:id="35" w:name="_Toc210124629"/>
-      <w:bookmarkStart w:id="36" w:name="_Toc210125387"/>
-      <w:bookmarkEnd w:id="33"/>
-      <w:bookmarkEnd w:id="34"/>
-      <w:bookmarkEnd w:id="35"/>
-      <w:bookmarkEnd w:id="36"/>
+      <w:bookmarkStart w:id="39" w:name="_Toc210123171"/>
+      <w:bookmarkStart w:id="40" w:name="_Toc210123298"/>
+      <w:bookmarkStart w:id="41" w:name="_Toc210124629"/>
+      <w:bookmarkStart w:id="42" w:name="_Toc210125387"/>
+      <w:bookmarkStart w:id="43" w:name="_Toc221907963"/>
+      <w:bookmarkStart w:id="44" w:name="_Toc221908760"/>
+      <w:bookmarkEnd w:id="39"/>
+      <w:bookmarkEnd w:id="40"/>
+      <w:bookmarkEnd w:id="41"/>
+      <w:bookmarkEnd w:id="42"/>
+      <w:bookmarkEnd w:id="43"/>
+      <w:bookmarkEnd w:id="44"/>
     </w:p>
     <w:p>
       <w:pPr>
@@ -6839,14 +7030,18 @@
           <w:szCs w:val="32"/>
         </w:rPr>
       </w:pPr>
-      <w:bookmarkStart w:id="37" w:name="_Toc210123172"/>
-      <w:bookmarkStart w:id="38" w:name="_Toc210123299"/>
-      <w:bookmarkStart w:id="39" w:name="_Toc210124630"/>
-      <w:bookmarkStart w:id="40" w:name="_Toc210125388"/>
-      <w:bookmarkEnd w:id="37"/>
-      <w:bookmarkEnd w:id="38"/>
-      <w:bookmarkEnd w:id="39"/>
-      <w:bookmarkEnd w:id="40"/>
+      <w:bookmarkStart w:id="45" w:name="_Toc210123172"/>
+      <w:bookmarkStart w:id="46" w:name="_Toc210123299"/>
+      <w:bookmarkStart w:id="47" w:name="_Toc210124630"/>
+      <w:bookmarkStart w:id="48" w:name="_Toc210125388"/>
+      <w:bookmarkStart w:id="49" w:name="_Toc221907964"/>
+      <w:bookmarkStart w:id="50" w:name="_Toc221908761"/>
+      <w:bookmarkEnd w:id="45"/>
+      <w:bookmarkEnd w:id="46"/>
+      <w:bookmarkEnd w:id="47"/>
+      <w:bookmarkEnd w:id="48"/>
+      <w:bookmarkEnd w:id="49"/>
+      <w:bookmarkEnd w:id="50"/>
     </w:p>
     <w:p>
       <w:pPr>
@@ -6856,11 +7051,11 @@
           <w:numId w:val="3"/>
         </w:numPr>
       </w:pPr>
-      <w:bookmarkStart w:id="41" w:name="_Toc210125389"/>
+      <w:bookmarkStart w:id="51" w:name="_Toc221908762"/>
       <w:r>
         <w:t>DIAGRAMA DE GANTT</w:t>
       </w:r>
-      <w:bookmarkEnd w:id="41"/>
+      <w:bookmarkEnd w:id="51"/>
     </w:p>
     <w:p>
       <w:r>
@@ -6875,11 +7070,11 @@
           <w:numId w:val="3"/>
         </w:numPr>
       </w:pPr>
-      <w:bookmarkStart w:id="42" w:name="_Toc210125390"/>
+      <w:bookmarkStart w:id="52" w:name="_Toc221908763"/>
       <w:r>
         <w:t>ESTIMACIONES DE COSTES</w:t>
       </w:r>
-      <w:bookmarkEnd w:id="42"/>
+      <w:bookmarkEnd w:id="52"/>
     </w:p>
     <w:p>
       <w:pPr>
@@ -6925,11 +7120,11 @@
           <w:numId w:val="2"/>
         </w:numPr>
       </w:pPr>
-      <w:bookmarkStart w:id="43" w:name="_Toc210125391"/>
+      <w:bookmarkStart w:id="53" w:name="_Toc221908764"/>
       <w:r>
         <w:t>FUTURAS MEJORAS Y AMPLIACIONES</w:t>
       </w:r>
-      <w:bookmarkEnd w:id="43"/>
+      <w:bookmarkEnd w:id="53"/>
     </w:p>
     <w:p>
       <w:r>
@@ -6956,14 +7151,18 @@
           <w:szCs w:val="32"/>
         </w:rPr>
       </w:pPr>
-      <w:bookmarkStart w:id="44" w:name="_Toc210123176"/>
-      <w:bookmarkStart w:id="45" w:name="_Toc210123303"/>
-      <w:bookmarkStart w:id="46" w:name="_Toc210124634"/>
-      <w:bookmarkStart w:id="47" w:name="_Toc210125392"/>
-      <w:bookmarkEnd w:id="44"/>
-      <w:bookmarkEnd w:id="45"/>
-      <w:bookmarkEnd w:id="46"/>
-      <w:bookmarkEnd w:id="47"/>
+      <w:bookmarkStart w:id="54" w:name="_Toc210123176"/>
+      <w:bookmarkStart w:id="55" w:name="_Toc210123303"/>
+      <w:bookmarkStart w:id="56" w:name="_Toc210124634"/>
+      <w:bookmarkStart w:id="57" w:name="_Toc210125392"/>
+      <w:bookmarkStart w:id="58" w:name="_Toc221907968"/>
+      <w:bookmarkStart w:id="59" w:name="_Toc221908765"/>
+      <w:bookmarkEnd w:id="54"/>
+      <w:bookmarkEnd w:id="55"/>
+      <w:bookmarkEnd w:id="56"/>
+      <w:bookmarkEnd w:id="57"/>
+      <w:bookmarkEnd w:id="58"/>
+      <w:bookmarkEnd w:id="59"/>
     </w:p>
     <w:p>
       <w:pPr>
@@ -6973,11 +7172,11 @@
           <w:numId w:val="3"/>
         </w:numPr>
       </w:pPr>
-      <w:bookmarkStart w:id="48" w:name="_Toc210125393"/>
+      <w:bookmarkStart w:id="60" w:name="_Toc221908766"/>
       <w:r>
         <w:t>PROPUESTAS DE MEJORA Y AMPLIACIONES</w:t>
       </w:r>
-      <w:bookmarkEnd w:id="48"/>
+      <w:bookmarkEnd w:id="60"/>
     </w:p>
     <w:p>
       <w:r>
@@ -6992,11 +7191,11 @@
           <w:numId w:val="3"/>
         </w:numPr>
       </w:pPr>
-      <w:bookmarkStart w:id="49" w:name="_Toc210125394"/>
+      <w:bookmarkStart w:id="61" w:name="_Toc221908767"/>
       <w:r>
         <w:t>IMPACTO Y RIESGO DE LOS CAMBIOS PROPUESTOS</w:t>
       </w:r>
-      <w:bookmarkEnd w:id="49"/>
+      <w:bookmarkEnd w:id="61"/>
     </w:p>
     <w:p>
       <w:r>
@@ -7011,12 +7210,11 @@
           <w:numId w:val="2"/>
         </w:numPr>
       </w:pPr>
-      <w:bookmarkStart w:id="50" w:name="_Toc210125395"/>
-      <w:r>
-        <w:lastRenderedPageBreak/>
+      <w:bookmarkStart w:id="62" w:name="_Toc221908768"/>
+      <w:r>
         <w:t>RELACIÓN CON LOS MÓDULOS DEL CICLO</w:t>
       </w:r>
-      <w:bookmarkEnd w:id="50"/>
+      <w:bookmarkEnd w:id="62"/>
     </w:p>
     <w:p>
       <w:r>
@@ -7094,11 +7292,11 @@
           <w:numId w:val="2"/>
         </w:numPr>
       </w:pPr>
-      <w:bookmarkStart w:id="51" w:name="_Toc210125396"/>
+      <w:bookmarkStart w:id="63" w:name="_Toc221908769"/>
       <w:r>
         <w:t>CONCLUSIONES</w:t>
       </w:r>
-      <w:bookmarkEnd w:id="51"/>
+      <w:bookmarkEnd w:id="63"/>
     </w:p>
     <w:p>
       <w:r>
@@ -7113,11 +7311,11 @@
           <w:numId w:val="2"/>
         </w:numPr>
       </w:pPr>
-      <w:bookmarkStart w:id="52" w:name="_Toc210125397"/>
+      <w:bookmarkStart w:id="64" w:name="_Toc221908770"/>
       <w:r>
         <w:t>DESPLIEGUE DE LA APLICACIÓN</w:t>
       </w:r>
-      <w:bookmarkEnd w:id="52"/>
+      <w:bookmarkEnd w:id="64"/>
     </w:p>
     <w:p>
       <w:r>
@@ -7144,14 +7342,18 @@
           <w:szCs w:val="32"/>
         </w:rPr>
       </w:pPr>
-      <w:bookmarkStart w:id="53" w:name="_Toc210123182"/>
-      <w:bookmarkStart w:id="54" w:name="_Toc210123309"/>
-      <w:bookmarkStart w:id="55" w:name="_Toc210124640"/>
-      <w:bookmarkStart w:id="56" w:name="_Toc210125398"/>
-      <w:bookmarkEnd w:id="53"/>
-      <w:bookmarkEnd w:id="54"/>
-      <w:bookmarkEnd w:id="55"/>
-      <w:bookmarkEnd w:id="56"/>
+      <w:bookmarkStart w:id="65" w:name="_Toc210123182"/>
+      <w:bookmarkStart w:id="66" w:name="_Toc210123309"/>
+      <w:bookmarkStart w:id="67" w:name="_Toc210124640"/>
+      <w:bookmarkStart w:id="68" w:name="_Toc210125398"/>
+      <w:bookmarkStart w:id="69" w:name="_Toc221907974"/>
+      <w:bookmarkStart w:id="70" w:name="_Toc221908771"/>
+      <w:bookmarkEnd w:id="65"/>
+      <w:bookmarkEnd w:id="66"/>
+      <w:bookmarkEnd w:id="67"/>
+      <w:bookmarkEnd w:id="68"/>
+      <w:bookmarkEnd w:id="69"/>
+      <w:bookmarkEnd w:id="70"/>
     </w:p>
     <w:p>
       <w:pPr>
@@ -7173,14 +7375,18 @@
           <w:szCs w:val="32"/>
         </w:rPr>
       </w:pPr>
-      <w:bookmarkStart w:id="57" w:name="_Toc210123183"/>
-      <w:bookmarkStart w:id="58" w:name="_Toc210123310"/>
-      <w:bookmarkStart w:id="59" w:name="_Toc210124641"/>
-      <w:bookmarkStart w:id="60" w:name="_Toc210125399"/>
-      <w:bookmarkEnd w:id="57"/>
-      <w:bookmarkEnd w:id="58"/>
-      <w:bookmarkEnd w:id="59"/>
-      <w:bookmarkEnd w:id="60"/>
+      <w:bookmarkStart w:id="71" w:name="_Toc210123183"/>
+      <w:bookmarkStart w:id="72" w:name="_Toc210123310"/>
+      <w:bookmarkStart w:id="73" w:name="_Toc210124641"/>
+      <w:bookmarkStart w:id="74" w:name="_Toc210125399"/>
+      <w:bookmarkStart w:id="75" w:name="_Toc221907975"/>
+      <w:bookmarkStart w:id="76" w:name="_Toc221908772"/>
+      <w:bookmarkEnd w:id="71"/>
+      <w:bookmarkEnd w:id="72"/>
+      <w:bookmarkEnd w:id="73"/>
+      <w:bookmarkEnd w:id="74"/>
+      <w:bookmarkEnd w:id="75"/>
+      <w:bookmarkEnd w:id="76"/>
     </w:p>
     <w:p>
       <w:pPr>
@@ -7202,14 +7408,18 @@
           <w:szCs w:val="32"/>
         </w:rPr>
       </w:pPr>
-      <w:bookmarkStart w:id="61" w:name="_Toc210123184"/>
-      <w:bookmarkStart w:id="62" w:name="_Toc210123311"/>
-      <w:bookmarkStart w:id="63" w:name="_Toc210124642"/>
-      <w:bookmarkStart w:id="64" w:name="_Toc210125400"/>
-      <w:bookmarkEnd w:id="61"/>
-      <w:bookmarkEnd w:id="62"/>
-      <w:bookmarkEnd w:id="63"/>
-      <w:bookmarkEnd w:id="64"/>
+      <w:bookmarkStart w:id="77" w:name="_Toc210123184"/>
+      <w:bookmarkStart w:id="78" w:name="_Toc210123311"/>
+      <w:bookmarkStart w:id="79" w:name="_Toc210124642"/>
+      <w:bookmarkStart w:id="80" w:name="_Toc210125400"/>
+      <w:bookmarkStart w:id="81" w:name="_Toc221907976"/>
+      <w:bookmarkStart w:id="82" w:name="_Toc221908773"/>
+      <w:bookmarkEnd w:id="77"/>
+      <w:bookmarkEnd w:id="78"/>
+      <w:bookmarkEnd w:id="79"/>
+      <w:bookmarkEnd w:id="80"/>
+      <w:bookmarkEnd w:id="81"/>
+      <w:bookmarkEnd w:id="82"/>
     </w:p>
     <w:p>
       <w:pPr>
@@ -7219,11 +7429,11 @@
           <w:numId w:val="3"/>
         </w:numPr>
       </w:pPr>
-      <w:bookmarkStart w:id="65" w:name="_Toc210125401"/>
+      <w:bookmarkStart w:id="83" w:name="_Toc221908774"/>
       <w:r>
         <w:t>INSTALACIÓN</w:t>
       </w:r>
-      <w:bookmarkEnd w:id="65"/>
+      <w:bookmarkEnd w:id="83"/>
     </w:p>
     <w:p>
       <w:r>
@@ -7238,11 +7448,11 @@
           <w:numId w:val="2"/>
         </w:numPr>
       </w:pPr>
-      <w:bookmarkStart w:id="66" w:name="_Toc210125402"/>
+      <w:bookmarkStart w:id="84" w:name="_Toc221908775"/>
       <w:r>
         <w:t>GUÍA DE ESTILOS Y MANUAL DE USUARIO</w:t>
       </w:r>
-      <w:bookmarkEnd w:id="66"/>
+      <w:bookmarkEnd w:id="84"/>
     </w:p>
     <w:p>
       <w:r>
@@ -7269,14 +7479,18 @@
           <w:szCs w:val="32"/>
         </w:rPr>
       </w:pPr>
-      <w:bookmarkStart w:id="67" w:name="_Toc210123187"/>
-      <w:bookmarkStart w:id="68" w:name="_Toc210123314"/>
-      <w:bookmarkStart w:id="69" w:name="_Toc210124645"/>
-      <w:bookmarkStart w:id="70" w:name="_Toc210125403"/>
-      <w:bookmarkEnd w:id="67"/>
-      <w:bookmarkEnd w:id="68"/>
-      <w:bookmarkEnd w:id="69"/>
-      <w:bookmarkEnd w:id="70"/>
+      <w:bookmarkStart w:id="85" w:name="_Toc210123187"/>
+      <w:bookmarkStart w:id="86" w:name="_Toc210123314"/>
+      <w:bookmarkStart w:id="87" w:name="_Toc210124645"/>
+      <w:bookmarkStart w:id="88" w:name="_Toc210125403"/>
+      <w:bookmarkStart w:id="89" w:name="_Toc221907979"/>
+      <w:bookmarkStart w:id="90" w:name="_Toc221908776"/>
+      <w:bookmarkEnd w:id="85"/>
+      <w:bookmarkEnd w:id="86"/>
+      <w:bookmarkEnd w:id="87"/>
+      <w:bookmarkEnd w:id="88"/>
+      <w:bookmarkEnd w:id="89"/>
+      <w:bookmarkEnd w:id="90"/>
     </w:p>
     <w:p>
       <w:pPr>
@@ -7286,11 +7500,11 @@
           <w:numId w:val="3"/>
         </w:numPr>
       </w:pPr>
-      <w:bookmarkStart w:id="71" w:name="_Toc210125404"/>
+      <w:bookmarkStart w:id="91" w:name="_Toc221908777"/>
       <w:r>
         <w:t>GUÍA DE ESTILOS</w:t>
       </w:r>
-      <w:bookmarkEnd w:id="71"/>
+      <w:bookmarkEnd w:id="91"/>
     </w:p>
     <w:p>
       <w:r>
@@ -7305,11 +7519,11 @@
           <w:numId w:val="3"/>
         </w:numPr>
       </w:pPr>
-      <w:bookmarkStart w:id="72" w:name="_Toc210125405"/>
+      <w:bookmarkStart w:id="92" w:name="_Toc221908778"/>
       <w:r>
         <w:t>MANUAL DE USUARIO</w:t>
       </w:r>
-      <w:bookmarkEnd w:id="72"/>
+      <w:bookmarkEnd w:id="92"/>
     </w:p>
     <w:p>
       <w:r>
@@ -7324,11 +7538,11 @@
           <w:numId w:val="2"/>
         </w:numPr>
       </w:pPr>
-      <w:bookmarkStart w:id="73" w:name="_Toc210125406"/>
+      <w:bookmarkStart w:id="93" w:name="_Toc221908779"/>
       <w:r>
         <w:t>WEBGRAFÍA Y FUENTES DE INFORMACIÓN</w:t>
       </w:r>
-      <w:bookmarkEnd w:id="73"/>
+      <w:bookmarkEnd w:id="93"/>
     </w:p>
     <w:p>
       <w:r>
@@ -7343,7 +7557,7 @@
     <w:p/>
     <w:p/>
     <w:sectPr>
-      <w:footerReference w:type="default" r:id="rId24"/>
+      <w:footerReference w:type="default" r:id="rId25"/>
       <w:pgSz w:w="11906" w:h="16838"/>
       <w:pgMar w:top="1134" w:right="1134" w:bottom="1418" w:left="1134" w:header="709" w:footer="709" w:gutter="0"/>
       <w:pgNumType w:start="1"/>
@@ -9599,6 +9813,10 @@
 </file>
 
 <file path=customXml/item1.xml><?xml version="1.0" encoding="utf-8"?>
+<b:Sources xmlns:b="http://schemas.openxmlformats.org/officeDocument/2006/bibliography" xmlns="http://schemas.openxmlformats.org/officeDocument/2006/bibliography" SelectedStyle="\APASixthEditionOfficeOnline.xsl" StyleName="APA" Version="6"/>
+</file>
+
+<file path=customXml/item2.xml><?xml version="1.0" encoding="utf-8"?>
 <?mso-contentType ?>
 <FormTemplates xmlns="http://schemas.microsoft.com/sharepoint/v3/contenttype/forms">
   <Display>DocumentLibraryForm</Display>
@@ -9607,19 +9825,7 @@
 </FormTemplates>
 </file>
 
-<file path=customXml/item2.xml><?xml version="1.0" encoding="utf-8"?>
-<b:Sources xmlns:b="http://schemas.openxmlformats.org/officeDocument/2006/bibliography" xmlns="http://schemas.openxmlformats.org/officeDocument/2006/bibliography" SelectedStyle="\APASixthEditionOfficeOnline.xsl" StyleName="APA" Version="6"/>
-</file>
-
 <file path=customXml/item3.xml><?xml version="1.0" encoding="utf-8"?>
-<p:properties xmlns:p="http://schemas.microsoft.com/office/2006/metadata/properties" xmlns:xsi="http://www.w3.org/2001/XMLSchema-instance" xmlns:pc="http://schemas.microsoft.com/office/infopath/2007/PartnerControls">
-  <documentManagement>
-    <_activity xmlns="d07641f9-f1a5-43c1-ac16-fa53e6c318bc" xsi:nil="true"/>
-  </documentManagement>
-</p:properties>
-</file>
-
-<file path=customXml/item4.xml><?xml version="1.0" encoding="utf-8"?>
 <ct:contentTypeSchema xmlns:ct="http://schemas.microsoft.com/office/2006/metadata/contentType" xmlns:ma="http://schemas.microsoft.com/office/2006/metadata/properties/metaAttributes" ct:_="" ma:_="" ma:contentTypeName="Documento" ma:contentTypeID="0x010100089FBA7B0FAFA84E9F1E615D3FC0A129" ma:contentTypeVersion="11" ma:contentTypeDescription="Crear nuevo documento." ma:contentTypeScope="" ma:versionID="fa55cfaacbcd603bd53d850e3b8176f7">
   <xsd:schema xmlns:xsd="http://www.w3.org/2001/XMLSchema" xmlns:xs="http://www.w3.org/2001/XMLSchema" xmlns:p="http://schemas.microsoft.com/office/2006/metadata/properties" xmlns:ns3="d07641f9-f1a5-43c1-ac16-fa53e6c318bc" targetNamespace="http://schemas.microsoft.com/office/2006/metadata/properties" ma:root="true" ma:fieldsID="78f989df160fe6a5ee2e0e0b0bfde0e3" ns3:_="">
     <xsd:import namespace="d07641f9-f1a5-43c1-ac16-fa53e6c318bc"/>
@@ -9807,7 +10013,23 @@
 </ct:contentTypeSchema>
 </file>
 
+<file path=customXml/item4.xml><?xml version="1.0" encoding="utf-8"?>
+<p:properties xmlns:p="http://schemas.microsoft.com/office/2006/metadata/properties" xmlns:xsi="http://www.w3.org/2001/XMLSchema-instance" xmlns:pc="http://schemas.microsoft.com/office/infopath/2007/PartnerControls">
+  <documentManagement>
+    <_activity xmlns="d07641f9-f1a5-43c1-ac16-fa53e6c318bc" xsi:nil="true"/>
+  </documentManagement>
+</p:properties>
+</file>
+
 <file path=customXml/itemProps1.xml><?xml version="1.0" encoding="utf-8"?>
+<ds:datastoreItem xmlns:ds="http://schemas.openxmlformats.org/officeDocument/2006/customXml" ds:itemID="{453714F8-FBC3-4DCC-8DCB-89BB58DCF76F}">
+  <ds:schemaRefs>
+    <ds:schemaRef ds:uri="http://schemas.openxmlformats.org/officeDocument/2006/bibliography"/>
+  </ds:schemaRefs>
+</ds:datastoreItem>
+</file>
+
+<file path=customXml/itemProps2.xml><?xml version="1.0" encoding="utf-8"?>
 <ds:datastoreItem xmlns:ds="http://schemas.openxmlformats.org/officeDocument/2006/customXml" ds:itemID="{480B8420-1B48-4D23-8D6E-64373AC5070B}">
   <ds:schemaRefs>
     <ds:schemaRef ds:uri="http://schemas.microsoft.com/sharepoint/v3/contenttype/forms"/>
@@ -9815,31 +10037,7 @@
 </ds:datastoreItem>
 </file>
 
-<file path=customXml/itemProps2.xml><?xml version="1.0" encoding="utf-8"?>
-<ds:datastoreItem xmlns:ds="http://schemas.openxmlformats.org/officeDocument/2006/customXml" ds:itemID="{453714F8-FBC3-4DCC-8DCB-89BB58DCF76F}">
-  <ds:schemaRefs>
-    <ds:schemaRef ds:uri="http://schemas.openxmlformats.org/officeDocument/2006/bibliography"/>
-  </ds:schemaRefs>
-</ds:datastoreItem>
-</file>
-
 <file path=customXml/itemProps3.xml><?xml version="1.0" encoding="utf-8"?>
-<ds:datastoreItem xmlns:ds="http://schemas.openxmlformats.org/officeDocument/2006/customXml" ds:itemID="{7F0B1298-25D5-45B9-909D-DD837044A49E}">
-  <ds:schemaRefs>
-    <ds:schemaRef ds:uri="http://purl.org/dc/elements/1.1/"/>
-    <ds:schemaRef ds:uri="http://schemas.microsoft.com/office/infopath/2007/PartnerControls"/>
-    <ds:schemaRef ds:uri="http://purl.org/dc/dcmitype/"/>
-    <ds:schemaRef ds:uri="http://www.w3.org/XML/1998/namespace"/>
-    <ds:schemaRef ds:uri="http://purl.org/dc/terms/"/>
-    <ds:schemaRef ds:uri="d07641f9-f1a5-43c1-ac16-fa53e6c318bc"/>
-    <ds:schemaRef ds:uri="http://schemas.microsoft.com/office/2006/documentManagement/types"/>
-    <ds:schemaRef ds:uri="http://schemas.openxmlformats.org/package/2006/metadata/core-properties"/>
-    <ds:schemaRef ds:uri="http://schemas.microsoft.com/office/2006/metadata/properties"/>
-  </ds:schemaRefs>
-</ds:datastoreItem>
-</file>
-
-<file path=customXml/itemProps4.xml><?xml version="1.0" encoding="utf-8"?>
 <ds:datastoreItem xmlns:ds="http://schemas.openxmlformats.org/officeDocument/2006/customXml" ds:itemID="{B3C09D93-2BDC-4563-9759-9158244E5DE7}">
   <ds:schemaRefs>
     <ds:schemaRef ds:uri="http://schemas.microsoft.com/office/2006/metadata/contentType"/>
@@ -9855,4 +10053,14 @@
     <ds:schemaRef ds:uri="http://schemas.microsoft.com/internal/obd"/>
   </ds:schemaRefs>
 </ds:datastoreItem>
+</file>
+
+<file path=customXml/itemProps4.xml><?xml version="1.0" encoding="utf-8"?>
+<ds:datastoreItem xmlns:ds="http://schemas.openxmlformats.org/officeDocument/2006/customXml" ds:itemID="{7F0B1298-25D5-45B9-909D-DD837044A49E}">
+  <ds:schemaRefs>
+    <ds:schemaRef ds:uri="http://schemas.microsoft.com/office/2006/metadata/properties"/>
+    <ds:schemaRef ds:uri="http://schemas.microsoft.com/office/infopath/2007/PartnerControls"/>
+    <ds:schemaRef ds:uri="d07641f9-f1a5-43c1-ac16-fa53e6c318bc"/>
+  </ds:schemaRefs>
+</ds:datastoreItem>
 </file>
</xml_diff>

<commit_message>
Modificaciones en la documentación
</commit_message>
<xml_diff>
--- a/docs/provisional_DocumentacionProyecto_2VIFC302.docx
+++ b/docs/provisional_DocumentacionProyecto_2VIFC302.docx
@@ -1286,7 +1286,7 @@
           <w:lang w:eastAsia="es-VE"/>
         </w:rPr>
         <w:drawing>
-          <wp:inline distT="0" distB="0" distL="0" distR="0" wp14:anchorId="1183C0B2" wp14:editId="6144F8AB">
+          <wp:inline distT="0" distB="0" distL="0" distR="0" wp14:anchorId="1183C0B2" wp14:editId="36FCF631">
             <wp:extent cx="7556500" cy="10599420"/>
             <wp:effectExtent l="0" t="0" r="6350" b="0"/>
             <wp:docPr id="2" name="Imagen 2" descr="D:\servicios forobeta posts\diseño grafico\CLIENTES\Feelmusic - 05.11.18\archivos\11\11.jpg"/>
@@ -6889,10 +6889,10 @@
           <w:noProof/>
         </w:rPr>
         <w:drawing>
-          <wp:inline distT="0" distB="0" distL="0" distR="0" wp14:anchorId="041199A3" wp14:editId="1DAEB531">
-            <wp:extent cx="6439986" cy="4830992"/>
-            <wp:effectExtent l="0" t="0" r="0" b="8255"/>
-            <wp:docPr id="963767397" name="Imagen 6" descr="Diagrama&#10;&#10;El contenido generado por IA puede ser incorrecto."/>
+          <wp:inline distT="0" distB="0" distL="0" distR="0" wp14:anchorId="041199A3" wp14:editId="5E9093F5">
+            <wp:extent cx="6494137" cy="4870602"/>
+            <wp:effectExtent l="0" t="0" r="2540" b="6350"/>
+            <wp:docPr id="963767397" name="Imagen 6"/>
             <wp:cNvGraphicFramePr>
               <a:graphicFrameLocks xmlns:a="http://schemas.openxmlformats.org/drawingml/2006/main" noChangeAspect="1"/>
             </wp:cNvGraphicFramePr>
@@ -6900,7 +6900,7 @@
               <a:graphicData uri="http://schemas.openxmlformats.org/drawingml/2006/picture">
                 <pic:pic xmlns:pic="http://schemas.openxmlformats.org/drawingml/2006/picture">
                   <pic:nvPicPr>
-                    <pic:cNvPr id="963767397" name="Imagen 6" descr="Diagrama&#10;&#10;El contenido generado por IA puede ser incorrecto."/>
+                    <pic:cNvPr id="963767397" name="Imagen 6"/>
                     <pic:cNvPicPr>
                       <a:picLocks noChangeAspect="1" noChangeArrowheads="1"/>
                     </pic:cNvPicPr>
@@ -6913,7 +6913,6 @@
                         </a:ext>
                       </a:extLst>
                     </a:blip>
-                    <a:srcRect/>
                     <a:stretch>
                       <a:fillRect/>
                     </a:stretch>
@@ -6921,7 +6920,7 @@
                   <pic:spPr bwMode="auto">
                     <a:xfrm>
                       <a:off x="0" y="0"/>
-                      <a:ext cx="6494137" cy="4871614"/>
+                      <a:ext cx="6494137" cy="4870602"/>
                     </a:xfrm>
                     <a:prstGeom prst="rect">
                       <a:avLst/>
@@ -7110,7 +7109,13 @@
       </w:r>
       <w:proofErr w:type="spellEnd"/>
       <w:r>
-        <w:t>: diseño de pantallas</w:t>
+        <w:t xml:space="preserve">: </w:t>
+      </w:r>
+      <w:r>
+        <w:t>D</w:t>
+      </w:r>
+      <w:r>
+        <w:t>iseño de pantallas</w:t>
       </w:r>
     </w:p>
     <w:p>
@@ -7122,7 +7127,13 @@
         </w:numPr>
       </w:pPr>
       <w:r>
-        <w:t>Draw.io: diagramas</w:t>
+        <w:t xml:space="preserve">Draw.io: </w:t>
+      </w:r>
+      <w:r>
+        <w:t>D</w:t>
+      </w:r>
+      <w:r>
+        <w:t>iagramas</w:t>
       </w:r>
     </w:p>
     <w:p>
@@ -7235,7 +7246,13 @@
       </w:r>
       <w:proofErr w:type="spellEnd"/>
       <w:r>
-        <w:t>: implementación de JPA para el ORM.</w:t>
+        <w:t xml:space="preserve">: </w:t>
+      </w:r>
+      <w:r>
+        <w:t>I</w:t>
+      </w:r>
+      <w:r>
+        <w:t>mplementación de JPA para el ORM.</w:t>
       </w:r>
     </w:p>
     <w:p>
@@ -7309,7 +7326,13 @@
         </w:numPr>
       </w:pPr>
       <w:r>
-        <w:t>Maven: como herramienta de gestión y construcción de proyectos que facilita la inclusión de dependencias.</w:t>
+        <w:t xml:space="preserve">Maven: </w:t>
+      </w:r>
+      <w:r>
+        <w:t>C</w:t>
+      </w:r>
+      <w:r>
+        <w:t>omo herramienta de gestión y construcción de proyectos que facilita la inclusión de dependencias.</w:t>
       </w:r>
     </w:p>
     <w:p>
@@ -7326,7 +7349,22 @@
       </w:r>
       <w:proofErr w:type="spellEnd"/>
       <w:r>
-        <w:t>: sistema de control de versiones y seguimiento de los hitos de entrega.</w:t>
+        <w:t xml:space="preserve">: </w:t>
+      </w:r>
+      <w:r>
+        <w:rPr>
+          <w:u w:val="single"/>
+        </w:rPr>
+        <w:t>S</w:t>
+      </w:r>
+      <w:r>
+        <w:rPr>
+          <w:u w:val="single"/>
+        </w:rPr>
+        <w:t>istema</w:t>
+      </w:r>
+      <w:r>
+        <w:t xml:space="preserve"> de control de versiones y seguimiento de los hitos de entrega.</w:t>
       </w:r>
     </w:p>
     <w:p>
@@ -7528,8 +7566,77 @@
       <w:bookmarkEnd w:id="51"/>
     </w:p>
     <w:p>
-      <w:r>
-        <w:t>(…)</w:t>
+      <w:pPr>
+        <w:keepNext/>
+      </w:pPr>
+      <w:r>
+        <w:rPr>
+          <w:noProof/>
+        </w:rPr>
+        <w:drawing>
+          <wp:inline distT="0" distB="0" distL="0" distR="0" wp14:anchorId="791D461B" wp14:editId="77ECE602">
+            <wp:extent cx="6120130" cy="4589780"/>
+            <wp:effectExtent l="0" t="0" r="0" b="1270"/>
+            <wp:docPr id="298751839" name="Imagen 6" descr="Gráfico&#10;&#10;El contenido generado por IA puede ser incorrecto."/>
+            <wp:cNvGraphicFramePr>
+              <a:graphicFrameLocks xmlns:a="http://schemas.openxmlformats.org/drawingml/2006/main" noChangeAspect="1"/>
+            </wp:cNvGraphicFramePr>
+            <a:graphic xmlns:a="http://schemas.openxmlformats.org/drawingml/2006/main">
+              <a:graphicData uri="http://schemas.openxmlformats.org/drawingml/2006/picture">
+                <pic:pic xmlns:pic="http://schemas.openxmlformats.org/drawingml/2006/picture">
+                  <pic:nvPicPr>
+                    <pic:cNvPr id="298751839" name="Imagen 6" descr="Gráfico&#10;&#10;El contenido generado por IA puede ser incorrecto."/>
+                    <pic:cNvPicPr/>
+                  </pic:nvPicPr>
+                  <pic:blipFill>
+                    <a:blip r:embed="rId24">
+                      <a:extLst>
+                        <a:ext uri="{28A0092B-C50C-407E-A947-70E740481C1C}">
+                          <a14:useLocalDpi xmlns:a14="http://schemas.microsoft.com/office/drawing/2010/main" val="0"/>
+                        </a:ext>
+                      </a:extLst>
+                    </a:blip>
+                    <a:stretch>
+                      <a:fillRect/>
+                    </a:stretch>
+                  </pic:blipFill>
+                  <pic:spPr>
+                    <a:xfrm>
+                      <a:off x="0" y="0"/>
+                      <a:ext cx="6120130" cy="4589780"/>
+                    </a:xfrm>
+                    <a:prstGeom prst="rect">
+                      <a:avLst/>
+                    </a:prstGeom>
+                  </pic:spPr>
+                </pic:pic>
+              </a:graphicData>
+            </a:graphic>
+          </wp:inline>
+        </w:drawing>
+      </w:r>
+    </w:p>
+    <w:p>
+      <w:pPr>
+        <w:pStyle w:val="Descripcin"/>
+        <w:jc w:val="center"/>
+        <w:rPr>
+          <w:u w:val="single"/>
+        </w:rPr>
+      </w:pPr>
+      <w:r>
+        <w:t xml:space="preserve">Figura </w:t>
+      </w:r>
+      <w:fldSimple w:instr=" SEQ Figura \* ARABIC ">
+        <w:r>
+          <w:rPr>
+            <w:noProof/>
+          </w:rPr>
+          <w:t>8</w:t>
+        </w:r>
+      </w:fldSimple>
+      <w:r>
+        <w:t>. Diagrame de Gantt</w:t>
       </w:r>
     </w:p>
     <w:p>
@@ -7592,7 +7699,6 @@
       </w:pPr>
       <w:bookmarkStart w:id="53" w:name="_Toc221908764"/>
       <w:r>
-        <w:lastRenderedPageBreak/>
         <w:t>FUTURAS MEJORAS Y AMPLIACIONES</w:t>
       </w:r>
       <w:bookmarkEnd w:id="53"/>
@@ -7725,6 +7831,7 @@
         </w:numPr>
       </w:pPr>
       <w:r>
+        <w:lastRenderedPageBreak/>
         <w:t>Acceso a Datos: para la persistencia de la información en la base de datos.</w:t>
       </w:r>
     </w:p>
@@ -7955,7 +8062,7 @@
                     <pic:cNvPicPr/>
                   </pic:nvPicPr>
                   <pic:blipFill>
-                    <a:blip r:embed="rId24" cstate="print">
+                    <a:blip r:embed="rId25" cstate="print">
                       <a:extLst>
                         <a:ext uri="{28A0092B-C50C-407E-A947-70E740481C1C}">
                           <a14:useLocalDpi xmlns:a14="http://schemas.microsoft.com/office/drawing/2010/main" val="0"/>
@@ -7995,7 +8102,7 @@
           <w:rPr>
             <w:noProof/>
           </w:rPr>
-          <w:t>8</w:t>
+          <w:t>9</w:t>
         </w:r>
       </w:fldSimple>
       <w:r>
@@ -8100,7 +8207,7 @@
     <w:p/>
     <w:p/>
     <w:sectPr>
-      <w:footerReference w:type="default" r:id="rId25"/>
+      <w:footerReference w:type="default" r:id="rId26"/>
       <w:pgSz w:w="11906" w:h="16838"/>
       <w:pgMar w:top="1134" w:right="1134" w:bottom="1418" w:left="1134" w:header="709" w:footer="709" w:gutter="0"/>
       <w:pgNumType w:start="1"/>
@@ -9722,6 +9829,7 @@
   <w:style w:type="character" w:default="1" w:styleId="Fuentedeprrafopredeter">
     <w:name w:val="Default Paragraph Font"/>
     <w:uiPriority w:val="1"/>
+    <w:semiHidden/>
     <w:unhideWhenUsed/>
   </w:style>
   <w:style w:type="table" w:default="1" w:styleId="Tablanormal">
@@ -10471,10 +10579,6 @@
 </file>
 
 <file path=customXml/item1.xml><?xml version="1.0" encoding="utf-8"?>
-<b:Sources xmlns:b="http://schemas.openxmlformats.org/officeDocument/2006/bibliography" xmlns="http://schemas.openxmlformats.org/officeDocument/2006/bibliography" SelectedStyle="\APASixthEditionOfficeOnline.xsl" StyleName="APA" Version="6"/>
-</file>
-
-<file path=customXml/item2.xml><?xml version="1.0" encoding="utf-8"?>
 <?mso-contentType ?>
 <FormTemplates xmlns="http://schemas.microsoft.com/sharepoint/v3/contenttype/forms">
   <Display>DocumentLibraryForm</Display>
@@ -10483,7 +10587,19 @@
 </FormTemplates>
 </file>
 
+<file path=customXml/item2.xml><?xml version="1.0" encoding="utf-8"?>
+<b:Sources xmlns:b="http://schemas.openxmlformats.org/officeDocument/2006/bibliography" xmlns="http://schemas.openxmlformats.org/officeDocument/2006/bibliography" SelectedStyle="\APASixthEditionOfficeOnline.xsl" StyleName="APA" Version="6"/>
+</file>
+
 <file path=customXml/item3.xml><?xml version="1.0" encoding="utf-8"?>
+<p:properties xmlns:p="http://schemas.microsoft.com/office/2006/metadata/properties" xmlns:xsi="http://www.w3.org/2001/XMLSchema-instance" xmlns:pc="http://schemas.microsoft.com/office/infopath/2007/PartnerControls">
+  <documentManagement>
+    <_activity xmlns="d07641f9-f1a5-43c1-ac16-fa53e6c318bc" xsi:nil="true"/>
+  </documentManagement>
+</p:properties>
+</file>
+
+<file path=customXml/item4.xml><?xml version="1.0" encoding="utf-8"?>
 <ct:contentTypeSchema xmlns:ct="http://schemas.microsoft.com/office/2006/metadata/contentType" xmlns:ma="http://schemas.microsoft.com/office/2006/metadata/properties/metaAttributes" ct:_="" ma:_="" ma:contentTypeName="Documento" ma:contentTypeID="0x010100089FBA7B0FAFA84E9F1E615D3FC0A129" ma:contentTypeVersion="11" ma:contentTypeDescription="Crear nuevo documento." ma:contentTypeScope="" ma:versionID="fa55cfaacbcd603bd53d850e3b8176f7">
   <xsd:schema xmlns:xsd="http://www.w3.org/2001/XMLSchema" xmlns:xs="http://www.w3.org/2001/XMLSchema" xmlns:p="http://schemas.microsoft.com/office/2006/metadata/properties" xmlns:ns3="d07641f9-f1a5-43c1-ac16-fa53e6c318bc" targetNamespace="http://schemas.microsoft.com/office/2006/metadata/properties" ma:root="true" ma:fieldsID="78f989df160fe6a5ee2e0e0b0bfde0e3" ns3:_="">
     <xsd:import namespace="d07641f9-f1a5-43c1-ac16-fa53e6c318bc"/>
@@ -10671,15 +10787,15 @@
 </ct:contentTypeSchema>
 </file>
 
-<file path=customXml/item4.xml><?xml version="1.0" encoding="utf-8"?>
-<p:properties xmlns:p="http://schemas.microsoft.com/office/2006/metadata/properties" xmlns:xsi="http://www.w3.org/2001/XMLSchema-instance" xmlns:pc="http://schemas.microsoft.com/office/infopath/2007/PartnerControls">
-  <documentManagement>
-    <_activity xmlns="d07641f9-f1a5-43c1-ac16-fa53e6c318bc" xsi:nil="true"/>
-  </documentManagement>
-</p:properties>
+<file path=customXml/itemProps1.xml><?xml version="1.0" encoding="utf-8"?>
+<ds:datastoreItem xmlns:ds="http://schemas.openxmlformats.org/officeDocument/2006/customXml" ds:itemID="{480B8420-1B48-4D23-8D6E-64373AC5070B}">
+  <ds:schemaRefs>
+    <ds:schemaRef ds:uri="http://schemas.microsoft.com/sharepoint/v3/contenttype/forms"/>
+  </ds:schemaRefs>
+</ds:datastoreItem>
 </file>
 
-<file path=customXml/itemProps1.xml><?xml version="1.0" encoding="utf-8"?>
+<file path=customXml/itemProps2.xml><?xml version="1.0" encoding="utf-8"?>
 <ds:datastoreItem xmlns:ds="http://schemas.openxmlformats.org/officeDocument/2006/customXml" ds:itemID="{453714F8-FBC3-4DCC-8DCB-89BB58DCF76F}">
   <ds:schemaRefs>
     <ds:schemaRef ds:uri="http://schemas.openxmlformats.org/officeDocument/2006/bibliography"/>
@@ -10687,15 +10803,17 @@
 </ds:datastoreItem>
 </file>
 
-<file path=customXml/itemProps2.xml><?xml version="1.0" encoding="utf-8"?>
-<ds:datastoreItem xmlns:ds="http://schemas.openxmlformats.org/officeDocument/2006/customXml" ds:itemID="{480B8420-1B48-4D23-8D6E-64373AC5070B}">
+<file path=customXml/itemProps3.xml><?xml version="1.0" encoding="utf-8"?>
+<ds:datastoreItem xmlns:ds="http://schemas.openxmlformats.org/officeDocument/2006/customXml" ds:itemID="{7F0B1298-25D5-45B9-909D-DD837044A49E}">
   <ds:schemaRefs>
-    <ds:schemaRef ds:uri="http://schemas.microsoft.com/sharepoint/v3/contenttype/forms"/>
+    <ds:schemaRef ds:uri="http://schemas.microsoft.com/office/2006/metadata/properties"/>
+    <ds:schemaRef ds:uri="http://schemas.microsoft.com/office/infopath/2007/PartnerControls"/>
+    <ds:schemaRef ds:uri="d07641f9-f1a5-43c1-ac16-fa53e6c318bc"/>
   </ds:schemaRefs>
 </ds:datastoreItem>
 </file>
 
-<file path=customXml/itemProps3.xml><?xml version="1.0" encoding="utf-8"?>
+<file path=customXml/itemProps4.xml><?xml version="1.0" encoding="utf-8"?>
 <ds:datastoreItem xmlns:ds="http://schemas.openxmlformats.org/officeDocument/2006/customXml" ds:itemID="{B3C09D93-2BDC-4563-9759-9158244E5DE7}">
   <ds:schemaRefs>
     <ds:schemaRef ds:uri="http://schemas.microsoft.com/office/2006/metadata/contentType"/>
@@ -10711,14 +10829,4 @@
     <ds:schemaRef ds:uri="http://schemas.microsoft.com/internal/obd"/>
   </ds:schemaRefs>
 </ds:datastoreItem>
-</file>
-
-<file path=customXml/itemProps4.xml><?xml version="1.0" encoding="utf-8"?>
-<ds:datastoreItem xmlns:ds="http://schemas.openxmlformats.org/officeDocument/2006/customXml" ds:itemID="{7F0B1298-25D5-45B9-909D-DD837044A49E}">
-  <ds:schemaRefs>
-    <ds:schemaRef ds:uri="http://schemas.microsoft.com/office/2006/metadata/properties"/>
-    <ds:schemaRef ds:uri="http://schemas.microsoft.com/office/infopath/2007/PartnerControls"/>
-    <ds:schemaRef ds:uri="d07641f9-f1a5-43c1-ac16-fa53e6c318bc"/>
-  </ds:schemaRefs>
-</ds:datastoreItem>
 </file>
</xml_diff>

<commit_message>
Actualizacion en git del proyecto
archivo dañado admin.fxml, por tercera vez
</commit_message>
<xml_diff>
--- a/docs/provisional_DocumentacionProyecto_2VIFC302.docx
+++ b/docs/provisional_DocumentacionProyecto_2VIFC302.docx
@@ -1286,7 +1286,7 @@
           <w:lang w:eastAsia="es-VE"/>
         </w:rPr>
         <w:drawing>
-          <wp:inline distT="0" distB="0" distL="0" distR="0" wp14:anchorId="1183C0B2" wp14:editId="36FCF631">
+          <wp:inline distT="0" distB="0" distL="0" distR="0" wp14:anchorId="1183C0B2" wp14:editId="18B37778">
             <wp:extent cx="7556500" cy="10599420"/>
             <wp:effectExtent l="0" t="0" r="6350" b="0"/>
             <wp:docPr id="2" name="Imagen 2" descr="D:\servicios forobeta posts\diseño grafico\CLIENTES\Feelmusic - 05.11.18\archivos\11\11.jpg"/>
@@ -5478,11 +5478,6 @@
       <w:bookmarkEnd w:id="13"/>
     </w:p>
     <w:p>
-      <w:r>
-        <w:t>(…)</w:t>
-      </w:r>
-    </w:p>
-    <w:p>
       <w:pPr>
         <w:pStyle w:val="Prrafodelista"/>
         <w:numPr>
@@ -5491,9 +5486,6 @@
         </w:numPr>
       </w:pPr>
       <w:r>
-        <w:rPr>
-          <w:u w:val="single"/>
-        </w:rPr>
         <w:t>Arquitectura</w:t>
       </w:r>
       <w:r>
@@ -5560,7 +5552,7 @@
         <w:t xml:space="preserve">Seguridad de datos: se debe asegurar la </w:t>
       </w:r>
       <w:r>
-        <w:t>seguridad</w:t>
+        <w:t>integridad</w:t>
       </w:r>
       <w:r>
         <w:t xml:space="preserve"> de los datos sensibles como las contraseñas.</w:t>
@@ -5612,7 +5604,15 @@
         <w:t>continuación,</w:t>
       </w:r>
       <w:r>
-        <w:t xml:space="preserve"> se detallan los casos de uso que el aplicativo contempla.</w:t>
+        <w:t xml:space="preserve"> se detallan los casos de uso que el aplicativo contempla</w:t>
+      </w:r>
+      <w:r>
+        <w:t xml:space="preserve"> y los actores que se relacionan con cada uno</w:t>
+      </w:r>
+    </w:p>
+    <w:p>
+      <w:r>
+        <w:t>.</w:t>
       </w:r>
     </w:p>
     <w:p>
@@ -7023,15 +7023,7 @@
         <w:t>n</w:t>
       </w:r>
       <w:r>
-        <w:t xml:space="preserve">: asegurar que la GUI de escritorio y la </w:t>
-      </w:r>
-      <w:proofErr w:type="gramStart"/>
-      <w:r>
-        <w:t>app</w:t>
-      </w:r>
-      <w:proofErr w:type="gramEnd"/>
-      <w:r>
-        <w:t xml:space="preserve"> móvil se comunican correctamente con la base de datos.</w:t>
+        <w:t>: asegurar que la GUI de escritorio y la app móvil se comunican correctamente con la base de datos.</w:t>
       </w:r>
     </w:p>
     <w:p>
@@ -10579,6 +10571,10 @@
 </file>
 
 <file path=customXml/item1.xml><?xml version="1.0" encoding="utf-8"?>
+<b:Sources xmlns:b="http://schemas.openxmlformats.org/officeDocument/2006/bibliography" xmlns="http://schemas.openxmlformats.org/officeDocument/2006/bibliography" SelectedStyle="\APASixthEditionOfficeOnline.xsl" StyleName="APA" Version="6"/>
+</file>
+
+<file path=customXml/item2.xml><?xml version="1.0" encoding="utf-8"?>
 <?mso-contentType ?>
 <FormTemplates xmlns="http://schemas.microsoft.com/sharepoint/v3/contenttype/forms">
   <Display>DocumentLibraryForm</Display>
@@ -10587,19 +10583,7 @@
 </FormTemplates>
 </file>
 
-<file path=customXml/item2.xml><?xml version="1.0" encoding="utf-8"?>
-<b:Sources xmlns:b="http://schemas.openxmlformats.org/officeDocument/2006/bibliography" xmlns="http://schemas.openxmlformats.org/officeDocument/2006/bibliography" SelectedStyle="\APASixthEditionOfficeOnline.xsl" StyleName="APA" Version="6"/>
-</file>
-
 <file path=customXml/item3.xml><?xml version="1.0" encoding="utf-8"?>
-<p:properties xmlns:p="http://schemas.microsoft.com/office/2006/metadata/properties" xmlns:xsi="http://www.w3.org/2001/XMLSchema-instance" xmlns:pc="http://schemas.microsoft.com/office/infopath/2007/PartnerControls">
-  <documentManagement>
-    <_activity xmlns="d07641f9-f1a5-43c1-ac16-fa53e6c318bc" xsi:nil="true"/>
-  </documentManagement>
-</p:properties>
-</file>
-
-<file path=customXml/item4.xml><?xml version="1.0" encoding="utf-8"?>
 <ct:contentTypeSchema xmlns:ct="http://schemas.microsoft.com/office/2006/metadata/contentType" xmlns:ma="http://schemas.microsoft.com/office/2006/metadata/properties/metaAttributes" ct:_="" ma:_="" ma:contentTypeName="Documento" ma:contentTypeID="0x010100089FBA7B0FAFA84E9F1E615D3FC0A129" ma:contentTypeVersion="11" ma:contentTypeDescription="Crear nuevo documento." ma:contentTypeScope="" ma:versionID="fa55cfaacbcd603bd53d850e3b8176f7">
   <xsd:schema xmlns:xsd="http://www.w3.org/2001/XMLSchema" xmlns:xs="http://www.w3.org/2001/XMLSchema" xmlns:p="http://schemas.microsoft.com/office/2006/metadata/properties" xmlns:ns3="d07641f9-f1a5-43c1-ac16-fa53e6c318bc" targetNamespace="http://schemas.microsoft.com/office/2006/metadata/properties" ma:root="true" ma:fieldsID="78f989df160fe6a5ee2e0e0b0bfde0e3" ns3:_="">
     <xsd:import namespace="d07641f9-f1a5-43c1-ac16-fa53e6c318bc"/>
@@ -10787,7 +10771,23 @@
 </ct:contentTypeSchema>
 </file>
 
+<file path=customXml/item4.xml><?xml version="1.0" encoding="utf-8"?>
+<p:properties xmlns:p="http://schemas.microsoft.com/office/2006/metadata/properties" xmlns:xsi="http://www.w3.org/2001/XMLSchema-instance" xmlns:pc="http://schemas.microsoft.com/office/infopath/2007/PartnerControls">
+  <documentManagement>
+    <_activity xmlns="d07641f9-f1a5-43c1-ac16-fa53e6c318bc" xsi:nil="true"/>
+  </documentManagement>
+</p:properties>
+</file>
+
 <file path=customXml/itemProps1.xml><?xml version="1.0" encoding="utf-8"?>
+<ds:datastoreItem xmlns:ds="http://schemas.openxmlformats.org/officeDocument/2006/customXml" ds:itemID="{453714F8-FBC3-4DCC-8DCB-89BB58DCF76F}">
+  <ds:schemaRefs>
+    <ds:schemaRef ds:uri="http://schemas.openxmlformats.org/officeDocument/2006/bibliography"/>
+  </ds:schemaRefs>
+</ds:datastoreItem>
+</file>
+
+<file path=customXml/itemProps2.xml><?xml version="1.0" encoding="utf-8"?>
 <ds:datastoreItem xmlns:ds="http://schemas.openxmlformats.org/officeDocument/2006/customXml" ds:itemID="{480B8420-1B48-4D23-8D6E-64373AC5070B}">
   <ds:schemaRefs>
     <ds:schemaRef ds:uri="http://schemas.microsoft.com/sharepoint/v3/contenttype/forms"/>
@@ -10795,25 +10795,7 @@
 </ds:datastoreItem>
 </file>
 
-<file path=customXml/itemProps2.xml><?xml version="1.0" encoding="utf-8"?>
-<ds:datastoreItem xmlns:ds="http://schemas.openxmlformats.org/officeDocument/2006/customXml" ds:itemID="{453714F8-FBC3-4DCC-8DCB-89BB58DCF76F}">
-  <ds:schemaRefs>
-    <ds:schemaRef ds:uri="http://schemas.openxmlformats.org/officeDocument/2006/bibliography"/>
-  </ds:schemaRefs>
-</ds:datastoreItem>
-</file>
-
 <file path=customXml/itemProps3.xml><?xml version="1.0" encoding="utf-8"?>
-<ds:datastoreItem xmlns:ds="http://schemas.openxmlformats.org/officeDocument/2006/customXml" ds:itemID="{7F0B1298-25D5-45B9-909D-DD837044A49E}">
-  <ds:schemaRefs>
-    <ds:schemaRef ds:uri="http://schemas.microsoft.com/office/2006/metadata/properties"/>
-    <ds:schemaRef ds:uri="http://schemas.microsoft.com/office/infopath/2007/PartnerControls"/>
-    <ds:schemaRef ds:uri="d07641f9-f1a5-43c1-ac16-fa53e6c318bc"/>
-  </ds:schemaRefs>
-</ds:datastoreItem>
-</file>
-
-<file path=customXml/itemProps4.xml><?xml version="1.0" encoding="utf-8"?>
 <ds:datastoreItem xmlns:ds="http://schemas.openxmlformats.org/officeDocument/2006/customXml" ds:itemID="{B3C09D93-2BDC-4563-9759-9158244E5DE7}">
   <ds:schemaRefs>
     <ds:schemaRef ds:uri="http://schemas.microsoft.com/office/2006/metadata/contentType"/>
@@ -10829,4 +10811,14 @@
     <ds:schemaRef ds:uri="http://schemas.microsoft.com/internal/obd"/>
   </ds:schemaRefs>
 </ds:datastoreItem>
+</file>
+
+<file path=customXml/itemProps4.xml><?xml version="1.0" encoding="utf-8"?>
+<ds:datastoreItem xmlns:ds="http://schemas.openxmlformats.org/officeDocument/2006/customXml" ds:itemID="{7F0B1298-25D5-45B9-909D-DD837044A49E}">
+  <ds:schemaRefs>
+    <ds:schemaRef ds:uri="http://schemas.microsoft.com/office/2006/metadata/properties"/>
+    <ds:schemaRef ds:uri="http://schemas.microsoft.com/office/infopath/2007/PartnerControls"/>
+    <ds:schemaRef ds:uri="d07641f9-f1a5-43c1-ac16-fa53e6c318bc"/>
+  </ds:schemaRefs>
+</ds:datastoreItem>
 </file>
</xml_diff>

<commit_message>
docs: modificacion diagrama de casos de uso
</commit_message>
<xml_diff>
--- a/docs/provisional_DocumentacionProyecto_2VIFC302.docx
+++ b/docs/provisional_DocumentacionProyecto_2VIFC302.docx
@@ -617,7 +617,6 @@
                               </w:rPr>
                               <w:t xml:space="preserve">&lt;&lt;Mes y </w:t>
                             </w:r>
-                            <w:proofErr w:type="spellStart"/>
                             <w:r>
                               <w:rPr>
                                 <w:rFonts w:eastAsia="Aptos" w:hAnsi="Aptos" w:cs="Aptos"/>
@@ -628,20 +627,7 @@
                                 <w:szCs w:val="32"/>
                                 <w:lang w:val="en-US"/>
                               </w:rPr>
-                              <w:t>año</w:t>
-                            </w:r>
-                            <w:proofErr w:type="spellEnd"/>
-                            <w:r>
-                              <w:rPr>
-                                <w:rFonts w:eastAsia="Aptos" w:hAnsi="Aptos" w:cs="Aptos"/>
-                                <w:b/>
-                                <w:bCs/>
-                                <w:color w:val="215E99" w:themeColor="text2" w:themeTint="BF"/>
-                                <w:sz w:val="32"/>
-                                <w:szCs w:val="32"/>
-                                <w:lang w:val="en-US"/>
-                              </w:rPr>
-                              <w:t>&gt;&gt;</w:t>
+                              <w:t>año&gt;&gt;</w:t>
                             </w:r>
                           </w:p>
                           <w:p>
@@ -857,7 +843,6 @@
                         </w:rPr>
                         <w:t xml:space="preserve">&lt;&lt;Mes y </w:t>
                       </w:r>
-                      <w:proofErr w:type="spellStart"/>
                       <w:r>
                         <w:rPr>
                           <w:rFonts w:eastAsia="Aptos" w:hAnsi="Aptos" w:cs="Aptos"/>
@@ -868,20 +853,7 @@
                           <w:szCs w:val="32"/>
                           <w:lang w:val="en-US"/>
                         </w:rPr>
-                        <w:t>año</w:t>
-                      </w:r>
-                      <w:proofErr w:type="spellEnd"/>
-                      <w:r>
-                        <w:rPr>
-                          <w:rFonts w:eastAsia="Aptos" w:hAnsi="Aptos" w:cs="Aptos"/>
-                          <w:b/>
-                          <w:bCs/>
-                          <w:color w:val="215E99" w:themeColor="text2" w:themeTint="BF"/>
-                          <w:sz w:val="32"/>
-                          <w:szCs w:val="32"/>
-                          <w:lang w:val="en-US"/>
-                        </w:rPr>
-                        <w:t>&gt;&gt;</w:t>
+                        <w:t>año&gt;&gt;</w:t>
                       </w:r>
                     </w:p>
                     <w:p>
@@ -1157,7 +1129,6 @@
                               </w:rPr>
                               <w:t xml:space="preserve">Desarrollo de </w:t>
                             </w:r>
-                            <w:proofErr w:type="spellStart"/>
                             <w:r>
                               <w:rPr>
                                 <w:rFonts w:eastAsia="Aptos" w:hAnsi="Aptos" w:cs="Aptos"/>
@@ -1166,31 +1137,8 @@
                                 <w:szCs w:val="44"/>
                                 <w:lang w:val="en-US"/>
                               </w:rPr>
-                              <w:t>Aplicaciones</w:t>
+                              <w:t>Aplicaciones Multiplataforma</w:t>
                             </w:r>
-                            <w:proofErr w:type="spellEnd"/>
-                            <w:r>
-                              <w:rPr>
-                                <w:rFonts w:eastAsia="Aptos" w:hAnsi="Aptos" w:cs="Aptos"/>
-                                <w:color w:val="215E99" w:themeColor="text2" w:themeTint="BF"/>
-                                <w:sz w:val="44"/>
-                                <w:szCs w:val="44"/>
-                                <w:lang w:val="en-US"/>
-                              </w:rPr>
-                              <w:t xml:space="preserve"> </w:t>
-                            </w:r>
-                            <w:proofErr w:type="spellStart"/>
-                            <w:r>
-                              <w:rPr>
-                                <w:rFonts w:eastAsia="Aptos" w:hAnsi="Aptos" w:cs="Aptos"/>
-                                <w:color w:val="215E99" w:themeColor="text2" w:themeTint="BF"/>
-                                <w:sz w:val="44"/>
-                                <w:szCs w:val="44"/>
-                                <w:lang w:val="en-US"/>
-                              </w:rPr>
-                              <w:t>Multiplataforma</w:t>
-                            </w:r>
-                            <w:proofErr w:type="spellEnd"/>
                           </w:p>
                         </w:txbxContent>
                       </wps:txbx>
@@ -1238,7 +1186,6 @@
                         </w:rPr>
                         <w:t xml:space="preserve">Desarrollo de </w:t>
                       </w:r>
-                      <w:proofErr w:type="spellStart"/>
                       <w:r>
                         <w:rPr>
                           <w:rFonts w:eastAsia="Aptos" w:hAnsi="Aptos" w:cs="Aptos"/>
@@ -1247,31 +1194,8 @@
                           <w:szCs w:val="44"/>
                           <w:lang w:val="en-US"/>
                         </w:rPr>
-                        <w:t>Aplicaciones</w:t>
+                        <w:t>Aplicaciones Multiplataforma</w:t>
                       </w:r>
-                      <w:proofErr w:type="spellEnd"/>
-                      <w:r>
-                        <w:rPr>
-                          <w:rFonts w:eastAsia="Aptos" w:hAnsi="Aptos" w:cs="Aptos"/>
-                          <w:color w:val="215E99" w:themeColor="text2" w:themeTint="BF"/>
-                          <w:sz w:val="44"/>
-                          <w:szCs w:val="44"/>
-                          <w:lang w:val="en-US"/>
-                        </w:rPr>
-                        <w:t xml:space="preserve"> </w:t>
-                      </w:r>
-                      <w:proofErr w:type="spellStart"/>
-                      <w:r>
-                        <w:rPr>
-                          <w:rFonts w:eastAsia="Aptos" w:hAnsi="Aptos" w:cs="Aptos"/>
-                          <w:color w:val="215E99" w:themeColor="text2" w:themeTint="BF"/>
-                          <w:sz w:val="44"/>
-                          <w:szCs w:val="44"/>
-                          <w:lang w:val="en-US"/>
-                        </w:rPr>
-                        <w:t>Multiplataforma</w:t>
-                      </w:r>
-                      <w:proofErr w:type="spellEnd"/>
                     </w:p>
                   </w:txbxContent>
                 </v:textbox>
@@ -1286,7 +1210,7 @@
           <w:lang w:eastAsia="es-VE"/>
         </w:rPr>
         <w:drawing>
-          <wp:inline distT="0" distB="0" distL="0" distR="0" wp14:anchorId="1183C0B2" wp14:editId="7B81B2B2">
+          <wp:inline distT="0" distB="0" distL="0" distR="0" wp14:anchorId="1183C0B2" wp14:editId="446985C4">
             <wp:extent cx="7556500" cy="10599420"/>
             <wp:effectExtent l="0" t="0" r="6350" b="0"/>
             <wp:docPr id="2" name="Imagen 2" descr="D:\servicios forobeta posts\diseño grafico\CLIENTES\Feelmusic - 05.11.18\archivos\11\11.jpg"/>
@@ -6677,9 +6601,9 @@
           <w:noProof/>
         </w:rPr>
         <w:drawing>
-          <wp:inline distT="0" distB="0" distL="0" distR="0" wp14:anchorId="629EDE24" wp14:editId="024A0034">
-            <wp:extent cx="6120130" cy="4680585"/>
-            <wp:effectExtent l="0" t="0" r="0" b="5715"/>
+          <wp:inline distT="0" distB="0" distL="0" distR="0" wp14:anchorId="629EDE24" wp14:editId="34127D9B">
+            <wp:extent cx="4228881" cy="4680585"/>
+            <wp:effectExtent l="0" t="0" r="635" b="5715"/>
             <wp:docPr id="1224806174" name="Imagen 6"/>
             <wp:cNvGraphicFramePr>
               <a:graphicFrameLocks xmlns:a="http://schemas.openxmlformats.org/drawingml/2006/main" noChangeAspect="1"/>
@@ -6688,11 +6612,11 @@
               <a:graphicData uri="http://schemas.openxmlformats.org/drawingml/2006/picture">
                 <pic:pic xmlns:pic="http://schemas.openxmlformats.org/drawingml/2006/picture">
                   <pic:nvPicPr>
-                    <pic:cNvPr id="1224806174" name=""/>
+                    <pic:cNvPr id="1224806174" name="Imagen 6"/>
                     <pic:cNvPicPr/>
                   </pic:nvPicPr>
                   <pic:blipFill>
-                    <a:blip r:embed="rId15" cstate="print">
+                    <a:blip r:embed="rId15">
                       <a:extLst>
                         <a:ext uri="{28A0092B-C50C-407E-A947-70E740481C1C}">
                           <a14:useLocalDpi xmlns:a14="http://schemas.microsoft.com/office/drawing/2010/main" val="0"/>
@@ -6706,7 +6630,7 @@
                   <pic:spPr>
                     <a:xfrm>
                       <a:off x="0" y="0"/>
-                      <a:ext cx="6120130" cy="4680585"/>
+                      <a:ext cx="4228881" cy="4680585"/>
                     </a:xfrm>
                     <a:prstGeom prst="rect">
                       <a:avLst/>
@@ -14515,6 +14439,7 @@
   <w:style w:type="character" w:default="1" w:styleId="Fuentedeprrafopredeter">
     <w:name w:val="Default Paragraph Font"/>
     <w:uiPriority w:val="1"/>
+    <w:semiHidden/>
     <w:unhideWhenUsed/>
   </w:style>
   <w:style w:type="table" w:default="1" w:styleId="Tablanormal">
@@ -15447,10 +15372,6 @@
 </file>
 
 <file path=customXml/item1.xml><?xml version="1.0" encoding="utf-8"?>
-<b:Sources xmlns:b="http://schemas.openxmlformats.org/officeDocument/2006/bibliography" xmlns="http://schemas.openxmlformats.org/officeDocument/2006/bibliography" SelectedStyle="\APASixthEditionOfficeOnline.xsl" StyleName="APA" Version="6"/>
-</file>
-
-<file path=customXml/item2.xml><?xml version="1.0" encoding="utf-8"?>
 <?mso-contentType ?>
 <FormTemplates xmlns="http://schemas.microsoft.com/sharepoint/v3/contenttype/forms">
   <Display>DocumentLibraryForm</Display>
@@ -15459,7 +15380,19 @@
 </FormTemplates>
 </file>
 
+<file path=customXml/item2.xml><?xml version="1.0" encoding="utf-8"?>
+<b:Sources xmlns:b="http://schemas.openxmlformats.org/officeDocument/2006/bibliography" xmlns="http://schemas.openxmlformats.org/officeDocument/2006/bibliography" SelectedStyle="\APASixthEditionOfficeOnline.xsl" StyleName="APA" Version="6"/>
+</file>
+
 <file path=customXml/item3.xml><?xml version="1.0" encoding="utf-8"?>
+<p:properties xmlns:p="http://schemas.microsoft.com/office/2006/metadata/properties" xmlns:xsi="http://www.w3.org/2001/XMLSchema-instance" xmlns:pc="http://schemas.microsoft.com/office/infopath/2007/PartnerControls">
+  <documentManagement>
+    <_activity xmlns="d07641f9-f1a5-43c1-ac16-fa53e6c318bc" xsi:nil="true"/>
+  </documentManagement>
+</p:properties>
+</file>
+
+<file path=customXml/item4.xml><?xml version="1.0" encoding="utf-8"?>
 <ct:contentTypeSchema xmlns:ct="http://schemas.microsoft.com/office/2006/metadata/contentType" xmlns:ma="http://schemas.microsoft.com/office/2006/metadata/properties/metaAttributes" ct:_="" ma:_="" ma:contentTypeName="Documento" ma:contentTypeID="0x010100089FBA7B0FAFA84E9F1E615D3FC0A129" ma:contentTypeVersion="11" ma:contentTypeDescription="Crear nuevo documento." ma:contentTypeScope="" ma:versionID="fa55cfaacbcd603bd53d850e3b8176f7">
   <xsd:schema xmlns:xsd="http://www.w3.org/2001/XMLSchema" xmlns:xs="http://www.w3.org/2001/XMLSchema" xmlns:p="http://schemas.microsoft.com/office/2006/metadata/properties" xmlns:ns3="d07641f9-f1a5-43c1-ac16-fa53e6c318bc" targetNamespace="http://schemas.microsoft.com/office/2006/metadata/properties" ma:root="true" ma:fieldsID="78f989df160fe6a5ee2e0e0b0bfde0e3" ns3:_="">
     <xsd:import namespace="d07641f9-f1a5-43c1-ac16-fa53e6c318bc"/>
@@ -15647,15 +15580,15 @@
 </ct:contentTypeSchema>
 </file>
 
-<file path=customXml/item4.xml><?xml version="1.0" encoding="utf-8"?>
-<p:properties xmlns:p="http://schemas.microsoft.com/office/2006/metadata/properties" xmlns:xsi="http://www.w3.org/2001/XMLSchema-instance" xmlns:pc="http://schemas.microsoft.com/office/infopath/2007/PartnerControls">
-  <documentManagement>
-    <_activity xmlns="d07641f9-f1a5-43c1-ac16-fa53e6c318bc" xsi:nil="true"/>
-  </documentManagement>
-</p:properties>
+<file path=customXml/itemProps1.xml><?xml version="1.0" encoding="utf-8"?>
+<ds:datastoreItem xmlns:ds="http://schemas.openxmlformats.org/officeDocument/2006/customXml" ds:itemID="{480B8420-1B48-4D23-8D6E-64373AC5070B}">
+  <ds:schemaRefs>
+    <ds:schemaRef ds:uri="http://schemas.microsoft.com/sharepoint/v3/contenttype/forms"/>
+  </ds:schemaRefs>
+</ds:datastoreItem>
 </file>
 
-<file path=customXml/itemProps1.xml><?xml version="1.0" encoding="utf-8"?>
+<file path=customXml/itemProps2.xml><?xml version="1.0" encoding="utf-8"?>
 <ds:datastoreItem xmlns:ds="http://schemas.openxmlformats.org/officeDocument/2006/customXml" ds:itemID="{453714F8-FBC3-4DCC-8DCB-89BB58DCF76F}">
   <ds:schemaRefs>
     <ds:schemaRef ds:uri="http://schemas.openxmlformats.org/officeDocument/2006/bibliography"/>
@@ -15663,15 +15596,17 @@
 </ds:datastoreItem>
 </file>
 
-<file path=customXml/itemProps2.xml><?xml version="1.0" encoding="utf-8"?>
-<ds:datastoreItem xmlns:ds="http://schemas.openxmlformats.org/officeDocument/2006/customXml" ds:itemID="{480B8420-1B48-4D23-8D6E-64373AC5070B}">
+<file path=customXml/itemProps3.xml><?xml version="1.0" encoding="utf-8"?>
+<ds:datastoreItem xmlns:ds="http://schemas.openxmlformats.org/officeDocument/2006/customXml" ds:itemID="{7F0B1298-25D5-45B9-909D-DD837044A49E}">
   <ds:schemaRefs>
-    <ds:schemaRef ds:uri="http://schemas.microsoft.com/sharepoint/v3/contenttype/forms"/>
+    <ds:schemaRef ds:uri="http://schemas.microsoft.com/office/2006/metadata/properties"/>
+    <ds:schemaRef ds:uri="http://schemas.microsoft.com/office/infopath/2007/PartnerControls"/>
+    <ds:schemaRef ds:uri="d07641f9-f1a5-43c1-ac16-fa53e6c318bc"/>
   </ds:schemaRefs>
 </ds:datastoreItem>
 </file>
 
-<file path=customXml/itemProps3.xml><?xml version="1.0" encoding="utf-8"?>
+<file path=customXml/itemProps4.xml><?xml version="1.0" encoding="utf-8"?>
 <ds:datastoreItem xmlns:ds="http://schemas.openxmlformats.org/officeDocument/2006/customXml" ds:itemID="{B3C09D93-2BDC-4563-9759-9158244E5DE7}">
   <ds:schemaRefs>
     <ds:schemaRef ds:uri="http://schemas.microsoft.com/office/2006/metadata/contentType"/>
@@ -15687,14 +15622,4 @@
     <ds:schemaRef ds:uri="http://schemas.microsoft.com/internal/obd"/>
   </ds:schemaRefs>
 </ds:datastoreItem>
-</file>
-
-<file path=customXml/itemProps4.xml><?xml version="1.0" encoding="utf-8"?>
-<ds:datastoreItem xmlns:ds="http://schemas.openxmlformats.org/officeDocument/2006/customXml" ds:itemID="{7F0B1298-25D5-45B9-909D-DD837044A49E}">
-  <ds:schemaRefs>
-    <ds:schemaRef ds:uri="http://schemas.microsoft.com/office/2006/metadata/properties"/>
-    <ds:schemaRef ds:uri="http://schemas.microsoft.com/office/infopath/2007/PartnerControls"/>
-    <ds:schemaRef ds:uri="d07641f9-f1a5-43c1-ac16-fa53e6c318bc"/>
-  </ds:schemaRefs>
-</ds:datastoreItem>
 </file>
</xml_diff>

<commit_message>
docs: modificada guia de estilos
</commit_message>
<xml_diff>
--- a/docs/provisional_DocumentacionProyecto_2VIFC302.docx
+++ b/docs/provisional_DocumentacionProyecto_2VIFC302.docx
@@ -615,19 +615,7 @@
                                 <w:szCs w:val="32"/>
                                 <w:lang w:val="en-US"/>
                               </w:rPr>
-                              <w:t xml:space="preserve">&lt;&lt;Mes y </w:t>
-                            </w:r>
-                            <w:r>
-                              <w:rPr>
-                                <w:rFonts w:eastAsia="Aptos" w:hAnsi="Aptos" w:cs="Aptos"/>
-                                <w:b/>
-                                <w:bCs/>
-                                <w:color w:val="215E99" w:themeColor="text2" w:themeTint="BF"/>
-                                <w:sz w:val="32"/>
-                                <w:szCs w:val="32"/>
-                                <w:lang w:val="en-US"/>
-                              </w:rPr>
-                              <w:t>año&gt;&gt;</w:t>
+                              <w:t>&lt;&lt;Mes y año&gt;&gt;</w:t>
                             </w:r>
                           </w:p>
                           <w:p>
@@ -841,19 +829,7 @@
                           <w:szCs w:val="32"/>
                           <w:lang w:val="en-US"/>
                         </w:rPr>
-                        <w:t xml:space="preserve">&lt;&lt;Mes y </w:t>
-                      </w:r>
-                      <w:r>
-                        <w:rPr>
-                          <w:rFonts w:eastAsia="Aptos" w:hAnsi="Aptos" w:cs="Aptos"/>
-                          <w:b/>
-                          <w:bCs/>
-                          <w:color w:val="215E99" w:themeColor="text2" w:themeTint="BF"/>
-                          <w:sz w:val="32"/>
-                          <w:szCs w:val="32"/>
-                          <w:lang w:val="en-US"/>
-                        </w:rPr>
-                        <w:t>año&gt;&gt;</w:t>
+                        <w:t>&lt;&lt;Mes y año&gt;&gt;</w:t>
                       </w:r>
                     </w:p>
                     <w:p>
@@ -1127,17 +1103,7 @@
                                 <w:szCs w:val="44"/>
                                 <w:lang w:val="en-US"/>
                               </w:rPr>
-                              <w:t xml:space="preserve">Desarrollo de </w:t>
-                            </w:r>
-                            <w:r>
-                              <w:rPr>
-                                <w:rFonts w:eastAsia="Aptos" w:hAnsi="Aptos" w:cs="Aptos"/>
-                                <w:color w:val="215E99" w:themeColor="text2" w:themeTint="BF"/>
-                                <w:sz w:val="44"/>
-                                <w:szCs w:val="44"/>
-                                <w:lang w:val="en-US"/>
-                              </w:rPr>
-                              <w:t>Aplicaciones Multiplataforma</w:t>
+                              <w:t>Desarrollo de Aplicaciones Multiplataforma</w:t>
                             </w:r>
                           </w:p>
                         </w:txbxContent>
@@ -1184,17 +1150,7 @@
                           <w:szCs w:val="44"/>
                           <w:lang w:val="en-US"/>
                         </w:rPr>
-                        <w:t xml:space="preserve">Desarrollo de </w:t>
-                      </w:r>
-                      <w:r>
-                        <w:rPr>
-                          <w:rFonts w:eastAsia="Aptos" w:hAnsi="Aptos" w:cs="Aptos"/>
-                          <w:color w:val="215E99" w:themeColor="text2" w:themeTint="BF"/>
-                          <w:sz w:val="44"/>
-                          <w:szCs w:val="44"/>
-                          <w:lang w:val="en-US"/>
-                        </w:rPr>
-                        <w:t>Aplicaciones Multiplataforma</w:t>
+                        <w:t>Desarrollo de Aplicaciones Multiplataforma</w:t>
                       </w:r>
                     </w:p>
                   </w:txbxContent>
@@ -1210,7 +1166,7 @@
           <w:lang w:eastAsia="es-VE"/>
         </w:rPr>
         <w:drawing>
-          <wp:inline distT="0" distB="0" distL="0" distR="0" wp14:anchorId="1183C0B2" wp14:editId="446985C4">
+          <wp:inline distT="0" distB="0" distL="0" distR="0" wp14:anchorId="1183C0B2" wp14:editId="2BD255BA">
             <wp:extent cx="7556500" cy="10599420"/>
             <wp:effectExtent l="0" t="0" r="6350" b="0"/>
             <wp:docPr id="2" name="Imagen 2" descr="D:\servicios forobeta posts\diseño grafico\CLIENTES\Feelmusic - 05.11.18\archivos\11\11.jpg"/>
@@ -1356,7 +1312,7 @@
             </w:rPr>
             <w:fldChar w:fldCharType="separate"/>
           </w:r>
-          <w:hyperlink w:anchor="_Toc221908739" w:history="1">
+          <w:hyperlink w:anchor="_Toc227855977" w:history="1">
             <w:r>
               <w:rPr>
                 <w:rStyle w:val="Hipervnculo"/>
@@ -1383,7 +1339,7 @@
                 <w:noProof/>
                 <w:webHidden/>
               </w:rPr>
-              <w:instrText xml:space="preserve"> PAGEREF _Toc221908739 \h </w:instrText>
+              <w:instrText xml:space="preserve"> PAGEREF _Toc227855977 \h </w:instrText>
             </w:r>
             <w:r>
               <w:rPr>
@@ -1429,7 +1385,7 @@
               <w:lang w:eastAsia="es-ES"/>
             </w:rPr>
           </w:pPr>
-          <w:hyperlink w:anchor="_Toc221908740" w:history="1">
+          <w:hyperlink w:anchor="_Toc227855978" w:history="1">
             <w:r>
               <w:rPr>
                 <w:rStyle w:val="Hipervnculo"/>
@@ -1473,7 +1429,7 @@
                 <w:noProof/>
                 <w:webHidden/>
               </w:rPr>
-              <w:instrText xml:space="preserve"> PAGEREF _Toc221908740 \h </w:instrText>
+              <w:instrText xml:space="preserve"> PAGEREF _Toc227855978 \h </w:instrText>
             </w:r>
             <w:r>
               <w:rPr>
@@ -1519,7 +1475,7 @@
               <w:lang w:eastAsia="es-ES"/>
             </w:rPr>
           </w:pPr>
-          <w:hyperlink w:anchor="_Toc221908741" w:history="1">
+          <w:hyperlink w:anchor="_Toc227855979" w:history="1">
             <w:r>
               <w:rPr>
                 <w:rStyle w:val="Hipervnculo"/>
@@ -1563,7 +1519,7 @@
                 <w:noProof/>
                 <w:webHidden/>
               </w:rPr>
-              <w:instrText xml:space="preserve"> PAGEREF _Toc221908741 \h </w:instrText>
+              <w:instrText xml:space="preserve"> PAGEREF _Toc227855979 \h </w:instrText>
             </w:r>
             <w:r>
               <w:rPr>
@@ -1609,7 +1565,7 @@
               <w:lang w:eastAsia="es-ES"/>
             </w:rPr>
           </w:pPr>
-          <w:hyperlink w:anchor="_Toc221908742" w:history="1">
+          <w:hyperlink w:anchor="_Toc227855980" w:history="1">
             <w:r>
               <w:rPr>
                 <w:rStyle w:val="Hipervnculo"/>
@@ -1653,7 +1609,7 @@
                 <w:noProof/>
                 <w:webHidden/>
               </w:rPr>
-              <w:instrText xml:space="preserve"> PAGEREF _Toc221908742 \h </w:instrText>
+              <w:instrText xml:space="preserve"> PAGEREF _Toc227855980 \h </w:instrText>
             </w:r>
             <w:r>
               <w:rPr>
@@ -1699,7 +1655,7 @@
               <w:lang w:eastAsia="es-ES"/>
             </w:rPr>
           </w:pPr>
-          <w:hyperlink w:anchor="_Toc221908743" w:history="1">
+          <w:hyperlink w:anchor="_Toc227855981" w:history="1">
             <w:r>
               <w:rPr>
                 <w:rStyle w:val="Hipervnculo"/>
@@ -1743,7 +1699,7 @@
                 <w:noProof/>
                 <w:webHidden/>
               </w:rPr>
-              <w:instrText xml:space="preserve"> PAGEREF _Toc221908743 \h </w:instrText>
+              <w:instrText xml:space="preserve"> PAGEREF _Toc227855981 \h </w:instrText>
             </w:r>
             <w:r>
               <w:rPr>
@@ -1789,7 +1745,7 @@
               <w:lang w:eastAsia="es-ES"/>
             </w:rPr>
           </w:pPr>
-          <w:hyperlink w:anchor="_Toc221908745" w:history="1">
+          <w:hyperlink w:anchor="_Toc227855983" w:history="1">
             <w:r>
               <w:rPr>
                 <w:rStyle w:val="Hipervnculo"/>
@@ -1833,7 +1789,7 @@
                 <w:noProof/>
                 <w:webHidden/>
               </w:rPr>
-              <w:instrText xml:space="preserve"> PAGEREF _Toc221908745 \h </w:instrText>
+              <w:instrText xml:space="preserve"> PAGEREF _Toc227855983 \h </w:instrText>
             </w:r>
             <w:r>
               <w:rPr>
@@ -1879,7 +1835,7 @@
               <w:lang w:eastAsia="es-ES"/>
             </w:rPr>
           </w:pPr>
-          <w:hyperlink w:anchor="_Toc221908746" w:history="1">
+          <w:hyperlink w:anchor="_Toc227855984" w:history="1">
             <w:r>
               <w:rPr>
                 <w:rStyle w:val="Hipervnculo"/>
@@ -1923,7 +1879,7 @@
                 <w:noProof/>
                 <w:webHidden/>
               </w:rPr>
-              <w:instrText xml:space="preserve"> PAGEREF _Toc221908746 \h </w:instrText>
+              <w:instrText xml:space="preserve"> PAGEREF _Toc227855984 \h </w:instrText>
             </w:r>
             <w:r>
               <w:rPr>
@@ -1943,7 +1899,7 @@
                 <w:noProof/>
                 <w:webHidden/>
               </w:rPr>
-              <w:t>4</w:t>
+              <w:t>5</w:t>
             </w:r>
             <w:r>
               <w:rPr>
@@ -1969,7 +1925,7 @@
               <w:lang w:eastAsia="es-ES"/>
             </w:rPr>
           </w:pPr>
-          <w:hyperlink w:anchor="_Toc221908747" w:history="1">
+          <w:hyperlink w:anchor="_Toc227855985" w:history="1">
             <w:r>
               <w:rPr>
                 <w:rStyle w:val="Hipervnculo"/>
@@ -2013,7 +1969,7 @@
                 <w:noProof/>
                 <w:webHidden/>
               </w:rPr>
-              <w:instrText xml:space="preserve"> PAGEREF _Toc221908747 \h </w:instrText>
+              <w:instrText xml:space="preserve"> PAGEREF _Toc227855985 \h </w:instrText>
             </w:r>
             <w:r>
               <w:rPr>
@@ -2033,7 +1989,7 @@
                 <w:noProof/>
                 <w:webHidden/>
               </w:rPr>
-              <w:t>4</w:t>
+              <w:t>5</w:t>
             </w:r>
             <w:r>
               <w:rPr>
@@ -2059,7 +2015,7 @@
               <w:lang w:eastAsia="es-ES"/>
             </w:rPr>
           </w:pPr>
-          <w:hyperlink w:anchor="_Toc221908748" w:history="1">
+          <w:hyperlink w:anchor="_Toc227855986" w:history="1">
             <w:r>
               <w:rPr>
                 <w:rStyle w:val="Hipervnculo"/>
@@ -2103,7 +2059,7 @@
                 <w:noProof/>
                 <w:webHidden/>
               </w:rPr>
-              <w:instrText xml:space="preserve"> PAGEREF _Toc221908748 \h </w:instrText>
+              <w:instrText xml:space="preserve"> PAGEREF _Toc227855986 \h </w:instrText>
             </w:r>
             <w:r>
               <w:rPr>
@@ -2123,7 +2079,7 @@
                 <w:noProof/>
                 <w:webHidden/>
               </w:rPr>
-              <w:t>5</w:t>
+              <w:t>6</w:t>
             </w:r>
             <w:r>
               <w:rPr>
@@ -2149,7 +2105,7 @@
               <w:lang w:eastAsia="es-ES"/>
             </w:rPr>
           </w:pPr>
-          <w:hyperlink w:anchor="_Toc221908749" w:history="1">
+          <w:hyperlink w:anchor="_Toc227855987" w:history="1">
             <w:r>
               <w:rPr>
                 <w:rStyle w:val="Hipervnculo"/>
@@ -2193,7 +2149,7 @@
                 <w:noProof/>
                 <w:webHidden/>
               </w:rPr>
-              <w:instrText xml:space="preserve"> PAGEREF _Toc221908749 \h </w:instrText>
+              <w:instrText xml:space="preserve"> PAGEREF _Toc227855987 \h </w:instrText>
             </w:r>
             <w:r>
               <w:rPr>
@@ -2213,7 +2169,7 @@
                 <w:noProof/>
                 <w:webHidden/>
               </w:rPr>
-              <w:t>5</w:t>
+              <w:t>6</w:t>
             </w:r>
             <w:r>
               <w:rPr>
@@ -2239,7 +2195,7 @@
               <w:lang w:eastAsia="es-ES"/>
             </w:rPr>
           </w:pPr>
-          <w:hyperlink w:anchor="_Toc221908750" w:history="1">
+          <w:hyperlink w:anchor="_Toc227855988" w:history="1">
             <w:r>
               <w:rPr>
                 <w:rStyle w:val="Hipervnculo"/>
@@ -2283,7 +2239,7 @@
                 <w:noProof/>
                 <w:webHidden/>
               </w:rPr>
-              <w:instrText xml:space="preserve"> PAGEREF _Toc221908750 \h </w:instrText>
+              <w:instrText xml:space="preserve"> PAGEREF _Toc227855988 \h </w:instrText>
             </w:r>
             <w:r>
               <w:rPr>
@@ -2303,7 +2259,7 @@
                 <w:noProof/>
                 <w:webHidden/>
               </w:rPr>
-              <w:t>5</w:t>
+              <w:t>6</w:t>
             </w:r>
             <w:r>
               <w:rPr>
@@ -2329,7 +2285,7 @@
               <w:lang w:eastAsia="es-ES"/>
             </w:rPr>
           </w:pPr>
-          <w:hyperlink w:anchor="_Toc221908751" w:history="1">
+          <w:hyperlink w:anchor="_Toc227855989" w:history="1">
             <w:r>
               <w:rPr>
                 <w:rStyle w:val="Hipervnculo"/>
@@ -2373,7 +2329,7 @@
                 <w:noProof/>
                 <w:webHidden/>
               </w:rPr>
-              <w:instrText xml:space="preserve"> PAGEREF _Toc221908751 \h </w:instrText>
+              <w:instrText xml:space="preserve"> PAGEREF _Toc227855989 \h </w:instrText>
             </w:r>
             <w:r>
               <w:rPr>
@@ -2393,7 +2349,7 @@
                 <w:noProof/>
                 <w:webHidden/>
               </w:rPr>
-              <w:t>6</w:t>
+              <w:t>8</w:t>
             </w:r>
             <w:r>
               <w:rPr>
@@ -2419,7 +2375,7 @@
               <w:lang w:eastAsia="es-ES"/>
             </w:rPr>
           </w:pPr>
-          <w:hyperlink w:anchor="_Toc221908752" w:history="1">
+          <w:hyperlink w:anchor="_Toc227855990" w:history="1">
             <w:r>
               <w:rPr>
                 <w:rStyle w:val="Hipervnculo"/>
@@ -2463,7 +2419,7 @@
                 <w:noProof/>
                 <w:webHidden/>
               </w:rPr>
-              <w:instrText xml:space="preserve"> PAGEREF _Toc221908752 \h </w:instrText>
+              <w:instrText xml:space="preserve"> PAGEREF _Toc227855990 \h </w:instrText>
             </w:r>
             <w:r>
               <w:rPr>
@@ -2483,7 +2439,7 @@
                 <w:noProof/>
                 <w:webHidden/>
               </w:rPr>
-              <w:t>7</w:t>
+              <w:t>9</w:t>
             </w:r>
             <w:r>
               <w:rPr>
@@ -2509,7 +2465,7 @@
               <w:lang w:eastAsia="es-ES"/>
             </w:rPr>
           </w:pPr>
-          <w:hyperlink w:anchor="_Toc221908753" w:history="1">
+          <w:hyperlink w:anchor="_Toc227855991" w:history="1">
             <w:r>
               <w:rPr>
                 <w:rStyle w:val="Hipervnculo"/>
@@ -2553,7 +2509,7 @@
                 <w:noProof/>
                 <w:webHidden/>
               </w:rPr>
-              <w:instrText xml:space="preserve"> PAGEREF _Toc221908753 \h </w:instrText>
+              <w:instrText xml:space="preserve"> PAGEREF _Toc227855991 \h </w:instrText>
             </w:r>
             <w:r>
               <w:rPr>
@@ -2573,7 +2529,7 @@
                 <w:noProof/>
                 <w:webHidden/>
               </w:rPr>
-              <w:t>8</w:t>
+              <w:t>10</w:t>
             </w:r>
             <w:r>
               <w:rPr>
@@ -2599,10 +2555,12 @@
               <w:lang w:eastAsia="es-ES"/>
             </w:rPr>
           </w:pPr>
-          <w:hyperlink w:anchor="_Toc221908754" w:history="1">
+          <w:hyperlink w:anchor="_Toc227855992" w:history="1">
             <w:r>
               <w:rPr>
                 <w:rStyle w:val="Hipervnculo"/>
+                <w:b/>
+                <w:bCs/>
                 <w:noProof/>
               </w:rPr>
               <w:t>2.5.</w:t>
@@ -2622,6 +2580,96 @@
                 <w:rStyle w:val="Hipervnculo"/>
                 <w:noProof/>
               </w:rPr>
+              <w:t>DIAGRAMA DE PAQUETES</w:t>
+            </w:r>
+            <w:r>
+              <w:rPr>
+                <w:noProof/>
+                <w:webHidden/>
+              </w:rPr>
+              <w:tab/>
+            </w:r>
+            <w:r>
+              <w:rPr>
+                <w:noProof/>
+                <w:webHidden/>
+              </w:rPr>
+              <w:fldChar w:fldCharType="begin"/>
+            </w:r>
+            <w:r>
+              <w:rPr>
+                <w:noProof/>
+                <w:webHidden/>
+              </w:rPr>
+              <w:instrText xml:space="preserve"> PAGEREF _Toc227855992 \h </w:instrText>
+            </w:r>
+            <w:r>
+              <w:rPr>
+                <w:noProof/>
+                <w:webHidden/>
+              </w:rPr>
+            </w:r>
+            <w:r>
+              <w:rPr>
+                <w:noProof/>
+                <w:webHidden/>
+              </w:rPr>
+              <w:fldChar w:fldCharType="separate"/>
+            </w:r>
+            <w:r>
+              <w:rPr>
+                <w:noProof/>
+                <w:webHidden/>
+              </w:rPr>
+              <w:t>11</w:t>
+            </w:r>
+            <w:r>
+              <w:rPr>
+                <w:noProof/>
+                <w:webHidden/>
+              </w:rPr>
+              <w:fldChar w:fldCharType="end"/>
+            </w:r>
+          </w:hyperlink>
+        </w:p>
+        <w:p>
+          <w:pPr>
+            <w:pStyle w:val="TDC2"/>
+            <w:tabs>
+              <w:tab w:val="left" w:pos="960"/>
+              <w:tab w:val="right" w:leader="dot" w:pos="9628"/>
+            </w:tabs>
+            <w:rPr>
+              <w:rFonts w:eastAsiaTheme="minorEastAsia"/>
+              <w:noProof/>
+              <w:sz w:val="24"/>
+              <w:szCs w:val="24"/>
+              <w:lang w:eastAsia="es-ES"/>
+            </w:rPr>
+          </w:pPr>
+          <w:hyperlink w:anchor="_Toc227855993" w:history="1">
+            <w:r>
+              <w:rPr>
+                <w:rStyle w:val="Hipervnculo"/>
+                <w:noProof/>
+              </w:rPr>
+              <w:t>2.6.</w:t>
+            </w:r>
+            <w:r>
+              <w:rPr>
+                <w:rFonts w:eastAsiaTheme="minorEastAsia"/>
+                <w:noProof/>
+                <w:sz w:val="24"/>
+                <w:szCs w:val="24"/>
+                <w:lang w:eastAsia="es-ES"/>
+              </w:rPr>
+              <w:tab/>
+            </w:r>
+            <w:r>
+              <w:rPr>
+                <w:rStyle w:val="Hipervnculo"/>
+                <w:noProof/>
+              </w:rPr>
               <w:t>INTERFACES GRÁFICAS DE USUARIO</w:t>
             </w:r>
             <w:r>
@@ -2643,7 +2691,7 @@
                 <w:noProof/>
                 <w:webHidden/>
               </w:rPr>
-              <w:instrText xml:space="preserve"> PAGEREF _Toc221908754 \h </w:instrText>
+              <w:instrText xml:space="preserve"> PAGEREF _Toc227855993 \h </w:instrText>
             </w:r>
             <w:r>
               <w:rPr>
@@ -2663,7 +2711,7 @@
                 <w:noProof/>
                 <w:webHidden/>
               </w:rPr>
-              <w:t>10</w:t>
+              <w:t>11</w:t>
             </w:r>
             <w:r>
               <w:rPr>
@@ -2689,13 +2737,13 @@
               <w:lang w:eastAsia="es-ES"/>
             </w:rPr>
           </w:pPr>
-          <w:hyperlink w:anchor="_Toc221908755" w:history="1">
+          <w:hyperlink w:anchor="_Toc227855994" w:history="1">
             <w:r>
               <w:rPr>
                 <w:rStyle w:val="Hipervnculo"/>
                 <w:noProof/>
               </w:rPr>
-              <w:t>2.5.1.</w:t>
+              <w:t>2.6.1.</w:t>
             </w:r>
             <w:r>
               <w:rPr>
@@ -2733,7 +2781,7 @@
                 <w:noProof/>
                 <w:webHidden/>
               </w:rPr>
-              <w:instrText xml:space="preserve"> PAGEREF _Toc221908755 \h </w:instrText>
+              <w:instrText xml:space="preserve"> PAGEREF _Toc227855994 \h </w:instrText>
             </w:r>
             <w:r>
               <w:rPr>
@@ -2753,7 +2801,7 @@
                 <w:noProof/>
                 <w:webHidden/>
               </w:rPr>
-              <w:t>12</w:t>
+              <w:t>14</w:t>
             </w:r>
             <w:r>
               <w:rPr>
@@ -2779,7 +2827,7 @@
               <w:lang w:eastAsia="es-ES"/>
             </w:rPr>
           </w:pPr>
-          <w:hyperlink w:anchor="_Toc221908756" w:history="1">
+          <w:hyperlink w:anchor="_Toc227855995" w:history="1">
             <w:r>
               <w:rPr>
                 <w:rStyle w:val="Hipervnculo"/>
@@ -2823,7 +2871,7 @@
                 <w:noProof/>
                 <w:webHidden/>
               </w:rPr>
-              <w:instrText xml:space="preserve"> PAGEREF _Toc221908756 \h </w:instrText>
+              <w:instrText xml:space="preserve"> PAGEREF _Toc227855995 \h </w:instrText>
             </w:r>
             <w:r>
               <w:rPr>
@@ -2843,7 +2891,7 @@
                 <w:noProof/>
                 <w:webHidden/>
               </w:rPr>
-              <w:t>13</w:t>
+              <w:t>14</w:t>
             </w:r>
             <w:r>
               <w:rPr>
@@ -2869,7 +2917,7 @@
               <w:lang w:eastAsia="es-ES"/>
             </w:rPr>
           </w:pPr>
-          <w:hyperlink w:anchor="_Toc221908757" w:history="1">
+          <w:hyperlink w:anchor="_Toc227855996" w:history="1">
             <w:r>
               <w:rPr>
                 <w:rStyle w:val="Hipervnculo"/>
@@ -2913,7 +2961,7 @@
                 <w:noProof/>
                 <w:webHidden/>
               </w:rPr>
-              <w:instrText xml:space="preserve"> PAGEREF _Toc221908757 \h </w:instrText>
+              <w:instrText xml:space="preserve"> PAGEREF _Toc227855996 \h </w:instrText>
             </w:r>
             <w:r>
               <w:rPr>
@@ -2933,7 +2981,7 @@
                 <w:noProof/>
                 <w:webHidden/>
               </w:rPr>
-              <w:t>13</w:t>
+              <w:t>15</w:t>
             </w:r>
             <w:r>
               <w:rPr>
@@ -2959,7 +3007,7 @@
               <w:lang w:eastAsia="es-ES"/>
             </w:rPr>
           </w:pPr>
-          <w:hyperlink w:anchor="_Toc221908758" w:history="1">
+          <w:hyperlink w:anchor="_Toc227855997" w:history="1">
             <w:r>
               <w:rPr>
                 <w:rStyle w:val="Hipervnculo"/>
@@ -3003,7 +3051,7 @@
                 <w:noProof/>
                 <w:webHidden/>
               </w:rPr>
-              <w:instrText xml:space="preserve"> PAGEREF _Toc221908758 \h </w:instrText>
+              <w:instrText xml:space="preserve"> PAGEREF _Toc227855997 \h </w:instrText>
             </w:r>
             <w:r>
               <w:rPr>
@@ -3023,7 +3071,7 @@
                 <w:noProof/>
                 <w:webHidden/>
               </w:rPr>
-              <w:t>14</w:t>
+              <w:t>15</w:t>
             </w:r>
             <w:r>
               <w:rPr>
@@ -3049,7 +3097,7 @@
               <w:lang w:eastAsia="es-ES"/>
             </w:rPr>
           </w:pPr>
-          <w:hyperlink w:anchor="_Toc221908762" w:history="1">
+          <w:hyperlink w:anchor="_Toc227856001" w:history="1">
             <w:r>
               <w:rPr>
                 <w:rStyle w:val="Hipervnculo"/>
@@ -3093,7 +3141,7 @@
                 <w:noProof/>
                 <w:webHidden/>
               </w:rPr>
-              <w:instrText xml:space="preserve"> PAGEREF _Toc221908762 \h </w:instrText>
+              <w:instrText xml:space="preserve"> PAGEREF _Toc227856001 \h </w:instrText>
             </w:r>
             <w:r>
               <w:rPr>
@@ -3113,7 +3161,7 @@
                 <w:noProof/>
                 <w:webHidden/>
               </w:rPr>
-              <w:t>14</w:t>
+              <w:t>16</w:t>
             </w:r>
             <w:r>
               <w:rPr>
@@ -3139,7 +3187,7 @@
               <w:lang w:eastAsia="es-ES"/>
             </w:rPr>
           </w:pPr>
-          <w:hyperlink w:anchor="_Toc221908763" w:history="1">
+          <w:hyperlink w:anchor="_Toc227856002" w:history="1">
             <w:r>
               <w:rPr>
                 <w:rStyle w:val="Hipervnculo"/>
@@ -3183,7 +3231,7 @@
                 <w:noProof/>
                 <w:webHidden/>
               </w:rPr>
-              <w:instrText xml:space="preserve"> PAGEREF _Toc221908763 \h </w:instrText>
+              <w:instrText xml:space="preserve"> PAGEREF _Toc227856002 \h </w:instrText>
             </w:r>
             <w:r>
               <w:rPr>
@@ -3203,7 +3251,7 @@
                 <w:noProof/>
                 <w:webHidden/>
               </w:rPr>
-              <w:t>14</w:t>
+              <w:t>17</w:t>
             </w:r>
             <w:r>
               <w:rPr>
@@ -3229,7 +3277,7 @@
               <w:lang w:eastAsia="es-ES"/>
             </w:rPr>
           </w:pPr>
-          <w:hyperlink w:anchor="_Toc221908764" w:history="1">
+          <w:hyperlink w:anchor="_Toc227856003" w:history="1">
             <w:r>
               <w:rPr>
                 <w:rStyle w:val="Hipervnculo"/>
@@ -3273,7 +3321,7 @@
                 <w:noProof/>
                 <w:webHidden/>
               </w:rPr>
-              <w:instrText xml:space="preserve"> PAGEREF _Toc221908764 \h </w:instrText>
+              <w:instrText xml:space="preserve"> PAGEREF _Toc227856003 \h </w:instrText>
             </w:r>
             <w:r>
               <w:rPr>
@@ -3293,7 +3341,7 @@
                 <w:noProof/>
                 <w:webHidden/>
               </w:rPr>
-              <w:t>14</w:t>
+              <w:t>17</w:t>
             </w:r>
             <w:r>
               <w:rPr>
@@ -3319,7 +3367,7 @@
               <w:lang w:eastAsia="es-ES"/>
             </w:rPr>
           </w:pPr>
-          <w:hyperlink w:anchor="_Toc221908766" w:history="1">
+          <w:hyperlink w:anchor="_Toc227856005" w:history="1">
             <w:r>
               <w:rPr>
                 <w:rStyle w:val="Hipervnculo"/>
@@ -3363,7 +3411,7 @@
                 <w:noProof/>
                 <w:webHidden/>
               </w:rPr>
-              <w:instrText xml:space="preserve"> PAGEREF _Toc221908766 \h </w:instrText>
+              <w:instrText xml:space="preserve"> PAGEREF _Toc227856005 \h </w:instrText>
             </w:r>
             <w:r>
               <w:rPr>
@@ -3383,7 +3431,7 @@
                 <w:noProof/>
                 <w:webHidden/>
               </w:rPr>
-              <w:t>14</w:t>
+              <w:t>17</w:t>
             </w:r>
             <w:r>
               <w:rPr>
@@ -3409,7 +3457,7 @@
               <w:lang w:eastAsia="es-ES"/>
             </w:rPr>
           </w:pPr>
-          <w:hyperlink w:anchor="_Toc221908767" w:history="1">
+          <w:hyperlink w:anchor="_Toc227856006" w:history="1">
             <w:r>
               <w:rPr>
                 <w:rStyle w:val="Hipervnculo"/>
@@ -3453,7 +3501,7 @@
                 <w:noProof/>
                 <w:webHidden/>
               </w:rPr>
-              <w:instrText xml:space="preserve"> PAGEREF _Toc221908767 \h </w:instrText>
+              <w:instrText xml:space="preserve"> PAGEREF _Toc227856006 \h </w:instrText>
             </w:r>
             <w:r>
               <w:rPr>
@@ -3473,7 +3521,7 @@
                 <w:noProof/>
                 <w:webHidden/>
               </w:rPr>
-              <w:t>14</w:t>
+              <w:t>17</w:t>
             </w:r>
             <w:r>
               <w:rPr>
@@ -3499,7 +3547,7 @@
               <w:lang w:eastAsia="es-ES"/>
             </w:rPr>
           </w:pPr>
-          <w:hyperlink w:anchor="_Toc221908768" w:history="1">
+          <w:hyperlink w:anchor="_Toc227856007" w:history="1">
             <w:r>
               <w:rPr>
                 <w:rStyle w:val="Hipervnculo"/>
@@ -3543,7 +3591,7 @@
                 <w:noProof/>
                 <w:webHidden/>
               </w:rPr>
-              <w:instrText xml:space="preserve"> PAGEREF _Toc221908768 \h </w:instrText>
+              <w:instrText xml:space="preserve"> PAGEREF _Toc227856007 \h </w:instrText>
             </w:r>
             <w:r>
               <w:rPr>
@@ -3563,7 +3611,7 @@
                 <w:noProof/>
                 <w:webHidden/>
               </w:rPr>
-              <w:t>14</w:t>
+              <w:t>17</w:t>
             </w:r>
             <w:r>
               <w:rPr>
@@ -3589,7 +3637,7 @@
               <w:lang w:eastAsia="es-ES"/>
             </w:rPr>
           </w:pPr>
-          <w:hyperlink w:anchor="_Toc221908769" w:history="1">
+          <w:hyperlink w:anchor="_Toc227856008" w:history="1">
             <w:r>
               <w:rPr>
                 <w:rStyle w:val="Hipervnculo"/>
@@ -3633,7 +3681,7 @@
                 <w:noProof/>
                 <w:webHidden/>
               </w:rPr>
-              <w:instrText xml:space="preserve"> PAGEREF _Toc221908769 \h </w:instrText>
+              <w:instrText xml:space="preserve"> PAGEREF _Toc227856008 \h </w:instrText>
             </w:r>
             <w:r>
               <w:rPr>
@@ -3653,7 +3701,7 @@
                 <w:noProof/>
                 <w:webHidden/>
               </w:rPr>
-              <w:t>14</w:t>
+              <w:t>17</w:t>
             </w:r>
             <w:r>
               <w:rPr>
@@ -3679,7 +3727,7 @@
               <w:lang w:eastAsia="es-ES"/>
             </w:rPr>
           </w:pPr>
-          <w:hyperlink w:anchor="_Toc221908770" w:history="1">
+          <w:hyperlink w:anchor="_Toc227856009" w:history="1">
             <w:r>
               <w:rPr>
                 <w:rStyle w:val="Hipervnculo"/>
@@ -3723,7 +3771,7 @@
                 <w:noProof/>
                 <w:webHidden/>
               </w:rPr>
-              <w:instrText xml:space="preserve"> PAGEREF _Toc221908770 \h </w:instrText>
+              <w:instrText xml:space="preserve"> PAGEREF _Toc227856009 \h </w:instrText>
             </w:r>
             <w:r>
               <w:rPr>
@@ -3743,7 +3791,7 @@
                 <w:noProof/>
                 <w:webHidden/>
               </w:rPr>
-              <w:t>14</w:t>
+              <w:t>17</w:t>
             </w:r>
             <w:r>
               <w:rPr>
@@ -3769,7 +3817,7 @@
               <w:lang w:eastAsia="es-ES"/>
             </w:rPr>
           </w:pPr>
-          <w:hyperlink w:anchor="_Toc221908774" w:history="1">
+          <w:hyperlink w:anchor="_Toc227856013" w:history="1">
             <w:r>
               <w:rPr>
                 <w:rStyle w:val="Hipervnculo"/>
@@ -3813,7 +3861,7 @@
                 <w:noProof/>
                 <w:webHidden/>
               </w:rPr>
-              <w:instrText xml:space="preserve"> PAGEREF _Toc221908774 \h </w:instrText>
+              <w:instrText xml:space="preserve"> PAGEREF _Toc227856013 \h </w:instrText>
             </w:r>
             <w:r>
               <w:rPr>
@@ -3833,7 +3881,7 @@
                 <w:noProof/>
                 <w:webHidden/>
               </w:rPr>
-              <w:t>14</w:t>
+              <w:t>17</w:t>
             </w:r>
             <w:r>
               <w:rPr>
@@ -3859,7 +3907,7 @@
               <w:lang w:eastAsia="es-ES"/>
             </w:rPr>
           </w:pPr>
-          <w:hyperlink w:anchor="_Toc221908775" w:history="1">
+          <w:hyperlink w:anchor="_Toc227856014" w:history="1">
             <w:r>
               <w:rPr>
                 <w:rStyle w:val="Hipervnculo"/>
@@ -3903,7 +3951,7 @@
                 <w:noProof/>
                 <w:webHidden/>
               </w:rPr>
-              <w:instrText xml:space="preserve"> PAGEREF _Toc221908775 \h </w:instrText>
+              <w:instrText xml:space="preserve"> PAGEREF _Toc227856014 \h </w:instrText>
             </w:r>
             <w:r>
               <w:rPr>
@@ -3923,7 +3971,7 @@
                 <w:noProof/>
                 <w:webHidden/>
               </w:rPr>
-              <w:t>14</w:t>
+              <w:t>17</w:t>
             </w:r>
             <w:r>
               <w:rPr>
@@ -3949,7 +3997,7 @@
               <w:lang w:eastAsia="es-ES"/>
             </w:rPr>
           </w:pPr>
-          <w:hyperlink w:anchor="_Toc221908777" w:history="1">
+          <w:hyperlink w:anchor="_Toc227856016" w:history="1">
             <w:r>
               <w:rPr>
                 <w:rStyle w:val="Hipervnculo"/>
@@ -3993,7 +4041,7 @@
                 <w:noProof/>
                 <w:webHidden/>
               </w:rPr>
-              <w:instrText xml:space="preserve"> PAGEREF _Toc221908777 \h </w:instrText>
+              <w:instrText xml:space="preserve"> PAGEREF _Toc227856016 \h </w:instrText>
             </w:r>
             <w:r>
               <w:rPr>
@@ -4013,7 +4061,295 @@
                 <w:noProof/>
                 <w:webHidden/>
               </w:rPr>
-              <w:t>15</w:t>
+              <w:t>18</w:t>
+            </w:r>
+            <w:r>
+              <w:rPr>
+                <w:noProof/>
+                <w:webHidden/>
+              </w:rPr>
+              <w:fldChar w:fldCharType="end"/>
+            </w:r>
+          </w:hyperlink>
+        </w:p>
+        <w:p>
+          <w:pPr>
+            <w:pStyle w:val="TDC3"/>
+            <w:tabs>
+              <w:tab w:val="right" w:leader="dot" w:pos="9628"/>
+            </w:tabs>
+            <w:rPr>
+              <w:rFonts w:eastAsiaTheme="minorEastAsia"/>
+              <w:noProof/>
+              <w:sz w:val="24"/>
+              <w:szCs w:val="24"/>
+              <w:lang w:eastAsia="es-ES"/>
+            </w:rPr>
+          </w:pPr>
+          <w:hyperlink w:anchor="_Toc227856017" w:history="1">
+            <w:r>
+              <w:rPr>
+                <w:rStyle w:val="Hipervnculo"/>
+                <w:noProof/>
+              </w:rPr>
+              <w:t>10.1.1. PALETA DE COLORES</w:t>
+            </w:r>
+            <w:r>
+              <w:rPr>
+                <w:noProof/>
+                <w:webHidden/>
+              </w:rPr>
+              <w:tab/>
+            </w:r>
+            <w:r>
+              <w:rPr>
+                <w:noProof/>
+                <w:webHidden/>
+              </w:rPr>
+              <w:fldChar w:fldCharType="begin"/>
+            </w:r>
+            <w:r>
+              <w:rPr>
+                <w:noProof/>
+                <w:webHidden/>
+              </w:rPr>
+              <w:instrText xml:space="preserve"> PAGEREF _Toc227856017 \h </w:instrText>
+            </w:r>
+            <w:r>
+              <w:rPr>
+                <w:noProof/>
+                <w:webHidden/>
+              </w:rPr>
+            </w:r>
+            <w:r>
+              <w:rPr>
+                <w:noProof/>
+                <w:webHidden/>
+              </w:rPr>
+              <w:fldChar w:fldCharType="separate"/>
+            </w:r>
+            <w:r>
+              <w:rPr>
+                <w:noProof/>
+                <w:webHidden/>
+              </w:rPr>
+              <w:t>18</w:t>
+            </w:r>
+            <w:r>
+              <w:rPr>
+                <w:noProof/>
+                <w:webHidden/>
+              </w:rPr>
+              <w:fldChar w:fldCharType="end"/>
+            </w:r>
+          </w:hyperlink>
+        </w:p>
+        <w:p>
+          <w:pPr>
+            <w:pStyle w:val="TDC3"/>
+            <w:tabs>
+              <w:tab w:val="right" w:leader="dot" w:pos="9628"/>
+            </w:tabs>
+            <w:rPr>
+              <w:rFonts w:eastAsiaTheme="minorEastAsia"/>
+              <w:noProof/>
+              <w:sz w:val="24"/>
+              <w:szCs w:val="24"/>
+              <w:lang w:eastAsia="es-ES"/>
+            </w:rPr>
+          </w:pPr>
+          <w:hyperlink w:anchor="_Toc227856018" w:history="1">
+            <w:r>
+              <w:rPr>
+                <w:rStyle w:val="Hipervnculo"/>
+                <w:noProof/>
+              </w:rPr>
+              <w:t>10.1.2. Tipografía</w:t>
+            </w:r>
+            <w:r>
+              <w:rPr>
+                <w:noProof/>
+                <w:webHidden/>
+              </w:rPr>
+              <w:tab/>
+            </w:r>
+            <w:r>
+              <w:rPr>
+                <w:noProof/>
+                <w:webHidden/>
+              </w:rPr>
+              <w:fldChar w:fldCharType="begin"/>
+            </w:r>
+            <w:r>
+              <w:rPr>
+                <w:noProof/>
+                <w:webHidden/>
+              </w:rPr>
+              <w:instrText xml:space="preserve"> PAGEREF _Toc227856018 \h </w:instrText>
+            </w:r>
+            <w:r>
+              <w:rPr>
+                <w:noProof/>
+                <w:webHidden/>
+              </w:rPr>
+            </w:r>
+            <w:r>
+              <w:rPr>
+                <w:noProof/>
+                <w:webHidden/>
+              </w:rPr>
+              <w:fldChar w:fldCharType="separate"/>
+            </w:r>
+            <w:r>
+              <w:rPr>
+                <w:noProof/>
+                <w:webHidden/>
+              </w:rPr>
+              <w:t>18</w:t>
+            </w:r>
+            <w:r>
+              <w:rPr>
+                <w:noProof/>
+                <w:webHidden/>
+              </w:rPr>
+              <w:fldChar w:fldCharType="end"/>
+            </w:r>
+          </w:hyperlink>
+        </w:p>
+        <w:p>
+          <w:pPr>
+            <w:pStyle w:val="TDC3"/>
+            <w:tabs>
+              <w:tab w:val="right" w:leader="dot" w:pos="9628"/>
+            </w:tabs>
+            <w:rPr>
+              <w:rFonts w:eastAsiaTheme="minorEastAsia"/>
+              <w:noProof/>
+              <w:sz w:val="24"/>
+              <w:szCs w:val="24"/>
+              <w:lang w:eastAsia="es-ES"/>
+            </w:rPr>
+          </w:pPr>
+          <w:hyperlink w:anchor="_Toc227856019" w:history="1">
+            <w:r>
+              <w:rPr>
+                <w:rStyle w:val="Hipervnculo"/>
+                <w:noProof/>
+              </w:rPr>
+              <w:t>10.1.3. Clases CSS definidas</w:t>
+            </w:r>
+            <w:r>
+              <w:rPr>
+                <w:noProof/>
+                <w:webHidden/>
+              </w:rPr>
+              <w:tab/>
+            </w:r>
+            <w:r>
+              <w:rPr>
+                <w:noProof/>
+                <w:webHidden/>
+              </w:rPr>
+              <w:fldChar w:fldCharType="begin"/>
+            </w:r>
+            <w:r>
+              <w:rPr>
+                <w:noProof/>
+                <w:webHidden/>
+              </w:rPr>
+              <w:instrText xml:space="preserve"> PAGEREF _Toc227856019 \h </w:instrText>
+            </w:r>
+            <w:r>
+              <w:rPr>
+                <w:noProof/>
+                <w:webHidden/>
+              </w:rPr>
+            </w:r>
+            <w:r>
+              <w:rPr>
+                <w:noProof/>
+                <w:webHidden/>
+              </w:rPr>
+              <w:fldChar w:fldCharType="separate"/>
+            </w:r>
+            <w:r>
+              <w:rPr>
+                <w:noProof/>
+                <w:webHidden/>
+              </w:rPr>
+              <w:t>18</w:t>
+            </w:r>
+            <w:r>
+              <w:rPr>
+                <w:noProof/>
+                <w:webHidden/>
+              </w:rPr>
+              <w:fldChar w:fldCharType="end"/>
+            </w:r>
+          </w:hyperlink>
+        </w:p>
+        <w:p>
+          <w:pPr>
+            <w:pStyle w:val="TDC3"/>
+            <w:tabs>
+              <w:tab w:val="right" w:leader="dot" w:pos="9628"/>
+            </w:tabs>
+            <w:rPr>
+              <w:rFonts w:eastAsiaTheme="minorEastAsia"/>
+              <w:noProof/>
+              <w:sz w:val="24"/>
+              <w:szCs w:val="24"/>
+              <w:lang w:eastAsia="es-ES"/>
+            </w:rPr>
+          </w:pPr>
+          <w:hyperlink w:anchor="_Toc227856020" w:history="1">
+            <w:r>
+              <w:rPr>
+                <w:rStyle w:val="Hipervnculo"/>
+                <w:noProof/>
+              </w:rPr>
+              <w:t>10.1.4. IMÁGENES E ICONOS</w:t>
+            </w:r>
+            <w:r>
+              <w:rPr>
+                <w:noProof/>
+                <w:webHidden/>
+              </w:rPr>
+              <w:tab/>
+            </w:r>
+            <w:r>
+              <w:rPr>
+                <w:noProof/>
+                <w:webHidden/>
+              </w:rPr>
+              <w:fldChar w:fldCharType="begin"/>
+            </w:r>
+            <w:r>
+              <w:rPr>
+                <w:noProof/>
+                <w:webHidden/>
+              </w:rPr>
+              <w:instrText xml:space="preserve"> PAGEREF _Toc227856020 \h </w:instrText>
+            </w:r>
+            <w:r>
+              <w:rPr>
+                <w:noProof/>
+                <w:webHidden/>
+              </w:rPr>
+            </w:r>
+            <w:r>
+              <w:rPr>
+                <w:noProof/>
+                <w:webHidden/>
+              </w:rPr>
+              <w:fldChar w:fldCharType="separate"/>
+            </w:r>
+            <w:r>
+              <w:rPr>
+                <w:noProof/>
+                <w:webHidden/>
+              </w:rPr>
+              <w:t>19</w:t>
             </w:r>
             <w:r>
               <w:rPr>
@@ -4039,7 +4375,7 @@
               <w:lang w:eastAsia="es-ES"/>
             </w:rPr>
           </w:pPr>
-          <w:hyperlink w:anchor="_Toc221908778" w:history="1">
+          <w:hyperlink w:anchor="_Toc227856021" w:history="1">
             <w:r>
               <w:rPr>
                 <w:rStyle w:val="Hipervnculo"/>
@@ -4083,7 +4419,7 @@
                 <w:noProof/>
                 <w:webHidden/>
               </w:rPr>
-              <w:instrText xml:space="preserve"> PAGEREF _Toc221908778 \h </w:instrText>
+              <w:instrText xml:space="preserve"> PAGEREF _Toc227856021 \h </w:instrText>
             </w:r>
             <w:r>
               <w:rPr>
@@ -4103,7 +4439,7 @@
                 <w:noProof/>
                 <w:webHidden/>
               </w:rPr>
-              <w:t>15</w:t>
+              <w:t>20</w:t>
             </w:r>
             <w:r>
               <w:rPr>
@@ -4129,7 +4465,7 @@
               <w:lang w:eastAsia="es-ES"/>
             </w:rPr>
           </w:pPr>
-          <w:hyperlink w:anchor="_Toc221908779" w:history="1">
+          <w:hyperlink w:anchor="_Toc227856022" w:history="1">
             <w:r>
               <w:rPr>
                 <w:rStyle w:val="Hipervnculo"/>
@@ -4173,7 +4509,7 @@
                 <w:noProof/>
                 <w:webHidden/>
               </w:rPr>
-              <w:instrText xml:space="preserve"> PAGEREF _Toc221908779 \h </w:instrText>
+              <w:instrText xml:space="preserve"> PAGEREF _Toc227856022 \h </w:instrText>
             </w:r>
             <w:r>
               <w:rPr>
@@ -4193,7 +4529,7 @@
                 <w:noProof/>
                 <w:webHidden/>
               </w:rPr>
-              <w:t>15</w:t>
+              <w:t>20</w:t>
             </w:r>
             <w:r>
               <w:rPr>
@@ -4244,7 +4580,6 @@
           <w:sz w:val="28"/>
           <w:szCs w:val="28"/>
         </w:rPr>
-        <w:lastRenderedPageBreak/>
         <w:t>Índice</w:t>
       </w:r>
       <w:r>
@@ -4285,7 +4620,7 @@
       <w:r>
         <w:fldChar w:fldCharType="separate"/>
       </w:r>
-      <w:hyperlink w:anchor="_Toc221908851" w:history="1">
+      <w:hyperlink w:anchor="_Toc227856184" w:history="1">
         <w:r>
           <w:rPr>
             <w:rStyle w:val="Hipervnculo"/>
@@ -4312,7 +4647,7 @@
             <w:noProof/>
             <w:webHidden/>
           </w:rPr>
-          <w:instrText xml:space="preserve"> PAGEREF _Toc221908851 \h </w:instrText>
+          <w:instrText xml:space="preserve"> PAGEREF _Toc227856184 \h </w:instrText>
         </w:r>
         <w:r>
           <w:rPr>
@@ -4332,7 +4667,7 @@
             <w:noProof/>
             <w:webHidden/>
           </w:rPr>
-          <w:t>5</w:t>
+          <w:t>6</w:t>
         </w:r>
         <w:r>
           <w:rPr>
@@ -4357,7 +4692,7 @@
           <w:lang w:eastAsia="es-ES"/>
         </w:rPr>
       </w:pPr>
-      <w:hyperlink w:anchor="_Toc221908852" w:history="1">
+      <w:hyperlink w:anchor="_Toc227856185" w:history="1">
         <w:r>
           <w:rPr>
             <w:rStyle w:val="Hipervnculo"/>
@@ -4384,79 +4719,7 @@
             <w:noProof/>
             <w:webHidden/>
           </w:rPr>
-          <w:instrText xml:space="preserve"> PAGEREF _Toc221908852 \h </w:instrText>
-        </w:r>
-        <w:r>
-          <w:rPr>
-            <w:noProof/>
-            <w:webHidden/>
-          </w:rPr>
-        </w:r>
-        <w:r>
-          <w:rPr>
-            <w:noProof/>
-            <w:webHidden/>
-          </w:rPr>
-          <w:fldChar w:fldCharType="separate"/>
-        </w:r>
-        <w:r>
-          <w:rPr>
-            <w:noProof/>
-            <w:webHidden/>
-          </w:rPr>
-          <w:t>7</w:t>
-        </w:r>
-        <w:r>
-          <w:rPr>
-            <w:noProof/>
-            <w:webHidden/>
-          </w:rPr>
-          <w:fldChar w:fldCharType="end"/>
-        </w:r>
-      </w:hyperlink>
-    </w:p>
-    <w:p>
-      <w:pPr>
-        <w:pStyle w:val="Tabladeilustraciones"/>
-        <w:tabs>
-          <w:tab w:val="right" w:leader="dot" w:pos="9628"/>
-        </w:tabs>
-        <w:rPr>
-          <w:rFonts w:eastAsiaTheme="minorEastAsia"/>
-          <w:noProof/>
-          <w:sz w:val="24"/>
-          <w:szCs w:val="24"/>
-          <w:lang w:eastAsia="es-ES"/>
-        </w:rPr>
-      </w:pPr>
-      <w:hyperlink w:anchor="_Toc221908853" w:history="1">
-        <w:r>
-          <w:rPr>
-            <w:rStyle w:val="Hipervnculo"/>
-            <w:noProof/>
-          </w:rPr>
-          <w:t>Figura 3. Diagrama de clases.</w:t>
-        </w:r>
-        <w:r>
-          <w:rPr>
-            <w:noProof/>
-            <w:webHidden/>
-          </w:rPr>
-          <w:tab/>
-        </w:r>
-        <w:r>
-          <w:rPr>
-            <w:noProof/>
-            <w:webHidden/>
-          </w:rPr>
-          <w:fldChar w:fldCharType="begin"/>
-        </w:r>
-        <w:r>
-          <w:rPr>
-            <w:noProof/>
-            <w:webHidden/>
-          </w:rPr>
-          <w:instrText xml:space="preserve"> PAGEREF _Toc221908853 \h </w:instrText>
+          <w:instrText xml:space="preserve"> PAGEREF _Toc227856185 \h </w:instrText>
         </w:r>
         <w:r>
           <w:rPr>
@@ -4501,13 +4764,13 @@
           <w:lang w:eastAsia="es-ES"/>
         </w:rPr>
       </w:pPr>
-      <w:hyperlink w:anchor="_Toc221908854" w:history="1">
+      <w:hyperlink w:anchor="_Toc227856186" w:history="1">
         <w:r>
           <w:rPr>
             <w:rStyle w:val="Hipervnculo"/>
             <w:noProof/>
           </w:rPr>
-          <w:t>Figura 4. Pantalla de inicio de sesión - Desktop</w:t>
+          <w:t>Figura 3. Diagrama de clases.</w:t>
         </w:r>
         <w:r>
           <w:rPr>
@@ -4528,7 +4791,7 @@
             <w:noProof/>
             <w:webHidden/>
           </w:rPr>
-          <w:instrText xml:space="preserve"> PAGEREF _Toc221908854 \h </w:instrText>
+          <w:instrText xml:space="preserve"> PAGEREF _Toc227856186 \h </w:instrText>
         </w:r>
         <w:r>
           <w:rPr>
@@ -4573,13 +4836,13 @@
           <w:lang w:eastAsia="es-ES"/>
         </w:rPr>
       </w:pPr>
-      <w:hyperlink w:anchor="_Toc221908855" w:history="1">
+      <w:hyperlink w:anchor="_Toc227856187" w:history="1">
         <w:r>
           <w:rPr>
             <w:rStyle w:val="Hipervnculo"/>
             <w:noProof/>
           </w:rPr>
-          <w:t>Figura 5. Pantalla Nueva FCT - Desktop</w:t>
+          <w:t>Figura 4. Pantalla de inicio de sesión - Desktop</w:t>
         </w:r>
         <w:r>
           <w:rPr>
@@ -4600,151 +4863,7 @@
             <w:noProof/>
             <w:webHidden/>
           </w:rPr>
-          <w:instrText xml:space="preserve"> PAGEREF _Toc221908855 \h </w:instrText>
-        </w:r>
-        <w:r>
-          <w:rPr>
-            <w:noProof/>
-            <w:webHidden/>
-          </w:rPr>
-        </w:r>
-        <w:r>
-          <w:rPr>
-            <w:noProof/>
-            <w:webHidden/>
-          </w:rPr>
-          <w:fldChar w:fldCharType="separate"/>
-        </w:r>
-        <w:r>
-          <w:rPr>
-            <w:noProof/>
-            <w:webHidden/>
-          </w:rPr>
-          <w:t>10</w:t>
-        </w:r>
-        <w:r>
-          <w:rPr>
-            <w:noProof/>
-            <w:webHidden/>
-          </w:rPr>
-          <w:fldChar w:fldCharType="end"/>
-        </w:r>
-      </w:hyperlink>
-    </w:p>
-    <w:p>
-      <w:pPr>
-        <w:pStyle w:val="Tabladeilustraciones"/>
-        <w:tabs>
-          <w:tab w:val="right" w:leader="dot" w:pos="9628"/>
-        </w:tabs>
-        <w:rPr>
-          <w:rFonts w:eastAsiaTheme="minorEastAsia"/>
-          <w:noProof/>
-          <w:sz w:val="24"/>
-          <w:szCs w:val="24"/>
-          <w:lang w:eastAsia="es-ES"/>
-        </w:rPr>
-      </w:pPr>
-      <w:hyperlink w:anchor="_Toc221908856" w:history="1">
-        <w:r>
-          <w:rPr>
-            <w:rStyle w:val="Hipervnculo"/>
-            <w:noProof/>
-          </w:rPr>
-          <w:t>Figura 6. Pantalla inicial usuario Estudiante - Móvil</w:t>
-        </w:r>
-        <w:r>
-          <w:rPr>
-            <w:noProof/>
-            <w:webHidden/>
-          </w:rPr>
-          <w:tab/>
-        </w:r>
-        <w:r>
-          <w:rPr>
-            <w:noProof/>
-            <w:webHidden/>
-          </w:rPr>
-          <w:fldChar w:fldCharType="begin"/>
-        </w:r>
-        <w:r>
-          <w:rPr>
-            <w:noProof/>
-            <w:webHidden/>
-          </w:rPr>
-          <w:instrText xml:space="preserve"> PAGEREF _Toc221908856 \h </w:instrText>
-        </w:r>
-        <w:r>
-          <w:rPr>
-            <w:noProof/>
-            <w:webHidden/>
-          </w:rPr>
-        </w:r>
-        <w:r>
-          <w:rPr>
-            <w:noProof/>
-            <w:webHidden/>
-          </w:rPr>
-          <w:fldChar w:fldCharType="separate"/>
-        </w:r>
-        <w:r>
-          <w:rPr>
-            <w:noProof/>
-            <w:webHidden/>
-          </w:rPr>
-          <w:t>11</w:t>
-        </w:r>
-        <w:r>
-          <w:rPr>
-            <w:noProof/>
-            <w:webHidden/>
-          </w:rPr>
-          <w:fldChar w:fldCharType="end"/>
-        </w:r>
-      </w:hyperlink>
-    </w:p>
-    <w:p>
-      <w:pPr>
-        <w:pStyle w:val="Tabladeilustraciones"/>
-        <w:tabs>
-          <w:tab w:val="right" w:leader="dot" w:pos="9628"/>
-        </w:tabs>
-        <w:rPr>
-          <w:rFonts w:eastAsiaTheme="minorEastAsia"/>
-          <w:noProof/>
-          <w:sz w:val="24"/>
-          <w:szCs w:val="24"/>
-          <w:lang w:eastAsia="es-ES"/>
-        </w:rPr>
-      </w:pPr>
-      <w:hyperlink w:anchor="_Toc221908857" w:history="1">
-        <w:r>
-          <w:rPr>
-            <w:rStyle w:val="Hipervnculo"/>
-            <w:noProof/>
-          </w:rPr>
-          <w:t>Figura 7. Pantalla Añadir justificante usuario Estudiante - Móvil</w:t>
-        </w:r>
-        <w:r>
-          <w:rPr>
-            <w:noProof/>
-            <w:webHidden/>
-          </w:rPr>
-          <w:tab/>
-        </w:r>
-        <w:r>
-          <w:rPr>
-            <w:noProof/>
-            <w:webHidden/>
-          </w:rPr>
-          <w:fldChar w:fldCharType="begin"/>
-        </w:r>
-        <w:r>
-          <w:rPr>
-            <w:noProof/>
-            <w:webHidden/>
-          </w:rPr>
-          <w:instrText xml:space="preserve"> PAGEREF _Toc221908857 \h </w:instrText>
+          <w:instrText xml:space="preserve"> PAGEREF _Toc227856187 \h </w:instrText>
         </w:r>
         <w:r>
           <w:rPr>
@@ -4776,6 +4895,294 @@
       </w:hyperlink>
     </w:p>
     <w:p>
+      <w:pPr>
+        <w:pStyle w:val="Tabladeilustraciones"/>
+        <w:tabs>
+          <w:tab w:val="right" w:leader="dot" w:pos="9628"/>
+        </w:tabs>
+        <w:rPr>
+          <w:rFonts w:eastAsiaTheme="minorEastAsia"/>
+          <w:noProof/>
+          <w:sz w:val="24"/>
+          <w:szCs w:val="24"/>
+          <w:lang w:eastAsia="es-ES"/>
+        </w:rPr>
+      </w:pPr>
+      <w:hyperlink w:anchor="_Toc227856188" w:history="1">
+        <w:r>
+          <w:rPr>
+            <w:rStyle w:val="Hipervnculo"/>
+            <w:noProof/>
+          </w:rPr>
+          <w:t>Figura 5. Pantalla Nueva FCT - Desktop</w:t>
+        </w:r>
+        <w:r>
+          <w:rPr>
+            <w:noProof/>
+            <w:webHidden/>
+          </w:rPr>
+          <w:tab/>
+        </w:r>
+        <w:r>
+          <w:rPr>
+            <w:noProof/>
+            <w:webHidden/>
+          </w:rPr>
+          <w:fldChar w:fldCharType="begin"/>
+        </w:r>
+        <w:r>
+          <w:rPr>
+            <w:noProof/>
+            <w:webHidden/>
+          </w:rPr>
+          <w:instrText xml:space="preserve"> PAGEREF _Toc227856188 \h </w:instrText>
+        </w:r>
+        <w:r>
+          <w:rPr>
+            <w:noProof/>
+            <w:webHidden/>
+          </w:rPr>
+        </w:r>
+        <w:r>
+          <w:rPr>
+            <w:noProof/>
+            <w:webHidden/>
+          </w:rPr>
+          <w:fldChar w:fldCharType="separate"/>
+        </w:r>
+        <w:r>
+          <w:rPr>
+            <w:noProof/>
+            <w:webHidden/>
+          </w:rPr>
+          <w:t>12</w:t>
+        </w:r>
+        <w:r>
+          <w:rPr>
+            <w:noProof/>
+            <w:webHidden/>
+          </w:rPr>
+          <w:fldChar w:fldCharType="end"/>
+        </w:r>
+      </w:hyperlink>
+    </w:p>
+    <w:p>
+      <w:pPr>
+        <w:pStyle w:val="Tabladeilustraciones"/>
+        <w:tabs>
+          <w:tab w:val="right" w:leader="dot" w:pos="9628"/>
+        </w:tabs>
+        <w:rPr>
+          <w:rFonts w:eastAsiaTheme="minorEastAsia"/>
+          <w:noProof/>
+          <w:sz w:val="24"/>
+          <w:szCs w:val="24"/>
+          <w:lang w:eastAsia="es-ES"/>
+        </w:rPr>
+      </w:pPr>
+      <w:hyperlink w:anchor="_Toc227856189" w:history="1">
+        <w:r>
+          <w:rPr>
+            <w:rStyle w:val="Hipervnculo"/>
+            <w:noProof/>
+          </w:rPr>
+          <w:t>Figura 6. Pantalla inicial usuario Estudiante - Móvil</w:t>
+        </w:r>
+        <w:r>
+          <w:rPr>
+            <w:noProof/>
+            <w:webHidden/>
+          </w:rPr>
+          <w:tab/>
+        </w:r>
+        <w:r>
+          <w:rPr>
+            <w:noProof/>
+            <w:webHidden/>
+          </w:rPr>
+          <w:fldChar w:fldCharType="begin"/>
+        </w:r>
+        <w:r>
+          <w:rPr>
+            <w:noProof/>
+            <w:webHidden/>
+          </w:rPr>
+          <w:instrText xml:space="preserve"> PAGEREF _Toc227856189 \h </w:instrText>
+        </w:r>
+        <w:r>
+          <w:rPr>
+            <w:noProof/>
+            <w:webHidden/>
+          </w:rPr>
+        </w:r>
+        <w:r>
+          <w:rPr>
+            <w:noProof/>
+            <w:webHidden/>
+          </w:rPr>
+          <w:fldChar w:fldCharType="separate"/>
+        </w:r>
+        <w:r>
+          <w:rPr>
+            <w:noProof/>
+            <w:webHidden/>
+          </w:rPr>
+          <w:t>13</w:t>
+        </w:r>
+        <w:r>
+          <w:rPr>
+            <w:noProof/>
+            <w:webHidden/>
+          </w:rPr>
+          <w:fldChar w:fldCharType="end"/>
+        </w:r>
+      </w:hyperlink>
+    </w:p>
+    <w:p>
+      <w:pPr>
+        <w:pStyle w:val="Tabladeilustraciones"/>
+        <w:tabs>
+          <w:tab w:val="right" w:leader="dot" w:pos="9628"/>
+        </w:tabs>
+        <w:rPr>
+          <w:rFonts w:eastAsiaTheme="minorEastAsia"/>
+          <w:noProof/>
+          <w:sz w:val="24"/>
+          <w:szCs w:val="24"/>
+          <w:lang w:eastAsia="es-ES"/>
+        </w:rPr>
+      </w:pPr>
+      <w:hyperlink w:anchor="_Toc227856190" w:history="1">
+        <w:r>
+          <w:rPr>
+            <w:rStyle w:val="Hipervnculo"/>
+            <w:noProof/>
+          </w:rPr>
+          <w:t>Figura 7. Pantalla Añadir justificante usuario Estudiante - Móvil</w:t>
+        </w:r>
+        <w:r>
+          <w:rPr>
+            <w:noProof/>
+            <w:webHidden/>
+          </w:rPr>
+          <w:tab/>
+        </w:r>
+        <w:r>
+          <w:rPr>
+            <w:noProof/>
+            <w:webHidden/>
+          </w:rPr>
+          <w:fldChar w:fldCharType="begin"/>
+        </w:r>
+        <w:r>
+          <w:rPr>
+            <w:noProof/>
+            <w:webHidden/>
+          </w:rPr>
+          <w:instrText xml:space="preserve"> PAGEREF _Toc227856190 \h </w:instrText>
+        </w:r>
+        <w:r>
+          <w:rPr>
+            <w:noProof/>
+            <w:webHidden/>
+          </w:rPr>
+        </w:r>
+        <w:r>
+          <w:rPr>
+            <w:noProof/>
+            <w:webHidden/>
+          </w:rPr>
+          <w:fldChar w:fldCharType="separate"/>
+        </w:r>
+        <w:r>
+          <w:rPr>
+            <w:noProof/>
+            <w:webHidden/>
+          </w:rPr>
+          <w:t>13</w:t>
+        </w:r>
+        <w:r>
+          <w:rPr>
+            <w:noProof/>
+            <w:webHidden/>
+          </w:rPr>
+          <w:fldChar w:fldCharType="end"/>
+        </w:r>
+      </w:hyperlink>
+    </w:p>
+    <w:p>
+      <w:pPr>
+        <w:pStyle w:val="Tabladeilustraciones"/>
+        <w:tabs>
+          <w:tab w:val="right" w:leader="dot" w:pos="9628"/>
+        </w:tabs>
+        <w:rPr>
+          <w:rFonts w:eastAsiaTheme="minorEastAsia"/>
+          <w:noProof/>
+          <w:sz w:val="24"/>
+          <w:szCs w:val="24"/>
+          <w:lang w:eastAsia="es-ES"/>
+        </w:rPr>
+      </w:pPr>
+      <w:hyperlink w:anchor="_Toc227856191" w:history="1">
+        <w:r>
+          <w:rPr>
+            <w:rStyle w:val="Hipervnculo"/>
+            <w:noProof/>
+          </w:rPr>
+          <w:t>Figura 8. Diagrama de Gantt</w:t>
+        </w:r>
+        <w:r>
+          <w:rPr>
+            <w:noProof/>
+            <w:webHidden/>
+          </w:rPr>
+          <w:tab/>
+        </w:r>
+        <w:r>
+          <w:rPr>
+            <w:noProof/>
+            <w:webHidden/>
+          </w:rPr>
+          <w:fldChar w:fldCharType="begin"/>
+        </w:r>
+        <w:r>
+          <w:rPr>
+            <w:noProof/>
+            <w:webHidden/>
+          </w:rPr>
+          <w:instrText xml:space="preserve"> PAGEREF _Toc227856191 \h </w:instrText>
+        </w:r>
+        <w:r>
+          <w:rPr>
+            <w:noProof/>
+            <w:webHidden/>
+          </w:rPr>
+        </w:r>
+        <w:r>
+          <w:rPr>
+            <w:noProof/>
+            <w:webHidden/>
+          </w:rPr>
+          <w:fldChar w:fldCharType="separate"/>
+        </w:r>
+        <w:r>
+          <w:rPr>
+            <w:noProof/>
+            <w:webHidden/>
+          </w:rPr>
+          <w:t>16</w:t>
+        </w:r>
+        <w:r>
+          <w:rPr>
+            <w:noProof/>
+            <w:webHidden/>
+          </w:rPr>
+          <w:fldChar w:fldCharType="end"/>
+        </w:r>
+      </w:hyperlink>
+    </w:p>
+    <w:p>
       <w:r>
         <w:fldChar w:fldCharType="end"/>
       </w:r>
@@ -4798,7 +5205,7 @@
       <w:pPr>
         <w:pStyle w:val="Ttulo2"/>
       </w:pPr>
-      <w:bookmarkStart w:id="0" w:name="_Toc221908739"/>
+      <w:bookmarkStart w:id="0" w:name="_Toc227855977"/>
       <w:r>
         <w:lastRenderedPageBreak/>
         <w:t>INTRODUCCIÓN</w:t>
@@ -4867,7 +5274,7 @@
           <w:numId w:val="2"/>
         </w:numPr>
       </w:pPr>
-      <w:bookmarkStart w:id="1" w:name="_Toc221908740"/>
+      <w:bookmarkStart w:id="1" w:name="_Toc227855978"/>
       <w:r>
         <w:t>OBJETIVOS DEL PROYECTO</w:t>
       </w:r>
@@ -4889,7 +5296,7 @@
           <w:numId w:val="3"/>
         </w:numPr>
       </w:pPr>
-      <w:bookmarkStart w:id="2" w:name="_Toc221908741"/>
+      <w:bookmarkStart w:id="2" w:name="_Toc227855979"/>
       <w:r>
         <w:t>OBJETIVO GENERAL DEL PROYECTO</w:t>
       </w:r>
@@ -4909,7 +5316,7 @@
           <w:numId w:val="3"/>
         </w:numPr>
       </w:pPr>
-      <w:bookmarkStart w:id="4" w:name="_Toc221908742"/>
+      <w:bookmarkStart w:id="4" w:name="_Toc227855980"/>
       <w:bookmarkEnd w:id="3"/>
       <w:r>
         <w:t>OBJETIVOS ESPECÍFICOS</w:t>
@@ -5058,7 +5465,7 @@
           <w:numId w:val="2"/>
         </w:numPr>
       </w:pPr>
-      <w:bookmarkStart w:id="5" w:name="_Toc221908743"/>
+      <w:bookmarkStart w:id="5" w:name="_Toc227855981"/>
       <w:r>
         <w:t>ANÁLISIS Y DISEÑO</w:t>
       </w:r>
@@ -5101,12 +5508,14 @@
       <w:bookmarkStart w:id="9" w:name="_Toc210125371"/>
       <w:bookmarkStart w:id="10" w:name="_Toc221907947"/>
       <w:bookmarkStart w:id="11" w:name="_Toc221908744"/>
+      <w:bookmarkStart w:id="12" w:name="_Toc227855982"/>
       <w:bookmarkEnd w:id="6"/>
       <w:bookmarkEnd w:id="7"/>
       <w:bookmarkEnd w:id="8"/>
       <w:bookmarkEnd w:id="9"/>
       <w:bookmarkEnd w:id="10"/>
       <w:bookmarkEnd w:id="11"/>
+      <w:bookmarkEnd w:id="12"/>
     </w:p>
     <w:p>
       <w:pPr>
@@ -5116,11 +5525,11 @@
           <w:numId w:val="3"/>
         </w:numPr>
       </w:pPr>
-      <w:bookmarkStart w:id="12" w:name="_Toc221908745"/>
+      <w:bookmarkStart w:id="13" w:name="_Toc227855983"/>
       <w:r>
         <w:t>REQUISITOS FUNCIONALES</w:t>
       </w:r>
-      <w:bookmarkEnd w:id="12"/>
+      <w:bookmarkEnd w:id="13"/>
     </w:p>
     <w:tbl>
       <w:tblPr>
@@ -5922,11 +6331,11 @@
           <w:numId w:val="3"/>
         </w:numPr>
       </w:pPr>
-      <w:bookmarkStart w:id="13" w:name="_Toc221908746"/>
+      <w:bookmarkStart w:id="14" w:name="_Toc227855984"/>
       <w:r>
         <w:t>REQUISITOS NO FUNCIONALES</w:t>
       </w:r>
-      <w:bookmarkEnd w:id="13"/>
+      <w:bookmarkEnd w:id="14"/>
     </w:p>
     <w:tbl>
       <w:tblPr>
@@ -6555,11 +6964,11 @@
           <w:numId w:val="3"/>
         </w:numPr>
       </w:pPr>
-      <w:bookmarkStart w:id="14" w:name="_Toc221908747"/>
+      <w:bookmarkStart w:id="15" w:name="_Toc227855985"/>
       <w:r>
         <w:t>CASOS DE USO</w:t>
       </w:r>
-      <w:bookmarkEnd w:id="14"/>
+      <w:bookmarkEnd w:id="15"/>
     </w:p>
     <w:p>
       <w:r>
@@ -6584,12 +6993,12 @@
           <w:numId w:val="3"/>
         </w:numPr>
       </w:pPr>
-      <w:bookmarkStart w:id="15" w:name="_Toc221908748"/>
+      <w:bookmarkStart w:id="16" w:name="_Toc227855986"/>
       <w:r>
         <w:lastRenderedPageBreak/>
         <w:t>DIAGRAMA DE CASOS DE USO</w:t>
       </w:r>
-      <w:bookmarkEnd w:id="15"/>
+      <w:bookmarkEnd w:id="16"/>
     </w:p>
     <w:p>
       <w:pPr>
@@ -6654,7 +7063,7 @@
         <w:pStyle w:val="Descripcin"/>
         <w:jc w:val="center"/>
       </w:pPr>
-      <w:bookmarkStart w:id="16" w:name="_Toc221908851"/>
+      <w:bookmarkStart w:id="17" w:name="_Toc227856184"/>
       <w:r>
         <w:t xml:space="preserve">Figura </w:t>
       </w:r>
@@ -6682,7 +7091,7 @@
       <w:r>
         <w:t>Diagrama de Casos de Uso</w:t>
       </w:r>
-      <w:bookmarkEnd w:id="16"/>
+      <w:bookmarkEnd w:id="17"/>
     </w:p>
     <w:p>
       <w:pPr>
@@ -6692,11 +7101,11 @@
           <w:numId w:val="3"/>
         </w:numPr>
       </w:pPr>
-      <w:bookmarkStart w:id="17" w:name="_Toc221908749"/>
+      <w:bookmarkStart w:id="18" w:name="_Toc227855987"/>
       <w:r>
         <w:t>DESCRIPCIÓN DE LOS ACTORES</w:t>
       </w:r>
-      <w:bookmarkEnd w:id="17"/>
+      <w:bookmarkEnd w:id="18"/>
     </w:p>
     <w:p>
       <w:pPr>
@@ -6815,11 +7224,11 @@
           <w:numId w:val="3"/>
         </w:numPr>
       </w:pPr>
-      <w:bookmarkStart w:id="18" w:name="_Toc221908750"/>
+      <w:bookmarkStart w:id="19" w:name="_Toc227855988"/>
       <w:r>
         <w:t>DESCRIPCIÓN DE LOS CASOS DE USO</w:t>
       </w:r>
-      <w:bookmarkEnd w:id="18"/>
+      <w:bookmarkEnd w:id="19"/>
     </w:p>
     <w:tbl>
       <w:tblPr>
@@ -8985,9 +9394,7 @@
         </w:tc>
       </w:tr>
     </w:tbl>
-    <w:p>
-      <w:bookmarkStart w:id="19" w:name="_Toc221908751"/>
-    </w:p>
+    <w:p/>
     <w:p>
       <w:pPr>
         <w:pStyle w:val="Ttulo2"/>
@@ -8996,10 +9403,11 @@
           <w:numId w:val="3"/>
         </w:numPr>
       </w:pPr>
+      <w:bookmarkStart w:id="20" w:name="_Toc227855989"/>
       <w:r>
         <w:t>MODELOS DE DATOS</w:t>
       </w:r>
-      <w:bookmarkEnd w:id="19"/>
+      <w:bookmarkEnd w:id="20"/>
     </w:p>
     <w:p>
       <w:r>
@@ -9033,12 +9441,12 @@
           <w:numId w:val="3"/>
         </w:numPr>
       </w:pPr>
-      <w:bookmarkStart w:id="20" w:name="_Toc221908752"/>
+      <w:bookmarkStart w:id="21" w:name="_Toc227855990"/>
       <w:r>
         <w:lastRenderedPageBreak/>
         <w:t>DIAGRAMA E/R</w:t>
       </w:r>
-      <w:bookmarkEnd w:id="20"/>
+      <w:bookmarkEnd w:id="21"/>
     </w:p>
     <w:p>
       <w:pPr>
@@ -9097,7 +9505,7 @@
         <w:pStyle w:val="Descripcin"/>
         <w:jc w:val="center"/>
       </w:pPr>
-      <w:bookmarkStart w:id="21" w:name="_Toc221908852"/>
+      <w:bookmarkStart w:id="22" w:name="_Toc227856185"/>
       <w:r>
         <w:t xml:space="preserve">Figura </w:t>
       </w:r>
@@ -9125,7 +9533,7 @@
       <w:r>
         <w:t>Diagrama Entidad/Relación</w:t>
       </w:r>
-      <w:bookmarkEnd w:id="21"/>
+      <w:bookmarkEnd w:id="22"/>
     </w:p>
     <w:p>
       <w:pPr>
@@ -9135,12 +9543,12 @@
           <w:numId w:val="3"/>
         </w:numPr>
       </w:pPr>
-      <w:bookmarkStart w:id="22" w:name="_Toc221908753"/>
+      <w:bookmarkStart w:id="23" w:name="_Toc227855991"/>
       <w:r>
         <w:lastRenderedPageBreak/>
         <w:t>DIAGRAMA DE CLASES</w:t>
       </w:r>
-      <w:bookmarkEnd w:id="22"/>
+      <w:bookmarkEnd w:id="23"/>
     </w:p>
     <w:p>
       <w:pPr>
@@ -9199,7 +9607,7 @@
         <w:pStyle w:val="Descripcin"/>
         <w:jc w:val="center"/>
       </w:pPr>
-      <w:bookmarkStart w:id="23" w:name="_Toc221908853"/>
+      <w:bookmarkStart w:id="24" w:name="_Toc227856186"/>
       <w:r>
         <w:t xml:space="preserve">Figura </w:t>
       </w:r>
@@ -9224,7 +9632,7 @@
       <w:r>
         <w:t>. Diagrama de clases.</w:t>
       </w:r>
-      <w:bookmarkEnd w:id="23"/>
+      <w:bookmarkEnd w:id="24"/>
     </w:p>
     <w:p>
       <w:pPr>
@@ -9242,11 +9650,12 @@
           <w:szCs w:val="20"/>
         </w:rPr>
       </w:pPr>
-      <w:bookmarkStart w:id="24" w:name="_Toc221908754"/>
+      <w:bookmarkStart w:id="25" w:name="_Toc227855992"/>
       <w:r>
         <w:lastRenderedPageBreak/>
         <w:t>DIAGRAMA DE PAQUETES</w:t>
       </w:r>
+      <w:bookmarkEnd w:id="25"/>
     </w:p>
     <w:p>
       <w:pPr>
@@ -9320,84 +9729,66 @@
           </w:tcPr>
           <w:p>
             <w:proofErr w:type="spellStart"/>
-            <w:proofErr w:type="gramStart"/>
             <w:r>
               <w:rPr>
                 <w:sz w:val="20"/>
                 <w:szCs w:val="20"/>
               </w:rPr>
-              <w:t>com.alba</w:t>
-            </w:r>
-            <w:proofErr w:type="gramEnd"/>
+              <w:t>com.alba.proyecto</w:t>
+            </w:r>
+            <w:proofErr w:type="spellEnd"/>
+          </w:p>
+        </w:tc>
+        <w:tc>
+          <w:tcPr>
+            <w:tcW w:w="6200" w:type="dxa"/>
+            <w:hideMark/>
+          </w:tcPr>
+          <w:p>
+            <w:pPr>
+              <w:cnfStyle w:val="000000100000" w:firstRow="0" w:lastRow="0" w:firstColumn="0" w:lastColumn="0" w:oddVBand="0" w:evenVBand="0" w:oddHBand="1" w:evenHBand="0" w:firstRowFirstColumn="0" w:firstRowLastColumn="0" w:lastRowFirstColumn="0" w:lastRowLastColumn="0"/>
+            </w:pPr>
             <w:r>
               <w:rPr>
                 <w:sz w:val="20"/>
                 <w:szCs w:val="20"/>
               </w:rPr>
-              <w:t>.proyecto</w:t>
-            </w:r>
-            <w:proofErr w:type="spellEnd"/>
-          </w:p>
-        </w:tc>
-        <w:tc>
-          <w:tcPr>
-            <w:tcW w:w="6200" w:type="dxa"/>
-            <w:hideMark/>
-          </w:tcPr>
-          <w:p>
-            <w:pPr>
-              <w:cnfStyle w:val="000000100000" w:firstRow="0" w:lastRow="0" w:firstColumn="0" w:lastColumn="0" w:oddVBand="0" w:evenVBand="0" w:oddHBand="1" w:evenHBand="0" w:firstRowFirstColumn="0" w:firstRowLastColumn="0" w:lastRowFirstColumn="0" w:lastRowLastColumn="0"/>
-            </w:pPr>
+              <w:t xml:space="preserve">Paquete raíz. Contiene la clase principal de arranque de la aplicación Spring Boot + </w:t>
+            </w:r>
+            <w:proofErr w:type="spellStart"/>
             <w:r>
               <w:rPr>
                 <w:sz w:val="20"/>
                 <w:szCs w:val="20"/>
               </w:rPr>
-              <w:t xml:space="preserve">Paquete raíz. Contiene la clase principal de arranque de la aplicación Spring Boot + </w:t>
-            </w:r>
-            <w:proofErr w:type="spellStart"/>
+              <w:t>JavaFX</w:t>
+            </w:r>
+            <w:proofErr w:type="spellEnd"/>
             <w:r>
               <w:rPr>
                 <w:sz w:val="20"/>
                 <w:szCs w:val="20"/>
               </w:rPr>
-              <w:t>JavaFX</w:t>
-            </w:r>
-            <w:proofErr w:type="spellEnd"/>
+              <w:t>.</w:t>
+            </w:r>
+          </w:p>
+        </w:tc>
+      </w:tr>
+      <w:tr>
+        <w:tc>
+          <w:tcPr>
+            <w:cnfStyle w:val="001000000000" w:firstRow="0" w:lastRow="0" w:firstColumn="1" w:lastColumn="0" w:oddVBand="0" w:evenVBand="0" w:oddHBand="0" w:evenHBand="0" w:firstRowFirstColumn="0" w:firstRowLastColumn="0" w:lastRowFirstColumn="0" w:lastRowLastColumn="0"/>
+            <w:tcW w:w="3000" w:type="dxa"/>
+            <w:hideMark/>
+          </w:tcPr>
+          <w:p>
+            <w:proofErr w:type="spellStart"/>
             <w:r>
               <w:rPr>
                 <w:sz w:val="20"/>
                 <w:szCs w:val="20"/>
               </w:rPr>
-              <w:t>.</w:t>
-            </w:r>
-          </w:p>
-        </w:tc>
-      </w:tr>
-      <w:tr>
-        <w:tc>
-          <w:tcPr>
-            <w:cnfStyle w:val="001000000000" w:firstRow="0" w:lastRow="0" w:firstColumn="1" w:lastColumn="0" w:oddVBand="0" w:evenVBand="0" w:oddHBand="0" w:evenHBand="0" w:firstRowFirstColumn="0" w:firstRowLastColumn="0" w:lastRowFirstColumn="0" w:lastRowLastColumn="0"/>
-            <w:tcW w:w="3000" w:type="dxa"/>
-            <w:hideMark/>
-          </w:tcPr>
-          <w:p>
-            <w:proofErr w:type="spellStart"/>
-            <w:proofErr w:type="gramStart"/>
-            <w:r>
-              <w:rPr>
-                <w:sz w:val="20"/>
-                <w:szCs w:val="20"/>
-              </w:rPr>
-              <w:t>com.alba</w:t>
-            </w:r>
-            <w:proofErr w:type="gramEnd"/>
-            <w:r>
-              <w:rPr>
-                <w:sz w:val="20"/>
-                <w:szCs w:val="20"/>
-              </w:rPr>
-              <w:t>.proyecto.config</w:t>
+              <w:t>com.alba.proyecto.config</w:t>
             </w:r>
             <w:proofErr w:type="spellEnd"/>
           </w:p>
@@ -9497,104 +9888,68 @@
           </w:tcPr>
           <w:p>
             <w:proofErr w:type="spellStart"/>
-            <w:proofErr w:type="gramStart"/>
             <w:r>
               <w:rPr>
                 <w:sz w:val="20"/>
                 <w:szCs w:val="20"/>
               </w:rPr>
-              <w:t>com.alba</w:t>
-            </w:r>
-            <w:proofErr w:type="gramEnd"/>
+              <w:t>com.alba.proyecto.controller</w:t>
+            </w:r>
+            <w:proofErr w:type="spellEnd"/>
+          </w:p>
+        </w:tc>
+        <w:tc>
+          <w:tcPr>
+            <w:tcW w:w="6200" w:type="dxa"/>
+            <w:hideMark/>
+          </w:tcPr>
+          <w:p>
+            <w:pPr>
+              <w:cnfStyle w:val="000000100000" w:firstRow="0" w:lastRow="0" w:firstColumn="0" w:lastColumn="0" w:oddVBand="0" w:evenVBand="0" w:oddHBand="1" w:evenHBand="0" w:firstRowFirstColumn="0" w:firstRowLastColumn="0" w:lastRowFirstColumn="0" w:lastRowLastColumn="0"/>
+            </w:pPr>
             <w:r>
               <w:rPr>
                 <w:sz w:val="20"/>
                 <w:szCs w:val="20"/>
               </w:rPr>
-              <w:t>.</w:t>
-            </w:r>
-            <w:proofErr w:type="gramStart"/>
+              <w:t xml:space="preserve">Controladores </w:t>
+            </w:r>
+            <w:proofErr w:type="spellStart"/>
             <w:r>
               <w:rPr>
                 <w:sz w:val="20"/>
                 <w:szCs w:val="20"/>
               </w:rPr>
-              <w:t>proyecto.controller</w:t>
+              <w:t>JavaFX</w:t>
             </w:r>
             <w:proofErr w:type="spellEnd"/>
-            <w:proofErr w:type="gramEnd"/>
-          </w:p>
-        </w:tc>
-        <w:tc>
-          <w:tcPr>
-            <w:tcW w:w="6200" w:type="dxa"/>
-            <w:hideMark/>
-          </w:tcPr>
-          <w:p>
-            <w:pPr>
-              <w:cnfStyle w:val="000000100000" w:firstRow="0" w:lastRow="0" w:firstColumn="0" w:lastColumn="0" w:oddVBand="0" w:evenVBand="0" w:oddHBand="1" w:evenHBand="0" w:firstRowFirstColumn="0" w:firstRowLastColumn="0" w:lastRowFirstColumn="0" w:lastRowLastColumn="0"/>
-            </w:pPr>
             <w:r>
               <w:rPr>
                 <w:sz w:val="20"/>
                 <w:szCs w:val="20"/>
               </w:rPr>
-              <w:t xml:space="preserve">Controladores </w:t>
-            </w:r>
+              <w:t>. Cada clase gestiona los eventos y la lógica de presentación de una pantalla o conjunto de paneles.</w:t>
+            </w:r>
+          </w:p>
+        </w:tc>
+      </w:tr>
+      <w:tr>
+        <w:tc>
+          <w:tcPr>
+            <w:cnfStyle w:val="001000000000" w:firstRow="0" w:lastRow="0" w:firstColumn="1" w:lastColumn="0" w:oddVBand="0" w:evenVBand="0" w:oddHBand="0" w:evenHBand="0" w:firstRowFirstColumn="0" w:firstRowLastColumn="0" w:lastRowFirstColumn="0" w:lastRowLastColumn="0"/>
+            <w:tcW w:w="3000" w:type="dxa"/>
+            <w:hideMark/>
+          </w:tcPr>
+          <w:p>
             <w:proofErr w:type="spellStart"/>
             <w:r>
               <w:rPr>
                 <w:sz w:val="20"/>
                 <w:szCs w:val="20"/>
               </w:rPr>
-              <w:t>JavaFX</w:t>
+              <w:t>com.alba.proyecto.modelo</w:t>
             </w:r>
             <w:proofErr w:type="spellEnd"/>
-            <w:r>
-              <w:rPr>
-                <w:sz w:val="20"/>
-                <w:szCs w:val="20"/>
-              </w:rPr>
-              <w:t>. Cada clase gestiona los eventos y la lógica de presentación de una pantalla o conjunto de paneles.</w:t>
-            </w:r>
-          </w:p>
-        </w:tc>
-      </w:tr>
-      <w:tr>
-        <w:tc>
-          <w:tcPr>
-            <w:cnfStyle w:val="001000000000" w:firstRow="0" w:lastRow="0" w:firstColumn="1" w:lastColumn="0" w:oddVBand="0" w:evenVBand="0" w:oddHBand="0" w:evenHBand="0" w:firstRowFirstColumn="0" w:firstRowLastColumn="0" w:lastRowFirstColumn="0" w:lastRowLastColumn="0"/>
-            <w:tcW w:w="3000" w:type="dxa"/>
-            <w:hideMark/>
-          </w:tcPr>
-          <w:p>
-            <w:proofErr w:type="spellStart"/>
-            <w:proofErr w:type="gramStart"/>
-            <w:r>
-              <w:rPr>
-                <w:sz w:val="20"/>
-                <w:szCs w:val="20"/>
-              </w:rPr>
-              <w:t>com.alba</w:t>
-            </w:r>
-            <w:proofErr w:type="gramEnd"/>
-            <w:r>
-              <w:rPr>
-                <w:sz w:val="20"/>
-                <w:szCs w:val="20"/>
-              </w:rPr>
-              <w:t>.</w:t>
-            </w:r>
-            <w:proofErr w:type="gramStart"/>
-            <w:r>
-              <w:rPr>
-                <w:sz w:val="20"/>
-                <w:szCs w:val="20"/>
-              </w:rPr>
-              <w:t>proyecto.modelo</w:t>
-            </w:r>
-            <w:proofErr w:type="spellEnd"/>
-            <w:proofErr w:type="gramEnd"/>
           </w:p>
         </w:tc>
         <w:tc>
@@ -9660,104 +10015,68 @@
           </w:tcPr>
           <w:p>
             <w:proofErr w:type="spellStart"/>
-            <w:proofErr w:type="gramStart"/>
             <w:r>
               <w:rPr>
                 <w:sz w:val="20"/>
                 <w:szCs w:val="20"/>
               </w:rPr>
-              <w:t>com.alba</w:t>
-            </w:r>
-            <w:proofErr w:type="gramEnd"/>
+              <w:t>com.alba.proyecto.repositorios</w:t>
+            </w:r>
+            <w:proofErr w:type="spellEnd"/>
+          </w:p>
+        </w:tc>
+        <w:tc>
+          <w:tcPr>
+            <w:tcW w:w="6200" w:type="dxa"/>
+            <w:hideMark/>
+          </w:tcPr>
+          <w:p>
+            <w:pPr>
+              <w:cnfStyle w:val="000000100000" w:firstRow="0" w:lastRow="0" w:firstColumn="0" w:lastColumn="0" w:oddVBand="0" w:evenVBand="0" w:oddHBand="1" w:evenHBand="0" w:firstRowFirstColumn="0" w:firstRowLastColumn="0" w:lastRowFirstColumn="0" w:lastRowLastColumn="0"/>
+            </w:pPr>
             <w:r>
               <w:rPr>
                 <w:sz w:val="20"/>
                 <w:szCs w:val="20"/>
               </w:rPr>
-              <w:t>.</w:t>
-            </w:r>
-            <w:proofErr w:type="gramStart"/>
+              <w:t xml:space="preserve">Interfaces de repositorio Spring Data JPA. Una por cada entidad principal. Heredan de </w:t>
+            </w:r>
+            <w:proofErr w:type="spellStart"/>
             <w:r>
               <w:rPr>
                 <w:sz w:val="20"/>
                 <w:szCs w:val="20"/>
               </w:rPr>
-              <w:t>proyecto.repositorios</w:t>
+              <w:t>JpaRepository</w:t>
             </w:r>
             <w:proofErr w:type="spellEnd"/>
-            <w:proofErr w:type="gramEnd"/>
-          </w:p>
-        </w:tc>
-        <w:tc>
-          <w:tcPr>
-            <w:tcW w:w="6200" w:type="dxa"/>
-            <w:hideMark/>
-          </w:tcPr>
-          <w:p>
-            <w:pPr>
-              <w:cnfStyle w:val="000000100000" w:firstRow="0" w:lastRow="0" w:firstColumn="0" w:lastColumn="0" w:oddVBand="0" w:evenVBand="0" w:oddHBand="1" w:evenHBand="0" w:firstRowFirstColumn="0" w:firstRowLastColumn="0" w:lastRowFirstColumn="0" w:lastRowLastColumn="0"/>
-            </w:pPr>
             <w:r>
               <w:rPr>
                 <w:sz w:val="20"/>
                 <w:szCs w:val="20"/>
               </w:rPr>
-              <w:t xml:space="preserve">Interfaces de repositorio Spring Data JPA. Una por cada entidad principal. Heredan de </w:t>
-            </w:r>
+              <w:t>.</w:t>
+            </w:r>
+          </w:p>
+        </w:tc>
+      </w:tr>
+      <w:tr>
+        <w:tc>
+          <w:tcPr>
+            <w:cnfStyle w:val="001000000000" w:firstRow="0" w:lastRow="0" w:firstColumn="1" w:lastColumn="0" w:oddVBand="0" w:evenVBand="0" w:oddHBand="0" w:evenHBand="0" w:firstRowFirstColumn="0" w:firstRowLastColumn="0" w:lastRowFirstColumn="0" w:lastRowLastColumn="0"/>
+            <w:tcW w:w="3000" w:type="dxa"/>
+            <w:hideMark/>
+          </w:tcPr>
+          <w:p>
             <w:proofErr w:type="spellStart"/>
             <w:r>
               <w:rPr>
                 <w:sz w:val="20"/>
                 <w:szCs w:val="20"/>
               </w:rPr>
-              <w:t>JpaRepository</w:t>
+              <w:t>com.alba.proyecto.services</w:t>
             </w:r>
             <w:proofErr w:type="spellEnd"/>
-            <w:r>
-              <w:rPr>
-                <w:sz w:val="20"/>
-                <w:szCs w:val="20"/>
-              </w:rPr>
-              <w:t>.</w:t>
-            </w:r>
-          </w:p>
-        </w:tc>
-      </w:tr>
-      <w:tr>
-        <w:tc>
-          <w:tcPr>
-            <w:cnfStyle w:val="001000000000" w:firstRow="0" w:lastRow="0" w:firstColumn="1" w:lastColumn="0" w:oddVBand="0" w:evenVBand="0" w:oddHBand="0" w:evenHBand="0" w:firstRowFirstColumn="0" w:firstRowLastColumn="0" w:lastRowFirstColumn="0" w:lastRowLastColumn="0"/>
-            <w:tcW w:w="3000" w:type="dxa"/>
-            <w:hideMark/>
-          </w:tcPr>
-          <w:p>
-            <w:proofErr w:type="spellStart"/>
-            <w:proofErr w:type="gramStart"/>
-            <w:r>
-              <w:rPr>
-                <w:sz w:val="20"/>
-                <w:szCs w:val="20"/>
-              </w:rPr>
-              <w:t>com.alba</w:t>
-            </w:r>
-            <w:proofErr w:type="gramEnd"/>
-            <w:r>
-              <w:rPr>
-                <w:sz w:val="20"/>
-                <w:szCs w:val="20"/>
-              </w:rPr>
-              <w:t>.</w:t>
-            </w:r>
-            <w:proofErr w:type="gramStart"/>
-            <w:r>
-              <w:rPr>
-                <w:sz w:val="20"/>
-                <w:szCs w:val="20"/>
-              </w:rPr>
-              <w:t>proyecto.services</w:t>
-            </w:r>
-            <w:proofErr w:type="spellEnd"/>
-            <w:proofErr w:type="gramEnd"/>
           </w:p>
         </w:tc>
         <w:tc>
@@ -9791,32 +10110,14 @@
           </w:tcPr>
           <w:p>
             <w:proofErr w:type="spellStart"/>
-            <w:proofErr w:type="gramStart"/>
             <w:r>
               <w:rPr>
                 <w:sz w:val="20"/>
                 <w:szCs w:val="20"/>
               </w:rPr>
-              <w:t>com.alba</w:t>
-            </w:r>
-            <w:proofErr w:type="gramEnd"/>
-            <w:r>
-              <w:rPr>
-                <w:sz w:val="20"/>
-                <w:szCs w:val="20"/>
-              </w:rPr>
-              <w:t>.</w:t>
-            </w:r>
-            <w:proofErr w:type="gramStart"/>
-            <w:r>
-              <w:rPr>
-                <w:sz w:val="20"/>
-                <w:szCs w:val="20"/>
-              </w:rPr>
-              <w:t>proyecto.view</w:t>
+              <w:t>com.alba.proyecto.view</w:t>
             </w:r>
             <w:proofErr w:type="spellEnd"/>
-            <w:proofErr w:type="gramEnd"/>
           </w:p>
         </w:tc>
         <w:tc>
@@ -9941,10 +10242,11 @@
           <w:numId w:val="3"/>
         </w:numPr>
       </w:pPr>
+      <w:bookmarkStart w:id="26" w:name="_Toc227855993"/>
       <w:r>
         <w:t>INTERFACES GRÁFICAS DE USUARIO</w:t>
       </w:r>
-      <w:bookmarkEnd w:id="24"/>
+      <w:bookmarkEnd w:id="26"/>
     </w:p>
     <w:p>
       <w:r>
@@ -10015,25 +10317,38 @@
         <w:pStyle w:val="Descripcin"/>
         <w:jc w:val="center"/>
       </w:pPr>
-      <w:bookmarkStart w:id="25" w:name="_Toc221908854"/>
+      <w:bookmarkStart w:id="27" w:name="_Toc227856187"/>
       <w:r>
         <w:t xml:space="preserve">Figura </w:t>
       </w:r>
-      <w:fldSimple w:instr=" SEQ Figura \* ARABIC ">
-        <w:r>
-          <w:rPr>
-            <w:noProof/>
-          </w:rPr>
-          <w:t>4</w:t>
-        </w:r>
-      </w:fldSimple>
+      <w:r>
+        <w:fldChar w:fldCharType="begin"/>
+      </w:r>
+      <w:r>
+        <w:instrText xml:space="preserve"> SEQ Figura \* ARABIC </w:instrText>
+      </w:r>
+      <w:r>
+        <w:fldChar w:fldCharType="separate"/>
+      </w:r>
+      <w:r>
+        <w:rPr>
+          <w:noProof/>
+        </w:rPr>
+        <w:t>4</w:t>
+      </w:r>
+      <w:r>
+        <w:rPr>
+          <w:noProof/>
+        </w:rPr>
+        <w:fldChar w:fldCharType="end"/>
+      </w:r>
       <w:r>
         <w:t>. Pantalla de inicio de sesión</w:t>
       </w:r>
       <w:r>
         <w:t xml:space="preserve"> - Desktop</w:t>
       </w:r>
-      <w:bookmarkEnd w:id="25"/>
+      <w:bookmarkEnd w:id="27"/>
     </w:p>
     <w:p>
       <w:pPr>
@@ -10092,25 +10407,38 @@
         <w:pStyle w:val="Descripcin"/>
         <w:jc w:val="center"/>
       </w:pPr>
-      <w:bookmarkStart w:id="26" w:name="_Toc221908855"/>
+      <w:bookmarkStart w:id="28" w:name="_Toc227856188"/>
       <w:r>
         <w:t xml:space="preserve">Figura </w:t>
       </w:r>
-      <w:fldSimple w:instr=" SEQ Figura \* ARABIC ">
-        <w:r>
-          <w:rPr>
-            <w:noProof/>
-          </w:rPr>
-          <w:t>5</w:t>
-        </w:r>
-      </w:fldSimple>
+      <w:r>
+        <w:fldChar w:fldCharType="begin"/>
+      </w:r>
+      <w:r>
+        <w:instrText xml:space="preserve"> SEQ Figura \* ARABIC </w:instrText>
+      </w:r>
+      <w:r>
+        <w:fldChar w:fldCharType="separate"/>
+      </w:r>
+      <w:r>
+        <w:rPr>
+          <w:noProof/>
+        </w:rPr>
+        <w:t>5</w:t>
+      </w:r>
+      <w:r>
+        <w:rPr>
+          <w:noProof/>
+        </w:rPr>
+        <w:fldChar w:fldCharType="end"/>
+      </w:r>
       <w:r>
         <w:t>. Pantalla Nueva FCT</w:t>
       </w:r>
       <w:r>
         <w:t xml:space="preserve"> - Desktop</w:t>
       </w:r>
-      <w:bookmarkEnd w:id="26"/>
+      <w:bookmarkEnd w:id="28"/>
     </w:p>
     <w:p/>
     <w:p>
@@ -10182,18 +10510,31 @@
         <w:pStyle w:val="Descripcin"/>
         <w:jc w:val="center"/>
       </w:pPr>
-      <w:bookmarkStart w:id="27" w:name="_Toc221908856"/>
+      <w:bookmarkStart w:id="29" w:name="_Toc227856189"/>
       <w:r>
         <w:t xml:space="preserve">Figura </w:t>
       </w:r>
-      <w:fldSimple w:instr=" SEQ Figura \* ARABIC ">
-        <w:r>
-          <w:rPr>
-            <w:noProof/>
-          </w:rPr>
-          <w:t>6</w:t>
-        </w:r>
-      </w:fldSimple>
+      <w:r>
+        <w:fldChar w:fldCharType="begin"/>
+      </w:r>
+      <w:r>
+        <w:instrText xml:space="preserve"> SEQ Figura \* ARABIC </w:instrText>
+      </w:r>
+      <w:r>
+        <w:fldChar w:fldCharType="separate"/>
+      </w:r>
+      <w:r>
+        <w:rPr>
+          <w:noProof/>
+        </w:rPr>
+        <w:t>6</w:t>
+      </w:r>
+      <w:r>
+        <w:rPr>
+          <w:noProof/>
+        </w:rPr>
+        <w:fldChar w:fldCharType="end"/>
+      </w:r>
       <w:r>
         <w:t>. Pantalla inicial</w:t>
       </w:r>
@@ -10206,7 +10547,7 @@
       <w:r>
         <w:t xml:space="preserve"> - Móvil</w:t>
       </w:r>
-      <w:bookmarkEnd w:id="27"/>
+      <w:bookmarkEnd w:id="29"/>
     </w:p>
     <w:p>
       <w:pPr>
@@ -10265,18 +10606,31 @@
         <w:pStyle w:val="Descripcin"/>
         <w:jc w:val="center"/>
       </w:pPr>
-      <w:bookmarkStart w:id="28" w:name="_Toc221908857"/>
+      <w:bookmarkStart w:id="30" w:name="_Toc227856190"/>
       <w:r>
         <w:t xml:space="preserve">Figura </w:t>
       </w:r>
-      <w:fldSimple w:instr=" SEQ Figura \* ARABIC ">
-        <w:r>
-          <w:rPr>
-            <w:noProof/>
-          </w:rPr>
-          <w:t>7</w:t>
-        </w:r>
-      </w:fldSimple>
+      <w:r>
+        <w:fldChar w:fldCharType="begin"/>
+      </w:r>
+      <w:r>
+        <w:instrText xml:space="preserve"> SEQ Figura \* ARABIC </w:instrText>
+      </w:r>
+      <w:r>
+        <w:fldChar w:fldCharType="separate"/>
+      </w:r>
+      <w:r>
+        <w:rPr>
+          <w:noProof/>
+        </w:rPr>
+        <w:t>7</w:t>
+      </w:r>
+      <w:r>
+        <w:rPr>
+          <w:noProof/>
+        </w:rPr>
+        <w:fldChar w:fldCharType="end"/>
+      </w:r>
       <w:r>
         <w:t xml:space="preserve">. Pantalla Añadir justificante </w:t>
       </w:r>
@@ -10289,7 +10643,7 @@
       <w:r>
         <w:t xml:space="preserve"> - Móvil</w:t>
       </w:r>
-      <w:bookmarkEnd w:id="28"/>
+      <w:bookmarkEnd w:id="30"/>
     </w:p>
     <w:p>
       <w:pPr>
@@ -10353,11 +10707,11 @@
           <w:numId w:val="3"/>
         </w:numPr>
       </w:pPr>
-      <w:bookmarkStart w:id="29" w:name="_Toc221908755"/>
+      <w:bookmarkStart w:id="31" w:name="_Toc227855994"/>
       <w:r>
         <w:t>MAPA DE NAVEGABILIDAD</w:t>
       </w:r>
-      <w:bookmarkEnd w:id="29"/>
+      <w:bookmarkEnd w:id="31"/>
     </w:p>
     <w:p>
       <w:r>
@@ -10467,11 +10821,11 @@
           <w:numId w:val="2"/>
         </w:numPr>
       </w:pPr>
-      <w:bookmarkStart w:id="30" w:name="_Toc221908756"/>
+      <w:bookmarkStart w:id="32" w:name="_Toc227855995"/>
       <w:r>
         <w:t>PLAN DE PRUEBAS</w:t>
       </w:r>
-      <w:bookmarkEnd w:id="30"/>
+      <w:bookmarkEnd w:id="32"/>
     </w:p>
     <w:p>
       <w:r>
@@ -10520,15 +10874,7 @@
         <w:t>n</w:t>
       </w:r>
       <w:r>
-        <w:t xml:space="preserve">: asegurar que la GUI de escritorio y la </w:t>
-      </w:r>
-      <w:proofErr w:type="gramStart"/>
-      <w:r>
-        <w:t>app</w:t>
-      </w:r>
-      <w:proofErr w:type="gramEnd"/>
-      <w:r>
-        <w:t xml:space="preserve"> móvil se comunican correctamente con la base de datos.</w:t>
+        <w:t>: asegurar que la GUI de escritorio y la app móvil se comunican correctamente con la base de datos.</w:t>
       </w:r>
     </w:p>
     <w:p>
@@ -10566,11 +10912,11 @@
           <w:numId w:val="2"/>
         </w:numPr>
       </w:pPr>
-      <w:bookmarkStart w:id="31" w:name="_Toc221908757"/>
+      <w:bookmarkStart w:id="33" w:name="_Toc227855996"/>
       <w:r>
         <w:t>TECNOLOGÍAS EMPLEADAS</w:t>
       </w:r>
-      <w:bookmarkEnd w:id="31"/>
+      <w:bookmarkEnd w:id="33"/>
     </w:p>
     <w:p>
       <w:r>
@@ -10930,11 +11276,11 @@
           <w:numId w:val="2"/>
         </w:numPr>
       </w:pPr>
-      <w:bookmarkStart w:id="32" w:name="_Toc221908758"/>
+      <w:bookmarkStart w:id="34" w:name="_Toc227855997"/>
       <w:r>
         <w:t>PLANIFICACIÓN Y PRESUPUESTO</w:t>
       </w:r>
-      <w:bookmarkEnd w:id="32"/>
+      <w:bookmarkEnd w:id="34"/>
     </w:p>
     <w:p>
       <w:r>
@@ -10961,18 +11307,20 @@
           <w:szCs w:val="32"/>
         </w:rPr>
       </w:pPr>
-      <w:bookmarkStart w:id="33" w:name="_Toc210123170"/>
-      <w:bookmarkStart w:id="34" w:name="_Toc210123297"/>
-      <w:bookmarkStart w:id="35" w:name="_Toc210124628"/>
-      <w:bookmarkStart w:id="36" w:name="_Toc210125386"/>
-      <w:bookmarkStart w:id="37" w:name="_Toc221907962"/>
-      <w:bookmarkStart w:id="38" w:name="_Toc221908759"/>
-      <w:bookmarkEnd w:id="33"/>
-      <w:bookmarkEnd w:id="34"/>
+      <w:bookmarkStart w:id="35" w:name="_Toc210123170"/>
+      <w:bookmarkStart w:id="36" w:name="_Toc210123297"/>
+      <w:bookmarkStart w:id="37" w:name="_Toc210124628"/>
+      <w:bookmarkStart w:id="38" w:name="_Toc210125386"/>
+      <w:bookmarkStart w:id="39" w:name="_Toc221907962"/>
+      <w:bookmarkStart w:id="40" w:name="_Toc221908759"/>
+      <w:bookmarkStart w:id="41" w:name="_Toc227855998"/>
       <w:bookmarkEnd w:id="35"/>
       <w:bookmarkEnd w:id="36"/>
       <w:bookmarkEnd w:id="37"/>
       <w:bookmarkEnd w:id="38"/>
+      <w:bookmarkEnd w:id="39"/>
+      <w:bookmarkEnd w:id="40"/>
+      <w:bookmarkEnd w:id="41"/>
     </w:p>
     <w:p>
       <w:pPr>
@@ -10994,18 +11342,20 @@
           <w:szCs w:val="32"/>
         </w:rPr>
       </w:pPr>
-      <w:bookmarkStart w:id="39" w:name="_Toc210123171"/>
-      <w:bookmarkStart w:id="40" w:name="_Toc210123298"/>
-      <w:bookmarkStart w:id="41" w:name="_Toc210124629"/>
-      <w:bookmarkStart w:id="42" w:name="_Toc210125387"/>
-      <w:bookmarkStart w:id="43" w:name="_Toc221907963"/>
-      <w:bookmarkStart w:id="44" w:name="_Toc221908760"/>
-      <w:bookmarkEnd w:id="39"/>
-      <w:bookmarkEnd w:id="40"/>
-      <w:bookmarkEnd w:id="41"/>
+      <w:bookmarkStart w:id="42" w:name="_Toc210123171"/>
+      <w:bookmarkStart w:id="43" w:name="_Toc210123298"/>
+      <w:bookmarkStart w:id="44" w:name="_Toc210124629"/>
+      <w:bookmarkStart w:id="45" w:name="_Toc210125387"/>
+      <w:bookmarkStart w:id="46" w:name="_Toc221907963"/>
+      <w:bookmarkStart w:id="47" w:name="_Toc221908760"/>
+      <w:bookmarkStart w:id="48" w:name="_Toc227855999"/>
       <w:bookmarkEnd w:id="42"/>
       <w:bookmarkEnd w:id="43"/>
       <w:bookmarkEnd w:id="44"/>
+      <w:bookmarkEnd w:id="45"/>
+      <w:bookmarkEnd w:id="46"/>
+      <w:bookmarkEnd w:id="47"/>
+      <w:bookmarkEnd w:id="48"/>
     </w:p>
     <w:p>
       <w:pPr>
@@ -11027,18 +11377,20 @@
           <w:szCs w:val="32"/>
         </w:rPr>
       </w:pPr>
-      <w:bookmarkStart w:id="45" w:name="_Toc210123172"/>
-      <w:bookmarkStart w:id="46" w:name="_Toc210123299"/>
-      <w:bookmarkStart w:id="47" w:name="_Toc210124630"/>
-      <w:bookmarkStart w:id="48" w:name="_Toc210125388"/>
-      <w:bookmarkStart w:id="49" w:name="_Toc221907964"/>
-      <w:bookmarkStart w:id="50" w:name="_Toc221908761"/>
-      <w:bookmarkEnd w:id="45"/>
-      <w:bookmarkEnd w:id="46"/>
-      <w:bookmarkEnd w:id="47"/>
-      <w:bookmarkEnd w:id="48"/>
+      <w:bookmarkStart w:id="49" w:name="_Toc210123172"/>
+      <w:bookmarkStart w:id="50" w:name="_Toc210123299"/>
+      <w:bookmarkStart w:id="51" w:name="_Toc210124630"/>
+      <w:bookmarkStart w:id="52" w:name="_Toc210125388"/>
+      <w:bookmarkStart w:id="53" w:name="_Toc221907964"/>
+      <w:bookmarkStart w:id="54" w:name="_Toc221908761"/>
+      <w:bookmarkStart w:id="55" w:name="_Toc227856000"/>
       <w:bookmarkEnd w:id="49"/>
       <w:bookmarkEnd w:id="50"/>
+      <w:bookmarkEnd w:id="51"/>
+      <w:bookmarkEnd w:id="52"/>
+      <w:bookmarkEnd w:id="53"/>
+      <w:bookmarkEnd w:id="54"/>
+      <w:bookmarkEnd w:id="55"/>
     </w:p>
     <w:p>
       <w:pPr>
@@ -11048,11 +11400,11 @@
           <w:numId w:val="3"/>
         </w:numPr>
       </w:pPr>
-      <w:bookmarkStart w:id="51" w:name="_Toc221908762"/>
+      <w:bookmarkStart w:id="56" w:name="_Toc227856001"/>
       <w:r>
         <w:t>DIAGRAMA DE GANTT</w:t>
       </w:r>
-      <w:bookmarkEnd w:id="51"/>
+      <w:bookmarkEnd w:id="56"/>
     </w:p>
     <w:p>
       <w:pPr>
@@ -11110,25 +11462,41 @@
         <w:pStyle w:val="Descripcin"/>
         <w:jc w:val="center"/>
       </w:pPr>
+      <w:bookmarkStart w:id="57" w:name="_Toc227856191"/>
       <w:r>
         <w:t xml:space="preserve">Figura </w:t>
       </w:r>
-      <w:fldSimple w:instr=" SEQ Figura \* ARABIC ">
-        <w:r>
-          <w:rPr>
-            <w:noProof/>
-          </w:rPr>
-          <w:t>8</w:t>
-        </w:r>
-      </w:fldSimple>
-      <w:r>
-        <w:t>. Diagrame de Gantt</w:t>
-      </w:r>
-    </w:p>
-    <w:p>
-      <w:r>
-        <w:br w:type="page"/>
-      </w:r>
+      <w:r>
+        <w:fldChar w:fldCharType="begin"/>
+      </w:r>
+      <w:r>
+        <w:instrText xml:space="preserve"> SEQ Figura \* ARABIC </w:instrText>
+      </w:r>
+      <w:r>
+        <w:fldChar w:fldCharType="separate"/>
+      </w:r>
+      <w:r>
+        <w:rPr>
+          <w:noProof/>
+        </w:rPr>
+        <w:t>8</w:t>
+      </w:r>
+      <w:r>
+        <w:rPr>
+          <w:noProof/>
+        </w:rPr>
+        <w:fldChar w:fldCharType="end"/>
+      </w:r>
+      <w:r>
+        <w:t>. Diagram</w:t>
+      </w:r>
+      <w:r>
+        <w:t>a</w:t>
+      </w:r>
+      <w:r>
+        <w:t xml:space="preserve"> de Gantt</w:t>
+      </w:r>
+      <w:bookmarkEnd w:id="57"/>
     </w:p>
     <w:p/>
     <w:p>
@@ -11139,11 +11507,11 @@
           <w:numId w:val="3"/>
         </w:numPr>
       </w:pPr>
-      <w:bookmarkStart w:id="52" w:name="_Toc221908763"/>
+      <w:bookmarkStart w:id="58" w:name="_Toc227856002"/>
       <w:r>
         <w:t>ESTIMACIONES DE COSTES</w:t>
       </w:r>
-      <w:bookmarkEnd w:id="52"/>
+      <w:bookmarkEnd w:id="58"/>
     </w:p>
     <w:p>
       <w:pPr>
@@ -11189,11 +11557,11 @@
           <w:numId w:val="2"/>
         </w:numPr>
       </w:pPr>
-      <w:bookmarkStart w:id="53" w:name="_Toc221908764"/>
+      <w:bookmarkStart w:id="59" w:name="_Toc227856003"/>
       <w:r>
         <w:t>FUTURAS MEJORAS Y AMPLIACIONES</w:t>
       </w:r>
-      <w:bookmarkEnd w:id="53"/>
+      <w:bookmarkEnd w:id="59"/>
     </w:p>
     <w:p>
       <w:r>
@@ -11220,18 +11588,20 @@
           <w:szCs w:val="32"/>
         </w:rPr>
       </w:pPr>
-      <w:bookmarkStart w:id="54" w:name="_Toc210123176"/>
-      <w:bookmarkStart w:id="55" w:name="_Toc210123303"/>
-      <w:bookmarkStart w:id="56" w:name="_Toc210124634"/>
-      <w:bookmarkStart w:id="57" w:name="_Toc210125392"/>
-      <w:bookmarkStart w:id="58" w:name="_Toc221907968"/>
-      <w:bookmarkStart w:id="59" w:name="_Toc221908765"/>
-      <w:bookmarkEnd w:id="54"/>
-      <w:bookmarkEnd w:id="55"/>
-      <w:bookmarkEnd w:id="56"/>
-      <w:bookmarkEnd w:id="57"/>
-      <w:bookmarkEnd w:id="58"/>
-      <w:bookmarkEnd w:id="59"/>
+      <w:bookmarkStart w:id="60" w:name="_Toc210123176"/>
+      <w:bookmarkStart w:id="61" w:name="_Toc210123303"/>
+      <w:bookmarkStart w:id="62" w:name="_Toc210124634"/>
+      <w:bookmarkStart w:id="63" w:name="_Toc210125392"/>
+      <w:bookmarkStart w:id="64" w:name="_Toc221907968"/>
+      <w:bookmarkStart w:id="65" w:name="_Toc221908765"/>
+      <w:bookmarkStart w:id="66" w:name="_Toc227856004"/>
+      <w:bookmarkEnd w:id="60"/>
+      <w:bookmarkEnd w:id="61"/>
+      <w:bookmarkEnd w:id="62"/>
+      <w:bookmarkEnd w:id="63"/>
+      <w:bookmarkEnd w:id="64"/>
+      <w:bookmarkEnd w:id="65"/>
+      <w:bookmarkEnd w:id="66"/>
     </w:p>
     <w:p>
       <w:pPr>
@@ -11241,11 +11611,11 @@
           <w:numId w:val="3"/>
         </w:numPr>
       </w:pPr>
-      <w:bookmarkStart w:id="60" w:name="_Toc221908766"/>
+      <w:bookmarkStart w:id="67" w:name="_Toc227856005"/>
       <w:r>
         <w:t>PROPUESTAS DE MEJORA Y AMPLIACIONES</w:t>
       </w:r>
-      <w:bookmarkEnd w:id="60"/>
+      <w:bookmarkEnd w:id="67"/>
     </w:p>
     <w:p>
       <w:r>
@@ -11260,11 +11630,11 @@
           <w:numId w:val="3"/>
         </w:numPr>
       </w:pPr>
-      <w:bookmarkStart w:id="61" w:name="_Toc221908767"/>
+      <w:bookmarkStart w:id="68" w:name="_Toc227856006"/>
       <w:r>
         <w:t>IMPACTO Y RIESGO DE LOS CAMBIOS PROPUESTOS</w:t>
       </w:r>
-      <w:bookmarkEnd w:id="61"/>
+      <w:bookmarkEnd w:id="68"/>
     </w:p>
     <w:p>
       <w:r>
@@ -11279,11 +11649,11 @@
           <w:numId w:val="2"/>
         </w:numPr>
       </w:pPr>
-      <w:bookmarkStart w:id="62" w:name="_Toc221908768"/>
+      <w:bookmarkStart w:id="69" w:name="_Toc227856007"/>
       <w:r>
         <w:t>RELACIÓN CON LOS MÓDULOS DEL CICLO</w:t>
       </w:r>
-      <w:bookmarkEnd w:id="62"/>
+      <w:bookmarkEnd w:id="69"/>
     </w:p>
     <w:p>
       <w:r>
@@ -11299,6 +11669,7 @@
         </w:numPr>
       </w:pPr>
       <w:r>
+        <w:lastRenderedPageBreak/>
         <w:t>Programación Multimedia y Dispositivos Móviles: para la App de Estudiante.</w:t>
       </w:r>
     </w:p>
@@ -11364,11 +11735,11 @@
           <w:numId w:val="2"/>
         </w:numPr>
       </w:pPr>
-      <w:bookmarkStart w:id="63" w:name="_Toc221908769"/>
+      <w:bookmarkStart w:id="70" w:name="_Toc227856008"/>
       <w:r>
         <w:t>CONCLUSIONES</w:t>
       </w:r>
-      <w:bookmarkEnd w:id="63"/>
+      <w:bookmarkEnd w:id="70"/>
     </w:p>
     <w:p>
       <w:r>
@@ -11383,11 +11754,11 @@
           <w:numId w:val="2"/>
         </w:numPr>
       </w:pPr>
-      <w:bookmarkStart w:id="64" w:name="_Toc221908770"/>
+      <w:bookmarkStart w:id="71" w:name="_Toc227856009"/>
       <w:r>
         <w:t>DESPLIEGUE DE LA APLICACIÓN</w:t>
       </w:r>
-      <w:bookmarkEnd w:id="64"/>
+      <w:bookmarkEnd w:id="71"/>
     </w:p>
     <w:p>
       <w:r>
@@ -11414,18 +11785,20 @@
           <w:szCs w:val="32"/>
         </w:rPr>
       </w:pPr>
-      <w:bookmarkStart w:id="65" w:name="_Toc210123182"/>
-      <w:bookmarkStart w:id="66" w:name="_Toc210123309"/>
-      <w:bookmarkStart w:id="67" w:name="_Toc210124640"/>
-      <w:bookmarkStart w:id="68" w:name="_Toc210125398"/>
-      <w:bookmarkStart w:id="69" w:name="_Toc221907974"/>
-      <w:bookmarkStart w:id="70" w:name="_Toc221908771"/>
-      <w:bookmarkEnd w:id="65"/>
-      <w:bookmarkEnd w:id="66"/>
-      <w:bookmarkEnd w:id="67"/>
-      <w:bookmarkEnd w:id="68"/>
-      <w:bookmarkEnd w:id="69"/>
-      <w:bookmarkEnd w:id="70"/>
+      <w:bookmarkStart w:id="72" w:name="_Toc210123182"/>
+      <w:bookmarkStart w:id="73" w:name="_Toc210123309"/>
+      <w:bookmarkStart w:id="74" w:name="_Toc210124640"/>
+      <w:bookmarkStart w:id="75" w:name="_Toc210125398"/>
+      <w:bookmarkStart w:id="76" w:name="_Toc221907974"/>
+      <w:bookmarkStart w:id="77" w:name="_Toc221908771"/>
+      <w:bookmarkStart w:id="78" w:name="_Toc227856010"/>
+      <w:bookmarkEnd w:id="72"/>
+      <w:bookmarkEnd w:id="73"/>
+      <w:bookmarkEnd w:id="74"/>
+      <w:bookmarkEnd w:id="75"/>
+      <w:bookmarkEnd w:id="76"/>
+      <w:bookmarkEnd w:id="77"/>
+      <w:bookmarkEnd w:id="78"/>
     </w:p>
     <w:p>
       <w:pPr>
@@ -11447,18 +11820,20 @@
           <w:szCs w:val="32"/>
         </w:rPr>
       </w:pPr>
-      <w:bookmarkStart w:id="71" w:name="_Toc210123183"/>
-      <w:bookmarkStart w:id="72" w:name="_Toc210123310"/>
-      <w:bookmarkStart w:id="73" w:name="_Toc210124641"/>
-      <w:bookmarkStart w:id="74" w:name="_Toc210125399"/>
-      <w:bookmarkStart w:id="75" w:name="_Toc221907975"/>
-      <w:bookmarkStart w:id="76" w:name="_Toc221908772"/>
-      <w:bookmarkEnd w:id="71"/>
-      <w:bookmarkEnd w:id="72"/>
-      <w:bookmarkEnd w:id="73"/>
-      <w:bookmarkEnd w:id="74"/>
-      <w:bookmarkEnd w:id="75"/>
-      <w:bookmarkEnd w:id="76"/>
+      <w:bookmarkStart w:id="79" w:name="_Toc210123183"/>
+      <w:bookmarkStart w:id="80" w:name="_Toc210123310"/>
+      <w:bookmarkStart w:id="81" w:name="_Toc210124641"/>
+      <w:bookmarkStart w:id="82" w:name="_Toc210125399"/>
+      <w:bookmarkStart w:id="83" w:name="_Toc221907975"/>
+      <w:bookmarkStart w:id="84" w:name="_Toc221908772"/>
+      <w:bookmarkStart w:id="85" w:name="_Toc227856011"/>
+      <w:bookmarkEnd w:id="79"/>
+      <w:bookmarkEnd w:id="80"/>
+      <w:bookmarkEnd w:id="81"/>
+      <w:bookmarkEnd w:id="82"/>
+      <w:bookmarkEnd w:id="83"/>
+      <w:bookmarkEnd w:id="84"/>
+      <w:bookmarkEnd w:id="85"/>
     </w:p>
     <w:p>
       <w:pPr>
@@ -11480,18 +11855,20 @@
           <w:szCs w:val="32"/>
         </w:rPr>
       </w:pPr>
-      <w:bookmarkStart w:id="77" w:name="_Toc210123184"/>
-      <w:bookmarkStart w:id="78" w:name="_Toc210123311"/>
-      <w:bookmarkStart w:id="79" w:name="_Toc210124642"/>
-      <w:bookmarkStart w:id="80" w:name="_Toc210125400"/>
-      <w:bookmarkStart w:id="81" w:name="_Toc221907976"/>
-      <w:bookmarkStart w:id="82" w:name="_Toc221908773"/>
-      <w:bookmarkEnd w:id="77"/>
-      <w:bookmarkEnd w:id="78"/>
-      <w:bookmarkEnd w:id="79"/>
-      <w:bookmarkEnd w:id="80"/>
-      <w:bookmarkEnd w:id="81"/>
-      <w:bookmarkEnd w:id="82"/>
+      <w:bookmarkStart w:id="86" w:name="_Toc210123184"/>
+      <w:bookmarkStart w:id="87" w:name="_Toc210123311"/>
+      <w:bookmarkStart w:id="88" w:name="_Toc210124642"/>
+      <w:bookmarkStart w:id="89" w:name="_Toc210125400"/>
+      <w:bookmarkStart w:id="90" w:name="_Toc221907976"/>
+      <w:bookmarkStart w:id="91" w:name="_Toc221908773"/>
+      <w:bookmarkStart w:id="92" w:name="_Toc227856012"/>
+      <w:bookmarkEnd w:id="86"/>
+      <w:bookmarkEnd w:id="87"/>
+      <w:bookmarkEnd w:id="88"/>
+      <w:bookmarkEnd w:id="89"/>
+      <w:bookmarkEnd w:id="90"/>
+      <w:bookmarkEnd w:id="91"/>
+      <w:bookmarkEnd w:id="92"/>
     </w:p>
     <w:p>
       <w:pPr>
@@ -11501,11 +11878,11 @@
           <w:numId w:val="3"/>
         </w:numPr>
       </w:pPr>
-      <w:bookmarkStart w:id="83" w:name="_Toc221908774"/>
+      <w:bookmarkStart w:id="93" w:name="_Toc227856013"/>
       <w:r>
         <w:t>INSTALACIÓN</w:t>
       </w:r>
-      <w:bookmarkEnd w:id="83"/>
+      <w:bookmarkEnd w:id="93"/>
     </w:p>
     <w:p>
       <w:r>
@@ -11520,91 +11897,17 @@
           <w:numId w:val="2"/>
         </w:numPr>
       </w:pPr>
-      <w:bookmarkStart w:id="84" w:name="_Toc221908775"/>
+      <w:bookmarkStart w:id="94" w:name="_Toc227856014"/>
       <w:r>
         <w:t>GUÍA DE ESTILOS Y MANUAL DE USUARIO</w:t>
       </w:r>
-      <w:bookmarkEnd w:id="84"/>
+      <w:bookmarkEnd w:id="94"/>
     </w:p>
     <w:p>
       <w:r>
         <w:t>En este apartado se describen los estilos que utiliza la aplicación en sus diferentes variables.</w:t>
       </w:r>
     </w:p>
-    <w:p>
-      <w:pPr>
-        <w:keepNext/>
-        <w:jc w:val="center"/>
-      </w:pPr>
-      <w:r>
-        <w:rPr>
-          <w:noProof/>
-        </w:rPr>
-        <w:lastRenderedPageBreak/>
-        <w:drawing>
-          <wp:inline distT="0" distB="0" distL="0" distR="0" wp14:anchorId="7D576B6B" wp14:editId="120170A3">
-            <wp:extent cx="1836175" cy="1836175"/>
-            <wp:effectExtent l="0" t="0" r="0" b="0"/>
-            <wp:docPr id="2039016050" name="Imagen 7" descr="Imagen que contiene Icono&#10;&#10;El contenido generado por IA puede ser incorrecto."/>
-            <wp:cNvGraphicFramePr>
-              <a:graphicFrameLocks xmlns:a="http://schemas.openxmlformats.org/drawingml/2006/main" noChangeAspect="1"/>
-            </wp:cNvGraphicFramePr>
-            <a:graphic xmlns:a="http://schemas.openxmlformats.org/drawingml/2006/main">
-              <a:graphicData uri="http://schemas.openxmlformats.org/drawingml/2006/picture">
-                <pic:pic xmlns:pic="http://schemas.openxmlformats.org/drawingml/2006/picture">
-                  <pic:nvPicPr>
-                    <pic:cNvPr id="2039016050" name="Imagen 7" descr="Imagen que contiene Icono&#10;&#10;El contenido generado por IA puede ser incorrecto."/>
-                    <pic:cNvPicPr/>
-                  </pic:nvPicPr>
-                  <pic:blipFill>
-                    <a:blip r:embed="rId25" cstate="print">
-                      <a:extLst>
-                        <a:ext uri="{28A0092B-C50C-407E-A947-70E740481C1C}">
-                          <a14:useLocalDpi xmlns:a14="http://schemas.microsoft.com/office/drawing/2010/main" val="0"/>
-                        </a:ext>
-                      </a:extLst>
-                    </a:blip>
-                    <a:stretch>
-                      <a:fillRect/>
-                    </a:stretch>
-                  </pic:blipFill>
-                  <pic:spPr>
-                    <a:xfrm>
-                      <a:off x="0" y="0"/>
-                      <a:ext cx="1849366" cy="1849366"/>
-                    </a:xfrm>
-                    <a:prstGeom prst="rect">
-                      <a:avLst/>
-                    </a:prstGeom>
-                  </pic:spPr>
-                </pic:pic>
-              </a:graphicData>
-            </a:graphic>
-          </wp:inline>
-        </w:drawing>
-      </w:r>
-    </w:p>
-    <w:p>
-      <w:pPr>
-        <w:pStyle w:val="Descripcin"/>
-        <w:jc w:val="center"/>
-      </w:pPr>
-      <w:r>
-        <w:t xml:space="preserve">Figura </w:t>
-      </w:r>
-      <w:fldSimple w:instr=" SEQ Figura \* ARABIC ">
-        <w:r>
-          <w:rPr>
-            <w:noProof/>
-          </w:rPr>
-          <w:t>9</w:t>
-        </w:r>
-      </w:fldSimple>
-      <w:r>
-        <w:t>. Logo provisional 1</w:t>
-      </w:r>
-    </w:p>
-    <w:p/>
     <w:p>
       <w:pPr>
         <w:pStyle w:val="Prrafodelista"/>
@@ -11625,18 +11928,20 @@
           <w:szCs w:val="32"/>
         </w:rPr>
       </w:pPr>
-      <w:bookmarkStart w:id="85" w:name="_Toc210123187"/>
-      <w:bookmarkStart w:id="86" w:name="_Toc210123314"/>
-      <w:bookmarkStart w:id="87" w:name="_Toc210124645"/>
-      <w:bookmarkStart w:id="88" w:name="_Toc210125403"/>
-      <w:bookmarkStart w:id="89" w:name="_Toc221907979"/>
-      <w:bookmarkStart w:id="90" w:name="_Toc221908776"/>
-      <w:bookmarkEnd w:id="85"/>
-      <w:bookmarkEnd w:id="86"/>
-      <w:bookmarkEnd w:id="87"/>
-      <w:bookmarkEnd w:id="88"/>
-      <w:bookmarkEnd w:id="89"/>
-      <w:bookmarkEnd w:id="90"/>
+      <w:bookmarkStart w:id="95" w:name="_Toc210123187"/>
+      <w:bookmarkStart w:id="96" w:name="_Toc210123314"/>
+      <w:bookmarkStart w:id="97" w:name="_Toc210124645"/>
+      <w:bookmarkStart w:id="98" w:name="_Toc210125403"/>
+      <w:bookmarkStart w:id="99" w:name="_Toc221907979"/>
+      <w:bookmarkStart w:id="100" w:name="_Toc221908776"/>
+      <w:bookmarkStart w:id="101" w:name="_Toc227856015"/>
+      <w:bookmarkEnd w:id="95"/>
+      <w:bookmarkEnd w:id="96"/>
+      <w:bookmarkEnd w:id="97"/>
+      <w:bookmarkEnd w:id="98"/>
+      <w:bookmarkEnd w:id="99"/>
+      <w:bookmarkEnd w:id="100"/>
+      <w:bookmarkEnd w:id="101"/>
     </w:p>
     <w:p>
       <w:pPr>
@@ -11646,11 +11951,22 @@
           <w:numId w:val="3"/>
         </w:numPr>
       </w:pPr>
-      <w:bookmarkStart w:id="91" w:name="_Toc221908777"/>
+      <w:bookmarkStart w:id="102" w:name="_Toc227856016"/>
       <w:r>
         <w:t>GUÍA DE ESTILOS</w:t>
       </w:r>
-      <w:bookmarkEnd w:id="91"/>
+      <w:bookmarkEnd w:id="102"/>
+    </w:p>
+    <w:p>
+      <w:pPr>
+        <w:pStyle w:val="Ttulo3"/>
+        <w:ind w:left="360"/>
+      </w:pPr>
+      <w:bookmarkStart w:id="103" w:name="_Toc227856017"/>
+      <w:r>
+        <w:t>10.1.1. PALETA DE COLORES</w:t>
+      </w:r>
+      <w:bookmarkEnd w:id="103"/>
     </w:p>
     <w:p>
       <w:pPr>
@@ -11659,6 +11975,104 @@
           <w:u w:val="single"/>
         </w:rPr>
       </w:pPr>
+      <w:r>
+        <w:rPr>
+          <w:noProof/>
+        </w:rPr>
+        <mc:AlternateContent>
+          <mc:Choice Requires="wps">
+            <w:drawing>
+              <wp:anchor distT="0" distB="0" distL="114300" distR="114300" simplePos="0" relativeHeight="251663364" behindDoc="0" locked="0" layoutInCell="1" allowOverlap="1" wp14:anchorId="477FD5B1" wp14:editId="1BE49B9C">
+                <wp:simplePos x="0" y="0"/>
+                <wp:positionH relativeFrom="column">
+                  <wp:posOffset>5145405</wp:posOffset>
+                </wp:positionH>
+                <wp:positionV relativeFrom="paragraph">
+                  <wp:posOffset>3234690</wp:posOffset>
+                </wp:positionV>
+                <wp:extent cx="1517650" cy="635"/>
+                <wp:effectExtent l="0" t="0" r="0" b="0"/>
+                <wp:wrapSquare wrapText="bothSides"/>
+                <wp:docPr id="1629102843" name="Cuadro de texto 1"/>
+                <wp:cNvGraphicFramePr/>
+                <a:graphic xmlns:a="http://schemas.openxmlformats.org/drawingml/2006/main">
+                  <a:graphicData uri="http://schemas.microsoft.com/office/word/2010/wordprocessingShape">
+                    <wps:wsp>
+                      <wps:cNvSpPr txBox="1"/>
+                      <wps:spPr>
+                        <a:xfrm>
+                          <a:off x="0" y="0"/>
+                          <a:ext cx="1517650" cy="635"/>
+                        </a:xfrm>
+                        <a:prstGeom prst="rect">
+                          <a:avLst/>
+                        </a:prstGeom>
+                        <a:solidFill>
+                          <a:prstClr val="white"/>
+                        </a:solidFill>
+                        <a:ln>
+                          <a:noFill/>
+                        </a:ln>
+                      </wps:spPr>
+                      <wps:txbx>
+                        <w:txbxContent>
+                          <w:p>
+                            <w:pPr>
+                              <w:pStyle w:val="Descripcin"/>
+                              <w:rPr>
+                                <w:noProof/>
+                                <w:color w:val="EE0000"/>
+                                <w:sz w:val="22"/>
+                                <w:szCs w:val="22"/>
+                                <w:u w:val="single"/>
+                              </w:rPr>
+                            </w:pPr>
+                            <w:r>
+                              <w:t>Figura 9. Paleta de colores</w:t>
+                            </w:r>
+                          </w:p>
+                        </w:txbxContent>
+                      </wps:txbx>
+                      <wps:bodyPr rot="0" spcFirstLastPara="0" vertOverflow="overflow" horzOverflow="overflow" vert="horz" wrap="square" lIns="0" tIns="0" rIns="0" bIns="0" numCol="1" spcCol="0" rtlCol="0" fromWordArt="0" anchor="t" anchorCtr="0" forceAA="0" compatLnSpc="1">
+                        <a:prstTxWarp prst="textNoShape">
+                          <a:avLst/>
+                        </a:prstTxWarp>
+                        <a:spAutoFit/>
+                      </wps:bodyPr>
+                    </wps:wsp>
+                  </a:graphicData>
+                </a:graphic>
+              </wp:anchor>
+            </w:drawing>
+          </mc:Choice>
+          <mc:Fallback>
+            <w:pict>
+              <v:shape w14:anchorId="477FD5B1" id="Cuadro de texto 1" o:spid="_x0000_s1031" type="#_x0000_t202" style="position:absolute;margin-left:405.15pt;margin-top:254.7pt;width:119.5pt;height:.05pt;z-index:251663364;visibility:visible;mso-wrap-style:square;mso-wrap-distance-left:9pt;mso-wrap-distance-top:0;mso-wrap-distance-right:9pt;mso-wrap-distance-bottom:0;mso-position-horizontal:absolute;mso-position-horizontal-relative:text;mso-position-vertical:absolute;mso-position-vertical-relative:text;v-text-anchor:top" o:gfxdata="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" stroked="f">
+                <v:textbox style="mso-fit-shape-to-text:t" inset="0,0,0,0">
+                  <w:txbxContent>
+                    <w:p>
+                      <w:pPr>
+                        <w:pStyle w:val="Descripcin"/>
+                        <w:rPr>
+                          <w:noProof/>
+                          <w:color w:val="EE0000"/>
+                          <w:sz w:val="22"/>
+                          <w:szCs w:val="22"/>
+                          <w:u w:val="single"/>
+                        </w:rPr>
+                      </w:pPr>
+                      <w:r>
+                        <w:t>Figura 9. Paleta de colores</w:t>
+                      </w:r>
+                    </w:p>
+                  </w:txbxContent>
+                </v:textbox>
+                <w10:wrap type="square"/>
+              </v:shape>
+            </w:pict>
+          </mc:Fallback>
+        </mc:AlternateContent>
+      </w:r>
       <w:r>
         <w:rPr>
           <w:noProof/>
@@ -11666,7 +12080,7 @@
           <w:u w:val="single"/>
         </w:rPr>
         <w:drawing>
-          <wp:anchor distT="0" distB="0" distL="114300" distR="114300" simplePos="0" relativeHeight="251659268" behindDoc="0" locked="0" layoutInCell="1" allowOverlap="1" wp14:anchorId="5D3AAB7B" wp14:editId="519D137D">
+          <wp:anchor distT="0" distB="0" distL="114300" distR="114300" simplePos="0" relativeHeight="251659268" behindDoc="0" locked="0" layoutInCell="1" allowOverlap="1" wp14:anchorId="5D3AAB7B" wp14:editId="00F836D1">
             <wp:simplePos x="0" y="0"/>
             <wp:positionH relativeFrom="page">
               <wp:posOffset>5248910</wp:posOffset>
@@ -11689,7 +12103,7 @@
                     <pic:cNvPicPr/>
                   </pic:nvPicPr>
                   <pic:blipFill>
-                    <a:blip r:embed="rId26" cstate="print">
+                    <a:blip r:embed="rId25" cstate="print">
                       <a:extLst>
                         <a:ext uri="{28A0092B-C50C-407E-A947-70E740481C1C}">
                           <a14:useLocalDpi xmlns:a14="http://schemas.microsoft.com/office/drawing/2010/main" val="0"/>
@@ -12137,68 +12551,169 @@
         </w:tc>
       </w:tr>
     </w:tbl>
+    <w:p>
+      <w:r>
+        <w:rPr>
+          <w:noProof/>
+        </w:rPr>
+        <mc:AlternateContent>
+          <mc:Choice Requires="wps">
+            <w:drawing>
+              <wp:anchor distT="0" distB="0" distL="114300" distR="114300" simplePos="0" relativeHeight="251661316" behindDoc="0" locked="0" layoutInCell="1" allowOverlap="1" wp14:anchorId="415FCCAF" wp14:editId="0D185269">
+                <wp:simplePos x="0" y="0"/>
+                <wp:positionH relativeFrom="column">
+                  <wp:posOffset>5377815</wp:posOffset>
+                </wp:positionH>
+                <wp:positionV relativeFrom="paragraph">
+                  <wp:posOffset>52705</wp:posOffset>
+                </wp:positionV>
+                <wp:extent cx="1285240" cy="288290"/>
+                <wp:effectExtent l="0" t="0" r="0" b="0"/>
+                <wp:wrapSquare wrapText="bothSides"/>
+                <wp:docPr id="917730273" name="Cuadro de texto 1"/>
+                <wp:cNvGraphicFramePr/>
+                <a:graphic xmlns:a="http://schemas.openxmlformats.org/drawingml/2006/main">
+                  <a:graphicData uri="http://schemas.microsoft.com/office/word/2010/wordprocessingShape">
+                    <wps:wsp>
+                      <wps:cNvSpPr txBox="1"/>
+                      <wps:spPr>
+                        <a:xfrm>
+                          <a:off x="0" y="0"/>
+                          <a:ext cx="1285240" cy="288290"/>
+                        </a:xfrm>
+                        <a:prstGeom prst="rect">
+                          <a:avLst/>
+                        </a:prstGeom>
+                        <a:solidFill>
+                          <a:prstClr val="white"/>
+                        </a:solidFill>
+                        <a:ln>
+                          <a:noFill/>
+                        </a:ln>
+                      </wps:spPr>
+                      <wps:txbx>
+                        <w:txbxContent>
+                          <w:p>
+                            <w:pPr>
+                              <w:pStyle w:val="Descripcin"/>
+                              <w:rPr>
+                                <w:noProof/>
+                                <w:color w:val="EE0000"/>
+                                <w:sz w:val="22"/>
+                                <w:szCs w:val="22"/>
+                                <w:u w:val="single"/>
+                              </w:rPr>
+                            </w:pPr>
+                            <w:r>
+                              <w:t>Figura 9. Paleta colores</w:t>
+                            </w:r>
+                          </w:p>
+                        </w:txbxContent>
+                      </wps:txbx>
+                      <wps:bodyPr rot="0" spcFirstLastPara="0" vertOverflow="overflow" horzOverflow="overflow" vert="horz" wrap="square" lIns="0" tIns="0" rIns="0" bIns="0" numCol="1" spcCol="0" rtlCol="0" fromWordArt="0" anchor="t" anchorCtr="0" forceAA="0" compatLnSpc="1">
+                        <a:prstTxWarp prst="textNoShape">
+                          <a:avLst/>
+                        </a:prstTxWarp>
+                        <a:noAutofit/>
+                      </wps:bodyPr>
+                    </wps:wsp>
+                  </a:graphicData>
+                </a:graphic>
+                <wp14:sizeRelH relativeFrom="margin">
+                  <wp14:pctWidth>0</wp14:pctWidth>
+                </wp14:sizeRelH>
+                <wp14:sizeRelV relativeFrom="margin">
+                  <wp14:pctHeight>0</wp14:pctHeight>
+                </wp14:sizeRelV>
+              </wp:anchor>
+            </w:drawing>
+          </mc:Choice>
+          <mc:Fallback>
+            <w:pict>
+              <v:shape w14:anchorId="415FCCAF" id="_x0000_s1032" type="#_x0000_t202" style="position:absolute;margin-left:423.45pt;margin-top:4.15pt;width:101.2pt;height:22.7pt;z-index:251661316;visibility:visible;mso-wrap-style:square;mso-width-percent:0;mso-height-percent:0;mso-wrap-distance-left:9pt;mso-wrap-distance-top:0;mso-wrap-distance-right:9pt;mso-wrap-distance-bottom:0;mso-position-horizontal:absolute;mso-position-horizontal-relative:text;mso-position-vertical:absolute;mso-position-vertical-relative:text;mso-width-percent:0;mso-height-percent:0;mso-width-relative:margin;mso-height-relative:margin;v-text-anchor:top" o:gfxdata="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" stroked="f">
+                <v:textbox inset="0,0,0,0">
+                  <w:txbxContent>
+                    <w:p>
+                      <w:pPr>
+                        <w:pStyle w:val="Descripcin"/>
+                        <w:rPr>
+                          <w:noProof/>
+                          <w:color w:val="EE0000"/>
+                          <w:sz w:val="22"/>
+                          <w:szCs w:val="22"/>
+                          <w:u w:val="single"/>
+                        </w:rPr>
+                      </w:pPr>
+                      <w:r>
+                        <w:t>Figura 9. Paleta colores</w:t>
+                      </w:r>
+                    </w:p>
+                  </w:txbxContent>
+                </v:textbox>
+                <w10:wrap type="square"/>
+              </v:shape>
+            </w:pict>
+          </mc:Fallback>
+        </mc:AlternateContent>
+      </w:r>
+    </w:p>
+    <w:p>
+      <w:pPr>
+        <w:pStyle w:val="Ttulo3"/>
+      </w:pPr>
+      <w:bookmarkStart w:id="104" w:name="_Toc227856018"/>
+      <w:r>
+        <w:t xml:space="preserve">10.1.2. </w:t>
+      </w:r>
+      <w:r>
+        <w:t>Tipografía</w:t>
+      </w:r>
+      <w:bookmarkEnd w:id="104"/>
+    </w:p>
+    <w:p>
+      <w:r>
+        <w:t xml:space="preserve">La fuente principal de la aplicación es Arial, </w:t>
+      </w:r>
+      <w:proofErr w:type="spellStart"/>
+      <w:r>
+        <w:t>sans-serif</w:t>
+      </w:r>
+      <w:proofErr w:type="spellEnd"/>
+      <w:r>
+        <w:t>, disponible en todos los sistemas operativos sin necesidad de instalación adicional. Se utilizan tres tamaños principales:</w:t>
+      </w:r>
+    </w:p>
+    <w:p>
+      <w:r>
+        <w:t>• Títulos de panel: 18px, negrit</w:t>
+      </w:r>
+      <w:r>
+        <w:t>a</w:t>
+      </w:r>
+    </w:p>
+    <w:p>
+      <w:r>
+        <w:t>• Texto de botones de menú: 13px</w:t>
+      </w:r>
+    </w:p>
+    <w:p>
+      <w:r>
+        <w:t>• Texto general de formularios y tablas: 12px, color por defecto del sistema</w:t>
+      </w:r>
+    </w:p>
     <w:p/>
     <w:p>
       <w:pPr>
-        <w:rPr>
-          <w:b/>
-          <w:bCs/>
-        </w:rPr>
-      </w:pPr>
-      <w:r>
-        <w:rPr>
-          <w:b/>
-          <w:bCs/>
-        </w:rPr>
-        <w:t>Tipografía</w:t>
-      </w:r>
-    </w:p>
-    <w:p>
-      <w:r>
-        <w:t xml:space="preserve">La fuente principal de la aplicación es Arial, </w:t>
-      </w:r>
-      <w:proofErr w:type="spellStart"/>
-      <w:r>
-        <w:t>sans-serif</w:t>
-      </w:r>
-      <w:proofErr w:type="spellEnd"/>
-      <w:r>
-        <w:t>, disponible en todos los sistemas operativos sin necesidad de instalación adicional. Se utilizan tres tamaños principales:</w:t>
-      </w:r>
-    </w:p>
-    <w:p>
-      <w:r>
-        <w:t>• Títulos de panel: 18px, negrit</w:t>
-      </w:r>
-      <w:r>
-        <w:t>a</w:t>
-      </w:r>
-    </w:p>
-    <w:p>
-      <w:r>
-        <w:t>• Texto de botones de menú: 13px</w:t>
-      </w:r>
-    </w:p>
-    <w:p>
-      <w:r>
-        <w:t>• Texto general de formularios y tablas: 12px, color por defecto del sistema</w:t>
-      </w:r>
-    </w:p>
-    <w:p/>
-    <w:p>
-      <w:pPr>
-        <w:rPr>
-          <w:b/>
-          <w:bCs/>
-        </w:rPr>
-      </w:pPr>
-      <w:r>
-        <w:rPr>
-          <w:b/>
-          <w:bCs/>
-        </w:rPr>
+        <w:pStyle w:val="Ttulo3"/>
+      </w:pPr>
+      <w:bookmarkStart w:id="105" w:name="_Toc227856019"/>
+      <w:r>
+        <w:t xml:space="preserve">10.1.3. </w:t>
+      </w:r>
+      <w:r>
         <w:t>Clases CSS definidas</w:t>
       </w:r>
+      <w:bookmarkEnd w:id="105"/>
     </w:p>
     <w:p>
       <w:r>
@@ -12313,13 +12828,8 @@
             <w:pPr>
               <w:spacing w:after="160" w:line="259" w:lineRule="auto"/>
             </w:pPr>
-            <w:proofErr w:type="gramStart"/>
-            <w:r>
-              <w:t>.fondo</w:t>
-            </w:r>
-            <w:proofErr w:type="gramEnd"/>
-            <w:r>
-              <w:t>-principal</w:t>
+            <w:r>
+              <w:t>.fondo-principal</w:t>
             </w:r>
           </w:p>
         </w:tc>
@@ -12350,13 +12860,8 @@
             <w:pPr>
               <w:spacing w:after="160" w:line="259" w:lineRule="auto"/>
             </w:pPr>
-            <w:proofErr w:type="gramStart"/>
-            <w:r>
-              <w:t>.fondo</w:t>
-            </w:r>
-            <w:proofErr w:type="gramEnd"/>
-            <w:r>
-              <w:t>-</w:t>
+            <w:r>
+              <w:t>.fondo-</w:t>
             </w:r>
             <w:proofErr w:type="spellStart"/>
             <w:r>
@@ -12395,7 +12900,6 @@
             <w:pPr>
               <w:spacing w:after="160" w:line="259" w:lineRule="auto"/>
             </w:pPr>
-            <w:proofErr w:type="gramStart"/>
             <w:r>
               <w:t>.</w:t>
             </w:r>
@@ -12404,7 +12908,6 @@
               <w:t>btn</w:t>
             </w:r>
             <w:proofErr w:type="spellEnd"/>
-            <w:proofErr w:type="gramEnd"/>
             <w:r>
               <w:t>-primario</w:t>
             </w:r>
@@ -12437,24 +12940,14 @@
             <w:pPr>
               <w:spacing w:after="160" w:line="259" w:lineRule="auto"/>
             </w:pPr>
-            <w:proofErr w:type="gramStart"/>
             <w:r>
               <w:t>.</w:t>
             </w:r>
             <w:proofErr w:type="spellStart"/>
             <w:r>
-              <w:t>btn</w:t>
-            </w:r>
-            <w:proofErr w:type="gramEnd"/>
-            <w:r>
-              <w:t>-</w:t>
-            </w:r>
-            <w:proofErr w:type="gramStart"/>
-            <w:r>
-              <w:t>primario:hover</w:t>
+              <w:t>btn-primario:hover</w:t>
             </w:r>
             <w:proofErr w:type="spellEnd"/>
-            <w:proofErr w:type="gramEnd"/>
           </w:p>
         </w:tc>
         <w:tc>
@@ -12495,7 +12988,6 @@
             <w:pPr>
               <w:spacing w:after="160" w:line="259" w:lineRule="auto"/>
             </w:pPr>
-            <w:proofErr w:type="gramStart"/>
             <w:r>
               <w:t>.</w:t>
             </w:r>
@@ -12504,7 +12996,6 @@
               <w:t>btn</w:t>
             </w:r>
             <w:proofErr w:type="spellEnd"/>
-            <w:proofErr w:type="gramEnd"/>
             <w:r>
               <w:t>-peligro</w:t>
             </w:r>
@@ -12537,24 +13028,14 @@
             <w:pPr>
               <w:spacing w:after="160" w:line="259" w:lineRule="auto"/>
             </w:pPr>
-            <w:proofErr w:type="gramStart"/>
             <w:r>
               <w:t>.</w:t>
             </w:r>
             <w:proofErr w:type="spellStart"/>
             <w:r>
-              <w:t>btn</w:t>
-            </w:r>
-            <w:proofErr w:type="gramEnd"/>
-            <w:r>
-              <w:t>-</w:t>
-            </w:r>
-            <w:proofErr w:type="gramStart"/>
-            <w:r>
-              <w:t>peligro:hover</w:t>
+              <w:t>btn-peligro:hover</w:t>
             </w:r>
             <w:proofErr w:type="spellEnd"/>
-            <w:proofErr w:type="gramEnd"/>
           </w:p>
         </w:tc>
         <w:tc>
@@ -12595,13 +13076,8 @@
             <w:pPr>
               <w:spacing w:after="160" w:line="259" w:lineRule="auto"/>
             </w:pPr>
-            <w:proofErr w:type="gramStart"/>
-            <w:r>
-              <w:t>.titulo</w:t>
-            </w:r>
-            <w:proofErr w:type="gramEnd"/>
-            <w:r>
-              <w:t>-panel</w:t>
+            <w:r>
+              <w:t>.titulo-panel</w:t>
             </w:r>
           </w:p>
         </w:tc>
@@ -12632,17 +13108,12 @@
             <w:pPr>
               <w:spacing w:after="160" w:line="259" w:lineRule="auto"/>
             </w:pPr>
-            <w:proofErr w:type="gramStart"/>
             <w:r>
               <w:t>.</w:t>
             </w:r>
             <w:proofErr w:type="spellStart"/>
             <w:r>
-              <w:t>label</w:t>
-            </w:r>
-            <w:proofErr w:type="gramEnd"/>
-            <w:r>
-              <w:t>-menu</w:t>
+              <w:t>label-menu</w:t>
             </w:r>
             <w:proofErr w:type="spellEnd"/>
           </w:p>
@@ -12677,17 +13148,12 @@
             <w:pPr>
               <w:spacing w:after="160" w:line="259" w:lineRule="auto"/>
             </w:pPr>
-            <w:proofErr w:type="gramStart"/>
             <w:r>
               <w:t>.</w:t>
             </w:r>
             <w:proofErr w:type="spellStart"/>
             <w:r>
-              <w:t>btn</w:t>
-            </w:r>
-            <w:proofErr w:type="gramEnd"/>
-            <w:r>
-              <w:t>-menu</w:t>
+              <w:t>btn-menu</w:t>
             </w:r>
             <w:proofErr w:type="spellEnd"/>
           </w:p>
@@ -12719,24 +13185,14 @@
             <w:pPr>
               <w:spacing w:after="160" w:line="259" w:lineRule="auto"/>
             </w:pPr>
-            <w:proofErr w:type="gramStart"/>
             <w:r>
               <w:t>.</w:t>
             </w:r>
             <w:proofErr w:type="spellStart"/>
             <w:r>
-              <w:t>btn</w:t>
-            </w:r>
-            <w:proofErr w:type="gramEnd"/>
-            <w:r>
-              <w:t>-</w:t>
-            </w:r>
-            <w:proofErr w:type="gramStart"/>
-            <w:r>
-              <w:t>menu:hover</w:t>
+              <w:t>btn-menu:hover</w:t>
             </w:r>
             <w:proofErr w:type="spellEnd"/>
-            <w:proofErr w:type="gramEnd"/>
           </w:p>
         </w:tc>
         <w:tc>
@@ -12764,6 +13220,445 @@
         </w:tc>
       </w:tr>
     </w:tbl>
+    <w:p/>
+    <w:p>
+      <w:pPr>
+        <w:pStyle w:val="Ttulo3"/>
+      </w:pPr>
+      <w:bookmarkStart w:id="106" w:name="_Toc227856020"/>
+      <w:r>
+        <w:t>10.1.4. IMÁGENES E ICONOS</w:t>
+      </w:r>
+      <w:bookmarkEnd w:id="106"/>
+    </w:p>
+    <w:p>
+      <w:pPr>
+        <w:keepNext/>
+        <w:jc w:val="center"/>
+      </w:pPr>
+      <w:r>
+        <w:rPr>
+          <w:noProof/>
+        </w:rPr>
+        <w:drawing>
+          <wp:inline distT="0" distB="0" distL="0" distR="0" wp14:anchorId="075E3C6F" wp14:editId="0F24AAC5">
+            <wp:extent cx="2368550" cy="2368550"/>
+            <wp:effectExtent l="0" t="0" r="0" b="0"/>
+            <wp:docPr id="2039016050" name="Imagen 7" descr="Imagen que contiene Icono&#10;&#10;El contenido generado por IA puede ser incorrecto."/>
+            <wp:cNvGraphicFramePr>
+              <a:graphicFrameLocks xmlns:a="http://schemas.openxmlformats.org/drawingml/2006/main" noChangeAspect="1"/>
+            </wp:cNvGraphicFramePr>
+            <a:graphic xmlns:a="http://schemas.openxmlformats.org/drawingml/2006/main">
+              <a:graphicData uri="http://schemas.openxmlformats.org/drawingml/2006/picture">
+                <pic:pic xmlns:pic="http://schemas.openxmlformats.org/drawingml/2006/picture">
+                  <pic:nvPicPr>
+                    <pic:cNvPr id="2039016050" name="Imagen 7" descr="Imagen que contiene Icono&#10;&#10;El contenido generado por IA puede ser incorrecto."/>
+                    <pic:cNvPicPr/>
+                  </pic:nvPicPr>
+                  <pic:blipFill>
+                    <a:blip r:embed="rId26" cstate="print">
+                      <a:extLst>
+                        <a:ext uri="{28A0092B-C50C-407E-A947-70E740481C1C}">
+                          <a14:useLocalDpi xmlns:a14="http://schemas.microsoft.com/office/drawing/2010/main" val="0"/>
+                        </a:ext>
+                      </a:extLst>
+                    </a:blip>
+                    <a:stretch>
+                      <a:fillRect/>
+                    </a:stretch>
+                  </pic:blipFill>
+                  <pic:spPr>
+                    <a:xfrm>
+                      <a:off x="0" y="0"/>
+                      <a:ext cx="2386074" cy="2386074"/>
+                    </a:xfrm>
+                    <a:prstGeom prst="rect">
+                      <a:avLst/>
+                    </a:prstGeom>
+                  </pic:spPr>
+                </pic:pic>
+              </a:graphicData>
+            </a:graphic>
+          </wp:inline>
+        </w:drawing>
+      </w:r>
+    </w:p>
+    <w:p>
+      <w:pPr>
+        <w:pStyle w:val="Descripcin"/>
+        <w:ind w:left="708" w:hanging="708"/>
+        <w:jc w:val="center"/>
+      </w:pPr>
+      <w:r>
+        <w:t>Figura 10.</w:t>
+      </w:r>
+      <w:r>
+        <w:t xml:space="preserve"> </w:t>
+      </w:r>
+      <w:r>
+        <w:t>Logo</w:t>
+      </w:r>
+      <w:r>
+        <w:t xml:space="preserve"> </w:t>
+      </w:r>
+      <w:r>
+        <w:t>provisional</w:t>
+      </w:r>
+    </w:p>
+    <w:p/>
+    <w:p>
+      <w:pPr>
+        <w:keepNext/>
+        <w:jc w:val="center"/>
+      </w:pPr>
+      <w:r>
+        <w:rPr>
+          <w:noProof/>
+        </w:rPr>
+        <w:lastRenderedPageBreak/>
+        <w:drawing>
+          <wp:inline distT="0" distB="0" distL="0" distR="0" wp14:anchorId="39FF7544" wp14:editId="16C9AD15">
+            <wp:extent cx="3479800" cy="1479129"/>
+            <wp:effectExtent l="533400" t="457200" r="806450" b="807085"/>
+            <wp:docPr id="1579107418" name="Imagen 7"/>
+            <wp:cNvGraphicFramePr>
+              <a:graphicFrameLocks xmlns:a="http://schemas.openxmlformats.org/drawingml/2006/main" noChangeAspect="1"/>
+            </wp:cNvGraphicFramePr>
+            <a:graphic xmlns:a="http://schemas.openxmlformats.org/drawingml/2006/main">
+              <a:graphicData uri="http://schemas.openxmlformats.org/drawingml/2006/picture">
+                <pic:pic xmlns:pic="http://schemas.openxmlformats.org/drawingml/2006/picture">
+                  <pic:nvPicPr>
+                    <pic:cNvPr id="0" name="Picture 6"/>
+                    <pic:cNvPicPr>
+                      <a:picLocks noChangeAspect="1" noChangeArrowheads="1"/>
+                    </pic:cNvPicPr>
+                  </pic:nvPicPr>
+                  <pic:blipFill>
+                    <a:blip r:embed="rId27">
+                      <a:extLst>
+                        <a:ext uri="{28A0092B-C50C-407E-A947-70E740481C1C}">
+                          <a14:useLocalDpi xmlns:a14="http://schemas.microsoft.com/office/drawing/2010/main" val="0"/>
+                        </a:ext>
+                      </a:extLst>
+                    </a:blip>
+                    <a:srcRect/>
+                    <a:stretch>
+                      <a:fillRect/>
+                    </a:stretch>
+                  </pic:blipFill>
+                  <pic:spPr bwMode="auto">
+                    <a:xfrm>
+                      <a:off x="0" y="0"/>
+                      <a:ext cx="3493548" cy="1484973"/>
+                    </a:xfrm>
+                    <a:prstGeom prst="rect">
+                      <a:avLst/>
+                    </a:prstGeom>
+                    <a:solidFill>
+                      <a:srgbClr val="000000">
+                        <a:shade val="95000"/>
+                      </a:srgbClr>
+                    </a:solidFill>
+                    <a:ln w="444500" cap="sq">
+                      <a:solidFill>
+                        <a:srgbClr val="000000"/>
+                      </a:solidFill>
+                      <a:miter lim="800000"/>
+                    </a:ln>
+                    <a:effectLst>
+                      <a:outerShdw blurRad="254000" dist="190500" dir="2700000" sy="90000" algn="bl" rotWithShape="0">
+                        <a:srgbClr val="000000">
+                          <a:alpha val="40000"/>
+                        </a:srgbClr>
+                      </a:outerShdw>
+                    </a:effectLst>
+                  </pic:spPr>
+                </pic:pic>
+              </a:graphicData>
+            </a:graphic>
+          </wp:inline>
+        </w:drawing>
+      </w:r>
+    </w:p>
+    <w:p>
+      <w:pPr>
+        <w:pStyle w:val="Descripcin"/>
+        <w:jc w:val="center"/>
+      </w:pPr>
+      <w:r>
+        <w:t>Figura 11. Logo Centro educativo</w:t>
+      </w:r>
+    </w:p>
+    <w:p/>
+    <w:tbl>
+      <w:tblPr>
+        <w:tblStyle w:val="Tablaconcuadrcula1clara-nfasis1"/>
+        <w:tblW w:w="0" w:type="auto"/>
+        <w:tblLook w:val="04A0" w:firstRow="1" w:lastRow="0" w:firstColumn="1" w:lastColumn="0" w:noHBand="0" w:noVBand="1"/>
+      </w:tblPr>
+      <w:tblGrid>
+        <w:gridCol w:w="4814"/>
+        <w:gridCol w:w="4814"/>
+      </w:tblGrid>
+      <w:tr>
+        <w:trPr>
+          <w:cnfStyle w:val="100000000000" w:firstRow="1" w:lastRow="0" w:firstColumn="0" w:lastColumn="0" w:oddVBand="0" w:evenVBand="0" w:oddHBand="0" w:evenHBand="0" w:firstRowFirstColumn="0" w:firstRowLastColumn="0" w:lastRowFirstColumn="0" w:lastRowLastColumn="0"/>
+        </w:trPr>
+        <w:tc>
+          <w:tcPr>
+            <w:cnfStyle w:val="001000000000" w:firstRow="0" w:lastRow="0" w:firstColumn="1" w:lastColumn="0" w:oddVBand="0" w:evenVBand="0" w:oddHBand="0" w:evenHBand="0" w:firstRowFirstColumn="0" w:firstRowLastColumn="0" w:lastRowFirstColumn="0" w:lastRowLastColumn="0"/>
+            <w:tcW w:w="4814" w:type="dxa"/>
+          </w:tcPr>
+          <w:p>
+            <w:pPr>
+              <w:jc w:val="center"/>
+            </w:pPr>
+            <w:r>
+              <w:t>ICONO</w:t>
+            </w:r>
+          </w:p>
+        </w:tc>
+        <w:tc>
+          <w:tcPr>
+            <w:tcW w:w="4814" w:type="dxa"/>
+          </w:tcPr>
+          <w:p>
+            <w:pPr>
+              <w:jc w:val="center"/>
+              <w:cnfStyle w:val="100000000000" w:firstRow="1" w:lastRow="0" w:firstColumn="0" w:lastColumn="0" w:oddVBand="0" w:evenVBand="0" w:oddHBand="0" w:evenHBand="0" w:firstRowFirstColumn="0" w:firstRowLastColumn="0" w:lastRowFirstColumn="0" w:lastRowLastColumn="0"/>
+            </w:pPr>
+            <w:r>
+              <w:t>UTILIDAD</w:t>
+            </w:r>
+          </w:p>
+        </w:tc>
+      </w:tr>
+      <w:tr>
+        <w:tc>
+          <w:tcPr>
+            <w:cnfStyle w:val="001000000000" w:firstRow="0" w:lastRow="0" w:firstColumn="1" w:lastColumn="0" w:oddVBand="0" w:evenVBand="0" w:oddHBand="0" w:evenHBand="0" w:firstRowFirstColumn="0" w:firstRowLastColumn="0" w:lastRowFirstColumn="0" w:lastRowLastColumn="0"/>
+            <w:tcW w:w="4814" w:type="dxa"/>
+          </w:tcPr>
+          <w:p>
+            <w:pPr>
+              <w:keepNext/>
+              <w:jc w:val="center"/>
+              <w:rPr>
+                <w:b w:val="0"/>
+                <w:bCs w:val="0"/>
+              </w:rPr>
+            </w:pPr>
+            <w:r>
+              <w:rPr>
+                <w:b w:val="0"/>
+                <w:bCs w:val="0"/>
+                <w:noProof/>
+              </w:rPr>
+              <w:drawing>
+                <wp:inline distT="0" distB="0" distL="0" distR="0" wp14:anchorId="7ADF2637" wp14:editId="093A72BE">
+                  <wp:extent cx="565150" cy="565150"/>
+                  <wp:effectExtent l="0" t="0" r="6350" b="6350"/>
+                  <wp:docPr id="601757383" name="Imagen 8"/>
+                  <wp:cNvGraphicFramePr>
+                    <a:graphicFrameLocks xmlns:a="http://schemas.openxmlformats.org/drawingml/2006/main" noChangeAspect="1"/>
+                  </wp:cNvGraphicFramePr>
+                  <a:graphic xmlns:a="http://schemas.openxmlformats.org/drawingml/2006/main">
+                    <a:graphicData uri="http://schemas.openxmlformats.org/drawingml/2006/picture">
+                      <pic:pic xmlns:pic="http://schemas.openxmlformats.org/drawingml/2006/picture">
+                        <pic:nvPicPr>
+                          <pic:cNvPr id="0" name="Picture 7"/>
+                          <pic:cNvPicPr>
+                            <a:picLocks noChangeAspect="1" noChangeArrowheads="1"/>
+                          </pic:cNvPicPr>
+                        </pic:nvPicPr>
+                        <pic:blipFill>
+                          <a:blip r:embed="rId28" cstate="print">
+                            <a:extLst>
+                              <a:ext uri="{28A0092B-C50C-407E-A947-70E740481C1C}">
+                                <a14:useLocalDpi xmlns:a14="http://schemas.microsoft.com/office/drawing/2010/main" val="0"/>
+                              </a:ext>
+                            </a:extLst>
+                          </a:blip>
+                          <a:srcRect/>
+                          <a:stretch>
+                            <a:fillRect/>
+                          </a:stretch>
+                        </pic:blipFill>
+                        <pic:spPr bwMode="auto">
+                          <a:xfrm>
+                            <a:off x="0" y="0"/>
+                            <a:ext cx="565150" cy="565150"/>
+                          </a:xfrm>
+                          <a:prstGeom prst="rect">
+                            <a:avLst/>
+                          </a:prstGeom>
+                          <a:noFill/>
+                          <a:ln>
+                            <a:noFill/>
+                          </a:ln>
+                        </pic:spPr>
+                      </pic:pic>
+                    </a:graphicData>
+                  </a:graphic>
+                </wp:inline>
+              </w:drawing>
+            </w:r>
+          </w:p>
+          <w:p>
+            <w:pPr>
+              <w:pStyle w:val="Descripcin"/>
+              <w:jc w:val="center"/>
+              <w:rPr>
+                <w:b w:val="0"/>
+                <w:bCs w:val="0"/>
+              </w:rPr>
+            </w:pPr>
+            <w:r>
+              <w:t>Icono 1.</w:t>
+            </w:r>
+          </w:p>
+          <w:p>
+            <w:pPr>
+              <w:pStyle w:val="Descripcin"/>
+              <w:jc w:val="center"/>
+              <w:rPr>
+                <w:b w:val="0"/>
+                <w:bCs w:val="0"/>
+              </w:rPr>
+            </w:pPr>
+          </w:p>
+        </w:tc>
+        <w:tc>
+          <w:tcPr>
+            <w:tcW w:w="4814" w:type="dxa"/>
+          </w:tcPr>
+          <w:p>
+            <w:pPr>
+              <w:jc w:val="center"/>
+              <w:cnfStyle w:val="000000000000" w:firstRow="0" w:lastRow="0" w:firstColumn="0" w:lastColumn="0" w:oddVBand="0" w:evenVBand="0" w:oddHBand="0" w:evenHBand="0" w:firstRowFirstColumn="0" w:firstRowLastColumn="0" w:lastRowFirstColumn="0" w:lastRowLastColumn="0"/>
+            </w:pPr>
+            <w:r>
+              <w:t>Icono para foto de usuario. Se muestra por defecto cuando el usuario no tiene una foto asignada.</w:t>
+            </w:r>
+          </w:p>
+        </w:tc>
+      </w:tr>
+      <w:tr>
+        <w:tc>
+          <w:tcPr>
+            <w:cnfStyle w:val="001000000000" w:firstRow="0" w:lastRow="0" w:firstColumn="1" w:lastColumn="0" w:oddVBand="0" w:evenVBand="0" w:oddHBand="0" w:evenHBand="0" w:firstRowFirstColumn="0" w:firstRowLastColumn="0" w:lastRowFirstColumn="0" w:lastRowLastColumn="0"/>
+            <w:tcW w:w="4814" w:type="dxa"/>
+          </w:tcPr>
+          <w:p>
+            <w:pPr>
+              <w:keepNext/>
+              <w:jc w:val="center"/>
+              <w:rPr>
+                <w:b w:val="0"/>
+                <w:bCs w:val="0"/>
+              </w:rPr>
+            </w:pPr>
+            <w:r>
+              <w:rPr>
+                <w:b w:val="0"/>
+                <w:bCs w:val="0"/>
+                <w:noProof/>
+              </w:rPr>
+              <w:drawing>
+                <wp:inline distT="0" distB="0" distL="0" distR="0" wp14:anchorId="782E52B2" wp14:editId="22253A4D">
+                  <wp:extent cx="628650" cy="628650"/>
+                  <wp:effectExtent l="0" t="0" r="0" b="0"/>
+                  <wp:docPr id="271971043" name="Imagen 9"/>
+                  <wp:cNvGraphicFramePr>
+                    <a:graphicFrameLocks xmlns:a="http://schemas.openxmlformats.org/drawingml/2006/main" noChangeAspect="1"/>
+                  </wp:cNvGraphicFramePr>
+                  <a:graphic xmlns:a="http://schemas.openxmlformats.org/drawingml/2006/main">
+                    <a:graphicData uri="http://schemas.openxmlformats.org/drawingml/2006/picture">
+                      <pic:pic xmlns:pic="http://schemas.openxmlformats.org/drawingml/2006/picture">
+                        <pic:nvPicPr>
+                          <pic:cNvPr id="0" name="Picture 8"/>
+                          <pic:cNvPicPr>
+                            <a:picLocks noChangeAspect="1" noChangeArrowheads="1"/>
+                          </pic:cNvPicPr>
+                        </pic:nvPicPr>
+                        <pic:blipFill>
+                          <a:blip r:embed="rId29" cstate="print">
+                            <a:extLst>
+                              <a:ext uri="{28A0092B-C50C-407E-A947-70E740481C1C}">
+                                <a14:useLocalDpi xmlns:a14="http://schemas.microsoft.com/office/drawing/2010/main" val="0"/>
+                              </a:ext>
+                            </a:extLst>
+                          </a:blip>
+                          <a:srcRect/>
+                          <a:stretch>
+                            <a:fillRect/>
+                          </a:stretch>
+                        </pic:blipFill>
+                        <pic:spPr bwMode="auto">
+                          <a:xfrm>
+                            <a:off x="0" y="0"/>
+                            <a:ext cx="628650" cy="628650"/>
+                          </a:xfrm>
+                          <a:prstGeom prst="rect">
+                            <a:avLst/>
+                          </a:prstGeom>
+                          <a:noFill/>
+                          <a:ln>
+                            <a:noFill/>
+                          </a:ln>
+                        </pic:spPr>
+                      </pic:pic>
+                    </a:graphicData>
+                  </a:graphic>
+                </wp:inline>
+              </w:drawing>
+            </w:r>
+          </w:p>
+          <w:p>
+            <w:pPr>
+              <w:pStyle w:val="Descripcin"/>
+              <w:jc w:val="center"/>
+              <w:rPr>
+                <w:b w:val="0"/>
+                <w:bCs w:val="0"/>
+              </w:rPr>
+            </w:pPr>
+            <w:r>
+              <w:t>Icono 2.</w:t>
+            </w:r>
+          </w:p>
+          <w:p>
+            <w:pPr>
+              <w:pStyle w:val="Descripcin"/>
+              <w:jc w:val="center"/>
+              <w:rPr>
+                <w:b w:val="0"/>
+                <w:bCs w:val="0"/>
+              </w:rPr>
+            </w:pPr>
+          </w:p>
+        </w:tc>
+        <w:tc>
+          <w:tcPr>
+            <w:tcW w:w="4814" w:type="dxa"/>
+          </w:tcPr>
+          <w:p>
+            <w:pPr>
+              <w:jc w:val="center"/>
+              <w:cnfStyle w:val="000000000000" w:firstRow="0" w:lastRow="0" w:firstColumn="0" w:lastColumn="0" w:oddVBand="0" w:evenVBand="0" w:oddHBand="0" w:evenHBand="0" w:firstRowFirstColumn="0" w:firstRowLastColumn="0" w:lastRowFirstColumn="0" w:lastRowLastColumn="0"/>
+            </w:pPr>
+            <w:r>
+              <w:t>Icono para el botón de edición.</w:t>
+            </w:r>
+          </w:p>
+        </w:tc>
+      </w:tr>
+    </w:tbl>
+    <w:p>
+      <w:pPr>
+        <w:jc w:val="center"/>
+      </w:pPr>
+    </w:p>
     <w:p/>
     <w:p/>
     <w:p>
@@ -12779,11 +13674,11 @@
           <w:numId w:val="3"/>
         </w:numPr>
       </w:pPr>
-      <w:bookmarkStart w:id="92" w:name="_Toc221908778"/>
+      <w:bookmarkStart w:id="107" w:name="_Toc227856021"/>
       <w:r>
         <w:t>MANUAL DE USUARIO</w:t>
       </w:r>
-      <w:bookmarkEnd w:id="92"/>
+      <w:bookmarkEnd w:id="107"/>
     </w:p>
     <w:p>
       <w:r>
@@ -12798,11 +13693,11 @@
           <w:numId w:val="2"/>
         </w:numPr>
       </w:pPr>
-      <w:bookmarkStart w:id="93" w:name="_Toc221908779"/>
+      <w:bookmarkStart w:id="108" w:name="_Toc227856022"/>
       <w:r>
         <w:t>WEBGRAFÍA Y FUENTES DE INFORMACIÓN</w:t>
       </w:r>
-      <w:bookmarkEnd w:id="93"/>
+      <w:bookmarkEnd w:id="108"/>
     </w:p>
     <w:p>
       <w:r>
@@ -12817,7 +13712,7 @@
     <w:p/>
     <w:p/>
     <w:sectPr>
-      <w:footerReference w:type="default" r:id="rId27"/>
+      <w:footerReference w:type="default" r:id="rId30"/>
       <w:pgSz w:w="11906" w:h="16838"/>
       <w:pgMar w:top="1134" w:right="1134" w:bottom="1418" w:left="1134" w:header="709" w:footer="709" w:gutter="0"/>
       <w:pgNumType w:start="1"/>
@@ -14287,7 +15182,6 @@
     <w:next w:val="Normal"/>
     <w:link w:val="Ttulo3Car"/>
     <w:uiPriority w:val="9"/>
-    <w:semiHidden/>
     <w:unhideWhenUsed/>
     <w:qFormat/>
     <w:rsid w:val="00BC2D47"/>
@@ -14494,7 +15388,6 @@
     <w:basedOn w:val="Fuentedeprrafopredeter"/>
     <w:link w:val="Ttulo3"/>
     <w:uiPriority w:val="9"/>
-    <w:semiHidden/>
     <w:rsid w:val="00BC2D47"/>
     <w:rPr>
       <w:rFonts w:eastAsiaTheme="majorEastAsia" w:cstheme="majorBidi"/>
@@ -14844,6 +15737,7 @@
     <w:name w:val="caption"/>
     <w:basedOn w:val="Normal"/>
     <w:next w:val="Normal"/>
+    <w:link w:val="DescripcinCar"/>
     <w:uiPriority w:val="35"/>
     <w:unhideWhenUsed/>
     <w:qFormat/>
@@ -15052,6 +15946,126 @@
       <w:color w:val="96607D" w:themeColor="followedHyperlink"/>
       <w:u w:val="single"/>
     </w:rPr>
+  </w:style>
+  <w:style w:type="table" w:styleId="Tablaconcuadrcula1clara-nfasis1">
+    <w:name w:val="Grid Table 1 Light Accent 1"/>
+    <w:basedOn w:val="Tablanormal"/>
+    <w:uiPriority w:val="46"/>
+    <w:rsid w:val="00F938AC"/>
+    <w:pPr>
+      <w:spacing w:after="0" w:line="240" w:lineRule="auto"/>
+    </w:pPr>
+    <w:tblPr>
+      <w:tblStyleRowBandSize w:val="1"/>
+      <w:tblStyleColBandSize w:val="1"/>
+      <w:tblBorders>
+        <w:top w:val="single" w:sz="4" w:space="0" w:color="83CAEB" w:themeColor="accent1" w:themeTint="66"/>
+        <w:left w:val="single" w:sz="4" w:space="0" w:color="83CAEB" w:themeColor="accent1" w:themeTint="66"/>
+        <w:bottom w:val="single" w:sz="4" w:space="0" w:color="83CAEB" w:themeColor="accent1" w:themeTint="66"/>
+        <w:right w:val="single" w:sz="4" w:space="0" w:color="83CAEB" w:themeColor="accent1" w:themeTint="66"/>
+        <w:insideH w:val="single" w:sz="4" w:space="0" w:color="83CAEB" w:themeColor="accent1" w:themeTint="66"/>
+        <w:insideV w:val="single" w:sz="4" w:space="0" w:color="83CAEB" w:themeColor="accent1" w:themeTint="66"/>
+      </w:tblBorders>
+    </w:tblPr>
+    <w:tblStylePr w:type="firstRow">
+      <w:rPr>
+        <w:b/>
+        <w:bCs/>
+      </w:rPr>
+      <w:tblPr/>
+      <w:tcPr>
+        <w:tcBorders>
+          <w:bottom w:val="single" w:sz="12" w:space="0" w:color="45B0E1" w:themeColor="accent1" w:themeTint="99"/>
+        </w:tcBorders>
+      </w:tcPr>
+    </w:tblStylePr>
+    <w:tblStylePr w:type="lastRow">
+      <w:rPr>
+        <w:b/>
+        <w:bCs/>
+      </w:rPr>
+      <w:tblPr/>
+      <w:tcPr>
+        <w:tcBorders>
+          <w:top w:val="double" w:sz="2" w:space="0" w:color="45B0E1" w:themeColor="accent1" w:themeTint="99"/>
+        </w:tcBorders>
+      </w:tcPr>
+    </w:tblStylePr>
+    <w:tblStylePr w:type="firstCol">
+      <w:rPr>
+        <w:b/>
+        <w:bCs/>
+      </w:rPr>
+    </w:tblStylePr>
+    <w:tblStylePr w:type="lastCol">
+      <w:rPr>
+        <w:b/>
+        <w:bCs/>
+      </w:rPr>
+    </w:tblStylePr>
+  </w:style>
+  <w:style w:type="paragraph" w:customStyle="1" w:styleId="Figuras">
+    <w:name w:val="Figuras"/>
+    <w:basedOn w:val="Descripcin"/>
+    <w:link w:val="FigurasCar"/>
+    <w:qFormat/>
+    <w:rsid w:val="00F938AC"/>
+    <w:pPr>
+      <w:jc w:val="center"/>
+    </w:pPr>
+  </w:style>
+  <w:style w:type="character" w:customStyle="1" w:styleId="DescripcinCar">
+    <w:name w:val="Descripción Car"/>
+    <w:basedOn w:val="Fuentedeprrafopredeter"/>
+    <w:link w:val="Descripcin"/>
+    <w:uiPriority w:val="35"/>
+    <w:rsid w:val="00F938AC"/>
+    <w:rPr>
+      <w:i/>
+      <w:iCs/>
+      <w:color w:val="0E2841" w:themeColor="text2"/>
+      <w:sz w:val="18"/>
+      <w:szCs w:val="18"/>
+    </w:rPr>
+  </w:style>
+  <w:style w:type="character" w:customStyle="1" w:styleId="FigurasCar">
+    <w:name w:val="Figuras Car"/>
+    <w:basedOn w:val="DescripcinCar"/>
+    <w:link w:val="Figuras"/>
+    <w:rsid w:val="00F938AC"/>
+    <w:rPr>
+      <w:i/>
+      <w:iCs/>
+      <w:color w:val="0E2841" w:themeColor="text2"/>
+      <w:sz w:val="18"/>
+      <w:szCs w:val="18"/>
+    </w:rPr>
+  </w:style>
+  <w:style w:type="paragraph" w:styleId="TDC1">
+    <w:name w:val="toc 1"/>
+    <w:basedOn w:val="Normal"/>
+    <w:next w:val="Normal"/>
+    <w:autoRedefine/>
+    <w:uiPriority w:val="39"/>
+    <w:semiHidden/>
+    <w:unhideWhenUsed/>
+    <w:rsid w:val="00BF3316"/>
+    <w:pPr>
+      <w:spacing w:after="100"/>
+    </w:pPr>
+  </w:style>
+  <w:style w:type="paragraph" w:styleId="TDC3">
+    <w:name w:val="toc 3"/>
+    <w:basedOn w:val="Normal"/>
+    <w:next w:val="Normal"/>
+    <w:autoRedefine/>
+    <w:uiPriority w:val="39"/>
+    <w:unhideWhenUsed/>
+    <w:rsid w:val="00BF3316"/>
+    <w:pPr>
+      <w:spacing w:after="100"/>
+      <w:ind w:left="440"/>
+    </w:pPr>
   </w:style>
 </w:styles>
 </file>
@@ -15372,6 +16386,10 @@
 </file>
 
 <file path=customXml/item1.xml><?xml version="1.0" encoding="utf-8"?>
+<b:Sources xmlns:b="http://schemas.openxmlformats.org/officeDocument/2006/bibliography" xmlns="http://schemas.openxmlformats.org/officeDocument/2006/bibliography" SelectedStyle="\APASixthEditionOfficeOnline.xsl" StyleName="APA" Version="6"/>
+</file>
+
+<file path=customXml/item2.xml><?xml version="1.0" encoding="utf-8"?>
 <?mso-contentType ?>
 <FormTemplates xmlns="http://schemas.microsoft.com/sharepoint/v3/contenttype/forms">
   <Display>DocumentLibraryForm</Display>
@@ -15380,19 +16398,7 @@
 </FormTemplates>
 </file>
 
-<file path=customXml/item2.xml><?xml version="1.0" encoding="utf-8"?>
-<b:Sources xmlns:b="http://schemas.openxmlformats.org/officeDocument/2006/bibliography" xmlns="http://schemas.openxmlformats.org/officeDocument/2006/bibliography" SelectedStyle="\APASixthEditionOfficeOnline.xsl" StyleName="APA" Version="6"/>
-</file>
-
 <file path=customXml/item3.xml><?xml version="1.0" encoding="utf-8"?>
-<p:properties xmlns:p="http://schemas.microsoft.com/office/2006/metadata/properties" xmlns:xsi="http://www.w3.org/2001/XMLSchema-instance" xmlns:pc="http://schemas.microsoft.com/office/infopath/2007/PartnerControls">
-  <documentManagement>
-    <_activity xmlns="d07641f9-f1a5-43c1-ac16-fa53e6c318bc" xsi:nil="true"/>
-  </documentManagement>
-</p:properties>
-</file>
-
-<file path=customXml/item4.xml><?xml version="1.0" encoding="utf-8"?>
 <ct:contentTypeSchema xmlns:ct="http://schemas.microsoft.com/office/2006/metadata/contentType" xmlns:ma="http://schemas.microsoft.com/office/2006/metadata/properties/metaAttributes" ct:_="" ma:_="" ma:contentTypeName="Documento" ma:contentTypeID="0x010100089FBA7B0FAFA84E9F1E615D3FC0A129" ma:contentTypeVersion="11" ma:contentTypeDescription="Crear nuevo documento." ma:contentTypeScope="" ma:versionID="fa55cfaacbcd603bd53d850e3b8176f7">
   <xsd:schema xmlns:xsd="http://www.w3.org/2001/XMLSchema" xmlns:xs="http://www.w3.org/2001/XMLSchema" xmlns:p="http://schemas.microsoft.com/office/2006/metadata/properties" xmlns:ns3="d07641f9-f1a5-43c1-ac16-fa53e6c318bc" targetNamespace="http://schemas.microsoft.com/office/2006/metadata/properties" ma:root="true" ma:fieldsID="78f989df160fe6a5ee2e0e0b0bfde0e3" ns3:_="">
     <xsd:import namespace="d07641f9-f1a5-43c1-ac16-fa53e6c318bc"/>
@@ -15580,7 +16586,23 @@
 </ct:contentTypeSchema>
 </file>
 
+<file path=customXml/item4.xml><?xml version="1.0" encoding="utf-8"?>
+<p:properties xmlns:p="http://schemas.microsoft.com/office/2006/metadata/properties" xmlns:xsi="http://www.w3.org/2001/XMLSchema-instance" xmlns:pc="http://schemas.microsoft.com/office/infopath/2007/PartnerControls">
+  <documentManagement>
+    <_activity xmlns="d07641f9-f1a5-43c1-ac16-fa53e6c318bc" xsi:nil="true"/>
+  </documentManagement>
+</p:properties>
+</file>
+
 <file path=customXml/itemProps1.xml><?xml version="1.0" encoding="utf-8"?>
+<ds:datastoreItem xmlns:ds="http://schemas.openxmlformats.org/officeDocument/2006/customXml" ds:itemID="{453714F8-FBC3-4DCC-8DCB-89BB58DCF76F}">
+  <ds:schemaRefs>
+    <ds:schemaRef ds:uri="http://schemas.openxmlformats.org/officeDocument/2006/bibliography"/>
+  </ds:schemaRefs>
+</ds:datastoreItem>
+</file>
+
+<file path=customXml/itemProps2.xml><?xml version="1.0" encoding="utf-8"?>
 <ds:datastoreItem xmlns:ds="http://schemas.openxmlformats.org/officeDocument/2006/customXml" ds:itemID="{480B8420-1B48-4D23-8D6E-64373AC5070B}">
   <ds:schemaRefs>
     <ds:schemaRef ds:uri="http://schemas.microsoft.com/sharepoint/v3/contenttype/forms"/>
@@ -15588,25 +16610,7 @@
 </ds:datastoreItem>
 </file>
 
-<file path=customXml/itemProps2.xml><?xml version="1.0" encoding="utf-8"?>
-<ds:datastoreItem xmlns:ds="http://schemas.openxmlformats.org/officeDocument/2006/customXml" ds:itemID="{453714F8-FBC3-4DCC-8DCB-89BB58DCF76F}">
-  <ds:schemaRefs>
-    <ds:schemaRef ds:uri="http://schemas.openxmlformats.org/officeDocument/2006/bibliography"/>
-  </ds:schemaRefs>
-</ds:datastoreItem>
-</file>
-
 <file path=customXml/itemProps3.xml><?xml version="1.0" encoding="utf-8"?>
-<ds:datastoreItem xmlns:ds="http://schemas.openxmlformats.org/officeDocument/2006/customXml" ds:itemID="{7F0B1298-25D5-45B9-909D-DD837044A49E}">
-  <ds:schemaRefs>
-    <ds:schemaRef ds:uri="http://schemas.microsoft.com/office/2006/metadata/properties"/>
-    <ds:schemaRef ds:uri="http://schemas.microsoft.com/office/infopath/2007/PartnerControls"/>
-    <ds:schemaRef ds:uri="d07641f9-f1a5-43c1-ac16-fa53e6c318bc"/>
-  </ds:schemaRefs>
-</ds:datastoreItem>
-</file>
-
-<file path=customXml/itemProps4.xml><?xml version="1.0" encoding="utf-8"?>
 <ds:datastoreItem xmlns:ds="http://schemas.openxmlformats.org/officeDocument/2006/customXml" ds:itemID="{B3C09D93-2BDC-4563-9759-9158244E5DE7}">
   <ds:schemaRefs>
     <ds:schemaRef ds:uri="http://schemas.microsoft.com/office/2006/metadata/contentType"/>
@@ -15622,4 +16626,14 @@
     <ds:schemaRef ds:uri="http://schemas.microsoft.com/internal/obd"/>
   </ds:schemaRefs>
 </ds:datastoreItem>
+</file>
+
+<file path=customXml/itemProps4.xml><?xml version="1.0" encoding="utf-8"?>
+<ds:datastoreItem xmlns:ds="http://schemas.openxmlformats.org/officeDocument/2006/customXml" ds:itemID="{7F0B1298-25D5-45B9-909D-DD837044A49E}">
+  <ds:schemaRefs>
+    <ds:schemaRef ds:uri="http://schemas.microsoft.com/office/2006/metadata/properties"/>
+    <ds:schemaRef ds:uri="http://schemas.microsoft.com/office/infopath/2007/PartnerControls"/>
+    <ds:schemaRef ds:uri="d07641f9-f1a5-43c1-ac16-fa53e6c318bc"/>
+  </ds:schemaRefs>
+</ds:datastoreItem>
 </file>
</xml_diff>

<commit_message>
docs: completada javadoc de paquetes modelo y utils.
</commit_message>
<xml_diff>
--- a/docs/provisional_DocumentacionProyecto_2VIFC302.docx
+++ b/docs/provisional_DocumentacionProyecto_2VIFC302.docx
@@ -1166,7 +1166,7 @@
           <w:lang w:eastAsia="es-VE"/>
         </w:rPr>
         <w:drawing>
-          <wp:inline distT="0" distB="0" distL="0" distR="0" wp14:anchorId="1183C0B2" wp14:editId="2BD255BA">
+          <wp:inline distT="0" distB="0" distL="0" distR="0" wp14:anchorId="1183C0B2" wp14:editId="03E81970">
             <wp:extent cx="7556500" cy="10599420"/>
             <wp:effectExtent l="0" t="0" r="6350" b="0"/>
             <wp:docPr id="2" name="Imagen 2" descr="D:\servicios forobeta posts\diseño grafico\CLIENTES\Feelmusic - 05.11.18\archivos\11\11.jpg"/>
@@ -1312,7 +1312,7 @@
             </w:rPr>
             <w:fldChar w:fldCharType="separate"/>
           </w:r>
-          <w:hyperlink w:anchor="_Toc227855977" w:history="1">
+          <w:hyperlink w:anchor="_Toc227865315" w:history="1">
             <w:r>
               <w:rPr>
                 <w:rStyle w:val="Hipervnculo"/>
@@ -1339,7 +1339,7 @@
                 <w:noProof/>
                 <w:webHidden/>
               </w:rPr>
-              <w:instrText xml:space="preserve"> PAGEREF _Toc227855977 \h </w:instrText>
+              <w:instrText xml:space="preserve"> PAGEREF _Toc227865315 \h </w:instrText>
             </w:r>
             <w:r>
               <w:rPr>
@@ -1385,7 +1385,7 @@
               <w:lang w:eastAsia="es-ES"/>
             </w:rPr>
           </w:pPr>
-          <w:hyperlink w:anchor="_Toc227855978" w:history="1">
+          <w:hyperlink w:anchor="_Toc227865316" w:history="1">
             <w:r>
               <w:rPr>
                 <w:rStyle w:val="Hipervnculo"/>
@@ -1429,7 +1429,7 @@
                 <w:noProof/>
                 <w:webHidden/>
               </w:rPr>
-              <w:instrText xml:space="preserve"> PAGEREF _Toc227855978 \h </w:instrText>
+              <w:instrText xml:space="preserve"> PAGEREF _Toc227865316 \h </w:instrText>
             </w:r>
             <w:r>
               <w:rPr>
@@ -1475,7 +1475,7 @@
               <w:lang w:eastAsia="es-ES"/>
             </w:rPr>
           </w:pPr>
-          <w:hyperlink w:anchor="_Toc227855979" w:history="1">
+          <w:hyperlink w:anchor="_Toc227865317" w:history="1">
             <w:r>
               <w:rPr>
                 <w:rStyle w:val="Hipervnculo"/>
@@ -1519,7 +1519,7 @@
                 <w:noProof/>
                 <w:webHidden/>
               </w:rPr>
-              <w:instrText xml:space="preserve"> PAGEREF _Toc227855979 \h </w:instrText>
+              <w:instrText xml:space="preserve"> PAGEREF _Toc227865317 \h </w:instrText>
             </w:r>
             <w:r>
               <w:rPr>
@@ -1565,7 +1565,7 @@
               <w:lang w:eastAsia="es-ES"/>
             </w:rPr>
           </w:pPr>
-          <w:hyperlink w:anchor="_Toc227855980" w:history="1">
+          <w:hyperlink w:anchor="_Toc227865318" w:history="1">
             <w:r>
               <w:rPr>
                 <w:rStyle w:val="Hipervnculo"/>
@@ -1609,7 +1609,7 @@
                 <w:noProof/>
                 <w:webHidden/>
               </w:rPr>
-              <w:instrText xml:space="preserve"> PAGEREF _Toc227855980 \h </w:instrText>
+              <w:instrText xml:space="preserve"> PAGEREF _Toc227865318 \h </w:instrText>
             </w:r>
             <w:r>
               <w:rPr>
@@ -1655,7 +1655,7 @@
               <w:lang w:eastAsia="es-ES"/>
             </w:rPr>
           </w:pPr>
-          <w:hyperlink w:anchor="_Toc227855981" w:history="1">
+          <w:hyperlink w:anchor="_Toc227865319" w:history="1">
             <w:r>
               <w:rPr>
                 <w:rStyle w:val="Hipervnculo"/>
@@ -1699,7 +1699,7 @@
                 <w:noProof/>
                 <w:webHidden/>
               </w:rPr>
-              <w:instrText xml:space="preserve"> PAGEREF _Toc227855981 \h </w:instrText>
+              <w:instrText xml:space="preserve"> PAGEREF _Toc227865319 \h </w:instrText>
             </w:r>
             <w:r>
               <w:rPr>
@@ -1745,7 +1745,7 @@
               <w:lang w:eastAsia="es-ES"/>
             </w:rPr>
           </w:pPr>
-          <w:hyperlink w:anchor="_Toc227855983" w:history="1">
+          <w:hyperlink w:anchor="_Toc227865321" w:history="1">
             <w:r>
               <w:rPr>
                 <w:rStyle w:val="Hipervnculo"/>
@@ -1789,7 +1789,7 @@
                 <w:noProof/>
                 <w:webHidden/>
               </w:rPr>
-              <w:instrText xml:space="preserve"> PAGEREF _Toc227855983 \h </w:instrText>
+              <w:instrText xml:space="preserve"> PAGEREF _Toc227865321 \h </w:instrText>
             </w:r>
             <w:r>
               <w:rPr>
@@ -1835,7 +1835,7 @@
               <w:lang w:eastAsia="es-ES"/>
             </w:rPr>
           </w:pPr>
-          <w:hyperlink w:anchor="_Toc227855984" w:history="1">
+          <w:hyperlink w:anchor="_Toc227865322" w:history="1">
             <w:r>
               <w:rPr>
                 <w:rStyle w:val="Hipervnculo"/>
@@ -1879,7 +1879,7 @@
                 <w:noProof/>
                 <w:webHidden/>
               </w:rPr>
-              <w:instrText xml:space="preserve"> PAGEREF _Toc227855984 \h </w:instrText>
+              <w:instrText xml:space="preserve"> PAGEREF _Toc227865322 \h </w:instrText>
             </w:r>
             <w:r>
               <w:rPr>
@@ -1925,7 +1925,7 @@
               <w:lang w:eastAsia="es-ES"/>
             </w:rPr>
           </w:pPr>
-          <w:hyperlink w:anchor="_Toc227855985" w:history="1">
+          <w:hyperlink w:anchor="_Toc227865323" w:history="1">
             <w:r>
               <w:rPr>
                 <w:rStyle w:val="Hipervnculo"/>
@@ -1969,7 +1969,7 @@
                 <w:noProof/>
                 <w:webHidden/>
               </w:rPr>
-              <w:instrText xml:space="preserve"> PAGEREF _Toc227855985 \h </w:instrText>
+              <w:instrText xml:space="preserve"> PAGEREF _Toc227865323 \h </w:instrText>
             </w:r>
             <w:r>
               <w:rPr>
@@ -2015,7 +2015,7 @@
               <w:lang w:eastAsia="es-ES"/>
             </w:rPr>
           </w:pPr>
-          <w:hyperlink w:anchor="_Toc227855986" w:history="1">
+          <w:hyperlink w:anchor="_Toc227865324" w:history="1">
             <w:r>
               <w:rPr>
                 <w:rStyle w:val="Hipervnculo"/>
@@ -2059,7 +2059,7 @@
                 <w:noProof/>
                 <w:webHidden/>
               </w:rPr>
-              <w:instrText xml:space="preserve"> PAGEREF _Toc227855986 \h </w:instrText>
+              <w:instrText xml:space="preserve"> PAGEREF _Toc227865324 \h </w:instrText>
             </w:r>
             <w:r>
               <w:rPr>
@@ -2105,7 +2105,7 @@
               <w:lang w:eastAsia="es-ES"/>
             </w:rPr>
           </w:pPr>
-          <w:hyperlink w:anchor="_Toc227855987" w:history="1">
+          <w:hyperlink w:anchor="_Toc227865325" w:history="1">
             <w:r>
               <w:rPr>
                 <w:rStyle w:val="Hipervnculo"/>
@@ -2149,7 +2149,7 @@
                 <w:noProof/>
                 <w:webHidden/>
               </w:rPr>
-              <w:instrText xml:space="preserve"> PAGEREF _Toc227855987 \h </w:instrText>
+              <w:instrText xml:space="preserve"> PAGEREF _Toc227865325 \h </w:instrText>
             </w:r>
             <w:r>
               <w:rPr>
@@ -2195,7 +2195,7 @@
               <w:lang w:eastAsia="es-ES"/>
             </w:rPr>
           </w:pPr>
-          <w:hyperlink w:anchor="_Toc227855988" w:history="1">
+          <w:hyperlink w:anchor="_Toc227865326" w:history="1">
             <w:r>
               <w:rPr>
                 <w:rStyle w:val="Hipervnculo"/>
@@ -2239,7 +2239,7 @@
                 <w:noProof/>
                 <w:webHidden/>
               </w:rPr>
-              <w:instrText xml:space="preserve"> PAGEREF _Toc227855988 \h </w:instrText>
+              <w:instrText xml:space="preserve"> PAGEREF _Toc227865326 \h </w:instrText>
             </w:r>
             <w:r>
               <w:rPr>
@@ -2285,7 +2285,7 @@
               <w:lang w:eastAsia="es-ES"/>
             </w:rPr>
           </w:pPr>
-          <w:hyperlink w:anchor="_Toc227855989" w:history="1">
+          <w:hyperlink w:anchor="_Toc227865327" w:history="1">
             <w:r>
               <w:rPr>
                 <w:rStyle w:val="Hipervnculo"/>
@@ -2329,7 +2329,7 @@
                 <w:noProof/>
                 <w:webHidden/>
               </w:rPr>
-              <w:instrText xml:space="preserve"> PAGEREF _Toc227855989 \h </w:instrText>
+              <w:instrText xml:space="preserve"> PAGEREF _Toc227865327 \h </w:instrText>
             </w:r>
             <w:r>
               <w:rPr>
@@ -2375,7 +2375,7 @@
               <w:lang w:eastAsia="es-ES"/>
             </w:rPr>
           </w:pPr>
-          <w:hyperlink w:anchor="_Toc227855990" w:history="1">
+          <w:hyperlink w:anchor="_Toc227865328" w:history="1">
             <w:r>
               <w:rPr>
                 <w:rStyle w:val="Hipervnculo"/>
@@ -2419,7 +2419,7 @@
                 <w:noProof/>
                 <w:webHidden/>
               </w:rPr>
-              <w:instrText xml:space="preserve"> PAGEREF _Toc227855990 \h </w:instrText>
+              <w:instrText xml:space="preserve"> PAGEREF _Toc227865328 \h </w:instrText>
             </w:r>
             <w:r>
               <w:rPr>
@@ -2465,7 +2465,7 @@
               <w:lang w:eastAsia="es-ES"/>
             </w:rPr>
           </w:pPr>
-          <w:hyperlink w:anchor="_Toc227855991" w:history="1">
+          <w:hyperlink w:anchor="_Toc227865329" w:history="1">
             <w:r>
               <w:rPr>
                 <w:rStyle w:val="Hipervnculo"/>
@@ -2509,7 +2509,7 @@
                 <w:noProof/>
                 <w:webHidden/>
               </w:rPr>
-              <w:instrText xml:space="preserve"> PAGEREF _Toc227855991 \h </w:instrText>
+              <w:instrText xml:space="preserve"> PAGEREF _Toc227865329 \h </w:instrText>
             </w:r>
             <w:r>
               <w:rPr>
@@ -2555,7 +2555,7 @@
               <w:lang w:eastAsia="es-ES"/>
             </w:rPr>
           </w:pPr>
-          <w:hyperlink w:anchor="_Toc227855992" w:history="1">
+          <w:hyperlink w:anchor="_Toc227865330" w:history="1">
             <w:r>
               <w:rPr>
                 <w:rStyle w:val="Hipervnculo"/>
@@ -2601,7 +2601,7 @@
                 <w:noProof/>
                 <w:webHidden/>
               </w:rPr>
-              <w:instrText xml:space="preserve"> PAGEREF _Toc227855992 \h </w:instrText>
+              <w:instrText xml:space="preserve"> PAGEREF _Toc227865330 \h </w:instrText>
             </w:r>
             <w:r>
               <w:rPr>
@@ -2647,7 +2647,7 @@
               <w:lang w:eastAsia="es-ES"/>
             </w:rPr>
           </w:pPr>
-          <w:hyperlink w:anchor="_Toc227855993" w:history="1">
+          <w:hyperlink w:anchor="_Toc227865331" w:history="1">
             <w:r>
               <w:rPr>
                 <w:rStyle w:val="Hipervnculo"/>
@@ -2691,7 +2691,7 @@
                 <w:noProof/>
                 <w:webHidden/>
               </w:rPr>
-              <w:instrText xml:space="preserve"> PAGEREF _Toc227855993 \h </w:instrText>
+              <w:instrText xml:space="preserve"> PAGEREF _Toc227865331 \h </w:instrText>
             </w:r>
             <w:r>
               <w:rPr>
@@ -2737,7 +2737,7 @@
               <w:lang w:eastAsia="es-ES"/>
             </w:rPr>
           </w:pPr>
-          <w:hyperlink w:anchor="_Toc227855994" w:history="1">
+          <w:hyperlink w:anchor="_Toc227865332" w:history="1">
             <w:r>
               <w:rPr>
                 <w:rStyle w:val="Hipervnculo"/>
@@ -2781,7 +2781,7 @@
                 <w:noProof/>
                 <w:webHidden/>
               </w:rPr>
-              <w:instrText xml:space="preserve"> PAGEREF _Toc227855994 \h </w:instrText>
+              <w:instrText xml:space="preserve"> PAGEREF _Toc227865332 \h </w:instrText>
             </w:r>
             <w:r>
               <w:rPr>
@@ -2827,7 +2827,7 @@
               <w:lang w:eastAsia="es-ES"/>
             </w:rPr>
           </w:pPr>
-          <w:hyperlink w:anchor="_Toc227855995" w:history="1">
+          <w:hyperlink w:anchor="_Toc227865333" w:history="1">
             <w:r>
               <w:rPr>
                 <w:rStyle w:val="Hipervnculo"/>
@@ -2871,7 +2871,7 @@
                 <w:noProof/>
                 <w:webHidden/>
               </w:rPr>
-              <w:instrText xml:space="preserve"> PAGEREF _Toc227855995 \h </w:instrText>
+              <w:instrText xml:space="preserve"> PAGEREF _Toc227865333 \h </w:instrText>
             </w:r>
             <w:r>
               <w:rPr>
@@ -2917,7 +2917,7 @@
               <w:lang w:eastAsia="es-ES"/>
             </w:rPr>
           </w:pPr>
-          <w:hyperlink w:anchor="_Toc227855996" w:history="1">
+          <w:hyperlink w:anchor="_Toc227865334" w:history="1">
             <w:r>
               <w:rPr>
                 <w:rStyle w:val="Hipervnculo"/>
@@ -2961,7 +2961,7 @@
                 <w:noProof/>
                 <w:webHidden/>
               </w:rPr>
-              <w:instrText xml:space="preserve"> PAGEREF _Toc227855996 \h </w:instrText>
+              <w:instrText xml:space="preserve"> PAGEREF _Toc227865334 \h </w:instrText>
             </w:r>
             <w:r>
               <w:rPr>
@@ -3007,7 +3007,7 @@
               <w:lang w:eastAsia="es-ES"/>
             </w:rPr>
           </w:pPr>
-          <w:hyperlink w:anchor="_Toc227855997" w:history="1">
+          <w:hyperlink w:anchor="_Toc227865335" w:history="1">
             <w:r>
               <w:rPr>
                 <w:rStyle w:val="Hipervnculo"/>
@@ -3051,7 +3051,7 @@
                 <w:noProof/>
                 <w:webHidden/>
               </w:rPr>
-              <w:instrText xml:space="preserve"> PAGEREF _Toc227855997 \h </w:instrText>
+              <w:instrText xml:space="preserve"> PAGEREF _Toc227865335 \h </w:instrText>
             </w:r>
             <w:r>
               <w:rPr>
@@ -3097,7 +3097,7 @@
               <w:lang w:eastAsia="es-ES"/>
             </w:rPr>
           </w:pPr>
-          <w:hyperlink w:anchor="_Toc227856001" w:history="1">
+          <w:hyperlink w:anchor="_Toc227865339" w:history="1">
             <w:r>
               <w:rPr>
                 <w:rStyle w:val="Hipervnculo"/>
@@ -3141,7 +3141,7 @@
                 <w:noProof/>
                 <w:webHidden/>
               </w:rPr>
-              <w:instrText xml:space="preserve"> PAGEREF _Toc227856001 \h </w:instrText>
+              <w:instrText xml:space="preserve"> PAGEREF _Toc227865339 \h </w:instrText>
             </w:r>
             <w:r>
               <w:rPr>
@@ -3187,7 +3187,7 @@
               <w:lang w:eastAsia="es-ES"/>
             </w:rPr>
           </w:pPr>
-          <w:hyperlink w:anchor="_Toc227856002" w:history="1">
+          <w:hyperlink w:anchor="_Toc227865340" w:history="1">
             <w:r>
               <w:rPr>
                 <w:rStyle w:val="Hipervnculo"/>
@@ -3231,7 +3231,7 @@
                 <w:noProof/>
                 <w:webHidden/>
               </w:rPr>
-              <w:instrText xml:space="preserve"> PAGEREF _Toc227856002 \h </w:instrText>
+              <w:instrText xml:space="preserve"> PAGEREF _Toc227865340 \h </w:instrText>
             </w:r>
             <w:r>
               <w:rPr>
@@ -3251,7 +3251,7 @@
                 <w:noProof/>
                 <w:webHidden/>
               </w:rPr>
-              <w:t>17</w:t>
+              <w:t>16</w:t>
             </w:r>
             <w:r>
               <w:rPr>
@@ -3277,7 +3277,7 @@
               <w:lang w:eastAsia="es-ES"/>
             </w:rPr>
           </w:pPr>
-          <w:hyperlink w:anchor="_Toc227856003" w:history="1">
+          <w:hyperlink w:anchor="_Toc227865341" w:history="1">
             <w:r>
               <w:rPr>
                 <w:rStyle w:val="Hipervnculo"/>
@@ -3321,7 +3321,7 @@
                 <w:noProof/>
                 <w:webHidden/>
               </w:rPr>
-              <w:instrText xml:space="preserve"> PAGEREF _Toc227856003 \h </w:instrText>
+              <w:instrText xml:space="preserve"> PAGEREF _Toc227865341 \h </w:instrText>
             </w:r>
             <w:r>
               <w:rPr>
@@ -3341,7 +3341,7 @@
                 <w:noProof/>
                 <w:webHidden/>
               </w:rPr>
-              <w:t>17</w:t>
+              <w:t>16</w:t>
             </w:r>
             <w:r>
               <w:rPr>
@@ -3367,7 +3367,7 @@
               <w:lang w:eastAsia="es-ES"/>
             </w:rPr>
           </w:pPr>
-          <w:hyperlink w:anchor="_Toc227856005" w:history="1">
+          <w:hyperlink w:anchor="_Toc227865343" w:history="1">
             <w:r>
               <w:rPr>
                 <w:rStyle w:val="Hipervnculo"/>
@@ -3411,7 +3411,7 @@
                 <w:noProof/>
                 <w:webHidden/>
               </w:rPr>
-              <w:instrText xml:space="preserve"> PAGEREF _Toc227856005 \h </w:instrText>
+              <w:instrText xml:space="preserve"> PAGEREF _Toc227865343 \h </w:instrText>
             </w:r>
             <w:r>
               <w:rPr>
@@ -3431,7 +3431,7 @@
                 <w:noProof/>
                 <w:webHidden/>
               </w:rPr>
-              <w:t>17</w:t>
+              <w:t>16</w:t>
             </w:r>
             <w:r>
               <w:rPr>
@@ -3457,7 +3457,7 @@
               <w:lang w:eastAsia="es-ES"/>
             </w:rPr>
           </w:pPr>
-          <w:hyperlink w:anchor="_Toc227856006" w:history="1">
+          <w:hyperlink w:anchor="_Toc227865344" w:history="1">
             <w:r>
               <w:rPr>
                 <w:rStyle w:val="Hipervnculo"/>
@@ -3501,7 +3501,7 @@
                 <w:noProof/>
                 <w:webHidden/>
               </w:rPr>
-              <w:instrText xml:space="preserve"> PAGEREF _Toc227856006 \h </w:instrText>
+              <w:instrText xml:space="preserve"> PAGEREF _Toc227865344 \h </w:instrText>
             </w:r>
             <w:r>
               <w:rPr>
@@ -3521,7 +3521,7 @@
                 <w:noProof/>
                 <w:webHidden/>
               </w:rPr>
-              <w:t>17</w:t>
+              <w:t>16</w:t>
             </w:r>
             <w:r>
               <w:rPr>
@@ -3547,7 +3547,7 @@
               <w:lang w:eastAsia="es-ES"/>
             </w:rPr>
           </w:pPr>
-          <w:hyperlink w:anchor="_Toc227856007" w:history="1">
+          <w:hyperlink w:anchor="_Toc227865345" w:history="1">
             <w:r>
               <w:rPr>
                 <w:rStyle w:val="Hipervnculo"/>
@@ -3591,7 +3591,7 @@
                 <w:noProof/>
                 <w:webHidden/>
               </w:rPr>
-              <w:instrText xml:space="preserve"> PAGEREF _Toc227856007 \h </w:instrText>
+              <w:instrText xml:space="preserve"> PAGEREF _Toc227865345 \h </w:instrText>
             </w:r>
             <w:r>
               <w:rPr>
@@ -3611,7 +3611,7 @@
                 <w:noProof/>
                 <w:webHidden/>
               </w:rPr>
-              <w:t>17</w:t>
+              <w:t>16</w:t>
             </w:r>
             <w:r>
               <w:rPr>
@@ -3637,7 +3637,7 @@
               <w:lang w:eastAsia="es-ES"/>
             </w:rPr>
           </w:pPr>
-          <w:hyperlink w:anchor="_Toc227856008" w:history="1">
+          <w:hyperlink w:anchor="_Toc227865346" w:history="1">
             <w:r>
               <w:rPr>
                 <w:rStyle w:val="Hipervnculo"/>
@@ -3681,7 +3681,7 @@
                 <w:noProof/>
                 <w:webHidden/>
               </w:rPr>
-              <w:instrText xml:space="preserve"> PAGEREF _Toc227856008 \h </w:instrText>
+              <w:instrText xml:space="preserve"> PAGEREF _Toc227865346 \h </w:instrText>
             </w:r>
             <w:r>
               <w:rPr>
@@ -3727,7 +3727,7 @@
               <w:lang w:eastAsia="es-ES"/>
             </w:rPr>
           </w:pPr>
-          <w:hyperlink w:anchor="_Toc227856009" w:history="1">
+          <w:hyperlink w:anchor="_Toc227865347" w:history="1">
             <w:r>
               <w:rPr>
                 <w:rStyle w:val="Hipervnculo"/>
@@ -3771,7 +3771,7 @@
                 <w:noProof/>
                 <w:webHidden/>
               </w:rPr>
-              <w:instrText xml:space="preserve"> PAGEREF _Toc227856009 \h </w:instrText>
+              <w:instrText xml:space="preserve"> PAGEREF _Toc227865347 \h </w:instrText>
             </w:r>
             <w:r>
               <w:rPr>
@@ -3817,7 +3817,7 @@
               <w:lang w:eastAsia="es-ES"/>
             </w:rPr>
           </w:pPr>
-          <w:hyperlink w:anchor="_Toc227856013" w:history="1">
+          <w:hyperlink w:anchor="_Toc227865351" w:history="1">
             <w:r>
               <w:rPr>
                 <w:rStyle w:val="Hipervnculo"/>
@@ -3861,7 +3861,7 @@
                 <w:noProof/>
                 <w:webHidden/>
               </w:rPr>
-              <w:instrText xml:space="preserve"> PAGEREF _Toc227856013 \h </w:instrText>
+              <w:instrText xml:space="preserve"> PAGEREF _Toc227865351 \h </w:instrText>
             </w:r>
             <w:r>
               <w:rPr>
@@ -3907,7 +3907,7 @@
               <w:lang w:eastAsia="es-ES"/>
             </w:rPr>
           </w:pPr>
-          <w:hyperlink w:anchor="_Toc227856014" w:history="1">
+          <w:hyperlink w:anchor="_Toc227865352" w:history="1">
             <w:r>
               <w:rPr>
                 <w:rStyle w:val="Hipervnculo"/>
@@ -3951,7 +3951,7 @@
                 <w:noProof/>
                 <w:webHidden/>
               </w:rPr>
-              <w:instrText xml:space="preserve"> PAGEREF _Toc227856014 \h </w:instrText>
+              <w:instrText xml:space="preserve"> PAGEREF _Toc227865352 \h </w:instrText>
             </w:r>
             <w:r>
               <w:rPr>
@@ -3997,7 +3997,7 @@
               <w:lang w:eastAsia="es-ES"/>
             </w:rPr>
           </w:pPr>
-          <w:hyperlink w:anchor="_Toc227856016" w:history="1">
+          <w:hyperlink w:anchor="_Toc227865354" w:history="1">
             <w:r>
               <w:rPr>
                 <w:rStyle w:val="Hipervnculo"/>
@@ -4041,7 +4041,7 @@
                 <w:noProof/>
                 <w:webHidden/>
               </w:rPr>
-              <w:instrText xml:space="preserve"> PAGEREF _Toc227856016 \h </w:instrText>
+              <w:instrText xml:space="preserve"> PAGEREF _Toc227865354 \h </w:instrText>
             </w:r>
             <w:r>
               <w:rPr>
@@ -4061,7 +4061,7 @@
                 <w:noProof/>
                 <w:webHidden/>
               </w:rPr>
-              <w:t>18</w:t>
+              <w:t>17</w:t>
             </w:r>
             <w:r>
               <w:rPr>
@@ -4086,7 +4086,7 @@
               <w:lang w:eastAsia="es-ES"/>
             </w:rPr>
           </w:pPr>
-          <w:hyperlink w:anchor="_Toc227856017" w:history="1">
+          <w:hyperlink w:anchor="_Toc227865355" w:history="1">
             <w:r>
               <w:rPr>
                 <w:rStyle w:val="Hipervnculo"/>
@@ -4113,7 +4113,7 @@
                 <w:noProof/>
                 <w:webHidden/>
               </w:rPr>
-              <w:instrText xml:space="preserve"> PAGEREF _Toc227856017 \h </w:instrText>
+              <w:instrText xml:space="preserve"> PAGEREF _Toc227865355 \h </w:instrText>
             </w:r>
             <w:r>
               <w:rPr>
@@ -4133,7 +4133,7 @@
                 <w:noProof/>
                 <w:webHidden/>
               </w:rPr>
-              <w:t>18</w:t>
+              <w:t>17</w:t>
             </w:r>
             <w:r>
               <w:rPr>
@@ -4158,7 +4158,7 @@
               <w:lang w:eastAsia="es-ES"/>
             </w:rPr>
           </w:pPr>
-          <w:hyperlink w:anchor="_Toc227856018" w:history="1">
+          <w:hyperlink w:anchor="_Toc227865356" w:history="1">
             <w:r>
               <w:rPr>
                 <w:rStyle w:val="Hipervnculo"/>
@@ -4185,7 +4185,7 @@
                 <w:noProof/>
                 <w:webHidden/>
               </w:rPr>
-              <w:instrText xml:space="preserve"> PAGEREF _Toc227856018 \h </w:instrText>
+              <w:instrText xml:space="preserve"> PAGEREF _Toc227865356 \h </w:instrText>
             </w:r>
             <w:r>
               <w:rPr>
@@ -4205,7 +4205,7 @@
                 <w:noProof/>
                 <w:webHidden/>
               </w:rPr>
-              <w:t>18</w:t>
+              <w:t>17</w:t>
             </w:r>
             <w:r>
               <w:rPr>
@@ -4230,7 +4230,7 @@
               <w:lang w:eastAsia="es-ES"/>
             </w:rPr>
           </w:pPr>
-          <w:hyperlink w:anchor="_Toc227856019" w:history="1">
+          <w:hyperlink w:anchor="_Toc227865357" w:history="1">
             <w:r>
               <w:rPr>
                 <w:rStyle w:val="Hipervnculo"/>
@@ -4257,7 +4257,7 @@
                 <w:noProof/>
                 <w:webHidden/>
               </w:rPr>
-              <w:instrText xml:space="preserve"> PAGEREF _Toc227856019 \h </w:instrText>
+              <w:instrText xml:space="preserve"> PAGEREF _Toc227865357 \h </w:instrText>
             </w:r>
             <w:r>
               <w:rPr>
@@ -4302,7 +4302,7 @@
               <w:lang w:eastAsia="es-ES"/>
             </w:rPr>
           </w:pPr>
-          <w:hyperlink w:anchor="_Toc227856020" w:history="1">
+          <w:hyperlink w:anchor="_Toc227865358" w:history="1">
             <w:r>
               <w:rPr>
                 <w:rStyle w:val="Hipervnculo"/>
@@ -4329,7 +4329,7 @@
                 <w:noProof/>
                 <w:webHidden/>
               </w:rPr>
-              <w:instrText xml:space="preserve"> PAGEREF _Toc227856020 \h </w:instrText>
+              <w:instrText xml:space="preserve"> PAGEREF _Toc227865358 \h </w:instrText>
             </w:r>
             <w:r>
               <w:rPr>
@@ -4349,7 +4349,7 @@
                 <w:noProof/>
                 <w:webHidden/>
               </w:rPr>
-              <w:t>19</w:t>
+              <w:t>18</w:t>
             </w:r>
             <w:r>
               <w:rPr>
@@ -4375,7 +4375,7 @@
               <w:lang w:eastAsia="es-ES"/>
             </w:rPr>
           </w:pPr>
-          <w:hyperlink w:anchor="_Toc227856021" w:history="1">
+          <w:hyperlink w:anchor="_Toc227865359" w:history="1">
             <w:r>
               <w:rPr>
                 <w:rStyle w:val="Hipervnculo"/>
@@ -4419,7 +4419,7 @@
                 <w:noProof/>
                 <w:webHidden/>
               </w:rPr>
-              <w:instrText xml:space="preserve"> PAGEREF _Toc227856021 \h </w:instrText>
+              <w:instrText xml:space="preserve"> PAGEREF _Toc227865359 \h </w:instrText>
             </w:r>
             <w:r>
               <w:rPr>
@@ -4439,7 +4439,7 @@
                 <w:noProof/>
                 <w:webHidden/>
               </w:rPr>
-              <w:t>20</w:t>
+              <w:t>19</w:t>
             </w:r>
             <w:r>
               <w:rPr>
@@ -4465,7 +4465,7 @@
               <w:lang w:eastAsia="es-ES"/>
             </w:rPr>
           </w:pPr>
-          <w:hyperlink w:anchor="_Toc227856022" w:history="1">
+          <w:hyperlink w:anchor="_Toc227865360" w:history="1">
             <w:r>
               <w:rPr>
                 <w:rStyle w:val="Hipervnculo"/>
@@ -4509,7 +4509,7 @@
                 <w:noProof/>
                 <w:webHidden/>
               </w:rPr>
-              <w:instrText xml:space="preserve"> PAGEREF _Toc227856022 \h </w:instrText>
+              <w:instrText xml:space="preserve"> PAGEREF _Toc227865360 \h </w:instrText>
             </w:r>
             <w:r>
               <w:rPr>
@@ -4529,7 +4529,7 @@
                 <w:noProof/>
                 <w:webHidden/>
               </w:rPr>
-              <w:t>20</w:t>
+              <w:t>19</w:t>
             </w:r>
             <w:r>
               <w:rPr>
@@ -5205,7 +5205,7 @@
       <w:pPr>
         <w:pStyle w:val="Ttulo2"/>
       </w:pPr>
-      <w:bookmarkStart w:id="0" w:name="_Toc227855977"/>
+      <w:bookmarkStart w:id="0" w:name="_Toc227865315"/>
       <w:r>
         <w:lastRenderedPageBreak/>
         <w:t>INTRODUCCIÓN</w:t>
@@ -5274,7 +5274,7 @@
           <w:numId w:val="2"/>
         </w:numPr>
       </w:pPr>
-      <w:bookmarkStart w:id="1" w:name="_Toc227855978"/>
+      <w:bookmarkStart w:id="1" w:name="_Toc227865316"/>
       <w:r>
         <w:t>OBJETIVOS DEL PROYECTO</w:t>
       </w:r>
@@ -5296,7 +5296,7 @@
           <w:numId w:val="3"/>
         </w:numPr>
       </w:pPr>
-      <w:bookmarkStart w:id="2" w:name="_Toc227855979"/>
+      <w:bookmarkStart w:id="2" w:name="_Toc227865317"/>
       <w:r>
         <w:t>OBJETIVO GENERAL DEL PROYECTO</w:t>
       </w:r>
@@ -5316,7 +5316,7 @@
           <w:numId w:val="3"/>
         </w:numPr>
       </w:pPr>
-      <w:bookmarkStart w:id="4" w:name="_Toc227855980"/>
+      <w:bookmarkStart w:id="4" w:name="_Toc227865318"/>
       <w:bookmarkEnd w:id="3"/>
       <w:r>
         <w:t>OBJETIVOS ESPECÍFICOS</w:t>
@@ -5465,7 +5465,7 @@
           <w:numId w:val="2"/>
         </w:numPr>
       </w:pPr>
-      <w:bookmarkStart w:id="5" w:name="_Toc227855981"/>
+      <w:bookmarkStart w:id="5" w:name="_Toc227865319"/>
       <w:r>
         <w:t>ANÁLISIS Y DISEÑO</w:t>
       </w:r>
@@ -5509,6 +5509,7 @@
       <w:bookmarkStart w:id="10" w:name="_Toc221907947"/>
       <w:bookmarkStart w:id="11" w:name="_Toc221908744"/>
       <w:bookmarkStart w:id="12" w:name="_Toc227855982"/>
+      <w:bookmarkStart w:id="13" w:name="_Toc227865320"/>
       <w:bookmarkEnd w:id="6"/>
       <w:bookmarkEnd w:id="7"/>
       <w:bookmarkEnd w:id="8"/>
@@ -5516,6 +5517,7 @@
       <w:bookmarkEnd w:id="10"/>
       <w:bookmarkEnd w:id="11"/>
       <w:bookmarkEnd w:id="12"/>
+      <w:bookmarkEnd w:id="13"/>
     </w:p>
     <w:p>
       <w:pPr>
@@ -5525,11 +5527,11 @@
           <w:numId w:val="3"/>
         </w:numPr>
       </w:pPr>
-      <w:bookmarkStart w:id="13" w:name="_Toc227855983"/>
+      <w:bookmarkStart w:id="14" w:name="_Toc227865321"/>
       <w:r>
         <w:t>REQUISITOS FUNCIONALES</w:t>
       </w:r>
-      <w:bookmarkEnd w:id="13"/>
+      <w:bookmarkEnd w:id="14"/>
     </w:p>
     <w:tbl>
       <w:tblPr>
@@ -6331,11 +6333,11 @@
           <w:numId w:val="3"/>
         </w:numPr>
       </w:pPr>
-      <w:bookmarkStart w:id="14" w:name="_Toc227855984"/>
+      <w:bookmarkStart w:id="15" w:name="_Toc227865322"/>
       <w:r>
         <w:t>REQUISITOS NO FUNCIONALES</w:t>
       </w:r>
-      <w:bookmarkEnd w:id="14"/>
+      <w:bookmarkEnd w:id="15"/>
     </w:p>
     <w:tbl>
       <w:tblPr>
@@ -6964,11 +6966,11 @@
           <w:numId w:val="3"/>
         </w:numPr>
       </w:pPr>
-      <w:bookmarkStart w:id="15" w:name="_Toc227855985"/>
+      <w:bookmarkStart w:id="16" w:name="_Toc227865323"/>
       <w:r>
         <w:t>CASOS DE USO</w:t>
       </w:r>
-      <w:bookmarkEnd w:id="15"/>
+      <w:bookmarkEnd w:id="16"/>
     </w:p>
     <w:p>
       <w:r>
@@ -6993,12 +6995,12 @@
           <w:numId w:val="3"/>
         </w:numPr>
       </w:pPr>
-      <w:bookmarkStart w:id="16" w:name="_Toc227855986"/>
+      <w:bookmarkStart w:id="17" w:name="_Toc227865324"/>
       <w:r>
         <w:lastRenderedPageBreak/>
         <w:t>DIAGRAMA DE CASOS DE USO</w:t>
       </w:r>
-      <w:bookmarkEnd w:id="16"/>
+      <w:bookmarkEnd w:id="17"/>
     </w:p>
     <w:p>
       <w:pPr>
@@ -7063,7 +7065,7 @@
         <w:pStyle w:val="Descripcin"/>
         <w:jc w:val="center"/>
       </w:pPr>
-      <w:bookmarkStart w:id="17" w:name="_Toc227856184"/>
+      <w:bookmarkStart w:id="18" w:name="_Toc227856184"/>
       <w:r>
         <w:t xml:space="preserve">Figura </w:t>
       </w:r>
@@ -7091,7 +7093,7 @@
       <w:r>
         <w:t>Diagrama de Casos de Uso</w:t>
       </w:r>
-      <w:bookmarkEnd w:id="17"/>
+      <w:bookmarkEnd w:id="18"/>
     </w:p>
     <w:p>
       <w:pPr>
@@ -7101,11 +7103,11 @@
           <w:numId w:val="3"/>
         </w:numPr>
       </w:pPr>
-      <w:bookmarkStart w:id="18" w:name="_Toc227855987"/>
+      <w:bookmarkStart w:id="19" w:name="_Toc227865325"/>
       <w:r>
         <w:t>DESCRIPCIÓN DE LOS ACTORES</w:t>
       </w:r>
-      <w:bookmarkEnd w:id="18"/>
+      <w:bookmarkEnd w:id="19"/>
     </w:p>
     <w:p>
       <w:pPr>
@@ -7224,11 +7226,11 @@
           <w:numId w:val="3"/>
         </w:numPr>
       </w:pPr>
-      <w:bookmarkStart w:id="19" w:name="_Toc227855988"/>
+      <w:bookmarkStart w:id="20" w:name="_Toc227865326"/>
       <w:r>
         <w:t>DESCRIPCIÓN DE LOS CASOS DE USO</w:t>
       </w:r>
-      <w:bookmarkEnd w:id="19"/>
+      <w:bookmarkEnd w:id="20"/>
     </w:p>
     <w:tbl>
       <w:tblPr>
@@ -9403,11 +9405,11 @@
           <w:numId w:val="3"/>
         </w:numPr>
       </w:pPr>
-      <w:bookmarkStart w:id="20" w:name="_Toc227855989"/>
+      <w:bookmarkStart w:id="21" w:name="_Toc227865327"/>
       <w:r>
         <w:t>MODELOS DE DATOS</w:t>
       </w:r>
-      <w:bookmarkEnd w:id="20"/>
+      <w:bookmarkEnd w:id="21"/>
     </w:p>
     <w:p>
       <w:r>
@@ -9441,12 +9443,12 @@
           <w:numId w:val="3"/>
         </w:numPr>
       </w:pPr>
-      <w:bookmarkStart w:id="21" w:name="_Toc227855990"/>
+      <w:bookmarkStart w:id="22" w:name="_Toc227865328"/>
       <w:r>
         <w:lastRenderedPageBreak/>
         <w:t>DIAGRAMA E/R</w:t>
       </w:r>
-      <w:bookmarkEnd w:id="21"/>
+      <w:bookmarkEnd w:id="22"/>
     </w:p>
     <w:p>
       <w:pPr>
@@ -9505,7 +9507,7 @@
         <w:pStyle w:val="Descripcin"/>
         <w:jc w:val="center"/>
       </w:pPr>
-      <w:bookmarkStart w:id="22" w:name="_Toc227856185"/>
+      <w:bookmarkStart w:id="23" w:name="_Toc227856185"/>
       <w:r>
         <w:t xml:space="preserve">Figura </w:t>
       </w:r>
@@ -9533,7 +9535,7 @@
       <w:r>
         <w:t>Diagrama Entidad/Relación</w:t>
       </w:r>
-      <w:bookmarkEnd w:id="22"/>
+      <w:bookmarkEnd w:id="23"/>
     </w:p>
     <w:p>
       <w:pPr>
@@ -9543,12 +9545,12 @@
           <w:numId w:val="3"/>
         </w:numPr>
       </w:pPr>
-      <w:bookmarkStart w:id="23" w:name="_Toc227855991"/>
+      <w:bookmarkStart w:id="24" w:name="_Toc227865329"/>
       <w:r>
         <w:lastRenderedPageBreak/>
         <w:t>DIAGRAMA DE CLASES</w:t>
       </w:r>
-      <w:bookmarkEnd w:id="23"/>
+      <w:bookmarkEnd w:id="24"/>
     </w:p>
     <w:p>
       <w:pPr>
@@ -9607,7 +9609,7 @@
         <w:pStyle w:val="Descripcin"/>
         <w:jc w:val="center"/>
       </w:pPr>
-      <w:bookmarkStart w:id="24" w:name="_Toc227856186"/>
+      <w:bookmarkStart w:id="25" w:name="_Toc227856186"/>
       <w:r>
         <w:t xml:space="preserve">Figura </w:t>
       </w:r>
@@ -9632,7 +9634,7 @@
       <w:r>
         <w:t>. Diagrama de clases.</w:t>
       </w:r>
-      <w:bookmarkEnd w:id="24"/>
+      <w:bookmarkEnd w:id="25"/>
     </w:p>
     <w:p>
       <w:pPr>
@@ -9650,12 +9652,12 @@
           <w:szCs w:val="20"/>
         </w:rPr>
       </w:pPr>
-      <w:bookmarkStart w:id="25" w:name="_Toc227855992"/>
+      <w:bookmarkStart w:id="26" w:name="_Toc227865330"/>
       <w:r>
         <w:lastRenderedPageBreak/>
         <w:t>DIAGRAMA DE PAQUETES</w:t>
       </w:r>
-      <w:bookmarkEnd w:id="25"/>
+      <w:bookmarkEnd w:id="26"/>
     </w:p>
     <w:p>
       <w:pPr>
@@ -9729,46 +9731,55 @@
           </w:tcPr>
           <w:p>
             <w:proofErr w:type="spellStart"/>
+            <w:proofErr w:type="gramStart"/>
             <w:r>
               <w:rPr>
                 <w:sz w:val="20"/>
                 <w:szCs w:val="20"/>
               </w:rPr>
-              <w:t>com.alba.proyecto</w:t>
-            </w:r>
-            <w:proofErr w:type="spellEnd"/>
-          </w:p>
-        </w:tc>
-        <w:tc>
-          <w:tcPr>
-            <w:tcW w:w="6200" w:type="dxa"/>
-            <w:hideMark/>
-          </w:tcPr>
-          <w:p>
-            <w:pPr>
-              <w:cnfStyle w:val="000000100000" w:firstRow="0" w:lastRow="0" w:firstColumn="0" w:lastColumn="0" w:oddVBand="0" w:evenVBand="0" w:oddHBand="1" w:evenHBand="0" w:firstRowFirstColumn="0" w:firstRowLastColumn="0" w:lastRowFirstColumn="0" w:lastRowLastColumn="0"/>
-            </w:pPr>
+              <w:t>com.alba</w:t>
+            </w:r>
+            <w:proofErr w:type="gramEnd"/>
             <w:r>
               <w:rPr>
                 <w:sz w:val="20"/>
                 <w:szCs w:val="20"/>
               </w:rPr>
-              <w:t xml:space="preserve">Paquete raíz. Contiene la clase principal de arranque de la aplicación Spring Boot + </w:t>
-            </w:r>
-            <w:proofErr w:type="spellStart"/>
+              <w:t>.proyecto</w:t>
+            </w:r>
+            <w:proofErr w:type="spellEnd"/>
+          </w:p>
+        </w:tc>
+        <w:tc>
+          <w:tcPr>
+            <w:tcW w:w="6200" w:type="dxa"/>
+            <w:hideMark/>
+          </w:tcPr>
+          <w:p>
+            <w:pPr>
+              <w:cnfStyle w:val="000000100000" w:firstRow="0" w:lastRow="0" w:firstColumn="0" w:lastColumn="0" w:oddVBand="0" w:evenVBand="0" w:oddHBand="1" w:evenHBand="0" w:firstRowFirstColumn="0" w:firstRowLastColumn="0" w:lastRowFirstColumn="0" w:lastRowLastColumn="0"/>
+            </w:pPr>
             <w:r>
               <w:rPr>
                 <w:sz w:val="20"/>
                 <w:szCs w:val="20"/>
               </w:rPr>
-              <w:t>JavaFX</w:t>
-            </w:r>
-            <w:proofErr w:type="spellEnd"/>
+              <w:t xml:space="preserve">Paquete raíz. Contiene la clase principal de arranque de la aplicación Spring Boot + </w:t>
+            </w:r>
+            <w:proofErr w:type="spellStart"/>
             <w:r>
               <w:rPr>
                 <w:sz w:val="20"/>
                 <w:szCs w:val="20"/>
               </w:rPr>
+              <w:t>JavaFX</w:t>
+            </w:r>
+            <w:proofErr w:type="spellEnd"/>
+            <w:r>
+              <w:rPr>
+                <w:sz w:val="20"/>
+                <w:szCs w:val="20"/>
+              </w:rPr>
               <w:t>.</w:t>
             </w:r>
           </w:p>
@@ -9783,12 +9794,21 @@
           </w:tcPr>
           <w:p>
             <w:proofErr w:type="spellStart"/>
+            <w:proofErr w:type="gramStart"/>
             <w:r>
               <w:rPr>
                 <w:sz w:val="20"/>
                 <w:szCs w:val="20"/>
               </w:rPr>
-              <w:t>com.alba.proyecto.config</w:t>
+              <w:t>com.alba</w:t>
+            </w:r>
+            <w:proofErr w:type="gramEnd"/>
+            <w:r>
+              <w:rPr>
+                <w:sz w:val="20"/>
+                <w:szCs w:val="20"/>
+              </w:rPr>
+              <w:t>.proyecto.config</w:t>
             </w:r>
             <w:proofErr w:type="spellEnd"/>
           </w:p>
@@ -9888,46 +9908,64 @@
           </w:tcPr>
           <w:p>
             <w:proofErr w:type="spellStart"/>
+            <w:proofErr w:type="gramStart"/>
             <w:r>
               <w:rPr>
                 <w:sz w:val="20"/>
                 <w:szCs w:val="20"/>
               </w:rPr>
-              <w:t>com.alba.proyecto.controller</w:t>
-            </w:r>
-            <w:proofErr w:type="spellEnd"/>
-          </w:p>
-        </w:tc>
-        <w:tc>
-          <w:tcPr>
-            <w:tcW w:w="6200" w:type="dxa"/>
-            <w:hideMark/>
-          </w:tcPr>
-          <w:p>
-            <w:pPr>
-              <w:cnfStyle w:val="000000100000" w:firstRow="0" w:lastRow="0" w:firstColumn="0" w:lastColumn="0" w:oddVBand="0" w:evenVBand="0" w:oddHBand="1" w:evenHBand="0" w:firstRowFirstColumn="0" w:firstRowLastColumn="0" w:lastRowFirstColumn="0" w:lastRowLastColumn="0"/>
-            </w:pPr>
+              <w:t>com.alba</w:t>
+            </w:r>
+            <w:proofErr w:type="gramEnd"/>
             <w:r>
               <w:rPr>
                 <w:sz w:val="20"/>
                 <w:szCs w:val="20"/>
               </w:rPr>
-              <w:t xml:space="preserve">Controladores </w:t>
-            </w:r>
-            <w:proofErr w:type="spellStart"/>
+              <w:t>.</w:t>
+            </w:r>
+            <w:proofErr w:type="gramStart"/>
             <w:r>
               <w:rPr>
                 <w:sz w:val="20"/>
                 <w:szCs w:val="20"/>
               </w:rPr>
-              <w:t>JavaFX</w:t>
+              <w:t>proyecto.controller</w:t>
             </w:r>
             <w:proofErr w:type="spellEnd"/>
+            <w:proofErr w:type="gramEnd"/>
+          </w:p>
+        </w:tc>
+        <w:tc>
+          <w:tcPr>
+            <w:tcW w:w="6200" w:type="dxa"/>
+            <w:hideMark/>
+          </w:tcPr>
+          <w:p>
+            <w:pPr>
+              <w:cnfStyle w:val="000000100000" w:firstRow="0" w:lastRow="0" w:firstColumn="0" w:lastColumn="0" w:oddVBand="0" w:evenVBand="0" w:oddHBand="1" w:evenHBand="0" w:firstRowFirstColumn="0" w:firstRowLastColumn="0" w:lastRowFirstColumn="0" w:lastRowLastColumn="0"/>
+            </w:pPr>
             <w:r>
               <w:rPr>
                 <w:sz w:val="20"/>
                 <w:szCs w:val="20"/>
               </w:rPr>
+              <w:t xml:space="preserve">Controladores </w:t>
+            </w:r>
+            <w:proofErr w:type="spellStart"/>
+            <w:r>
+              <w:rPr>
+                <w:sz w:val="20"/>
+                <w:szCs w:val="20"/>
+              </w:rPr>
+              <w:t>JavaFX</w:t>
+            </w:r>
+            <w:proofErr w:type="spellEnd"/>
+            <w:r>
+              <w:rPr>
+                <w:sz w:val="20"/>
+                <w:szCs w:val="20"/>
+              </w:rPr>
               <w:t>. Cada clase gestiona los eventos y la lógica de presentación de una pantalla o conjunto de paneles.</w:t>
             </w:r>
           </w:p>
@@ -9942,14 +9980,32 @@
           </w:tcPr>
           <w:p>
             <w:proofErr w:type="spellStart"/>
+            <w:proofErr w:type="gramStart"/>
             <w:r>
               <w:rPr>
                 <w:sz w:val="20"/>
                 <w:szCs w:val="20"/>
               </w:rPr>
-              <w:t>com.alba.proyecto.modelo</w:t>
+              <w:t>com.alba</w:t>
+            </w:r>
+            <w:proofErr w:type="gramEnd"/>
+            <w:r>
+              <w:rPr>
+                <w:sz w:val="20"/>
+                <w:szCs w:val="20"/>
+              </w:rPr>
+              <w:t>.</w:t>
+            </w:r>
+            <w:proofErr w:type="gramStart"/>
+            <w:r>
+              <w:rPr>
+                <w:sz w:val="20"/>
+                <w:szCs w:val="20"/>
+              </w:rPr>
+              <w:t>proyecto.modelo</w:t>
             </w:r>
             <w:proofErr w:type="spellEnd"/>
+            <w:proofErr w:type="gramEnd"/>
           </w:p>
         </w:tc>
         <w:tc>
@@ -10015,46 +10071,64 @@
           </w:tcPr>
           <w:p>
             <w:proofErr w:type="spellStart"/>
+            <w:proofErr w:type="gramStart"/>
             <w:r>
               <w:rPr>
                 <w:sz w:val="20"/>
                 <w:szCs w:val="20"/>
               </w:rPr>
-              <w:t>com.alba.proyecto.repositorios</w:t>
-            </w:r>
-            <w:proofErr w:type="spellEnd"/>
-          </w:p>
-        </w:tc>
-        <w:tc>
-          <w:tcPr>
-            <w:tcW w:w="6200" w:type="dxa"/>
-            <w:hideMark/>
-          </w:tcPr>
-          <w:p>
-            <w:pPr>
-              <w:cnfStyle w:val="000000100000" w:firstRow="0" w:lastRow="0" w:firstColumn="0" w:lastColumn="0" w:oddVBand="0" w:evenVBand="0" w:oddHBand="1" w:evenHBand="0" w:firstRowFirstColumn="0" w:firstRowLastColumn="0" w:lastRowFirstColumn="0" w:lastRowLastColumn="0"/>
-            </w:pPr>
+              <w:t>com.alba</w:t>
+            </w:r>
+            <w:proofErr w:type="gramEnd"/>
             <w:r>
               <w:rPr>
                 <w:sz w:val="20"/>
                 <w:szCs w:val="20"/>
               </w:rPr>
-              <w:t xml:space="preserve">Interfaces de repositorio Spring Data JPA. Una por cada entidad principal. Heredan de </w:t>
-            </w:r>
-            <w:proofErr w:type="spellStart"/>
+              <w:t>.</w:t>
+            </w:r>
+            <w:proofErr w:type="gramStart"/>
             <w:r>
               <w:rPr>
                 <w:sz w:val="20"/>
                 <w:szCs w:val="20"/>
               </w:rPr>
-              <w:t>JpaRepository</w:t>
+              <w:t>proyecto.repositorios</w:t>
             </w:r>
             <w:proofErr w:type="spellEnd"/>
+            <w:proofErr w:type="gramEnd"/>
+          </w:p>
+        </w:tc>
+        <w:tc>
+          <w:tcPr>
+            <w:tcW w:w="6200" w:type="dxa"/>
+            <w:hideMark/>
+          </w:tcPr>
+          <w:p>
+            <w:pPr>
+              <w:cnfStyle w:val="000000100000" w:firstRow="0" w:lastRow="0" w:firstColumn="0" w:lastColumn="0" w:oddVBand="0" w:evenVBand="0" w:oddHBand="1" w:evenHBand="0" w:firstRowFirstColumn="0" w:firstRowLastColumn="0" w:lastRowFirstColumn="0" w:lastRowLastColumn="0"/>
+            </w:pPr>
             <w:r>
               <w:rPr>
                 <w:sz w:val="20"/>
                 <w:szCs w:val="20"/>
               </w:rPr>
+              <w:t xml:space="preserve">Interfaces de repositorio Spring Data JPA. Una por cada entidad principal. Heredan de </w:t>
+            </w:r>
+            <w:proofErr w:type="spellStart"/>
+            <w:r>
+              <w:rPr>
+                <w:sz w:val="20"/>
+                <w:szCs w:val="20"/>
+              </w:rPr>
+              <w:t>JpaRepository</w:t>
+            </w:r>
+            <w:proofErr w:type="spellEnd"/>
+            <w:r>
+              <w:rPr>
+                <w:sz w:val="20"/>
+                <w:szCs w:val="20"/>
+              </w:rPr>
               <w:t>.</w:t>
             </w:r>
           </w:p>
@@ -10069,14 +10143,32 @@
           </w:tcPr>
           <w:p>
             <w:proofErr w:type="spellStart"/>
+            <w:proofErr w:type="gramStart"/>
             <w:r>
               <w:rPr>
                 <w:sz w:val="20"/>
                 <w:szCs w:val="20"/>
               </w:rPr>
-              <w:t>com.alba.proyecto.services</w:t>
+              <w:t>com.alba</w:t>
+            </w:r>
+            <w:proofErr w:type="gramEnd"/>
+            <w:r>
+              <w:rPr>
+                <w:sz w:val="20"/>
+                <w:szCs w:val="20"/>
+              </w:rPr>
+              <w:t>.</w:t>
+            </w:r>
+            <w:proofErr w:type="gramStart"/>
+            <w:r>
+              <w:rPr>
+                <w:sz w:val="20"/>
+                <w:szCs w:val="20"/>
+              </w:rPr>
+              <w:t>proyecto.services</w:t>
             </w:r>
             <w:proofErr w:type="spellEnd"/>
+            <w:proofErr w:type="gramEnd"/>
           </w:p>
         </w:tc>
         <w:tc>
@@ -10110,14 +10202,32 @@
           </w:tcPr>
           <w:p>
             <w:proofErr w:type="spellStart"/>
+            <w:proofErr w:type="gramStart"/>
             <w:r>
               <w:rPr>
                 <w:sz w:val="20"/>
                 <w:szCs w:val="20"/>
               </w:rPr>
-              <w:t>com.alba.proyecto.view</w:t>
+              <w:t>com.alba</w:t>
+            </w:r>
+            <w:proofErr w:type="gramEnd"/>
+            <w:r>
+              <w:rPr>
+                <w:sz w:val="20"/>
+                <w:szCs w:val="20"/>
+              </w:rPr>
+              <w:t>.</w:t>
+            </w:r>
+            <w:proofErr w:type="gramStart"/>
+            <w:r>
+              <w:rPr>
+                <w:sz w:val="20"/>
+                <w:szCs w:val="20"/>
+              </w:rPr>
+              <w:t>proyecto.view</w:t>
             </w:r>
             <w:proofErr w:type="spellEnd"/>
+            <w:proofErr w:type="gramEnd"/>
           </w:p>
         </w:tc>
         <w:tc>
@@ -10242,11 +10352,11 @@
           <w:numId w:val="3"/>
         </w:numPr>
       </w:pPr>
-      <w:bookmarkStart w:id="26" w:name="_Toc227855993"/>
+      <w:bookmarkStart w:id="27" w:name="_Toc227865331"/>
       <w:r>
         <w:t>INTERFACES GRÁFICAS DE USUARIO</w:t>
       </w:r>
-      <w:bookmarkEnd w:id="26"/>
+      <w:bookmarkEnd w:id="27"/>
     </w:p>
     <w:p>
       <w:r>
@@ -10317,38 +10427,25 @@
         <w:pStyle w:val="Descripcin"/>
         <w:jc w:val="center"/>
       </w:pPr>
-      <w:bookmarkStart w:id="27" w:name="_Toc227856187"/>
+      <w:bookmarkStart w:id="28" w:name="_Toc227856187"/>
       <w:r>
         <w:t xml:space="preserve">Figura </w:t>
       </w:r>
-      <w:r>
-        <w:fldChar w:fldCharType="begin"/>
-      </w:r>
-      <w:r>
-        <w:instrText xml:space="preserve"> SEQ Figura \* ARABIC </w:instrText>
-      </w:r>
-      <w:r>
-        <w:fldChar w:fldCharType="separate"/>
-      </w:r>
-      <w:r>
-        <w:rPr>
-          <w:noProof/>
-        </w:rPr>
-        <w:t>4</w:t>
-      </w:r>
-      <w:r>
-        <w:rPr>
-          <w:noProof/>
-        </w:rPr>
-        <w:fldChar w:fldCharType="end"/>
-      </w:r>
+      <w:fldSimple w:instr=" SEQ Figura \* ARABIC ">
+        <w:r>
+          <w:rPr>
+            <w:noProof/>
+          </w:rPr>
+          <w:t>4</w:t>
+        </w:r>
+      </w:fldSimple>
       <w:r>
         <w:t>. Pantalla de inicio de sesión</w:t>
       </w:r>
       <w:r>
         <w:t xml:space="preserve"> - Desktop</w:t>
       </w:r>
-      <w:bookmarkEnd w:id="27"/>
+      <w:bookmarkEnd w:id="28"/>
     </w:p>
     <w:p>
       <w:pPr>
@@ -10407,38 +10504,25 @@
         <w:pStyle w:val="Descripcin"/>
         <w:jc w:val="center"/>
       </w:pPr>
-      <w:bookmarkStart w:id="28" w:name="_Toc227856188"/>
+      <w:bookmarkStart w:id="29" w:name="_Toc227856188"/>
       <w:r>
         <w:t xml:space="preserve">Figura </w:t>
       </w:r>
-      <w:r>
-        <w:fldChar w:fldCharType="begin"/>
-      </w:r>
-      <w:r>
-        <w:instrText xml:space="preserve"> SEQ Figura \* ARABIC </w:instrText>
-      </w:r>
-      <w:r>
-        <w:fldChar w:fldCharType="separate"/>
-      </w:r>
-      <w:r>
-        <w:rPr>
-          <w:noProof/>
-        </w:rPr>
-        <w:t>5</w:t>
-      </w:r>
-      <w:r>
-        <w:rPr>
-          <w:noProof/>
-        </w:rPr>
-        <w:fldChar w:fldCharType="end"/>
-      </w:r>
+      <w:fldSimple w:instr=" SEQ Figura \* ARABIC ">
+        <w:r>
+          <w:rPr>
+            <w:noProof/>
+          </w:rPr>
+          <w:t>5</w:t>
+        </w:r>
+      </w:fldSimple>
       <w:r>
         <w:t>. Pantalla Nueva FCT</w:t>
       </w:r>
       <w:r>
         <w:t xml:space="preserve"> - Desktop</w:t>
       </w:r>
-      <w:bookmarkEnd w:id="28"/>
+      <w:bookmarkEnd w:id="29"/>
     </w:p>
     <w:p/>
     <w:p>
@@ -10510,31 +10594,18 @@
         <w:pStyle w:val="Descripcin"/>
         <w:jc w:val="center"/>
       </w:pPr>
-      <w:bookmarkStart w:id="29" w:name="_Toc227856189"/>
+      <w:bookmarkStart w:id="30" w:name="_Toc227856189"/>
       <w:r>
         <w:t xml:space="preserve">Figura </w:t>
       </w:r>
-      <w:r>
-        <w:fldChar w:fldCharType="begin"/>
-      </w:r>
-      <w:r>
-        <w:instrText xml:space="preserve"> SEQ Figura \* ARABIC </w:instrText>
-      </w:r>
-      <w:r>
-        <w:fldChar w:fldCharType="separate"/>
-      </w:r>
-      <w:r>
-        <w:rPr>
-          <w:noProof/>
-        </w:rPr>
-        <w:t>6</w:t>
-      </w:r>
-      <w:r>
-        <w:rPr>
-          <w:noProof/>
-        </w:rPr>
-        <w:fldChar w:fldCharType="end"/>
-      </w:r>
+      <w:fldSimple w:instr=" SEQ Figura \* ARABIC ">
+        <w:r>
+          <w:rPr>
+            <w:noProof/>
+          </w:rPr>
+          <w:t>6</w:t>
+        </w:r>
+      </w:fldSimple>
       <w:r>
         <w:t>. Pantalla inicial</w:t>
       </w:r>
@@ -10547,7 +10618,7 @@
       <w:r>
         <w:t xml:space="preserve"> - Móvil</w:t>
       </w:r>
-      <w:bookmarkEnd w:id="29"/>
+      <w:bookmarkEnd w:id="30"/>
     </w:p>
     <w:p>
       <w:pPr>
@@ -10606,31 +10677,18 @@
         <w:pStyle w:val="Descripcin"/>
         <w:jc w:val="center"/>
       </w:pPr>
-      <w:bookmarkStart w:id="30" w:name="_Toc227856190"/>
+      <w:bookmarkStart w:id="31" w:name="_Toc227856190"/>
       <w:r>
         <w:t xml:space="preserve">Figura </w:t>
       </w:r>
-      <w:r>
-        <w:fldChar w:fldCharType="begin"/>
-      </w:r>
-      <w:r>
-        <w:instrText xml:space="preserve"> SEQ Figura \* ARABIC </w:instrText>
-      </w:r>
-      <w:r>
-        <w:fldChar w:fldCharType="separate"/>
-      </w:r>
-      <w:r>
-        <w:rPr>
-          <w:noProof/>
-        </w:rPr>
-        <w:t>7</w:t>
-      </w:r>
-      <w:r>
-        <w:rPr>
-          <w:noProof/>
-        </w:rPr>
-        <w:fldChar w:fldCharType="end"/>
-      </w:r>
+      <w:fldSimple w:instr=" SEQ Figura \* ARABIC ">
+        <w:r>
+          <w:rPr>
+            <w:noProof/>
+          </w:rPr>
+          <w:t>7</w:t>
+        </w:r>
+      </w:fldSimple>
       <w:r>
         <w:t xml:space="preserve">. Pantalla Añadir justificante </w:t>
       </w:r>
@@ -10643,7 +10701,7 @@
       <w:r>
         <w:t xml:space="preserve"> - Móvil</w:t>
       </w:r>
-      <w:bookmarkEnd w:id="30"/>
+      <w:bookmarkEnd w:id="31"/>
     </w:p>
     <w:p>
       <w:pPr>
@@ -10707,11 +10765,11 @@
           <w:numId w:val="3"/>
         </w:numPr>
       </w:pPr>
-      <w:bookmarkStart w:id="31" w:name="_Toc227855994"/>
+      <w:bookmarkStart w:id="32" w:name="_Toc227865332"/>
       <w:r>
         <w:t>MAPA DE NAVEGABILIDAD</w:t>
       </w:r>
-      <w:bookmarkEnd w:id="31"/>
+      <w:bookmarkEnd w:id="32"/>
     </w:p>
     <w:p>
       <w:r>
@@ -10821,11 +10879,11 @@
           <w:numId w:val="2"/>
         </w:numPr>
       </w:pPr>
-      <w:bookmarkStart w:id="32" w:name="_Toc227855995"/>
+      <w:bookmarkStart w:id="33" w:name="_Toc227865333"/>
       <w:r>
         <w:t>PLAN DE PRUEBAS</w:t>
       </w:r>
-      <w:bookmarkEnd w:id="32"/>
+      <w:bookmarkEnd w:id="33"/>
     </w:p>
     <w:p>
       <w:r>
@@ -10912,11 +10970,11 @@
           <w:numId w:val="2"/>
         </w:numPr>
       </w:pPr>
-      <w:bookmarkStart w:id="33" w:name="_Toc227855996"/>
+      <w:bookmarkStart w:id="34" w:name="_Toc227865334"/>
       <w:r>
         <w:t>TECNOLOGÍAS EMPLEADAS</w:t>
       </w:r>
-      <w:bookmarkEnd w:id="33"/>
+      <w:bookmarkEnd w:id="34"/>
     </w:p>
     <w:p>
       <w:r>
@@ -11276,11 +11334,11 @@
           <w:numId w:val="2"/>
         </w:numPr>
       </w:pPr>
-      <w:bookmarkStart w:id="34" w:name="_Toc227855997"/>
+      <w:bookmarkStart w:id="35" w:name="_Toc227865335"/>
       <w:r>
         <w:t>PLANIFICACIÓN Y PRESUPUESTO</w:t>
       </w:r>
-      <w:bookmarkEnd w:id="34"/>
+      <w:bookmarkEnd w:id="35"/>
     </w:p>
     <w:p>
       <w:r>
@@ -11307,20 +11365,22 @@
           <w:szCs w:val="32"/>
         </w:rPr>
       </w:pPr>
-      <w:bookmarkStart w:id="35" w:name="_Toc210123170"/>
-      <w:bookmarkStart w:id="36" w:name="_Toc210123297"/>
-      <w:bookmarkStart w:id="37" w:name="_Toc210124628"/>
-      <w:bookmarkStart w:id="38" w:name="_Toc210125386"/>
-      <w:bookmarkStart w:id="39" w:name="_Toc221907962"/>
-      <w:bookmarkStart w:id="40" w:name="_Toc221908759"/>
-      <w:bookmarkStart w:id="41" w:name="_Toc227855998"/>
-      <w:bookmarkEnd w:id="35"/>
+      <w:bookmarkStart w:id="36" w:name="_Toc210123170"/>
+      <w:bookmarkStart w:id="37" w:name="_Toc210123297"/>
+      <w:bookmarkStart w:id="38" w:name="_Toc210124628"/>
+      <w:bookmarkStart w:id="39" w:name="_Toc210125386"/>
+      <w:bookmarkStart w:id="40" w:name="_Toc221907962"/>
+      <w:bookmarkStart w:id="41" w:name="_Toc221908759"/>
+      <w:bookmarkStart w:id="42" w:name="_Toc227855998"/>
+      <w:bookmarkStart w:id="43" w:name="_Toc227865336"/>
       <w:bookmarkEnd w:id="36"/>
       <w:bookmarkEnd w:id="37"/>
       <w:bookmarkEnd w:id="38"/>
       <w:bookmarkEnd w:id="39"/>
       <w:bookmarkEnd w:id="40"/>
       <w:bookmarkEnd w:id="41"/>
+      <w:bookmarkEnd w:id="42"/>
+      <w:bookmarkEnd w:id="43"/>
     </w:p>
     <w:p>
       <w:pPr>
@@ -11342,20 +11402,22 @@
           <w:szCs w:val="32"/>
         </w:rPr>
       </w:pPr>
-      <w:bookmarkStart w:id="42" w:name="_Toc210123171"/>
-      <w:bookmarkStart w:id="43" w:name="_Toc210123298"/>
-      <w:bookmarkStart w:id="44" w:name="_Toc210124629"/>
-      <w:bookmarkStart w:id="45" w:name="_Toc210125387"/>
-      <w:bookmarkStart w:id="46" w:name="_Toc221907963"/>
-      <w:bookmarkStart w:id="47" w:name="_Toc221908760"/>
-      <w:bookmarkStart w:id="48" w:name="_Toc227855999"/>
-      <w:bookmarkEnd w:id="42"/>
-      <w:bookmarkEnd w:id="43"/>
+      <w:bookmarkStart w:id="44" w:name="_Toc210123171"/>
+      <w:bookmarkStart w:id="45" w:name="_Toc210123298"/>
+      <w:bookmarkStart w:id="46" w:name="_Toc210124629"/>
+      <w:bookmarkStart w:id="47" w:name="_Toc210125387"/>
+      <w:bookmarkStart w:id="48" w:name="_Toc221907963"/>
+      <w:bookmarkStart w:id="49" w:name="_Toc221908760"/>
+      <w:bookmarkStart w:id="50" w:name="_Toc227855999"/>
+      <w:bookmarkStart w:id="51" w:name="_Toc227865337"/>
       <w:bookmarkEnd w:id="44"/>
       <w:bookmarkEnd w:id="45"/>
       <w:bookmarkEnd w:id="46"/>
       <w:bookmarkEnd w:id="47"/>
       <w:bookmarkEnd w:id="48"/>
+      <w:bookmarkEnd w:id="49"/>
+      <w:bookmarkEnd w:id="50"/>
+      <w:bookmarkEnd w:id="51"/>
     </w:p>
     <w:p>
       <w:pPr>
@@ -11377,20 +11439,22 @@
           <w:szCs w:val="32"/>
         </w:rPr>
       </w:pPr>
-      <w:bookmarkStart w:id="49" w:name="_Toc210123172"/>
-      <w:bookmarkStart w:id="50" w:name="_Toc210123299"/>
-      <w:bookmarkStart w:id="51" w:name="_Toc210124630"/>
-      <w:bookmarkStart w:id="52" w:name="_Toc210125388"/>
-      <w:bookmarkStart w:id="53" w:name="_Toc221907964"/>
-      <w:bookmarkStart w:id="54" w:name="_Toc221908761"/>
-      <w:bookmarkStart w:id="55" w:name="_Toc227856000"/>
-      <w:bookmarkEnd w:id="49"/>
-      <w:bookmarkEnd w:id="50"/>
-      <w:bookmarkEnd w:id="51"/>
+      <w:bookmarkStart w:id="52" w:name="_Toc210123172"/>
+      <w:bookmarkStart w:id="53" w:name="_Toc210123299"/>
+      <w:bookmarkStart w:id="54" w:name="_Toc210124630"/>
+      <w:bookmarkStart w:id="55" w:name="_Toc210125388"/>
+      <w:bookmarkStart w:id="56" w:name="_Toc221907964"/>
+      <w:bookmarkStart w:id="57" w:name="_Toc221908761"/>
+      <w:bookmarkStart w:id="58" w:name="_Toc227856000"/>
+      <w:bookmarkStart w:id="59" w:name="_Toc227865338"/>
       <w:bookmarkEnd w:id="52"/>
       <w:bookmarkEnd w:id="53"/>
       <w:bookmarkEnd w:id="54"/>
       <w:bookmarkEnd w:id="55"/>
+      <w:bookmarkEnd w:id="56"/>
+      <w:bookmarkEnd w:id="57"/>
+      <w:bookmarkEnd w:id="58"/>
+      <w:bookmarkEnd w:id="59"/>
     </w:p>
     <w:p>
       <w:pPr>
@@ -11400,11 +11464,11 @@
           <w:numId w:val="3"/>
         </w:numPr>
       </w:pPr>
-      <w:bookmarkStart w:id="56" w:name="_Toc227856001"/>
+      <w:bookmarkStart w:id="60" w:name="_Toc227865339"/>
       <w:r>
         <w:t>DIAGRAMA DE GANTT</w:t>
       </w:r>
-      <w:bookmarkEnd w:id="56"/>
+      <w:bookmarkEnd w:id="60"/>
     </w:p>
     <w:p>
       <w:pPr>
@@ -11462,31 +11526,18 @@
         <w:pStyle w:val="Descripcin"/>
         <w:jc w:val="center"/>
       </w:pPr>
-      <w:bookmarkStart w:id="57" w:name="_Toc227856191"/>
+      <w:bookmarkStart w:id="61" w:name="_Toc227856191"/>
       <w:r>
         <w:t xml:space="preserve">Figura </w:t>
       </w:r>
-      <w:r>
-        <w:fldChar w:fldCharType="begin"/>
-      </w:r>
-      <w:r>
-        <w:instrText xml:space="preserve"> SEQ Figura \* ARABIC </w:instrText>
-      </w:r>
-      <w:r>
-        <w:fldChar w:fldCharType="separate"/>
-      </w:r>
-      <w:r>
-        <w:rPr>
-          <w:noProof/>
-        </w:rPr>
-        <w:t>8</w:t>
-      </w:r>
-      <w:r>
-        <w:rPr>
-          <w:noProof/>
-        </w:rPr>
-        <w:fldChar w:fldCharType="end"/>
-      </w:r>
+      <w:fldSimple w:instr=" SEQ Figura \* ARABIC ">
+        <w:r>
+          <w:rPr>
+            <w:noProof/>
+          </w:rPr>
+          <w:t>8</w:t>
+        </w:r>
+      </w:fldSimple>
       <w:r>
         <w:t>. Diagram</w:t>
       </w:r>
@@ -11496,7 +11547,7 @@
       <w:r>
         <w:t xml:space="preserve"> de Gantt</w:t>
       </w:r>
-      <w:bookmarkEnd w:id="57"/>
+      <w:bookmarkEnd w:id="61"/>
     </w:p>
     <w:p/>
     <w:p>
@@ -11507,11 +11558,11 @@
           <w:numId w:val="3"/>
         </w:numPr>
       </w:pPr>
-      <w:bookmarkStart w:id="58" w:name="_Toc227856002"/>
+      <w:bookmarkStart w:id="62" w:name="_Toc227865340"/>
       <w:r>
         <w:t>ESTIMACIONES DE COSTES</w:t>
       </w:r>
-      <w:bookmarkEnd w:id="58"/>
+      <w:bookmarkEnd w:id="62"/>
     </w:p>
     <w:p>
       <w:pPr>
@@ -11557,11 +11608,11 @@
           <w:numId w:val="2"/>
         </w:numPr>
       </w:pPr>
-      <w:bookmarkStart w:id="59" w:name="_Toc227856003"/>
+      <w:bookmarkStart w:id="63" w:name="_Toc227865341"/>
       <w:r>
         <w:t>FUTURAS MEJORAS Y AMPLIACIONES</w:t>
       </w:r>
-      <w:bookmarkEnd w:id="59"/>
+      <w:bookmarkEnd w:id="63"/>
     </w:p>
     <w:p>
       <w:r>
@@ -11588,20 +11639,22 @@
           <w:szCs w:val="32"/>
         </w:rPr>
       </w:pPr>
-      <w:bookmarkStart w:id="60" w:name="_Toc210123176"/>
-      <w:bookmarkStart w:id="61" w:name="_Toc210123303"/>
-      <w:bookmarkStart w:id="62" w:name="_Toc210124634"/>
-      <w:bookmarkStart w:id="63" w:name="_Toc210125392"/>
-      <w:bookmarkStart w:id="64" w:name="_Toc221907968"/>
-      <w:bookmarkStart w:id="65" w:name="_Toc221908765"/>
-      <w:bookmarkStart w:id="66" w:name="_Toc227856004"/>
-      <w:bookmarkEnd w:id="60"/>
-      <w:bookmarkEnd w:id="61"/>
-      <w:bookmarkEnd w:id="62"/>
-      <w:bookmarkEnd w:id="63"/>
+      <w:bookmarkStart w:id="64" w:name="_Toc210123176"/>
+      <w:bookmarkStart w:id="65" w:name="_Toc210123303"/>
+      <w:bookmarkStart w:id="66" w:name="_Toc210124634"/>
+      <w:bookmarkStart w:id="67" w:name="_Toc210125392"/>
+      <w:bookmarkStart w:id="68" w:name="_Toc221907968"/>
+      <w:bookmarkStart w:id="69" w:name="_Toc221908765"/>
+      <w:bookmarkStart w:id="70" w:name="_Toc227856004"/>
+      <w:bookmarkStart w:id="71" w:name="_Toc227865342"/>
       <w:bookmarkEnd w:id="64"/>
       <w:bookmarkEnd w:id="65"/>
       <w:bookmarkEnd w:id="66"/>
+      <w:bookmarkEnd w:id="67"/>
+      <w:bookmarkEnd w:id="68"/>
+      <w:bookmarkEnd w:id="69"/>
+      <w:bookmarkEnd w:id="70"/>
+      <w:bookmarkEnd w:id="71"/>
     </w:p>
     <w:p>
       <w:pPr>
@@ -11611,11 +11664,11 @@
           <w:numId w:val="3"/>
         </w:numPr>
       </w:pPr>
-      <w:bookmarkStart w:id="67" w:name="_Toc227856005"/>
+      <w:bookmarkStart w:id="72" w:name="_Toc227865343"/>
       <w:r>
         <w:t>PROPUESTAS DE MEJORA Y AMPLIACIONES</w:t>
       </w:r>
-      <w:bookmarkEnd w:id="67"/>
+      <w:bookmarkEnd w:id="72"/>
     </w:p>
     <w:p>
       <w:r>
@@ -11630,11 +11683,11 @@
           <w:numId w:val="3"/>
         </w:numPr>
       </w:pPr>
-      <w:bookmarkStart w:id="68" w:name="_Toc227856006"/>
+      <w:bookmarkStart w:id="73" w:name="_Toc227865344"/>
       <w:r>
         <w:t>IMPACTO Y RIESGO DE LOS CAMBIOS PROPUESTOS</w:t>
       </w:r>
-      <w:bookmarkEnd w:id="68"/>
+      <w:bookmarkEnd w:id="73"/>
     </w:p>
     <w:p>
       <w:r>
@@ -11649,11 +11702,11 @@
           <w:numId w:val="2"/>
         </w:numPr>
       </w:pPr>
-      <w:bookmarkStart w:id="69" w:name="_Toc227856007"/>
+      <w:bookmarkStart w:id="74" w:name="_Toc227865345"/>
       <w:r>
         <w:t>RELACIÓN CON LOS MÓDULOS DEL CICLO</w:t>
       </w:r>
-      <w:bookmarkEnd w:id="69"/>
+      <w:bookmarkEnd w:id="74"/>
     </w:p>
     <w:p>
       <w:r>
@@ -11735,11 +11788,11 @@
           <w:numId w:val="2"/>
         </w:numPr>
       </w:pPr>
-      <w:bookmarkStart w:id="70" w:name="_Toc227856008"/>
+      <w:bookmarkStart w:id="75" w:name="_Toc227865346"/>
       <w:r>
         <w:t>CONCLUSIONES</w:t>
       </w:r>
-      <w:bookmarkEnd w:id="70"/>
+      <w:bookmarkEnd w:id="75"/>
     </w:p>
     <w:p>
       <w:r>
@@ -11754,11 +11807,11 @@
           <w:numId w:val="2"/>
         </w:numPr>
       </w:pPr>
-      <w:bookmarkStart w:id="71" w:name="_Toc227856009"/>
+      <w:bookmarkStart w:id="76" w:name="_Toc227865347"/>
       <w:r>
         <w:t>DESPLIEGUE DE LA APLICACIÓN</w:t>
       </w:r>
-      <w:bookmarkEnd w:id="71"/>
+      <w:bookmarkEnd w:id="76"/>
     </w:p>
     <w:p>
       <w:r>
@@ -11785,20 +11838,22 @@
           <w:szCs w:val="32"/>
         </w:rPr>
       </w:pPr>
-      <w:bookmarkStart w:id="72" w:name="_Toc210123182"/>
-      <w:bookmarkStart w:id="73" w:name="_Toc210123309"/>
-      <w:bookmarkStart w:id="74" w:name="_Toc210124640"/>
-      <w:bookmarkStart w:id="75" w:name="_Toc210125398"/>
-      <w:bookmarkStart w:id="76" w:name="_Toc221907974"/>
-      <w:bookmarkStart w:id="77" w:name="_Toc221908771"/>
-      <w:bookmarkStart w:id="78" w:name="_Toc227856010"/>
-      <w:bookmarkEnd w:id="72"/>
-      <w:bookmarkEnd w:id="73"/>
-      <w:bookmarkEnd w:id="74"/>
-      <w:bookmarkEnd w:id="75"/>
-      <w:bookmarkEnd w:id="76"/>
+      <w:bookmarkStart w:id="77" w:name="_Toc210123182"/>
+      <w:bookmarkStart w:id="78" w:name="_Toc210123309"/>
+      <w:bookmarkStart w:id="79" w:name="_Toc210124640"/>
+      <w:bookmarkStart w:id="80" w:name="_Toc210125398"/>
+      <w:bookmarkStart w:id="81" w:name="_Toc221907974"/>
+      <w:bookmarkStart w:id="82" w:name="_Toc221908771"/>
+      <w:bookmarkStart w:id="83" w:name="_Toc227856010"/>
+      <w:bookmarkStart w:id="84" w:name="_Toc227865348"/>
       <w:bookmarkEnd w:id="77"/>
       <w:bookmarkEnd w:id="78"/>
+      <w:bookmarkEnd w:id="79"/>
+      <w:bookmarkEnd w:id="80"/>
+      <w:bookmarkEnd w:id="81"/>
+      <w:bookmarkEnd w:id="82"/>
+      <w:bookmarkEnd w:id="83"/>
+      <w:bookmarkEnd w:id="84"/>
     </w:p>
     <w:p>
       <w:pPr>
@@ -11820,20 +11875,22 @@
           <w:szCs w:val="32"/>
         </w:rPr>
       </w:pPr>
-      <w:bookmarkStart w:id="79" w:name="_Toc210123183"/>
-      <w:bookmarkStart w:id="80" w:name="_Toc210123310"/>
-      <w:bookmarkStart w:id="81" w:name="_Toc210124641"/>
-      <w:bookmarkStart w:id="82" w:name="_Toc210125399"/>
-      <w:bookmarkStart w:id="83" w:name="_Toc221907975"/>
-      <w:bookmarkStart w:id="84" w:name="_Toc221908772"/>
-      <w:bookmarkStart w:id="85" w:name="_Toc227856011"/>
-      <w:bookmarkEnd w:id="79"/>
-      <w:bookmarkEnd w:id="80"/>
-      <w:bookmarkEnd w:id="81"/>
-      <w:bookmarkEnd w:id="82"/>
-      <w:bookmarkEnd w:id="83"/>
-      <w:bookmarkEnd w:id="84"/>
+      <w:bookmarkStart w:id="85" w:name="_Toc210123183"/>
+      <w:bookmarkStart w:id="86" w:name="_Toc210123310"/>
+      <w:bookmarkStart w:id="87" w:name="_Toc210124641"/>
+      <w:bookmarkStart w:id="88" w:name="_Toc210125399"/>
+      <w:bookmarkStart w:id="89" w:name="_Toc221907975"/>
+      <w:bookmarkStart w:id="90" w:name="_Toc221908772"/>
+      <w:bookmarkStart w:id="91" w:name="_Toc227856011"/>
+      <w:bookmarkStart w:id="92" w:name="_Toc227865349"/>
       <w:bookmarkEnd w:id="85"/>
+      <w:bookmarkEnd w:id="86"/>
+      <w:bookmarkEnd w:id="87"/>
+      <w:bookmarkEnd w:id="88"/>
+      <w:bookmarkEnd w:id="89"/>
+      <w:bookmarkEnd w:id="90"/>
+      <w:bookmarkEnd w:id="91"/>
+      <w:bookmarkEnd w:id="92"/>
     </w:p>
     <w:p>
       <w:pPr>
@@ -11855,20 +11912,22 @@
           <w:szCs w:val="32"/>
         </w:rPr>
       </w:pPr>
-      <w:bookmarkStart w:id="86" w:name="_Toc210123184"/>
-      <w:bookmarkStart w:id="87" w:name="_Toc210123311"/>
-      <w:bookmarkStart w:id="88" w:name="_Toc210124642"/>
-      <w:bookmarkStart w:id="89" w:name="_Toc210125400"/>
-      <w:bookmarkStart w:id="90" w:name="_Toc221907976"/>
-      <w:bookmarkStart w:id="91" w:name="_Toc221908773"/>
-      <w:bookmarkStart w:id="92" w:name="_Toc227856012"/>
-      <w:bookmarkEnd w:id="86"/>
-      <w:bookmarkEnd w:id="87"/>
-      <w:bookmarkEnd w:id="88"/>
-      <w:bookmarkEnd w:id="89"/>
-      <w:bookmarkEnd w:id="90"/>
-      <w:bookmarkEnd w:id="91"/>
-      <w:bookmarkEnd w:id="92"/>
+      <w:bookmarkStart w:id="93" w:name="_Toc210123184"/>
+      <w:bookmarkStart w:id="94" w:name="_Toc210123311"/>
+      <w:bookmarkStart w:id="95" w:name="_Toc210124642"/>
+      <w:bookmarkStart w:id="96" w:name="_Toc210125400"/>
+      <w:bookmarkStart w:id="97" w:name="_Toc221907976"/>
+      <w:bookmarkStart w:id="98" w:name="_Toc221908773"/>
+      <w:bookmarkStart w:id="99" w:name="_Toc227856012"/>
+      <w:bookmarkStart w:id="100" w:name="_Toc227865350"/>
+      <w:bookmarkEnd w:id="93"/>
+      <w:bookmarkEnd w:id="94"/>
+      <w:bookmarkEnd w:id="95"/>
+      <w:bookmarkEnd w:id="96"/>
+      <w:bookmarkEnd w:id="97"/>
+      <w:bookmarkEnd w:id="98"/>
+      <w:bookmarkEnd w:id="99"/>
+      <w:bookmarkEnd w:id="100"/>
     </w:p>
     <w:p>
       <w:pPr>
@@ -11878,11 +11937,11 @@
           <w:numId w:val="3"/>
         </w:numPr>
       </w:pPr>
-      <w:bookmarkStart w:id="93" w:name="_Toc227856013"/>
+      <w:bookmarkStart w:id="101" w:name="_Toc227865351"/>
       <w:r>
         <w:t>INSTALACIÓN</w:t>
       </w:r>
-      <w:bookmarkEnd w:id="93"/>
+      <w:bookmarkEnd w:id="101"/>
     </w:p>
     <w:p>
       <w:r>
@@ -11897,11 +11956,11 @@
           <w:numId w:val="2"/>
         </w:numPr>
       </w:pPr>
-      <w:bookmarkStart w:id="94" w:name="_Toc227856014"/>
+      <w:bookmarkStart w:id="102" w:name="_Toc227865352"/>
       <w:r>
         <w:t>GUÍA DE ESTILOS Y MANUAL DE USUARIO</w:t>
       </w:r>
-      <w:bookmarkEnd w:id="94"/>
+      <w:bookmarkEnd w:id="102"/>
     </w:p>
     <w:p>
       <w:r>
@@ -11928,20 +11987,22 @@
           <w:szCs w:val="32"/>
         </w:rPr>
       </w:pPr>
-      <w:bookmarkStart w:id="95" w:name="_Toc210123187"/>
-      <w:bookmarkStart w:id="96" w:name="_Toc210123314"/>
-      <w:bookmarkStart w:id="97" w:name="_Toc210124645"/>
-      <w:bookmarkStart w:id="98" w:name="_Toc210125403"/>
-      <w:bookmarkStart w:id="99" w:name="_Toc221907979"/>
-      <w:bookmarkStart w:id="100" w:name="_Toc221908776"/>
-      <w:bookmarkStart w:id="101" w:name="_Toc227856015"/>
-      <w:bookmarkEnd w:id="95"/>
-      <w:bookmarkEnd w:id="96"/>
-      <w:bookmarkEnd w:id="97"/>
-      <w:bookmarkEnd w:id="98"/>
-      <w:bookmarkEnd w:id="99"/>
-      <w:bookmarkEnd w:id="100"/>
-      <w:bookmarkEnd w:id="101"/>
+      <w:bookmarkStart w:id="103" w:name="_Toc210123187"/>
+      <w:bookmarkStart w:id="104" w:name="_Toc210123314"/>
+      <w:bookmarkStart w:id="105" w:name="_Toc210124645"/>
+      <w:bookmarkStart w:id="106" w:name="_Toc210125403"/>
+      <w:bookmarkStart w:id="107" w:name="_Toc221907979"/>
+      <w:bookmarkStart w:id="108" w:name="_Toc221908776"/>
+      <w:bookmarkStart w:id="109" w:name="_Toc227856015"/>
+      <w:bookmarkStart w:id="110" w:name="_Toc227865353"/>
+      <w:bookmarkEnd w:id="103"/>
+      <w:bookmarkEnd w:id="104"/>
+      <w:bookmarkEnd w:id="105"/>
+      <w:bookmarkEnd w:id="106"/>
+      <w:bookmarkEnd w:id="107"/>
+      <w:bookmarkEnd w:id="108"/>
+      <w:bookmarkEnd w:id="109"/>
+      <w:bookmarkEnd w:id="110"/>
     </w:p>
     <w:p>
       <w:pPr>
@@ -11951,22 +12012,22 @@
           <w:numId w:val="3"/>
         </w:numPr>
       </w:pPr>
-      <w:bookmarkStart w:id="102" w:name="_Toc227856016"/>
+      <w:bookmarkStart w:id="111" w:name="_Toc227865354"/>
       <w:r>
         <w:t>GUÍA DE ESTILOS</w:t>
       </w:r>
-      <w:bookmarkEnd w:id="102"/>
+      <w:bookmarkEnd w:id="111"/>
     </w:p>
     <w:p>
       <w:pPr>
         <w:pStyle w:val="Ttulo3"/>
         <w:ind w:left="360"/>
       </w:pPr>
-      <w:bookmarkStart w:id="103" w:name="_Toc227856017"/>
+      <w:bookmarkStart w:id="112" w:name="_Toc227865355"/>
       <w:r>
         <w:t>10.1.1. PALETA DE COLORES</w:t>
       </w:r>
-      <w:bookmarkEnd w:id="103"/>
+      <w:bookmarkEnd w:id="112"/>
     </w:p>
     <w:p>
       <w:pPr>
@@ -12661,14 +12722,14 @@
       <w:pPr>
         <w:pStyle w:val="Ttulo3"/>
       </w:pPr>
-      <w:bookmarkStart w:id="104" w:name="_Toc227856018"/>
+      <w:bookmarkStart w:id="113" w:name="_Toc227865356"/>
       <w:r>
         <w:t xml:space="preserve">10.1.2. </w:t>
       </w:r>
       <w:r>
         <w:t>Tipografía</w:t>
       </w:r>
-      <w:bookmarkEnd w:id="104"/>
+      <w:bookmarkEnd w:id="113"/>
     </w:p>
     <w:p>
       <w:r>
@@ -12706,14 +12767,14 @@
       <w:pPr>
         <w:pStyle w:val="Ttulo3"/>
       </w:pPr>
-      <w:bookmarkStart w:id="105" w:name="_Toc227856019"/>
+      <w:bookmarkStart w:id="114" w:name="_Toc227865357"/>
       <w:r>
         <w:t xml:space="preserve">10.1.3. </w:t>
       </w:r>
       <w:r>
         <w:t>Clases CSS definidas</w:t>
       </w:r>
-      <w:bookmarkEnd w:id="105"/>
+      <w:bookmarkEnd w:id="114"/>
     </w:p>
     <w:p>
       <w:r>
@@ -12828,8 +12889,13 @@
             <w:pPr>
               <w:spacing w:after="160" w:line="259" w:lineRule="auto"/>
             </w:pPr>
-            <w:r>
-              <w:t>.fondo-principal</w:t>
+            <w:proofErr w:type="gramStart"/>
+            <w:r>
+              <w:t>.fondo</w:t>
+            </w:r>
+            <w:proofErr w:type="gramEnd"/>
+            <w:r>
+              <w:t>-principal</w:t>
             </w:r>
           </w:p>
         </w:tc>
@@ -12860,8 +12926,13 @@
             <w:pPr>
               <w:spacing w:after="160" w:line="259" w:lineRule="auto"/>
             </w:pPr>
-            <w:r>
-              <w:t>.fondo-</w:t>
+            <w:proofErr w:type="gramStart"/>
+            <w:r>
+              <w:t>.fondo</w:t>
+            </w:r>
+            <w:proofErr w:type="gramEnd"/>
+            <w:r>
+              <w:t>-</w:t>
             </w:r>
             <w:proofErr w:type="spellStart"/>
             <w:r>
@@ -12900,6 +12971,7 @@
             <w:pPr>
               <w:spacing w:after="160" w:line="259" w:lineRule="auto"/>
             </w:pPr>
+            <w:proofErr w:type="gramStart"/>
             <w:r>
               <w:t>.</w:t>
             </w:r>
@@ -12908,6 +12980,7 @@
               <w:t>btn</w:t>
             </w:r>
             <w:proofErr w:type="spellEnd"/>
+            <w:proofErr w:type="gramEnd"/>
             <w:r>
               <w:t>-primario</w:t>
             </w:r>
@@ -12940,14 +13013,24 @@
             <w:pPr>
               <w:spacing w:after="160" w:line="259" w:lineRule="auto"/>
             </w:pPr>
+            <w:proofErr w:type="gramStart"/>
             <w:r>
               <w:t>.</w:t>
             </w:r>
             <w:proofErr w:type="spellStart"/>
             <w:r>
-              <w:t>btn-primario:hover</w:t>
+              <w:t>btn</w:t>
+            </w:r>
+            <w:proofErr w:type="gramEnd"/>
+            <w:r>
+              <w:t>-</w:t>
+            </w:r>
+            <w:proofErr w:type="gramStart"/>
+            <w:r>
+              <w:t>primario:hover</w:t>
             </w:r>
             <w:proofErr w:type="spellEnd"/>
+            <w:proofErr w:type="gramEnd"/>
           </w:p>
         </w:tc>
         <w:tc>
@@ -12988,6 +13071,7 @@
             <w:pPr>
               <w:spacing w:after="160" w:line="259" w:lineRule="auto"/>
             </w:pPr>
+            <w:proofErr w:type="gramStart"/>
             <w:r>
               <w:t>.</w:t>
             </w:r>
@@ -12996,6 +13080,7 @@
               <w:t>btn</w:t>
             </w:r>
             <w:proofErr w:type="spellEnd"/>
+            <w:proofErr w:type="gramEnd"/>
             <w:r>
               <w:t>-peligro</w:t>
             </w:r>
@@ -13028,14 +13113,24 @@
             <w:pPr>
               <w:spacing w:after="160" w:line="259" w:lineRule="auto"/>
             </w:pPr>
+            <w:proofErr w:type="gramStart"/>
             <w:r>
               <w:t>.</w:t>
             </w:r>
             <w:proofErr w:type="spellStart"/>
             <w:r>
-              <w:t>btn-peligro:hover</w:t>
+              <w:t>btn</w:t>
+            </w:r>
+            <w:proofErr w:type="gramEnd"/>
+            <w:r>
+              <w:t>-</w:t>
+            </w:r>
+            <w:proofErr w:type="gramStart"/>
+            <w:r>
+              <w:t>peligro:hover</w:t>
             </w:r>
             <w:proofErr w:type="spellEnd"/>
+            <w:proofErr w:type="gramEnd"/>
           </w:p>
         </w:tc>
         <w:tc>
@@ -13076,8 +13171,13 @@
             <w:pPr>
               <w:spacing w:after="160" w:line="259" w:lineRule="auto"/>
             </w:pPr>
-            <w:r>
-              <w:t>.titulo-panel</w:t>
+            <w:proofErr w:type="gramStart"/>
+            <w:r>
+              <w:t>.titulo</w:t>
+            </w:r>
+            <w:proofErr w:type="gramEnd"/>
+            <w:r>
+              <w:t>-panel</w:t>
             </w:r>
           </w:p>
         </w:tc>
@@ -13108,12 +13208,17 @@
             <w:pPr>
               <w:spacing w:after="160" w:line="259" w:lineRule="auto"/>
             </w:pPr>
+            <w:proofErr w:type="gramStart"/>
             <w:r>
               <w:t>.</w:t>
             </w:r>
             <w:proofErr w:type="spellStart"/>
             <w:r>
-              <w:t>label-menu</w:t>
+              <w:t>label</w:t>
+            </w:r>
+            <w:proofErr w:type="gramEnd"/>
+            <w:r>
+              <w:t>-menu</w:t>
             </w:r>
             <w:proofErr w:type="spellEnd"/>
           </w:p>
@@ -13148,12 +13253,17 @@
             <w:pPr>
               <w:spacing w:after="160" w:line="259" w:lineRule="auto"/>
             </w:pPr>
+            <w:proofErr w:type="gramStart"/>
             <w:r>
               <w:t>.</w:t>
             </w:r>
             <w:proofErr w:type="spellStart"/>
             <w:r>
-              <w:t>btn-menu</w:t>
+              <w:t>btn</w:t>
+            </w:r>
+            <w:proofErr w:type="gramEnd"/>
+            <w:r>
+              <w:t>-menu</w:t>
             </w:r>
             <w:proofErr w:type="spellEnd"/>
           </w:p>
@@ -13185,14 +13295,24 @@
             <w:pPr>
               <w:spacing w:after="160" w:line="259" w:lineRule="auto"/>
             </w:pPr>
+            <w:proofErr w:type="gramStart"/>
             <w:r>
               <w:t>.</w:t>
             </w:r>
             <w:proofErr w:type="spellStart"/>
             <w:r>
-              <w:t>btn-menu:hover</w:t>
+              <w:t>btn</w:t>
+            </w:r>
+            <w:proofErr w:type="gramEnd"/>
+            <w:r>
+              <w:t>-</w:t>
+            </w:r>
+            <w:proofErr w:type="gramStart"/>
+            <w:r>
+              <w:t>menu:hover</w:t>
             </w:r>
             <w:proofErr w:type="spellEnd"/>
+            <w:proofErr w:type="gramEnd"/>
           </w:p>
         </w:tc>
         <w:tc>
@@ -13225,11 +13345,11 @@
       <w:pPr>
         <w:pStyle w:val="Ttulo3"/>
       </w:pPr>
-      <w:bookmarkStart w:id="106" w:name="_Toc227856020"/>
+      <w:bookmarkStart w:id="115" w:name="_Toc227865358"/>
       <w:r>
         <w:t>10.1.4. IMÁGENES E ICONOS</w:t>
       </w:r>
-      <w:bookmarkEnd w:id="106"/>
+      <w:bookmarkEnd w:id="115"/>
     </w:p>
     <w:p>
       <w:pPr>
@@ -13450,8 +13570,6 @@
             </w:pPr>
             <w:r>
               <w:rPr>
-                <w:b w:val="0"/>
-                <w:bCs w:val="0"/>
                 <w:noProof/>
               </w:rPr>
               <w:drawing>
@@ -13560,8 +13678,6 @@
             </w:pPr>
             <w:r>
               <w:rPr>
-                <w:b w:val="0"/>
-                <w:bCs w:val="0"/>
                 <w:noProof/>
               </w:rPr>
               <w:drawing>
@@ -13674,11 +13790,11 @@
           <w:numId w:val="3"/>
         </w:numPr>
       </w:pPr>
-      <w:bookmarkStart w:id="107" w:name="_Toc227856021"/>
+      <w:bookmarkStart w:id="116" w:name="_Toc227865359"/>
       <w:r>
         <w:t>MANUAL DE USUARIO</w:t>
       </w:r>
-      <w:bookmarkEnd w:id="107"/>
+      <w:bookmarkEnd w:id="116"/>
     </w:p>
     <w:p>
       <w:r>
@@ -13693,11 +13809,11 @@
           <w:numId w:val="2"/>
         </w:numPr>
       </w:pPr>
-      <w:bookmarkStart w:id="108" w:name="_Toc227856022"/>
+      <w:bookmarkStart w:id="117" w:name="_Toc227865360"/>
       <w:r>
         <w:t>WEBGRAFÍA Y FUENTES DE INFORMACIÓN</w:t>
       </w:r>
-      <w:bookmarkEnd w:id="108"/>
+      <w:bookmarkEnd w:id="117"/>
     </w:p>
     <w:p>
       <w:r>
@@ -16386,10 +16502,6 @@
 </file>
 
 <file path=customXml/item1.xml><?xml version="1.0" encoding="utf-8"?>
-<b:Sources xmlns:b="http://schemas.openxmlformats.org/officeDocument/2006/bibliography" xmlns="http://schemas.openxmlformats.org/officeDocument/2006/bibliography" SelectedStyle="\APASixthEditionOfficeOnline.xsl" StyleName="APA" Version="6"/>
-</file>
-
-<file path=customXml/item2.xml><?xml version="1.0" encoding="utf-8"?>
 <?mso-contentType ?>
 <FormTemplates xmlns="http://schemas.microsoft.com/sharepoint/v3/contenttype/forms">
   <Display>DocumentLibraryForm</Display>
@@ -16398,7 +16510,19 @@
 </FormTemplates>
 </file>
 
+<file path=customXml/item2.xml><?xml version="1.0" encoding="utf-8"?>
+<b:Sources xmlns:b="http://schemas.openxmlformats.org/officeDocument/2006/bibliography" xmlns="http://schemas.openxmlformats.org/officeDocument/2006/bibliography" SelectedStyle="\APASixthEditionOfficeOnline.xsl" StyleName="APA" Version="6"/>
+</file>
+
 <file path=customXml/item3.xml><?xml version="1.0" encoding="utf-8"?>
+<p:properties xmlns:p="http://schemas.microsoft.com/office/2006/metadata/properties" xmlns:xsi="http://www.w3.org/2001/XMLSchema-instance" xmlns:pc="http://schemas.microsoft.com/office/infopath/2007/PartnerControls">
+  <documentManagement>
+    <_activity xmlns="d07641f9-f1a5-43c1-ac16-fa53e6c318bc" xsi:nil="true"/>
+  </documentManagement>
+</p:properties>
+</file>
+
+<file path=customXml/item4.xml><?xml version="1.0" encoding="utf-8"?>
 <ct:contentTypeSchema xmlns:ct="http://schemas.microsoft.com/office/2006/metadata/contentType" xmlns:ma="http://schemas.microsoft.com/office/2006/metadata/properties/metaAttributes" ct:_="" ma:_="" ma:contentTypeName="Documento" ma:contentTypeID="0x010100089FBA7B0FAFA84E9F1E615D3FC0A129" ma:contentTypeVersion="11" ma:contentTypeDescription="Crear nuevo documento." ma:contentTypeScope="" ma:versionID="fa55cfaacbcd603bd53d850e3b8176f7">
   <xsd:schema xmlns:xsd="http://www.w3.org/2001/XMLSchema" xmlns:xs="http://www.w3.org/2001/XMLSchema" xmlns:p="http://schemas.microsoft.com/office/2006/metadata/properties" xmlns:ns3="d07641f9-f1a5-43c1-ac16-fa53e6c318bc" targetNamespace="http://schemas.microsoft.com/office/2006/metadata/properties" ma:root="true" ma:fieldsID="78f989df160fe6a5ee2e0e0b0bfde0e3" ns3:_="">
     <xsd:import namespace="d07641f9-f1a5-43c1-ac16-fa53e6c318bc"/>
@@ -16586,15 +16710,15 @@
 </ct:contentTypeSchema>
 </file>
 
-<file path=customXml/item4.xml><?xml version="1.0" encoding="utf-8"?>
-<p:properties xmlns:p="http://schemas.microsoft.com/office/2006/metadata/properties" xmlns:xsi="http://www.w3.org/2001/XMLSchema-instance" xmlns:pc="http://schemas.microsoft.com/office/infopath/2007/PartnerControls">
-  <documentManagement>
-    <_activity xmlns="d07641f9-f1a5-43c1-ac16-fa53e6c318bc" xsi:nil="true"/>
-  </documentManagement>
-</p:properties>
+<file path=customXml/itemProps1.xml><?xml version="1.0" encoding="utf-8"?>
+<ds:datastoreItem xmlns:ds="http://schemas.openxmlformats.org/officeDocument/2006/customXml" ds:itemID="{480B8420-1B48-4D23-8D6E-64373AC5070B}">
+  <ds:schemaRefs>
+    <ds:schemaRef ds:uri="http://schemas.microsoft.com/sharepoint/v3/contenttype/forms"/>
+  </ds:schemaRefs>
+</ds:datastoreItem>
 </file>
 
-<file path=customXml/itemProps1.xml><?xml version="1.0" encoding="utf-8"?>
+<file path=customXml/itemProps2.xml><?xml version="1.0" encoding="utf-8"?>
 <ds:datastoreItem xmlns:ds="http://schemas.openxmlformats.org/officeDocument/2006/customXml" ds:itemID="{453714F8-FBC3-4DCC-8DCB-89BB58DCF76F}">
   <ds:schemaRefs>
     <ds:schemaRef ds:uri="http://schemas.openxmlformats.org/officeDocument/2006/bibliography"/>
@@ -16602,15 +16726,17 @@
 </ds:datastoreItem>
 </file>
 
-<file path=customXml/itemProps2.xml><?xml version="1.0" encoding="utf-8"?>
-<ds:datastoreItem xmlns:ds="http://schemas.openxmlformats.org/officeDocument/2006/customXml" ds:itemID="{480B8420-1B48-4D23-8D6E-64373AC5070B}">
+<file path=customXml/itemProps3.xml><?xml version="1.0" encoding="utf-8"?>
+<ds:datastoreItem xmlns:ds="http://schemas.openxmlformats.org/officeDocument/2006/customXml" ds:itemID="{7F0B1298-25D5-45B9-909D-DD837044A49E}">
   <ds:schemaRefs>
-    <ds:schemaRef ds:uri="http://schemas.microsoft.com/sharepoint/v3/contenttype/forms"/>
+    <ds:schemaRef ds:uri="http://schemas.microsoft.com/office/2006/metadata/properties"/>
+    <ds:schemaRef ds:uri="http://schemas.microsoft.com/office/infopath/2007/PartnerControls"/>
+    <ds:schemaRef ds:uri="d07641f9-f1a5-43c1-ac16-fa53e6c318bc"/>
   </ds:schemaRefs>
 </ds:datastoreItem>
 </file>
 
-<file path=customXml/itemProps3.xml><?xml version="1.0" encoding="utf-8"?>
+<file path=customXml/itemProps4.xml><?xml version="1.0" encoding="utf-8"?>
 <ds:datastoreItem xmlns:ds="http://schemas.openxmlformats.org/officeDocument/2006/customXml" ds:itemID="{B3C09D93-2BDC-4563-9759-9158244E5DE7}">
   <ds:schemaRefs>
     <ds:schemaRef ds:uri="http://schemas.microsoft.com/office/2006/metadata/contentType"/>
@@ -16626,14 +16752,4 @@
     <ds:schemaRef ds:uri="http://schemas.microsoft.com/internal/obd"/>
   </ds:schemaRefs>
 </ds:datastoreItem>
-</file>
-
-<file path=customXml/itemProps4.xml><?xml version="1.0" encoding="utf-8"?>
-<ds:datastoreItem xmlns:ds="http://schemas.openxmlformats.org/officeDocument/2006/customXml" ds:itemID="{7F0B1298-25D5-45B9-909D-DD837044A49E}">
-  <ds:schemaRefs>
-    <ds:schemaRef ds:uri="http://schemas.microsoft.com/office/2006/metadata/properties"/>
-    <ds:schemaRef ds:uri="http://schemas.microsoft.com/office/infopath/2007/PartnerControls"/>
-    <ds:schemaRef ds:uri="d07641f9-f1a5-43c1-ac16-fa53e6c318bc"/>
-  </ds:schemaRefs>
-</ds:datastoreItem>
 </file>
</xml_diff>

<commit_message>
añadidas pantallas NO FUNCIONALES y css a profesor y estudiante
</commit_message>
<xml_diff>
--- a/docs/provisional_DocumentacionProyecto_2VIFC302.docx
+++ b/docs/provisional_DocumentacionProyecto_2VIFC302.docx
@@ -1166,7 +1166,7 @@
           <w:lang w:eastAsia="es-VE"/>
         </w:rPr>
         <w:drawing>
-          <wp:inline distT="0" distB="0" distL="0" distR="0" wp14:anchorId="1183C0B2" wp14:editId="03E81970">
+          <wp:inline distT="0" distB="0" distL="0" distR="0" wp14:anchorId="1183C0B2" wp14:editId="09143DC2">
             <wp:extent cx="7556500" cy="10599420"/>
             <wp:effectExtent l="0" t="0" r="6350" b="0"/>
             <wp:docPr id="2" name="Imagen 2" descr="D:\servicios forobeta posts\diseño grafico\CLIENTES\Feelmusic - 05.11.18\archivos\11\11.jpg"/>
@@ -2580,21 +2580,7 @@
                 <w:rStyle w:val="Hipervnculo"/>
                 <w:noProof/>
               </w:rPr>
-              <w:t>DIAGRAMA DE PAQ</w:t>
-            </w:r>
-            <w:r>
-              <w:rPr>
-                <w:rStyle w:val="Hipervnculo"/>
-                <w:noProof/>
-              </w:rPr>
-              <w:t>U</w:t>
-            </w:r>
-            <w:r>
-              <w:rPr>
-                <w:rStyle w:val="Hipervnculo"/>
-                <w:noProof/>
-              </w:rPr>
-              <w:t>ETES</w:t>
+              <w:t>DIAGRAMA DE PAQUETES</w:t>
             </w:r>
             <w:r>
               <w:rPr>
@@ -4106,21 +4092,7 @@
                 <w:rStyle w:val="Hipervnculo"/>
                 <w:noProof/>
               </w:rPr>
-              <w:t>10.1.1. PALETA DE</w:t>
-            </w:r>
-            <w:r>
-              <w:rPr>
-                <w:rStyle w:val="Hipervnculo"/>
-                <w:noProof/>
-              </w:rPr>
-              <w:t xml:space="preserve"> </w:t>
-            </w:r>
-            <w:r>
-              <w:rPr>
-                <w:rStyle w:val="Hipervnculo"/>
-                <w:noProof/>
-              </w:rPr>
-              <w:t>COLORES</w:t>
+              <w:t>10.1.1. PALETA DE COLORES</w:t>
             </w:r>
             <w:r>
               <w:rPr>
@@ -4264,21 +4236,7 @@
                 <w:rStyle w:val="Hipervnculo"/>
                 <w:noProof/>
               </w:rPr>
-              <w:t>10.1.3. Clases CSS de</w:t>
-            </w:r>
-            <w:r>
-              <w:rPr>
-                <w:rStyle w:val="Hipervnculo"/>
-                <w:noProof/>
-              </w:rPr>
-              <w:t>f</w:t>
-            </w:r>
-            <w:r>
-              <w:rPr>
-                <w:rStyle w:val="Hipervnculo"/>
-                <w:noProof/>
-              </w:rPr>
-              <w:t>inidas</w:t>
+              <w:t>10.1.3. Clases CSS definidas</w:t>
             </w:r>
             <w:r>
               <w:rPr>
@@ -5256,15 +5214,7 @@
     </w:p>
     <w:p>
       <w:r>
-        <w:t xml:space="preserve">El presente documento corresponde a la documentación del Proyecto </w:t>
-      </w:r>
-      <w:proofErr w:type="spellStart"/>
-      <w:r>
-        <w:t>Intermodular</w:t>
-      </w:r>
-      <w:proofErr w:type="spellEnd"/>
-      <w:r>
-        <w:t xml:space="preserve"> del CFGS en Técnico Superior de Desarrollo de Aplicaciones Multiplataforma</w:t>
+        <w:t>El presente documento corresponde a la documentación del Proyecto Intermodular del CFGS en Técnico Superior de Desarrollo de Aplicaciones Multiplataforma</w:t>
       </w:r>
       <w:r>
         <w:t>.</w:t>
@@ -5349,6 +5299,9 @@
       <w:r>
         <w:t>El objetivo general del proyecto es el desarrollo e implementación completa de un sistema de gestión integral que permita administrar las Formaciones en Empresa de los ciclos formativos del departamento de Informática y Comunicaciones del CIFP La Laboral de Gijón.</w:t>
       </w:r>
+      <w:r>
+        <w:t xml:space="preserve"> Con esta aplicación se pretende relacionar estudiantes de varios cursos, con sus FCTs (Formaciones en Centros de Trabajo), permitiendo que ellos mismos, y otros tipos de usuarios (Profesores, Tutores de empresa, Administrador) puedan consultar temas relacionados con dicha formación en cualquier momento.</w:t>
+      </w:r>
     </w:p>
     <w:p>
       <w:pPr>
@@ -5509,6 +5462,7 @@
       </w:pPr>
       <w:bookmarkStart w:id="5" w:name="_Toc227865319"/>
       <w:r>
+        <w:lastRenderedPageBreak/>
         <w:t>ANÁLISIS Y DISEÑO</w:t>
       </w:r>
       <w:bookmarkEnd w:id="5"/>
@@ -6630,15 +6584,7 @@
               <w:cnfStyle w:val="000000100000" w:firstRow="0" w:lastRow="0" w:firstColumn="0" w:lastColumn="0" w:oddVBand="0" w:evenVBand="0" w:oddHBand="1" w:evenHBand="0" w:firstRowFirstColumn="0" w:firstRowLastColumn="0" w:lastRowFirstColumn="0" w:lastRowLastColumn="0"/>
             </w:pPr>
             <w:r>
-              <w:t xml:space="preserve">El sistema garantizará la persistencia de datos mediante una base de datos relacional MySQL gestionada con </w:t>
-            </w:r>
-            <w:proofErr w:type="spellStart"/>
-            <w:r>
-              <w:t>Hibernate</w:t>
-            </w:r>
-            <w:proofErr w:type="spellEnd"/>
-            <w:r>
-              <w:t>/JPA.</w:t>
+              <w:t>El sistema garantizará la persistencia de datos mediante una base de datos relacional MySQL gestionada con Hibernate/JPA.</w:t>
             </w:r>
           </w:p>
         </w:tc>
@@ -6700,15 +6646,7 @@
               <w:cnfStyle w:val="000000000000" w:firstRow="0" w:lastRow="0" w:firstColumn="0" w:lastColumn="0" w:oddVBand="0" w:evenVBand="0" w:oddHBand="0" w:evenHBand="0" w:firstRowFirstColumn="0" w:firstRowLastColumn="0" w:lastRowFirstColumn="0" w:lastRowLastColumn="0"/>
             </w:pPr>
             <w:r>
-              <w:t xml:space="preserve">Las contraseñas de los usuarios serán almacenadas de forma segura mediante el algoritmo de hash </w:t>
-            </w:r>
-            <w:proofErr w:type="spellStart"/>
-            <w:r>
-              <w:t>BCrypt</w:t>
-            </w:r>
-            <w:proofErr w:type="spellEnd"/>
-            <w:r>
-              <w:t>.</w:t>
+              <w:t>Las contraseñas de los usuarios serán almacenadas de forma segura mediante el algoritmo de hash BCrypt.</w:t>
             </w:r>
           </w:p>
         </w:tc>
@@ -6900,15 +6838,7 @@
               <w:cnfStyle w:val="000000100000" w:firstRow="0" w:lastRow="0" w:firstColumn="0" w:lastColumn="0" w:oddVBand="0" w:evenVBand="0" w:oddHBand="1" w:evenHBand="0" w:firstRowFirstColumn="0" w:firstRowLastColumn="0" w:lastRowFirstColumn="0" w:lastRowLastColumn="0"/>
             </w:pPr>
             <w:r>
-              <w:t xml:space="preserve">El proyecto estará completamente documentado mediante este documento y comentarios </w:t>
-            </w:r>
-            <w:proofErr w:type="spellStart"/>
-            <w:r>
-              <w:t>JavaDoc</w:t>
-            </w:r>
-            <w:proofErr w:type="spellEnd"/>
-            <w:r>
-              <w:t xml:space="preserve"> en el código fuente.</w:t>
+              <w:t>El proyecto estará completamente documentado mediante este documento y comentarios JavaDoc en el código fuente.</w:t>
             </w:r>
           </w:p>
         </w:tc>
@@ -6970,15 +6900,7 @@
               <w:cnfStyle w:val="000000000000" w:firstRow="0" w:lastRow="0" w:firstColumn="0" w:lastColumn="0" w:oddVBand="0" w:evenVBand="0" w:oddHBand="0" w:evenHBand="0" w:firstRowFirstColumn="0" w:firstRowLastColumn="0" w:lastRowFirstColumn="0" w:lastRowLastColumn="0"/>
             </w:pPr>
             <w:r>
-              <w:t xml:space="preserve">El código fuente será gestionado mediante Git y alojado en GitHub, con </w:t>
-            </w:r>
-            <w:proofErr w:type="spellStart"/>
-            <w:r>
-              <w:t>commits</w:t>
-            </w:r>
-            <w:proofErr w:type="spellEnd"/>
-            <w:r>
-              <w:t xml:space="preserve"> organizados por funcionalidades.</w:t>
+              <w:t>El código fuente será gestionado mediante Git y alojado en GitHub, con commits organizados por funcionalidades.</w:t>
             </w:r>
           </w:p>
         </w:tc>
@@ -9772,168 +9694,66 @@
             <w:hideMark/>
           </w:tcPr>
           <w:p>
-            <w:proofErr w:type="spellStart"/>
-            <w:proofErr w:type="gramStart"/>
             <w:r>
               <w:rPr>
                 <w:sz w:val="20"/>
                 <w:szCs w:val="20"/>
               </w:rPr>
-              <w:t>com.alba</w:t>
-            </w:r>
-            <w:proofErr w:type="gramEnd"/>
+              <w:t>com.alba.proyecto</w:t>
+            </w:r>
+          </w:p>
+        </w:tc>
+        <w:tc>
+          <w:tcPr>
+            <w:tcW w:w="6200" w:type="dxa"/>
+            <w:hideMark/>
+          </w:tcPr>
+          <w:p>
+            <w:pPr>
+              <w:cnfStyle w:val="000000100000" w:firstRow="0" w:lastRow="0" w:firstColumn="0" w:lastColumn="0" w:oddVBand="0" w:evenVBand="0" w:oddHBand="1" w:evenHBand="0" w:firstRowFirstColumn="0" w:firstRowLastColumn="0" w:lastRowFirstColumn="0" w:lastRowLastColumn="0"/>
+            </w:pPr>
             <w:r>
               <w:rPr>
                 <w:sz w:val="20"/>
                 <w:szCs w:val="20"/>
               </w:rPr>
-              <w:t>.proyecto</w:t>
-            </w:r>
-            <w:proofErr w:type="spellEnd"/>
-          </w:p>
-        </w:tc>
-        <w:tc>
-          <w:tcPr>
-            <w:tcW w:w="6200" w:type="dxa"/>
-            <w:hideMark/>
-          </w:tcPr>
-          <w:p>
-            <w:pPr>
-              <w:cnfStyle w:val="000000100000" w:firstRow="0" w:lastRow="0" w:firstColumn="0" w:lastColumn="0" w:oddVBand="0" w:evenVBand="0" w:oddHBand="1" w:evenHBand="0" w:firstRowFirstColumn="0" w:firstRowLastColumn="0" w:lastRowFirstColumn="0" w:lastRowLastColumn="0"/>
-            </w:pPr>
+              <w:t>Paquete raíz. Contiene la clase principal de arranque de la aplicación Spring Boot + JavaFX.</w:t>
+            </w:r>
+          </w:p>
+        </w:tc>
+      </w:tr>
+      <w:tr>
+        <w:tc>
+          <w:tcPr>
+            <w:cnfStyle w:val="001000000000" w:firstRow="0" w:lastRow="0" w:firstColumn="1" w:lastColumn="0" w:oddVBand="0" w:evenVBand="0" w:oddHBand="0" w:evenHBand="0" w:firstRowFirstColumn="0" w:firstRowLastColumn="0" w:lastRowFirstColumn="0" w:lastRowLastColumn="0"/>
+            <w:tcW w:w="3000" w:type="dxa"/>
+            <w:hideMark/>
+          </w:tcPr>
+          <w:p>
             <w:r>
               <w:rPr>
                 <w:sz w:val="20"/>
                 <w:szCs w:val="20"/>
               </w:rPr>
-              <w:t xml:space="preserve">Paquete raíz. Contiene la clase principal de arranque de la aplicación Spring Boot + </w:t>
-            </w:r>
-            <w:proofErr w:type="spellStart"/>
+              <w:t>com.alba.proyecto.config</w:t>
+            </w:r>
+          </w:p>
+        </w:tc>
+        <w:tc>
+          <w:tcPr>
+            <w:tcW w:w="6200" w:type="dxa"/>
+            <w:hideMark/>
+          </w:tcPr>
+          <w:p>
+            <w:pPr>
+              <w:cnfStyle w:val="000000000000" w:firstRow="0" w:lastRow="0" w:firstColumn="0" w:lastColumn="0" w:oddVBand="0" w:evenVBand="0" w:oddHBand="0" w:evenHBand="0" w:firstRowFirstColumn="0" w:firstRowLastColumn="0" w:lastRowFirstColumn="0" w:lastRowLastColumn="0"/>
+            </w:pPr>
             <w:r>
               <w:rPr>
                 <w:sz w:val="20"/>
                 <w:szCs w:val="20"/>
               </w:rPr>
-              <w:t>JavaFX</w:t>
-            </w:r>
-            <w:proofErr w:type="spellEnd"/>
-            <w:r>
-              <w:rPr>
-                <w:sz w:val="20"/>
-                <w:szCs w:val="20"/>
-              </w:rPr>
-              <w:t>.</w:t>
-            </w:r>
-          </w:p>
-        </w:tc>
-      </w:tr>
-      <w:tr>
-        <w:tc>
-          <w:tcPr>
-            <w:cnfStyle w:val="001000000000" w:firstRow="0" w:lastRow="0" w:firstColumn="1" w:lastColumn="0" w:oddVBand="0" w:evenVBand="0" w:oddHBand="0" w:evenHBand="0" w:firstRowFirstColumn="0" w:firstRowLastColumn="0" w:lastRowFirstColumn="0" w:lastRowLastColumn="0"/>
-            <w:tcW w:w="3000" w:type="dxa"/>
-            <w:hideMark/>
-          </w:tcPr>
-          <w:p>
-            <w:proofErr w:type="spellStart"/>
-            <w:proofErr w:type="gramStart"/>
-            <w:r>
-              <w:rPr>
-                <w:sz w:val="20"/>
-                <w:szCs w:val="20"/>
-              </w:rPr>
-              <w:t>com.alba</w:t>
-            </w:r>
-            <w:proofErr w:type="gramEnd"/>
-            <w:r>
-              <w:rPr>
-                <w:sz w:val="20"/>
-                <w:szCs w:val="20"/>
-              </w:rPr>
-              <w:t>.proyecto.config</w:t>
-            </w:r>
-            <w:proofErr w:type="spellEnd"/>
-          </w:p>
-        </w:tc>
-        <w:tc>
-          <w:tcPr>
-            <w:tcW w:w="6200" w:type="dxa"/>
-            <w:hideMark/>
-          </w:tcPr>
-          <w:p>
-            <w:pPr>
-              <w:cnfStyle w:val="000000000000" w:firstRow="0" w:lastRow="0" w:firstColumn="0" w:lastColumn="0" w:oddVBand="0" w:evenVBand="0" w:oddHBand="0" w:evenHBand="0" w:firstRowFirstColumn="0" w:firstRowLastColumn="0" w:lastRowFirstColumn="0" w:lastRowLastColumn="0"/>
-            </w:pPr>
-            <w:r>
-              <w:rPr>
-                <w:sz w:val="20"/>
-                <w:szCs w:val="20"/>
-              </w:rPr>
-              <w:t>Configuración de la integración Spring-</w:t>
-            </w:r>
-            <w:proofErr w:type="spellStart"/>
-            <w:r>
-              <w:rPr>
-                <w:sz w:val="20"/>
-                <w:szCs w:val="20"/>
-              </w:rPr>
-              <w:t>JavaFX</w:t>
-            </w:r>
-            <w:proofErr w:type="spellEnd"/>
-            <w:r>
-              <w:rPr>
-                <w:sz w:val="20"/>
-                <w:szCs w:val="20"/>
-              </w:rPr>
-              <w:t xml:space="preserve">. Contiene </w:t>
-            </w:r>
-            <w:proofErr w:type="spellStart"/>
-            <w:r>
-              <w:rPr>
-                <w:sz w:val="20"/>
-                <w:szCs w:val="20"/>
-              </w:rPr>
-              <w:t>SpringFXMLLoader</w:t>
-            </w:r>
-            <w:proofErr w:type="spellEnd"/>
-            <w:r>
-              <w:rPr>
-                <w:sz w:val="20"/>
-                <w:szCs w:val="20"/>
-              </w:rPr>
-              <w:t xml:space="preserve">, </w:t>
-            </w:r>
-            <w:proofErr w:type="spellStart"/>
-            <w:r>
-              <w:rPr>
-                <w:sz w:val="20"/>
-                <w:szCs w:val="20"/>
-              </w:rPr>
-              <w:t>StageManager</w:t>
-            </w:r>
-            <w:proofErr w:type="spellEnd"/>
-            <w:r>
-              <w:rPr>
-                <w:sz w:val="20"/>
-                <w:szCs w:val="20"/>
-              </w:rPr>
-              <w:t xml:space="preserve"> y </w:t>
-            </w:r>
-            <w:proofErr w:type="spellStart"/>
-            <w:r>
-              <w:rPr>
-                <w:sz w:val="20"/>
-                <w:szCs w:val="20"/>
-              </w:rPr>
-              <w:t>AppJavaConfig</w:t>
-            </w:r>
-            <w:proofErr w:type="spellEnd"/>
-            <w:r>
-              <w:rPr>
-                <w:sz w:val="20"/>
-                <w:szCs w:val="20"/>
-              </w:rPr>
-              <w:t>.</w:t>
+              <w:t>Configuración de la integración Spring-JavaFX. Contiene SpringFXMLLoader, StageManager y AppJavaConfig.</w:t>
             </w:r>
           </w:p>
         </w:tc>
@@ -9949,33 +9769,49 @@
             <w:hideMark/>
           </w:tcPr>
           <w:p>
-            <w:proofErr w:type="spellStart"/>
-            <w:proofErr w:type="gramStart"/>
             <w:r>
               <w:rPr>
                 <w:sz w:val="20"/>
                 <w:szCs w:val="20"/>
               </w:rPr>
-              <w:t>com.alba</w:t>
-            </w:r>
-            <w:proofErr w:type="gramEnd"/>
+              <w:t>com.alba.proyecto.controller</w:t>
+            </w:r>
+          </w:p>
+        </w:tc>
+        <w:tc>
+          <w:tcPr>
+            <w:tcW w:w="6200" w:type="dxa"/>
+            <w:hideMark/>
+          </w:tcPr>
+          <w:p>
+            <w:pPr>
+              <w:cnfStyle w:val="000000100000" w:firstRow="0" w:lastRow="0" w:firstColumn="0" w:lastColumn="0" w:oddVBand="0" w:evenVBand="0" w:oddHBand="1" w:evenHBand="0" w:firstRowFirstColumn="0" w:firstRowLastColumn="0" w:lastRowFirstColumn="0" w:lastRowLastColumn="0"/>
+            </w:pPr>
             <w:r>
               <w:rPr>
                 <w:sz w:val="20"/>
                 <w:szCs w:val="20"/>
               </w:rPr>
-              <w:t>.</w:t>
-            </w:r>
-            <w:proofErr w:type="gramStart"/>
+              <w:t>Controladores JavaFX. Cada clase gestiona los eventos y la lógica de presentación de una pantalla o conjunto de paneles.</w:t>
+            </w:r>
+          </w:p>
+        </w:tc>
+      </w:tr>
+      <w:tr>
+        <w:tc>
+          <w:tcPr>
+            <w:cnfStyle w:val="001000000000" w:firstRow="0" w:lastRow="0" w:firstColumn="1" w:lastColumn="0" w:oddVBand="0" w:evenVBand="0" w:oddHBand="0" w:evenHBand="0" w:firstRowFirstColumn="0" w:firstRowLastColumn="0" w:lastRowFirstColumn="0" w:lastRowLastColumn="0"/>
+            <w:tcW w:w="3000" w:type="dxa"/>
+            <w:hideMark/>
+          </w:tcPr>
+          <w:p>
             <w:r>
               <w:rPr>
                 <w:sz w:val="20"/>
                 <w:szCs w:val="20"/>
               </w:rPr>
-              <w:t>proyecto.controller</w:t>
-            </w:r>
-            <w:proofErr w:type="spellEnd"/>
-            <w:proofErr w:type="gramEnd"/>
+              <w:t>com.alba.proyecto.modelo</w:t>
+            </w:r>
           </w:p>
         </w:tc>
         <w:tc>
@@ -9985,118 +9821,14 @@
           </w:tcPr>
           <w:p>
             <w:pPr>
-              <w:cnfStyle w:val="000000100000" w:firstRow="0" w:lastRow="0" w:firstColumn="0" w:lastColumn="0" w:oddVBand="0" w:evenVBand="0" w:oddHBand="1" w:evenHBand="0" w:firstRowFirstColumn="0" w:firstRowLastColumn="0" w:lastRowFirstColumn="0" w:lastRowLastColumn="0"/>
+              <w:cnfStyle w:val="000000000000" w:firstRow="0" w:lastRow="0" w:firstColumn="0" w:lastColumn="0" w:oddVBand="0" w:evenVBand="0" w:oddHBand="0" w:evenHBand="0" w:firstRowFirstColumn="0" w:firstRowLastColumn="0" w:lastRowFirstColumn="0" w:lastRowLastColumn="0"/>
             </w:pPr>
             <w:r>
               <w:rPr>
                 <w:sz w:val="20"/>
                 <w:szCs w:val="20"/>
               </w:rPr>
-              <w:t xml:space="preserve">Controladores </w:t>
-            </w:r>
-            <w:proofErr w:type="spellStart"/>
-            <w:r>
-              <w:rPr>
-                <w:sz w:val="20"/>
-                <w:szCs w:val="20"/>
-              </w:rPr>
-              <w:t>JavaFX</w:t>
-            </w:r>
-            <w:proofErr w:type="spellEnd"/>
-            <w:r>
-              <w:rPr>
-                <w:sz w:val="20"/>
-                <w:szCs w:val="20"/>
-              </w:rPr>
-              <w:t>. Cada clase gestiona los eventos y la lógica de presentación de una pantalla o conjunto de paneles.</w:t>
-            </w:r>
-          </w:p>
-        </w:tc>
-      </w:tr>
-      <w:tr>
-        <w:tc>
-          <w:tcPr>
-            <w:cnfStyle w:val="001000000000" w:firstRow="0" w:lastRow="0" w:firstColumn="1" w:lastColumn="0" w:oddVBand="0" w:evenVBand="0" w:oddHBand="0" w:evenHBand="0" w:firstRowFirstColumn="0" w:firstRowLastColumn="0" w:lastRowFirstColumn="0" w:lastRowLastColumn="0"/>
-            <w:tcW w:w="3000" w:type="dxa"/>
-            <w:hideMark/>
-          </w:tcPr>
-          <w:p>
-            <w:proofErr w:type="spellStart"/>
-            <w:proofErr w:type="gramStart"/>
-            <w:r>
-              <w:rPr>
-                <w:sz w:val="20"/>
-                <w:szCs w:val="20"/>
-              </w:rPr>
-              <w:t>com.alba</w:t>
-            </w:r>
-            <w:proofErr w:type="gramEnd"/>
-            <w:r>
-              <w:rPr>
-                <w:sz w:val="20"/>
-                <w:szCs w:val="20"/>
-              </w:rPr>
-              <w:t>.</w:t>
-            </w:r>
-            <w:proofErr w:type="gramStart"/>
-            <w:r>
-              <w:rPr>
-                <w:sz w:val="20"/>
-                <w:szCs w:val="20"/>
-              </w:rPr>
-              <w:t>proyecto.modelo</w:t>
-            </w:r>
-            <w:proofErr w:type="spellEnd"/>
-            <w:proofErr w:type="gramEnd"/>
-          </w:p>
-        </w:tc>
-        <w:tc>
-          <w:tcPr>
-            <w:tcW w:w="6200" w:type="dxa"/>
-            <w:hideMark/>
-          </w:tcPr>
-          <w:p>
-            <w:pPr>
-              <w:cnfStyle w:val="000000000000" w:firstRow="0" w:lastRow="0" w:firstColumn="0" w:lastColumn="0" w:oddVBand="0" w:evenVBand="0" w:oddHBand="0" w:evenHBand="0" w:firstRowFirstColumn="0" w:firstRowLastColumn="0" w:lastRowFirstColumn="0" w:lastRowLastColumn="0"/>
-            </w:pPr>
-            <w:r>
-              <w:rPr>
-                <w:sz w:val="20"/>
-                <w:szCs w:val="20"/>
-              </w:rPr>
-              <w:t xml:space="preserve">Entidades JPA del dominio: Persona, Administrador, Profesor, Estudiante, </w:t>
-            </w:r>
-            <w:proofErr w:type="spellStart"/>
-            <w:r>
-              <w:rPr>
-                <w:sz w:val="20"/>
-                <w:szCs w:val="20"/>
-              </w:rPr>
-              <w:t>TutorEmpresa</w:t>
-            </w:r>
-            <w:proofErr w:type="spellEnd"/>
-            <w:r>
-              <w:rPr>
-                <w:sz w:val="20"/>
-                <w:szCs w:val="20"/>
-              </w:rPr>
-              <w:t xml:space="preserve">, Empresa, FCT, </w:t>
-            </w:r>
-            <w:proofErr w:type="spellStart"/>
-            <w:r>
-              <w:rPr>
-                <w:sz w:val="20"/>
-                <w:szCs w:val="20"/>
-              </w:rPr>
-              <w:t>FaltaAsistencia</w:t>
-            </w:r>
-            <w:proofErr w:type="spellEnd"/>
-            <w:r>
-              <w:rPr>
-                <w:sz w:val="20"/>
-                <w:szCs w:val="20"/>
-              </w:rPr>
-              <w:t>, Curso y sus enumeraciones.</w:t>
+              <w:t>Entidades JPA del dominio: Persona, Administrador, Profesor, Estudiante, TutorEmpresa, Empresa, FCT, FaltaAsistencia, Curso y sus enumeraciones.</w:t>
             </w:r>
           </w:p>
         </w:tc>
@@ -10112,105 +9844,49 @@
             <w:hideMark/>
           </w:tcPr>
           <w:p>
-            <w:proofErr w:type="spellStart"/>
-            <w:proofErr w:type="gramStart"/>
             <w:r>
               <w:rPr>
                 <w:sz w:val="20"/>
                 <w:szCs w:val="20"/>
               </w:rPr>
-              <w:t>com.alba</w:t>
-            </w:r>
-            <w:proofErr w:type="gramEnd"/>
+              <w:t>com.alba.proyecto.repositorios</w:t>
+            </w:r>
+          </w:p>
+        </w:tc>
+        <w:tc>
+          <w:tcPr>
+            <w:tcW w:w="6200" w:type="dxa"/>
+            <w:hideMark/>
+          </w:tcPr>
+          <w:p>
+            <w:pPr>
+              <w:cnfStyle w:val="000000100000" w:firstRow="0" w:lastRow="0" w:firstColumn="0" w:lastColumn="0" w:oddVBand="0" w:evenVBand="0" w:oddHBand="1" w:evenHBand="0" w:firstRowFirstColumn="0" w:firstRowLastColumn="0" w:lastRowFirstColumn="0" w:lastRowLastColumn="0"/>
+            </w:pPr>
             <w:r>
               <w:rPr>
                 <w:sz w:val="20"/>
                 <w:szCs w:val="20"/>
               </w:rPr>
-              <w:t>.</w:t>
-            </w:r>
-            <w:proofErr w:type="gramStart"/>
+              <w:t>Interfaces de repositorio Spring Data JPA. Una por cada entidad principal. Heredan de JpaRepository.</w:t>
+            </w:r>
+          </w:p>
+        </w:tc>
+      </w:tr>
+      <w:tr>
+        <w:tc>
+          <w:tcPr>
+            <w:cnfStyle w:val="001000000000" w:firstRow="0" w:lastRow="0" w:firstColumn="1" w:lastColumn="0" w:oddVBand="0" w:evenVBand="0" w:oddHBand="0" w:evenHBand="0" w:firstRowFirstColumn="0" w:firstRowLastColumn="0" w:lastRowFirstColumn="0" w:lastRowLastColumn="0"/>
+            <w:tcW w:w="3000" w:type="dxa"/>
+            <w:hideMark/>
+          </w:tcPr>
+          <w:p>
             <w:r>
               <w:rPr>
                 <w:sz w:val="20"/>
                 <w:szCs w:val="20"/>
               </w:rPr>
-              <w:t>proyecto.repositorios</w:t>
-            </w:r>
-            <w:proofErr w:type="spellEnd"/>
-            <w:proofErr w:type="gramEnd"/>
-          </w:p>
-        </w:tc>
-        <w:tc>
-          <w:tcPr>
-            <w:tcW w:w="6200" w:type="dxa"/>
-            <w:hideMark/>
-          </w:tcPr>
-          <w:p>
-            <w:pPr>
-              <w:cnfStyle w:val="000000100000" w:firstRow="0" w:lastRow="0" w:firstColumn="0" w:lastColumn="0" w:oddVBand="0" w:evenVBand="0" w:oddHBand="1" w:evenHBand="0" w:firstRowFirstColumn="0" w:firstRowLastColumn="0" w:lastRowFirstColumn="0" w:lastRowLastColumn="0"/>
-            </w:pPr>
-            <w:r>
-              <w:rPr>
-                <w:sz w:val="20"/>
-                <w:szCs w:val="20"/>
-              </w:rPr>
-              <w:t xml:space="preserve">Interfaces de repositorio Spring Data JPA. Una por cada entidad principal. Heredan de </w:t>
-            </w:r>
-            <w:proofErr w:type="spellStart"/>
-            <w:r>
-              <w:rPr>
-                <w:sz w:val="20"/>
-                <w:szCs w:val="20"/>
-              </w:rPr>
-              <w:t>JpaRepository</w:t>
-            </w:r>
-            <w:proofErr w:type="spellEnd"/>
-            <w:r>
-              <w:rPr>
-                <w:sz w:val="20"/>
-                <w:szCs w:val="20"/>
-              </w:rPr>
-              <w:t>.</w:t>
-            </w:r>
-          </w:p>
-        </w:tc>
-      </w:tr>
-      <w:tr>
-        <w:tc>
-          <w:tcPr>
-            <w:cnfStyle w:val="001000000000" w:firstRow="0" w:lastRow="0" w:firstColumn="1" w:lastColumn="0" w:oddVBand="0" w:evenVBand="0" w:oddHBand="0" w:evenHBand="0" w:firstRowFirstColumn="0" w:firstRowLastColumn="0" w:lastRowFirstColumn="0" w:lastRowLastColumn="0"/>
-            <w:tcW w:w="3000" w:type="dxa"/>
-            <w:hideMark/>
-          </w:tcPr>
-          <w:p>
-            <w:proofErr w:type="spellStart"/>
-            <w:proofErr w:type="gramStart"/>
-            <w:r>
-              <w:rPr>
-                <w:sz w:val="20"/>
-                <w:szCs w:val="20"/>
-              </w:rPr>
-              <w:t>com.alba</w:t>
-            </w:r>
-            <w:proofErr w:type="gramEnd"/>
-            <w:r>
-              <w:rPr>
-                <w:sz w:val="20"/>
-                <w:szCs w:val="20"/>
-              </w:rPr>
-              <w:t>.</w:t>
-            </w:r>
-            <w:proofErr w:type="gramStart"/>
-            <w:r>
-              <w:rPr>
-                <w:sz w:val="20"/>
-                <w:szCs w:val="20"/>
-              </w:rPr>
-              <w:t>proyecto.services</w:t>
-            </w:r>
-            <w:proofErr w:type="spellEnd"/>
-            <w:proofErr w:type="gramEnd"/>
+              <w:t>com.alba.proyecto.services</w:t>
+            </w:r>
           </w:p>
         </w:tc>
         <w:tc>
@@ -10243,33 +9919,49 @@
             <w:hideMark/>
           </w:tcPr>
           <w:p>
-            <w:proofErr w:type="spellStart"/>
-            <w:proofErr w:type="gramStart"/>
             <w:r>
               <w:rPr>
                 <w:sz w:val="20"/>
                 <w:szCs w:val="20"/>
               </w:rPr>
-              <w:t>com.alba</w:t>
-            </w:r>
-            <w:proofErr w:type="gramEnd"/>
+              <w:t>com.alba.proyecto.view</w:t>
+            </w:r>
+          </w:p>
+        </w:tc>
+        <w:tc>
+          <w:tcPr>
+            <w:tcW w:w="6200" w:type="dxa"/>
+            <w:hideMark/>
+          </w:tcPr>
+          <w:p>
+            <w:pPr>
+              <w:cnfStyle w:val="000000100000" w:firstRow="0" w:lastRow="0" w:firstColumn="0" w:lastColumn="0" w:oddVBand="0" w:evenVBand="0" w:oddHBand="1" w:evenHBand="0" w:firstRowFirstColumn="0" w:firstRowLastColumn="0" w:lastRowFirstColumn="0" w:lastRowLastColumn="0"/>
+            </w:pPr>
             <w:r>
               <w:rPr>
                 <w:sz w:val="20"/>
                 <w:szCs w:val="20"/>
               </w:rPr>
-              <w:t>.</w:t>
-            </w:r>
-            <w:proofErr w:type="gramStart"/>
+              <w:t>Enumeración FxmlView con las rutas y títulos de las vistas FXML disponibles.</w:t>
+            </w:r>
+          </w:p>
+        </w:tc>
+      </w:tr>
+      <w:tr>
+        <w:tc>
+          <w:tcPr>
+            <w:cnfStyle w:val="001000000000" w:firstRow="0" w:lastRow="0" w:firstColumn="1" w:lastColumn="0" w:oddVBand="0" w:evenVBand="0" w:oddHBand="0" w:evenHBand="0" w:firstRowFirstColumn="0" w:firstRowLastColumn="0" w:lastRowFirstColumn="0" w:lastRowLastColumn="0"/>
+            <w:tcW w:w="3000" w:type="dxa"/>
+            <w:hideMark/>
+          </w:tcPr>
+          <w:p>
             <w:r>
               <w:rPr>
                 <w:sz w:val="20"/>
                 <w:szCs w:val="20"/>
               </w:rPr>
-              <w:t>proyecto.view</w:t>
-            </w:r>
-            <w:proofErr w:type="spellEnd"/>
-            <w:proofErr w:type="gramEnd"/>
+              <w:t>utils</w:t>
+            </w:r>
           </w:p>
         </w:tc>
         <w:tc>
@@ -10279,100 +9971,14 @@
           </w:tcPr>
           <w:p>
             <w:pPr>
-              <w:cnfStyle w:val="000000100000" w:firstRow="0" w:lastRow="0" w:firstColumn="0" w:lastColumn="0" w:oddVBand="0" w:evenVBand="0" w:oddHBand="1" w:evenHBand="0" w:firstRowFirstColumn="0" w:firstRowLastColumn="0" w:lastRowFirstColumn="0" w:lastRowLastColumn="0"/>
+              <w:cnfStyle w:val="000000000000" w:firstRow="0" w:lastRow="0" w:firstColumn="0" w:lastColumn="0" w:oddVBand="0" w:evenVBand="0" w:oddHBand="0" w:evenHBand="0" w:firstRowFirstColumn="0" w:firstRowLastColumn="0" w:lastRowFirstColumn="0" w:lastRowLastColumn="0"/>
             </w:pPr>
             <w:r>
               <w:rPr>
                 <w:sz w:val="20"/>
                 <w:szCs w:val="20"/>
               </w:rPr>
-              <w:t xml:space="preserve">Enumeración </w:t>
-            </w:r>
-            <w:proofErr w:type="spellStart"/>
-            <w:r>
-              <w:rPr>
-                <w:sz w:val="20"/>
-                <w:szCs w:val="20"/>
-              </w:rPr>
-              <w:t>FxmlView</w:t>
-            </w:r>
-            <w:proofErr w:type="spellEnd"/>
-            <w:r>
-              <w:rPr>
-                <w:sz w:val="20"/>
-                <w:szCs w:val="20"/>
-              </w:rPr>
-              <w:t xml:space="preserve"> con las rutas y títulos de las vistas FXML disponibles.</w:t>
-            </w:r>
-          </w:p>
-        </w:tc>
-      </w:tr>
-      <w:tr>
-        <w:tc>
-          <w:tcPr>
-            <w:cnfStyle w:val="001000000000" w:firstRow="0" w:lastRow="0" w:firstColumn="1" w:lastColumn="0" w:oddVBand="0" w:evenVBand="0" w:oddHBand="0" w:evenHBand="0" w:firstRowFirstColumn="0" w:firstRowLastColumn="0" w:lastRowFirstColumn="0" w:lastRowLastColumn="0"/>
-            <w:tcW w:w="3000" w:type="dxa"/>
-            <w:hideMark/>
-          </w:tcPr>
-          <w:p>
-            <w:proofErr w:type="spellStart"/>
-            <w:r>
-              <w:rPr>
-                <w:sz w:val="20"/>
-                <w:szCs w:val="20"/>
-              </w:rPr>
-              <w:t>utils</w:t>
-            </w:r>
-            <w:proofErr w:type="spellEnd"/>
-          </w:p>
-        </w:tc>
-        <w:tc>
-          <w:tcPr>
-            <w:tcW w:w="6200" w:type="dxa"/>
-            <w:hideMark/>
-          </w:tcPr>
-          <w:p>
-            <w:pPr>
-              <w:cnfStyle w:val="000000000000" w:firstRow="0" w:lastRow="0" w:firstColumn="0" w:lastColumn="0" w:oddVBand="0" w:evenVBand="0" w:oddHBand="0" w:evenHBand="0" w:firstRowFirstColumn="0" w:firstRowLastColumn="0" w:lastRowFirstColumn="0" w:lastRowLastColumn="0"/>
-            </w:pPr>
-            <w:r>
-              <w:rPr>
-                <w:sz w:val="20"/>
-                <w:szCs w:val="20"/>
-              </w:rPr>
-              <w:t xml:space="preserve">Clases de utilidad transversales: Validador (expresiones regulares y verificación </w:t>
-            </w:r>
-            <w:proofErr w:type="spellStart"/>
-            <w:r>
-              <w:rPr>
-                <w:sz w:val="20"/>
-                <w:szCs w:val="20"/>
-              </w:rPr>
-              <w:t>BCrypt</w:t>
-            </w:r>
-            <w:proofErr w:type="spellEnd"/>
-            <w:r>
-              <w:rPr>
-                <w:sz w:val="20"/>
-                <w:szCs w:val="20"/>
-              </w:rPr>
-              <w:t>) y Transformador (</w:t>
-            </w:r>
-            <w:proofErr w:type="spellStart"/>
-            <w:r>
-              <w:rPr>
-                <w:sz w:val="20"/>
-                <w:szCs w:val="20"/>
-              </w:rPr>
-              <w:t>hashing</w:t>
-            </w:r>
-            <w:proofErr w:type="spellEnd"/>
-            <w:r>
-              <w:rPr>
-                <w:sz w:val="20"/>
-                <w:szCs w:val="20"/>
-              </w:rPr>
-              <w:t xml:space="preserve"> y formateo de fechas).</w:t>
+              <w:t>Clases de utilidad transversales: Validador (expresiones regulares y verificación BCrypt) y Transformador (hashing y formateo de fechas).</w:t>
             </w:r>
           </w:p>
         </w:tc>
@@ -10941,15 +10547,7 @@
         </w:numPr>
       </w:pPr>
       <w:r>
-        <w:t xml:space="preserve">Pruebas Unitarias: verificación de la lógica de negocio en el </w:t>
-      </w:r>
-      <w:proofErr w:type="spellStart"/>
-      <w:r>
-        <w:t>backend</w:t>
-      </w:r>
-      <w:proofErr w:type="spellEnd"/>
-      <w:r>
-        <w:t>.</w:t>
+        <w:t>Pruebas Unitarias: verificación de la lógica de negocio en el backend.</w:t>
       </w:r>
     </w:p>
     <w:p>
@@ -11045,13 +10643,8 @@
           <w:numId w:val="6"/>
         </w:numPr>
       </w:pPr>
-      <w:proofErr w:type="spellStart"/>
-      <w:r>
-        <w:t>Mockflow</w:t>
-      </w:r>
-      <w:proofErr w:type="spellEnd"/>
-      <w:r>
-        <w:t xml:space="preserve">: </w:t>
+      <w:r>
+        <w:t xml:space="preserve">Mockflow: </w:t>
       </w:r>
       <w:r>
         <w:t>D</w:t>
@@ -11103,17 +10696,182 @@
           <w:b/>
           <w:bCs/>
         </w:rPr>
-        <w:t xml:space="preserve">Lenguajes de programación y </w:t>
-      </w:r>
-      <w:proofErr w:type="spellStart"/>
-      <w:r>
+        <w:t>Lenguajes de programación y Frameworks:</w:t>
+      </w:r>
+    </w:p>
+    <w:p>
+      <w:pPr>
+        <w:pStyle w:val="Prrafodelista"/>
+        <w:numPr>
+          <w:ilvl w:val="0"/>
+          <w:numId w:val="6"/>
+        </w:numPr>
+      </w:pPr>
+      <w:r>
+        <w:t>Java (JDK 17): Lenguaje usado para la lógica de negocio.</w:t>
+      </w:r>
+    </w:p>
+    <w:p>
+      <w:pPr>
+        <w:pStyle w:val="Prrafodelista"/>
+        <w:numPr>
+          <w:ilvl w:val="0"/>
+          <w:numId w:val="6"/>
+        </w:numPr>
+      </w:pPr>
+      <w:r>
+        <w:t>Spring Boot: Framework principal para el desarrollo de la aplicación.</w:t>
+      </w:r>
+    </w:p>
+    <w:p>
+      <w:pPr>
         <w:rPr>
           <w:b/>
           <w:bCs/>
         </w:rPr>
-        <w:t>Frameworks</w:t>
-      </w:r>
-      <w:proofErr w:type="spellEnd"/>
+      </w:pPr>
+      <w:r>
+        <w:rPr>
+          <w:b/>
+          <w:bCs/>
+        </w:rPr>
+        <w:t>Gestión de la base de datos:</w:t>
+      </w:r>
+    </w:p>
+    <w:p>
+      <w:pPr>
+        <w:pStyle w:val="Prrafodelista"/>
+        <w:numPr>
+          <w:ilvl w:val="0"/>
+          <w:numId w:val="6"/>
+        </w:numPr>
+      </w:pPr>
+      <w:r>
+        <w:t>Xampp</w:t>
+      </w:r>
+    </w:p>
+    <w:p>
+      <w:pPr>
+        <w:pStyle w:val="Prrafodelista"/>
+        <w:numPr>
+          <w:ilvl w:val="0"/>
+          <w:numId w:val="6"/>
+        </w:numPr>
+      </w:pPr>
+      <w:r>
+        <w:t xml:space="preserve">Hibertante: </w:t>
+      </w:r>
+      <w:r>
+        <w:t>I</w:t>
+      </w:r>
+      <w:r>
+        <w:t>mplementación de JPA para el ORM.</w:t>
+      </w:r>
+    </w:p>
+    <w:p>
+      <w:pPr>
+        <w:rPr>
+          <w:b/>
+          <w:bCs/>
+        </w:rPr>
+      </w:pPr>
+      <w:r>
+        <w:rPr>
+          <w:b/>
+          <w:bCs/>
+        </w:rPr>
+        <w:t>IDEs y Herramientas de construcción:</w:t>
+      </w:r>
+    </w:p>
+    <w:p>
+      <w:pPr>
+        <w:pStyle w:val="Prrafodelista"/>
+        <w:numPr>
+          <w:ilvl w:val="0"/>
+          <w:numId w:val="6"/>
+        </w:numPr>
+      </w:pPr>
+      <w:r>
+        <w:t>Eclipse</w:t>
+      </w:r>
+      <w:r>
+        <w:t>:</w:t>
+      </w:r>
+      <w:r>
+        <w:t xml:space="preserve"> versión </w:t>
+      </w:r>
+      <w:r>
+        <w:t>2025-09 (4.37.0)</w:t>
+      </w:r>
+    </w:p>
+    <w:p>
+      <w:pPr>
+        <w:pStyle w:val="Prrafodelista"/>
+        <w:numPr>
+          <w:ilvl w:val="0"/>
+          <w:numId w:val="6"/>
+        </w:numPr>
+      </w:pPr>
+      <w:r>
+        <w:t xml:space="preserve">Android Studio: entorno integrado de Google para aplicaciones </w:t>
+      </w:r>
+      <w:r>
+        <w:t>móviles</w:t>
+      </w:r>
+    </w:p>
+    <w:p>
+      <w:pPr>
+        <w:pStyle w:val="Prrafodelista"/>
+        <w:numPr>
+          <w:ilvl w:val="0"/>
+          <w:numId w:val="6"/>
+        </w:numPr>
+      </w:pPr>
+      <w:r>
+        <w:t xml:space="preserve">Maven: </w:t>
+      </w:r>
+      <w:r>
+        <w:t>C</w:t>
+      </w:r>
+      <w:r>
+        <w:t>omo herramienta de gestión y construcción de proyectos que facilita la inclusión de dependencias.</w:t>
+      </w:r>
+    </w:p>
+    <w:p>
+      <w:pPr>
+        <w:pStyle w:val="Prrafodelista"/>
+        <w:numPr>
+          <w:ilvl w:val="0"/>
+          <w:numId w:val="6"/>
+        </w:numPr>
+      </w:pPr>
+      <w:r>
+        <w:t xml:space="preserve">Github: </w:t>
+      </w:r>
+      <w:r>
+        <w:t>S</w:t>
+      </w:r>
+      <w:r>
+        <w:t>istema</w:t>
+      </w:r>
+      <w:r>
+        <w:t xml:space="preserve"> de control de versiones y seguimiento de los hitos de entrega.</w:t>
+      </w:r>
+    </w:p>
+    <w:p>
+      <w:pPr>
+        <w:rPr>
+          <w:b/>
+          <w:bCs/>
+        </w:rPr>
+      </w:pPr>
+      <w:r>
+        <w:rPr>
+          <w:b/>
+          <w:bCs/>
+        </w:rPr>
+        <w:t>Diseño de interfaces</w:t>
+      </w:r>
       <w:r>
         <w:rPr>
           <w:b/>
@@ -11131,7 +10889,7 @@
         </w:numPr>
       </w:pPr>
       <w:r>
-        <w:t>Java (JDK 17): Lenguaje usado para la lógica de negocio.</w:t>
+        <w:t>JavaFX: Librería utilizada para el desarrollo de la GUI de escritorio</w:t>
       </w:r>
     </w:p>
     <w:p>
@@ -11143,226 +10901,14 @@
         </w:numPr>
       </w:pPr>
       <w:r>
-        <w:t>Spring Boot: Framework principal para el desarrollo de la aplicación.</w:t>
-      </w:r>
-    </w:p>
-    <w:p>
-      <w:pPr>
-        <w:rPr>
-          <w:b/>
-          <w:bCs/>
-        </w:rPr>
-      </w:pPr>
-      <w:r>
-        <w:rPr>
-          <w:b/>
-          <w:bCs/>
-        </w:rPr>
-        <w:t>Gestión de la base de datos:</w:t>
-      </w:r>
-    </w:p>
-    <w:p>
-      <w:pPr>
-        <w:pStyle w:val="Prrafodelista"/>
-        <w:numPr>
-          <w:ilvl w:val="0"/>
-          <w:numId w:val="6"/>
-        </w:numPr>
-      </w:pPr>
-      <w:proofErr w:type="spellStart"/>
-      <w:r>
-        <w:t>Xampp</w:t>
-      </w:r>
-      <w:proofErr w:type="spellEnd"/>
-    </w:p>
-    <w:p>
-      <w:pPr>
-        <w:pStyle w:val="Prrafodelista"/>
-        <w:numPr>
-          <w:ilvl w:val="0"/>
-          <w:numId w:val="6"/>
-        </w:numPr>
-      </w:pPr>
-      <w:proofErr w:type="spellStart"/>
-      <w:r>
-        <w:t>Hibertante</w:t>
-      </w:r>
-      <w:proofErr w:type="spellEnd"/>
-      <w:r>
-        <w:t xml:space="preserve">: </w:t>
-      </w:r>
-      <w:r>
-        <w:t>I</w:t>
-      </w:r>
-      <w:r>
-        <w:t>mplementación de JPA para el ORM.</w:t>
-      </w:r>
-    </w:p>
-    <w:p>
-      <w:pPr>
-        <w:rPr>
-          <w:b/>
-          <w:bCs/>
-        </w:rPr>
-      </w:pPr>
-      <w:proofErr w:type="spellStart"/>
-      <w:r>
-        <w:rPr>
-          <w:b/>
-          <w:bCs/>
-        </w:rPr>
-        <w:t>IDEs</w:t>
-      </w:r>
-      <w:proofErr w:type="spellEnd"/>
-      <w:r>
-        <w:rPr>
-          <w:b/>
-          <w:bCs/>
-        </w:rPr>
-        <w:t xml:space="preserve"> y Herramientas de construcción:</w:t>
-      </w:r>
-    </w:p>
-    <w:p>
-      <w:pPr>
-        <w:pStyle w:val="Prrafodelista"/>
-        <w:numPr>
-          <w:ilvl w:val="0"/>
-          <w:numId w:val="6"/>
-        </w:numPr>
-      </w:pPr>
-      <w:r>
-        <w:t>Eclipse</w:t>
-      </w:r>
-      <w:r>
-        <w:t>:</w:t>
-      </w:r>
-      <w:r>
-        <w:t xml:space="preserve"> versión </w:t>
-      </w:r>
-      <w:r>
-        <w:t>2025-09 (4.37.0)</w:t>
-      </w:r>
-    </w:p>
-    <w:p>
-      <w:pPr>
-        <w:pStyle w:val="Prrafodelista"/>
-        <w:numPr>
-          <w:ilvl w:val="0"/>
-          <w:numId w:val="6"/>
-        </w:numPr>
-      </w:pPr>
-      <w:r>
-        <w:t xml:space="preserve">Android Studio: entorno integrado de Google para aplicaciones </w:t>
-      </w:r>
-      <w:r>
-        <w:t>móviles</w:t>
-      </w:r>
-    </w:p>
-    <w:p>
-      <w:pPr>
-        <w:pStyle w:val="Prrafodelista"/>
-        <w:numPr>
-          <w:ilvl w:val="0"/>
-          <w:numId w:val="6"/>
-        </w:numPr>
-      </w:pPr>
-      <w:r>
-        <w:t xml:space="preserve">Maven: </w:t>
-      </w:r>
-      <w:r>
-        <w:t>C</w:t>
-      </w:r>
-      <w:r>
-        <w:t>omo herramienta de gestión y construcción de proyectos que facilita la inclusión de dependencias.</w:t>
-      </w:r>
-    </w:p>
-    <w:p>
-      <w:pPr>
-        <w:pStyle w:val="Prrafodelista"/>
-        <w:numPr>
-          <w:ilvl w:val="0"/>
-          <w:numId w:val="6"/>
-        </w:numPr>
-      </w:pPr>
-      <w:proofErr w:type="spellStart"/>
-      <w:r>
-        <w:t>Github</w:t>
-      </w:r>
-      <w:proofErr w:type="spellEnd"/>
-      <w:r>
-        <w:t xml:space="preserve">: </w:t>
-      </w:r>
-      <w:r>
-        <w:t>S</w:t>
-      </w:r>
-      <w:r>
-        <w:t>istema</w:t>
-      </w:r>
-      <w:r>
-        <w:t xml:space="preserve"> de control de versiones y seguimiento de los hitos de entrega.</w:t>
-      </w:r>
-    </w:p>
-    <w:p>
-      <w:pPr>
-        <w:rPr>
-          <w:b/>
-          <w:bCs/>
-        </w:rPr>
-      </w:pPr>
-      <w:r>
-        <w:rPr>
-          <w:b/>
-          <w:bCs/>
-        </w:rPr>
-        <w:t>Diseño de interfaces</w:t>
-      </w:r>
-      <w:r>
-        <w:rPr>
-          <w:b/>
-          <w:bCs/>
-        </w:rPr>
-        <w:t>:</w:t>
-      </w:r>
-    </w:p>
-    <w:p>
-      <w:pPr>
-        <w:pStyle w:val="Prrafodelista"/>
-        <w:numPr>
-          <w:ilvl w:val="0"/>
-          <w:numId w:val="6"/>
-        </w:numPr>
-      </w:pPr>
-      <w:proofErr w:type="spellStart"/>
-      <w:r>
-        <w:t>JavaFX</w:t>
-      </w:r>
-      <w:proofErr w:type="spellEnd"/>
-      <w:r>
-        <w:t>: Librería utilizada para el desarrollo de la GUI de escritorio</w:t>
-      </w:r>
-    </w:p>
-    <w:p>
-      <w:pPr>
-        <w:pStyle w:val="Prrafodelista"/>
-        <w:numPr>
-          <w:ilvl w:val="0"/>
-          <w:numId w:val="6"/>
-        </w:numPr>
-      </w:pPr>
-      <w:r>
         <w:t>Android</w:t>
       </w:r>
       <w:r>
         <w:t xml:space="preserve"> SDK</w:t>
       </w:r>
       <w:r>
-        <w:t xml:space="preserve"> + </w:t>
-      </w:r>
-      <w:proofErr w:type="spellStart"/>
-      <w:r>
-        <w:t>Kotlin</w:t>
-      </w:r>
-      <w:proofErr w:type="spellEnd"/>
+        <w:t xml:space="preserve"> + Kotlin</w:t>
+      </w:r>
       <w:r>
         <w:t>: Conjunto de herramientas y lenguaje de programación utilizado para el desarrollo de la aplicación móvil.</w:t>
       </w:r>
@@ -12481,13 +12027,8 @@
               <w:cnfStyle w:val="000000000000" w:firstRow="0" w:lastRow="0" w:firstColumn="0" w:lastColumn="0" w:oddVBand="0" w:evenVBand="0" w:oddHBand="0" w:evenHBand="0" w:firstRowFirstColumn="0" w:firstRowLastColumn="0" w:lastRowFirstColumn="0" w:lastRowLastColumn="0"/>
             </w:pPr>
             <w:r>
-              <w:t xml:space="preserve">Azul </w:t>
-            </w:r>
-            <w:proofErr w:type="spellStart"/>
-            <w:r>
-              <w:t>cyan</w:t>
-            </w:r>
-            <w:proofErr w:type="spellEnd"/>
+              <w:t>Azul cyan</w:t>
+            </w:r>
           </w:p>
         </w:tc>
         <w:tc>
@@ -12775,15 +12316,7 @@
     </w:p>
     <w:p>
       <w:r>
-        <w:t xml:space="preserve">La fuente principal de la aplicación es Arial, </w:t>
-      </w:r>
-      <w:proofErr w:type="spellStart"/>
-      <w:r>
-        <w:t>sans-serif</w:t>
-      </w:r>
-      <w:proofErr w:type="spellEnd"/>
-      <w:r>
-        <w:t>, disponible en todos los sistemas operativos sin necesidad de instalación adicional. Se utilizan tres tamaños principales:</w:t>
+        <w:t>La fuente principal de la aplicación es Arial, sans-serif, disponible en todos los sistemas operativos sin necesidad de instalación adicional. Se utilizan tres tamaños principales:</w:t>
       </w:r>
     </w:p>
     <w:p>
@@ -12820,55 +12353,7 @@
     </w:p>
     <w:p>
       <w:r>
-        <w:t xml:space="preserve">Los estilos se definen en el fichero Styles.css ubicado en </w:t>
-      </w:r>
-      <w:proofErr w:type="spellStart"/>
-      <w:r>
-        <w:t>src</w:t>
-      </w:r>
-      <w:proofErr w:type="spellEnd"/>
-      <w:r>
-        <w:t>/</w:t>
-      </w:r>
-      <w:proofErr w:type="spellStart"/>
-      <w:r>
-        <w:t>main</w:t>
-      </w:r>
-      <w:proofErr w:type="spellEnd"/>
-      <w:r>
-        <w:t>/</w:t>
-      </w:r>
-      <w:proofErr w:type="spellStart"/>
-      <w:r>
-        <w:t>resources</w:t>
-      </w:r>
-      <w:proofErr w:type="spellEnd"/>
-      <w:r>
-        <w:t>/</w:t>
-      </w:r>
-      <w:proofErr w:type="spellStart"/>
-      <w:r>
-        <w:t>styles</w:t>
-      </w:r>
-      <w:proofErr w:type="spellEnd"/>
-      <w:r>
-        <w:t xml:space="preserve">/. Se aplican a los componentes </w:t>
-      </w:r>
-      <w:proofErr w:type="spellStart"/>
-      <w:r>
-        <w:t>JavaFX</w:t>
-      </w:r>
-      <w:proofErr w:type="spellEnd"/>
-      <w:r>
-        <w:t xml:space="preserve"> mediante el atributo </w:t>
-      </w:r>
-      <w:proofErr w:type="spellStart"/>
-      <w:r>
-        <w:t>styleClass</w:t>
-      </w:r>
-      <w:proofErr w:type="spellEnd"/>
-      <w:r>
-        <w:t xml:space="preserve"> en los ficheros FXML.</w:t>
+        <w:t>Los estilos se definen en el fichero Styles.css ubicado en src/main/resources/styles/. Se aplican a los componentes JavaFX mediante el atributo styleClass en los ficheros FXML.</w:t>
       </w:r>
     </w:p>
     <w:p/>
@@ -12931,13 +12416,8 @@
             <w:pPr>
               <w:spacing w:after="160" w:line="259" w:lineRule="auto"/>
             </w:pPr>
-            <w:proofErr w:type="gramStart"/>
-            <w:r>
-              <w:t>.fondo</w:t>
-            </w:r>
-            <w:proofErr w:type="gramEnd"/>
-            <w:r>
-              <w:t>-principal</w:t>
+            <w:r>
+              <w:t>.fondo-principal</w:t>
             </w:r>
           </w:p>
         </w:tc>
@@ -12968,19 +12448,9 @@
             <w:pPr>
               <w:spacing w:after="160" w:line="259" w:lineRule="auto"/>
             </w:pPr>
-            <w:proofErr w:type="gramStart"/>
-            <w:r>
-              <w:t>.fondo</w:t>
-            </w:r>
-            <w:proofErr w:type="gramEnd"/>
-            <w:r>
-              <w:t>-</w:t>
-            </w:r>
-            <w:proofErr w:type="spellStart"/>
-            <w:r>
-              <w:t>menu</w:t>
-            </w:r>
-            <w:proofErr w:type="spellEnd"/>
+            <w:r>
+              <w:t>.fondo-menu</w:t>
+            </w:r>
           </w:p>
         </w:tc>
         <w:tc>
@@ -13013,18 +12483,8 @@
             <w:pPr>
               <w:spacing w:after="160" w:line="259" w:lineRule="auto"/>
             </w:pPr>
-            <w:proofErr w:type="gramStart"/>
-            <w:r>
-              <w:t>.</w:t>
-            </w:r>
-            <w:proofErr w:type="spellStart"/>
-            <w:r>
-              <w:t>btn</w:t>
-            </w:r>
-            <w:proofErr w:type="spellEnd"/>
-            <w:proofErr w:type="gramEnd"/>
-            <w:r>
-              <w:t>-primario</w:t>
+            <w:r>
+              <w:t>.btn-primario</w:t>
             </w:r>
           </w:p>
         </w:tc>
@@ -13055,24 +12515,9 @@
             <w:pPr>
               <w:spacing w:after="160" w:line="259" w:lineRule="auto"/>
             </w:pPr>
-            <w:proofErr w:type="gramStart"/>
-            <w:r>
-              <w:t>.</w:t>
-            </w:r>
-            <w:proofErr w:type="spellStart"/>
-            <w:r>
-              <w:t>btn</w:t>
-            </w:r>
-            <w:proofErr w:type="gramEnd"/>
-            <w:r>
-              <w:t>-</w:t>
-            </w:r>
-            <w:proofErr w:type="gramStart"/>
-            <w:r>
-              <w:t>primario:hover</w:t>
-            </w:r>
-            <w:proofErr w:type="spellEnd"/>
-            <w:proofErr w:type="gramEnd"/>
+            <w:r>
+              <w:t>.btn-primario:hover</w:t>
+            </w:r>
           </w:p>
         </w:tc>
         <w:tc>
@@ -13086,15 +12531,7 @@
               <w:cnfStyle w:val="000000000000" w:firstRow="0" w:lastRow="0" w:firstColumn="0" w:lastColumn="0" w:oddVBand="0" w:evenVBand="0" w:oddHBand="0" w:evenHBand="0" w:firstRowFirstColumn="0" w:firstRowLastColumn="0" w:lastRowFirstColumn="0" w:lastRowLastColumn="0"/>
             </w:pPr>
             <w:r>
-              <w:t xml:space="preserve">Estado </w:t>
-            </w:r>
-            <w:proofErr w:type="spellStart"/>
-            <w:r>
-              <w:t>hover</w:t>
-            </w:r>
-            <w:proofErr w:type="spellEnd"/>
-            <w:r>
-              <w:t xml:space="preserve"> del botón primario. Fondo #4c85b9</w:t>
+              <w:t>Estado hover del botón primario. Fondo #4c85b9</w:t>
             </w:r>
           </w:p>
         </w:tc>
@@ -13113,18 +12550,8 @@
             <w:pPr>
               <w:spacing w:after="160" w:line="259" w:lineRule="auto"/>
             </w:pPr>
-            <w:proofErr w:type="gramStart"/>
-            <w:r>
-              <w:t>.</w:t>
-            </w:r>
-            <w:proofErr w:type="spellStart"/>
-            <w:r>
-              <w:t>btn</w:t>
-            </w:r>
-            <w:proofErr w:type="spellEnd"/>
-            <w:proofErr w:type="gramEnd"/>
-            <w:r>
-              <w:t>-peligro</w:t>
+            <w:r>
+              <w:t>.btn-peligro</w:t>
             </w:r>
           </w:p>
         </w:tc>
@@ -13155,24 +12582,9 @@
             <w:pPr>
               <w:spacing w:after="160" w:line="259" w:lineRule="auto"/>
             </w:pPr>
-            <w:proofErr w:type="gramStart"/>
-            <w:r>
-              <w:t>.</w:t>
-            </w:r>
-            <w:proofErr w:type="spellStart"/>
-            <w:r>
-              <w:t>btn</w:t>
-            </w:r>
-            <w:proofErr w:type="gramEnd"/>
-            <w:r>
-              <w:t>-</w:t>
-            </w:r>
-            <w:proofErr w:type="gramStart"/>
-            <w:r>
-              <w:t>peligro:hover</w:t>
-            </w:r>
-            <w:proofErr w:type="spellEnd"/>
-            <w:proofErr w:type="gramEnd"/>
+            <w:r>
+              <w:t>.btn-peligro:hover</w:t>
+            </w:r>
           </w:p>
         </w:tc>
         <w:tc>
@@ -13186,15 +12598,7 @@
               <w:cnfStyle w:val="000000000000" w:firstRow="0" w:lastRow="0" w:firstColumn="0" w:lastColumn="0" w:oddVBand="0" w:evenVBand="0" w:oddHBand="0" w:evenHBand="0" w:firstRowFirstColumn="0" w:firstRowLastColumn="0" w:lastRowFirstColumn="0" w:lastRowLastColumn="0"/>
             </w:pPr>
             <w:r>
-              <w:t xml:space="preserve">Estado </w:t>
-            </w:r>
-            <w:proofErr w:type="spellStart"/>
-            <w:r>
-              <w:t>hover</w:t>
-            </w:r>
-            <w:proofErr w:type="spellEnd"/>
-            <w:r>
-              <w:t xml:space="preserve"> del botón peligro. Fondo #6188d8</w:t>
+              <w:t>Estado hover del botón peligro. Fondo #6188d8</w:t>
             </w:r>
           </w:p>
         </w:tc>
@@ -13213,13 +12617,8 @@
             <w:pPr>
               <w:spacing w:after="160" w:line="259" w:lineRule="auto"/>
             </w:pPr>
-            <w:proofErr w:type="gramStart"/>
-            <w:r>
-              <w:t>.titulo</w:t>
-            </w:r>
-            <w:proofErr w:type="gramEnd"/>
-            <w:r>
-              <w:t>-panel</w:t>
+            <w:r>
+              <w:t>.titulo-panel</w:t>
             </w:r>
           </w:p>
         </w:tc>
@@ -13250,19 +12649,9 @@
             <w:pPr>
               <w:spacing w:after="160" w:line="259" w:lineRule="auto"/>
             </w:pPr>
-            <w:proofErr w:type="gramStart"/>
-            <w:r>
-              <w:t>.</w:t>
-            </w:r>
-            <w:proofErr w:type="spellStart"/>
-            <w:r>
-              <w:t>label</w:t>
-            </w:r>
-            <w:proofErr w:type="gramEnd"/>
-            <w:r>
-              <w:t>-menu</w:t>
-            </w:r>
-            <w:proofErr w:type="spellEnd"/>
+            <w:r>
+              <w:t>.label-menu</w:t>
+            </w:r>
           </w:p>
         </w:tc>
         <w:tc>
@@ -13295,19 +12684,9 @@
             <w:pPr>
               <w:spacing w:after="160" w:line="259" w:lineRule="auto"/>
             </w:pPr>
-            <w:proofErr w:type="gramStart"/>
-            <w:r>
-              <w:t>.</w:t>
-            </w:r>
-            <w:proofErr w:type="spellStart"/>
-            <w:r>
-              <w:t>btn</w:t>
-            </w:r>
-            <w:proofErr w:type="gramEnd"/>
-            <w:r>
-              <w:t>-menu</w:t>
-            </w:r>
-            <w:proofErr w:type="spellEnd"/>
+            <w:r>
+              <w:t>.btn-menu</w:t>
+            </w:r>
           </w:p>
         </w:tc>
         <w:tc>
@@ -13337,24 +12716,9 @@
             <w:pPr>
               <w:spacing w:after="160" w:line="259" w:lineRule="auto"/>
             </w:pPr>
-            <w:proofErr w:type="gramStart"/>
-            <w:r>
-              <w:t>.</w:t>
-            </w:r>
-            <w:proofErr w:type="spellStart"/>
-            <w:r>
-              <w:t>btn</w:t>
-            </w:r>
-            <w:proofErr w:type="gramEnd"/>
-            <w:r>
-              <w:t>-</w:t>
-            </w:r>
-            <w:proofErr w:type="gramStart"/>
-            <w:r>
-              <w:t>menu:hover</w:t>
-            </w:r>
-            <w:proofErr w:type="spellEnd"/>
-            <w:proofErr w:type="gramEnd"/>
+            <w:r>
+              <w:t>.btn-menu:hover</w:t>
+            </w:r>
           </w:p>
         </w:tc>
         <w:tc>
@@ -13368,15 +12732,7 @@
               <w:cnfStyle w:val="000000000000" w:firstRow="0" w:lastRow="0" w:firstColumn="0" w:lastColumn="0" w:oddVBand="0" w:evenVBand="0" w:oddHBand="0" w:evenHBand="0" w:firstRowFirstColumn="0" w:firstRowLastColumn="0" w:lastRowFirstColumn="0" w:lastRowLastColumn="0"/>
             </w:pPr>
             <w:r>
-              <w:t xml:space="preserve">Estado </w:t>
-            </w:r>
-            <w:proofErr w:type="spellStart"/>
-            <w:r>
-              <w:t>hover</w:t>
-            </w:r>
-            <w:proofErr w:type="spellEnd"/>
-            <w:r>
-              <w:t xml:space="preserve"> de los botones del menú. Fondo #4c85b9, texto blanco</w:t>
+              <w:t>Estado hover de los botones del menú. Fondo #4c85b9, texto blanco</w:t>
             </w:r>
           </w:p>
         </w:tc>
@@ -16544,6 +15900,10 @@
 </file>
 
 <file path=customXml/item1.xml><?xml version="1.0" encoding="utf-8"?>
+<b:Sources xmlns:b="http://schemas.openxmlformats.org/officeDocument/2006/bibliography" xmlns="http://schemas.openxmlformats.org/officeDocument/2006/bibliography" SelectedStyle="\APASixthEditionOfficeOnline.xsl" StyleName="APA" Version="6"/>
+</file>
+
+<file path=customXml/item2.xml><?xml version="1.0" encoding="utf-8"?>
 <?mso-contentType ?>
 <FormTemplates xmlns="http://schemas.microsoft.com/sharepoint/v3/contenttype/forms">
   <Display>DocumentLibraryForm</Display>
@@ -16552,19 +15912,7 @@
 </FormTemplates>
 </file>
 
-<file path=customXml/item2.xml><?xml version="1.0" encoding="utf-8"?>
-<b:Sources xmlns:b="http://schemas.openxmlformats.org/officeDocument/2006/bibliography" xmlns="http://schemas.openxmlformats.org/officeDocument/2006/bibliography" SelectedStyle="\APASixthEditionOfficeOnline.xsl" StyleName="APA" Version="6"/>
-</file>
-
 <file path=customXml/item3.xml><?xml version="1.0" encoding="utf-8"?>
-<p:properties xmlns:p="http://schemas.microsoft.com/office/2006/metadata/properties" xmlns:xsi="http://www.w3.org/2001/XMLSchema-instance" xmlns:pc="http://schemas.microsoft.com/office/infopath/2007/PartnerControls">
-  <documentManagement>
-    <_activity xmlns="d07641f9-f1a5-43c1-ac16-fa53e6c318bc" xsi:nil="true"/>
-  </documentManagement>
-</p:properties>
-</file>
-
-<file path=customXml/item4.xml><?xml version="1.0" encoding="utf-8"?>
 <ct:contentTypeSchema xmlns:ct="http://schemas.microsoft.com/office/2006/metadata/contentType" xmlns:ma="http://schemas.microsoft.com/office/2006/metadata/properties/metaAttributes" ct:_="" ma:_="" ma:contentTypeName="Documento" ma:contentTypeID="0x010100089FBA7B0FAFA84E9F1E615D3FC0A129" ma:contentTypeVersion="11" ma:contentTypeDescription="Crear nuevo documento." ma:contentTypeScope="" ma:versionID="fa55cfaacbcd603bd53d850e3b8176f7">
   <xsd:schema xmlns:xsd="http://www.w3.org/2001/XMLSchema" xmlns:xs="http://www.w3.org/2001/XMLSchema" xmlns:p="http://schemas.microsoft.com/office/2006/metadata/properties" xmlns:ns3="d07641f9-f1a5-43c1-ac16-fa53e6c318bc" targetNamespace="http://schemas.microsoft.com/office/2006/metadata/properties" ma:root="true" ma:fieldsID="78f989df160fe6a5ee2e0e0b0bfde0e3" ns3:_="">
     <xsd:import namespace="d07641f9-f1a5-43c1-ac16-fa53e6c318bc"/>
@@ -16752,7 +16100,23 @@
 </ct:contentTypeSchema>
 </file>
 
+<file path=customXml/item4.xml><?xml version="1.0" encoding="utf-8"?>
+<p:properties xmlns:p="http://schemas.microsoft.com/office/2006/metadata/properties" xmlns:xsi="http://www.w3.org/2001/XMLSchema-instance" xmlns:pc="http://schemas.microsoft.com/office/infopath/2007/PartnerControls">
+  <documentManagement>
+    <_activity xmlns="d07641f9-f1a5-43c1-ac16-fa53e6c318bc" xsi:nil="true"/>
+  </documentManagement>
+</p:properties>
+</file>
+
 <file path=customXml/itemProps1.xml><?xml version="1.0" encoding="utf-8"?>
+<ds:datastoreItem xmlns:ds="http://schemas.openxmlformats.org/officeDocument/2006/customXml" ds:itemID="{453714F8-FBC3-4DCC-8DCB-89BB58DCF76F}">
+  <ds:schemaRefs>
+    <ds:schemaRef ds:uri="http://schemas.openxmlformats.org/officeDocument/2006/bibliography"/>
+  </ds:schemaRefs>
+</ds:datastoreItem>
+</file>
+
+<file path=customXml/itemProps2.xml><?xml version="1.0" encoding="utf-8"?>
 <ds:datastoreItem xmlns:ds="http://schemas.openxmlformats.org/officeDocument/2006/customXml" ds:itemID="{480B8420-1B48-4D23-8D6E-64373AC5070B}">
   <ds:schemaRefs>
     <ds:schemaRef ds:uri="http://schemas.microsoft.com/sharepoint/v3/contenttype/forms"/>
@@ -16760,25 +16124,7 @@
 </ds:datastoreItem>
 </file>
 
-<file path=customXml/itemProps2.xml><?xml version="1.0" encoding="utf-8"?>
-<ds:datastoreItem xmlns:ds="http://schemas.openxmlformats.org/officeDocument/2006/customXml" ds:itemID="{453714F8-FBC3-4DCC-8DCB-89BB58DCF76F}">
-  <ds:schemaRefs>
-    <ds:schemaRef ds:uri="http://schemas.openxmlformats.org/officeDocument/2006/bibliography"/>
-  </ds:schemaRefs>
-</ds:datastoreItem>
-</file>
-
 <file path=customXml/itemProps3.xml><?xml version="1.0" encoding="utf-8"?>
-<ds:datastoreItem xmlns:ds="http://schemas.openxmlformats.org/officeDocument/2006/customXml" ds:itemID="{7F0B1298-25D5-45B9-909D-DD837044A49E}">
-  <ds:schemaRefs>
-    <ds:schemaRef ds:uri="http://schemas.microsoft.com/office/2006/metadata/properties"/>
-    <ds:schemaRef ds:uri="http://schemas.microsoft.com/office/infopath/2007/PartnerControls"/>
-    <ds:schemaRef ds:uri="d07641f9-f1a5-43c1-ac16-fa53e6c318bc"/>
-  </ds:schemaRefs>
-</ds:datastoreItem>
-</file>
-
-<file path=customXml/itemProps4.xml><?xml version="1.0" encoding="utf-8"?>
 <ds:datastoreItem xmlns:ds="http://schemas.openxmlformats.org/officeDocument/2006/customXml" ds:itemID="{B3C09D93-2BDC-4563-9759-9158244E5DE7}">
   <ds:schemaRefs>
     <ds:schemaRef ds:uri="http://schemas.microsoft.com/office/2006/metadata/contentType"/>
@@ -16794,4 +16140,14 @@
     <ds:schemaRef ds:uri="http://schemas.microsoft.com/internal/obd"/>
   </ds:schemaRefs>
 </ds:datastoreItem>
+</file>
+
+<file path=customXml/itemProps4.xml><?xml version="1.0" encoding="utf-8"?>
+<ds:datastoreItem xmlns:ds="http://schemas.openxmlformats.org/officeDocument/2006/customXml" ds:itemID="{7F0B1298-25D5-45B9-909D-DD837044A49E}">
+  <ds:schemaRefs>
+    <ds:schemaRef ds:uri="http://schemas.microsoft.com/office/2006/metadata/properties"/>
+    <ds:schemaRef ds:uri="http://schemas.microsoft.com/office/infopath/2007/PartnerControls"/>
+    <ds:schemaRef ds:uri="d07641f9-f1a5-43c1-ac16-fa53e6c318bc"/>
+  </ds:schemaRefs>
+</ds:datastoreItem>
 </file>
</xml_diff>